<commit_message>
Messenger: topics, pins, polls, events, tasks in chat, formatting; sender-only edit/delete
- Edit and delete a message: the sender only. Delete a chat: either
  person of a direct message, a group's admins, a project's admins for
  its channel and topics, or a site admin (a channel takes its topics).
- Topics: sub-channels of a project channel, opened by anyone in it.
- Pinned messages (up to 100 a chat) with a bar under the chat name.
- The + button: polls, events (RSVP, .ics, email invite), tasks; More >
  Make a task from any message.
- WhatsApp-style formatting with a format bar and shortcuts.
- Links to a message (?room=&msg=), used by pins and search.
- README and both manuals updated.

Co-Authored-By: Claude Opus 5.5 <noreply@anthropic.com>
Claude-Session: https://claude.ai/code/session_01HMFznQ3NqvEPBkq88avjvR
</commit_message>
<xml_diff>
--- a/docs/manual/LWK_Viewer_User_Manual_EN.docx
+++ b/docs/manual/LWK_Viewer_User_Manual_EN.docx
@@ -3276,6 +3276,39 @@
           <w:p>
             <w:pPr/>
             <w:r>
+              <w:t xml:space="preserve">Topic</w:t>
+            </w:r>
+          </w:p>
+        </w:tc>
+        <w:tc>
+          <w:tcPr>
+            <w:tcW w:w="4680" w:type="dxa"/>
+          </w:tcPr>
+          <w:p>
+            <w:pPr/>
+            <w:r>
+              <w:t xml:space="preserve">A sub-channel of a project channel for one subject (Facade, MEP coordination, Site visits). Listed under its channel, and as tabs under the channel's name: </w:t>
+            </w:r>
+            <w:r>
+              <w:rPr>
+                <w:b/>
+              </w:rPr>
+              <w:t xml:space="preserve"># General</w:t>
+            </w:r>
+            <w:r>
+              <w:t xml:space="preserve"> is the channel itself</w:t>
+            </w:r>
+          </w:p>
+        </w:tc>
+      </w:tr>
+      <w:tr>
+        <w:tc>
+          <w:tcPr>
+            <w:tcW w:w="4680" w:type="dxa"/>
+          </w:tcPr>
+          <w:p>
+            <w:pPr/>
+            <w:r>
               <w:t xml:space="preserve">Group</w:t>
             </w:r>
           </w:p>
@@ -3374,6 +3407,15 @@
         <w:rPr>
           <w:b/>
         </w:rPr>
+        <w:t xml:space="preserve">New topic</w:t>
+      </w:r>
+      <w:r>
+        <w:t xml:space="preserve"> (project channels), </w:t>
+      </w:r>
+      <w:r>
+        <w:rPr>
+          <w:b/>
+        </w:rPr>
         <w:t xml:space="preserve">Leave</w:t>
       </w:r>
       <w:r>
@@ -3395,7 +3437,7 @@
         <w:t xml:space="preserve">Send chat link to WhatsApp</w:t>
       </w:r>
       <w:r>
-        <w:t xml:space="preserve"> and, for its admin, </w:t>
+        <w:t xml:space="preserve"> and </w:t>
       </w:r>
       <w:r>
         <w:rPr>
@@ -3404,6 +3446,114 @@
         <w:t xml:space="preserve">Delete chat</w:t>
       </w:r>
       <w:r>
+        <w:t xml:space="preserve">, for those who may delete it.</w:t>
+      </w:r>
+    </w:p>
+    <w:p>
+      <w:pPr>
+        <w:pStyle w:val="ListParagraph"/>
+        <w:numPr>
+          <w:ilvl w:val="0"/>
+          <w:numId w:val="14"/>
+        </w:numPr>
+      </w:pPr>
+      <w:r>
+        <w:rPr>
+          <w:b/>
+        </w:rPr>
+        <w:t xml:space="preserve">Opening a topic:</w:t>
+      </w:r>
+      <w:r>
+        <w:t xml:space="preserve"> anyone in the project channel presses </w:t>
+      </w:r>
+      <w:r>
+        <w:rPr>
+          <w:b/>
+        </w:rPr>
+        <w:t xml:space="preserve">+ Topic</w:t>
+      </w:r>
+      <w:r>
+        <w:t xml:space="preserve"> on the tabs under its name (or </w:t>
+      </w:r>
+      <w:r>
+        <w:rPr>
+          <w:b/>
+        </w:rPr>
+        <w:t xml:space="preserve">New topic</w:t>
+      </w:r>
+      <w:r>
+        <w:t xml:space="preserve"> in its menu, or the pencil &gt; </w:t>
+      </w:r>
+      <w:r>
+        <w:rPr>
+          <w:b/>
+        </w:rPr>
+        <w:t xml:space="preserve">Topic in a project channel</w:t>
+      </w:r>
+      <w:r>
+        <w:t xml:space="preserve">). Everyone in the channel is added.</w:t>
+      </w:r>
+    </w:p>
+    <w:p>
+      <w:pPr>
+        <w:pStyle w:val="ListParagraph"/>
+        <w:numPr>
+          <w:ilvl w:val="0"/>
+          <w:numId w:val="14"/>
+        </w:numPr>
+      </w:pPr>
+      <w:r>
+        <w:rPr>
+          <w:b/>
+        </w:rPr>
+        <w:t xml:space="preserve">Who can delete a chat:</w:t>
+      </w:r>
+      <w:r>
+        <w:t xml:space="preserve"> a direct message, either of the two people (it goes for both); a group, its admins (who started it) or a site admin; a project channel or topic, the project's admins or a site admin. Deleting a channel deletes its topics too.</w:t>
+      </w:r>
+    </w:p>
+    <w:p>
+      <w:pPr>
+        <w:pStyle w:val="ListParagraph"/>
+        <w:numPr>
+          <w:ilvl w:val="0"/>
+          <w:numId w:val="14"/>
+        </w:numPr>
+      </w:pPr>
+      <w:r>
+        <w:rPr>
+          <w:b/>
+        </w:rPr>
+        <w:t xml:space="preserve">Chat info</w:t>
+      </w:r>
+      <w:r>
+        <w:t xml:space="preserve"> (the people button): the description, the members (add, remove, message), </w:t>
+      </w:r>
+      <w:r>
+        <w:rPr>
+          <w:b/>
+        </w:rPr>
+        <w:t xml:space="preserve">Pictures and files</w:t>
+      </w:r>
+      <w:r>
+        <w:t xml:space="preserve">, </w:t>
+      </w:r>
+      <w:r>
+        <w:rPr>
+          <w:b/>
+        </w:rPr>
+        <w:t xml:space="preserve">Leave this chat</w:t>
+      </w:r>
+      <w:r>
+        <w:t xml:space="preserve"> and </w:t>
+      </w:r>
+      <w:r>
+        <w:rPr>
+          <w:b/>
+        </w:rPr>
+        <w:t xml:space="preserve">Delete this chat</w:t>
+      </w:r>
+      <w:r>
         <w:t xml:space="preserve">.</w:t>
       </w:r>
     </w:p>
@@ -3416,19 +3566,211 @@
         </w:numPr>
       </w:pPr>
       <w:r>
-        <w:rPr>
-          <w:b/>
-        </w:rPr>
-        <w:t xml:space="preserve">Chat info</w:t>
-      </w:r>
-      <w:r>
-        <w:t xml:space="preserve"> (the people button): the description, the members (add, remove, message), </w:t>
-      </w:r>
-      <w:r>
-        <w:rPr>
-          <w:b/>
-        </w:rPr>
-        <w:t xml:space="preserve">Pictures and files</w:t>
+        <w:t xml:space="preserve">The number on </w:t>
+      </w:r>
+      <w:r>
+        <w:rPr>
+          <w:b/>
+        </w:rPr>
+        <w:t xml:space="preserve">Chat</w:t>
+      </w:r>
+      <w:r>
+        <w:t xml:space="preserve"> in the top bar of every page shows unread messages; </w:t>
+      </w:r>
+      <w:r>
+        <w:rPr>
+          <w:b/>
+        </w:rPr>
+        <w:t xml:space="preserve">@</w:t>
+      </w:r>
+      <w:r>
+        <w:t xml:space="preserve"> means you were mentioned.</w:t>
+      </w:r>
+    </w:p>
+    <w:p>
+      <w:pPr/>
+      <w:r>
+        <w:rPr>
+          <w:b/>
+        </w:rPr>
+        <w:t xml:space="preserve">Writing</w:t>
+      </w:r>
+    </w:p>
+    <w:p>
+      <w:pPr>
+        <w:pStyle w:val="ListParagraph"/>
+        <w:numPr>
+          <w:ilvl w:val="0"/>
+          <w:numId w:val="15"/>
+        </w:numPr>
+      </w:pPr>
+      <w:r>
+        <w:rPr>
+          <w:b/>
+        </w:rPr>
+        <w:t xml:space="preserve">Enter</w:t>
+      </w:r>
+      <w:r>
+        <w:t xml:space="preserve"> makes a new line; the </w:t>
+      </w:r>
+      <w:r>
+        <w:rPr>
+          <w:b/>
+        </w:rPr>
+        <w:t xml:space="preserve">Send</w:t>
+      </w:r>
+      <w:r>
+        <w:t xml:space="preserve"> button sends (on a keyboard, </w:t>
+      </w:r>
+      <w:r>
+        <w:rPr>
+          <w:b/>
+        </w:rPr>
+        <w:t xml:space="preserve">Ctrl+Enter</w:t>
+      </w:r>
+      <w:r>
+        <w:t xml:space="preserve"> sends too).</w:t>
+      </w:r>
+    </w:p>
+    <w:p>
+      <w:pPr>
+        <w:pStyle w:val="ListParagraph"/>
+        <w:numPr>
+          <w:ilvl w:val="0"/>
+          <w:numId w:val="15"/>
+        </w:numPr>
+      </w:pPr>
+      <w:r>
+        <w:t xml:space="preserve">Paste or drop screenshots, or use the paper clip for pictures and files up to 50 MB each. OneDrive, SharePoint and ACC links show as cards; a video link shows a play card, and a pasted OneDrive or SharePoint </w:t>
+      </w:r>
+      <w:r>
+        <w:rPr>
+          <w:b/>
+        </w:rPr>
+        <w:t xml:space="preserve">Embed</w:t>
+      </w:r>
+      <w:r>
+        <w:t xml:space="preserve"> code plays right in the chat.</w:t>
+      </w:r>
+    </w:p>
+    <w:p>
+      <w:pPr>
+        <w:pStyle w:val="ListParagraph"/>
+        <w:numPr>
+          <w:ilvl w:val="0"/>
+          <w:numId w:val="15"/>
+        </w:numPr>
+      </w:pPr>
+      <w:r>
+        <w:rPr>
+          <w:b/>
+        </w:rPr>
+        <w:t xml:space="preserve">@</w:t>
+      </w:r>
+      <w:r>
+        <w:t xml:space="preserve"> a person. </w:t>
+      </w:r>
+      <w:r>
+        <w:rPr>
+          <w:b/>
+        </w:rPr>
+        <w:t xml:space="preserve">#</w:t>
+      </w:r>
+      <w:r>
+        <w:t xml:space="preserve"> a task, </w:t>
+      </w:r>
+      <w:r>
+        <w:rPr>
+          <w:b/>
+        </w:rPr>
+        <w:t xml:space="preserve">!</w:t>
+      </w:r>
+      <w:r>
+        <w:t xml:space="preserve"> an issue, </w:t>
+      </w:r>
+      <w:r>
+        <w:rPr>
+          <w:b/>
+        </w:rPr>
+        <w:t xml:space="preserve">$</w:t>
+      </w:r>
+      <w:r>
+        <w:t xml:space="preserve"> a sheet, </w:t>
+      </w:r>
+      <w:r>
+        <w:rPr>
+          <w:b/>
+        </w:rPr>
+        <w:t xml:space="preserve">%</w:t>
+      </w:r>
+      <w:r>
+        <w:t xml:space="preserve"> the 3D model or a saved view: a list opens as you type. </w:t>
+      </w:r>
+      <w:r>
+        <w:rPr>
+          <w:b/>
+        </w:rPr>
+        <w:t xml:space="preserve">Choose the project first</w:t>
+      </w:r>
+      <w:r>
+        <w:t xml:space="preserve"> in the row of projects at the top of the list (in a project channel its own project is chosen). The </w:t>
+      </w:r>
+      <w:r>
+        <w:rPr>
+          <w:b/>
+        </w:rPr>
+        <w:t xml:space="preserve">#</w:t>
+      </w:r>
+      <w:r>
+        <w:t xml:space="preserve"> button beside the paper clip opens the same lists with tabs.</w:t>
+      </w:r>
+    </w:p>
+    <w:p>
+      <w:pPr>
+        <w:pStyle w:val="ListParagraph"/>
+        <w:numPr>
+          <w:ilvl w:val="0"/>
+          <w:numId w:val="15"/>
+        </w:numPr>
+      </w:pPr>
+      <w:r>
+        <w:t xml:space="preserve">The picked item shows in the message as a named link that opens it.</w:t>
+      </w:r>
+    </w:p>
+    <w:p>
+      <w:pPr>
+        <w:pStyle w:val="ListParagraph"/>
+        <w:numPr>
+          <w:ilvl w:val="0"/>
+          <w:numId w:val="15"/>
+        </w:numPr>
+      </w:pPr>
+      <w:r>
+        <w:t xml:space="preserve">🙂 adds emoji.</w:t>
+      </w:r>
+    </w:p>
+    <w:p>
+      <w:pPr>
+        <w:pStyle w:val="ListParagraph"/>
+        <w:numPr>
+          <w:ilvl w:val="0"/>
+          <w:numId w:val="15"/>
+        </w:numPr>
+      </w:pPr>
+      <w:r>
+        <w:rPr>
+          <w:b/>
+        </w:rPr>
+        <w:t xml:space="preserve">Formatting (Aa):</w:t>
+      </w:r>
+      <w:r>
+        <w:t xml:space="preserve"> the bar above the box has </w:t>
+      </w:r>
+      <w:r>
+        <w:rPr>
+          <w:b/>
+        </w:rPr>
+        <w:t xml:space="preserve">B</w:t>
       </w:r>
       <w:r>
         <w:t xml:space="preserve">, </w:t>
@@ -3437,7 +3779,34 @@
         <w:rPr>
           <w:b/>
         </w:rPr>
-        <w:t xml:space="preserve">Leave this chat</w:t>
+        <w:t xml:space="preserve">I</w:t>
+      </w:r>
+      <w:r>
+        <w:t xml:space="preserve">, </w:t>
+      </w:r>
+      <w:r>
+        <w:rPr>
+          <w:b/>
+        </w:rPr>
+        <w:t xml:space="preserve">S</w:t>
+      </w:r>
+      <w:r>
+        <w:t xml:space="preserve">, code, bullet and numbered lists, quote and code block; </w:t>
+      </w:r>
+      <w:r>
+        <w:rPr>
+          <w:b/>
+        </w:rPr>
+        <w:t xml:space="preserve">Ctrl+B</w:t>
+      </w:r>
+      <w:r>
+        <w:t xml:space="preserve">, </w:t>
+      </w:r>
+      <w:r>
+        <w:rPr>
+          <w:b/>
+        </w:rPr>
+        <w:t xml:space="preserve">Ctrl+I</w:t>
       </w:r>
       <w:r>
         <w:t xml:space="preserve"> and </w:t>
@@ -3446,7 +3815,424 @@
         <w:rPr>
           <w:b/>
         </w:rPr>
-        <w:t xml:space="preserve">Delete this chat</w:t>
+        <w:t xml:space="preserve">Ctrl+Shift+X</w:t>
+      </w:r>
+      <w:r>
+        <w:t xml:space="preserve"> work on the selection. It is written the WhatsApp way (*bold*, _italic_, ~strike~), so forwarded messages look the same in WhatsApp. Enter on a list line starts the next item.</w:t>
+      </w:r>
+    </w:p>
+    <w:p>
+      <w:pPr>
+        <w:pStyle w:val="ListParagraph"/>
+        <w:numPr>
+          <w:ilvl w:val="0"/>
+          <w:numId w:val="15"/>
+        </w:numPr>
+      </w:pPr>
+      <w:r>
+        <w:rPr>
+          <w:b/>
+        </w:rPr>
+        <w:t xml:space="preserve">The + button:</w:t>
+      </w:r>
+      <w:r>
+        <w:t xml:space="preserve"> </w:t>
+      </w:r>
+      <w:r>
+        <w:rPr>
+          <w:b/>
+        </w:rPr>
+        <w:t xml:space="preserve">Poll</w:t>
+      </w:r>
+      <w:r>
+        <w:t xml:space="preserve">, </w:t>
+      </w:r>
+      <w:r>
+        <w:rPr>
+          <w:b/>
+        </w:rPr>
+        <w:t xml:space="preserve">Event / meeting</w:t>
+      </w:r>
+      <w:r>
+        <w:t xml:space="preserve">, </w:t>
+      </w:r>
+      <w:r>
+        <w:rPr>
+          <w:b/>
+        </w:rPr>
+        <w:t xml:space="preserve">Task</w:t>
+      </w:r>
+      <w:r>
+        <w:t xml:space="preserve">, or a link to a task, issue, sheet or 3D view.</w:t>
+      </w:r>
+    </w:p>
+    <w:p>
+      <w:pPr/>
+      <w:r>
+        <w:rPr>
+          <w:b/>
+        </w:rPr>
+        <w:t xml:space="preserve">Polls, events and tasks</w:t>
+      </w:r>
+    </w:p>
+    <w:p>
+      <w:pPr>
+        <w:pStyle w:val="ListParagraph"/>
+        <w:numPr>
+          <w:ilvl w:val="0"/>
+          <w:numId w:val="16"/>
+        </w:numPr>
+      </w:pPr>
+      <w:r>
+        <w:rPr>
+          <w:b/>
+        </w:rPr>
+        <w:t xml:space="preserve">Poll:</w:t>
+      </w:r>
+      <w:r>
+        <w:t xml:space="preserve"> a question with 2 to 10 choices; tick </w:t>
+      </w:r>
+      <w:r>
+        <w:rPr>
+          <w:b/>
+        </w:rPr>
+        <w:t xml:space="preserve">Allow more than one answer</w:t>
+      </w:r>
+      <w:r>
+        <w:t xml:space="preserve">, </w:t>
+      </w:r>
+      <w:r>
+        <w:rPr>
+          <w:b/>
+        </w:rPr>
+        <w:t xml:space="preserve">Anonymous</w:t>
+      </w:r>
+      <w:r>
+        <w:t xml:space="preserve"> or a closing date if you like. Tap a choice to vote, again to take it back. The writer can </w:t>
+      </w:r>
+      <w:r>
+        <w:rPr>
+          <w:b/>
+        </w:rPr>
+        <w:t xml:space="preserve">Close poll</w:t>
+      </w:r>
+      <w:r>
+        <w:t xml:space="preserve"> (and reopen it).</w:t>
+      </w:r>
+    </w:p>
+    <w:p>
+      <w:pPr>
+        <w:pStyle w:val="ListParagraph"/>
+        <w:numPr>
+          <w:ilvl w:val="0"/>
+          <w:numId w:val="16"/>
+        </w:numPr>
+      </w:pPr>
+      <w:r>
+        <w:rPr>
+          <w:b/>
+        </w:rPr>
+        <w:t xml:space="preserve">Event:</w:t>
+      </w:r>
+      <w:r>
+        <w:t xml:space="preserve"> title, date, time (or </w:t>
+      </w:r>
+      <w:r>
+        <w:rPr>
+          <w:b/>
+        </w:rPr>
+        <w:t xml:space="preserve">All day</w:t>
+      </w:r>
+      <w:r>
+        <w:t xml:space="preserve">), where and the Teams link. Everyone in the chat is invited (by email too when mail is set up) and answers </w:t>
+      </w:r>
+      <w:r>
+        <w:rPr>
+          <w:b/>
+        </w:rPr>
+        <w:t xml:space="preserve">Going</w:t>
+      </w:r>
+      <w:r>
+        <w:t xml:space="preserve">, </w:t>
+      </w:r>
+      <w:r>
+        <w:rPr>
+          <w:b/>
+        </w:rPr>
+        <w:t xml:space="preserve">Maybe</w:t>
+      </w:r>
+      <w:r>
+        <w:t xml:space="preserve"> or </w:t>
+      </w:r>
+      <w:r>
+        <w:rPr>
+          <w:b/>
+        </w:rPr>
+        <w:t xml:space="preserve">Can't go</w:t>
+      </w:r>
+      <w:r>
+        <w:t xml:space="preserve">. </w:t>
+      </w:r>
+      <w:r>
+        <w:rPr>
+          <w:b/>
+        </w:rPr>
+        <w:t xml:space="preserve">Add to calendar (.ics)</w:t>
+      </w:r>
+      <w:r>
+        <w:t xml:space="preserve"> puts it in Outlook, Google or the phone. The writer can </w:t>
+      </w:r>
+      <w:r>
+        <w:rPr>
+          <w:b/>
+        </w:rPr>
+        <w:t xml:space="preserve">Change</w:t>
+      </w:r>
+      <w:r>
+        <w:t xml:space="preserve"> or </w:t>
+      </w:r>
+      <w:r>
+        <w:rPr>
+          <w:b/>
+        </w:rPr>
+        <w:t xml:space="preserve">Cancel event</w:t>
+      </w:r>
+      <w:r>
+        <w:t xml:space="preserve">; the chat is told.</w:t>
+      </w:r>
+    </w:p>
+    <w:p>
+      <w:pPr>
+        <w:pStyle w:val="ListParagraph"/>
+        <w:numPr>
+          <w:ilvl w:val="0"/>
+          <w:numId w:val="16"/>
+        </w:numPr>
+      </w:pPr>
+      <w:r>
+        <w:rPr>
+          <w:b/>
+        </w:rPr>
+        <w:t xml:space="preserve">Task:</w:t>
+      </w:r>
+      <w:r>
+        <w:t xml:space="preserve"> choose the task list and group (this project's first), owners (this chat's people first), due date and priority. The task goes into the list and its card into the chat. ⋯ More &gt; </w:t>
+      </w:r>
+      <w:r>
+        <w:rPr>
+          <w:b/>
+        </w:rPr>
+        <w:t xml:space="preserve">Make a task</w:t>
+      </w:r>
+      <w:r>
+        <w:t xml:space="preserve"> on any message does the same, with the message as the description, the people @mentioned as owners and a link back to it.</w:t>
+      </w:r>
+    </w:p>
+    <w:p>
+      <w:pPr/>
+      <w:r>
+        <w:rPr>
+          <w:b/>
+        </w:rPr>
+        <w:t xml:space="preserve">A message</w:t>
+      </w:r>
+    </w:p>
+    <w:p>
+      <w:pPr>
+        <w:pStyle w:val="ListParagraph"/>
+        <w:numPr>
+          <w:ilvl w:val="0"/>
+          <w:numId w:val="17"/>
+        </w:numPr>
+      </w:pPr>
+      <w:r>
+        <w:t xml:space="preserve">Hover a message (tap it on a phone): 🙂 </w:t>
+      </w:r>
+      <w:r>
+        <w:rPr>
+          <w:b/>
+        </w:rPr>
+        <w:t xml:space="preserve">React</w:t>
+      </w:r>
+      <w:r>
+        <w:t xml:space="preserve">, ↩ </w:t>
+      </w:r>
+      <w:r>
+        <w:rPr>
+          <w:b/>
+        </w:rPr>
+        <w:t xml:space="preserve">Reply</w:t>
+      </w:r>
+      <w:r>
+        <w:t xml:space="preserve">, ✏ </w:t>
+      </w:r>
+      <w:r>
+        <w:rPr>
+          <w:b/>
+        </w:rPr>
+        <w:t xml:space="preserve">Edit</w:t>
+      </w:r>
+      <w:r>
+        <w:t xml:space="preserve"> (your own) and ⋯ </w:t>
+      </w:r>
+      <w:r>
+        <w:rPr>
+          <w:b/>
+        </w:rPr>
+        <w:t xml:space="preserve">More</w:t>
+      </w:r>
+      <w:r>
+        <w:t xml:space="preserve">: </w:t>
+      </w:r>
+      <w:r>
+        <w:rPr>
+          <w:b/>
+        </w:rPr>
+        <w:t xml:space="preserve">Copy</w:t>
+      </w:r>
+      <w:r>
+        <w:t xml:space="preserve">, </w:t>
+      </w:r>
+      <w:r>
+        <w:rPr>
+          <w:b/>
+        </w:rPr>
+        <w:t xml:space="preserve">Pin</w:t>
+      </w:r>
+      <w:r>
+        <w:t xml:space="preserve">, </w:t>
+      </w:r>
+      <w:r>
+        <w:rPr>
+          <w:b/>
+        </w:rPr>
+        <w:t xml:space="preserve">Make a task</w:t>
+      </w:r>
+      <w:r>
+        <w:t xml:space="preserve">, </w:t>
+      </w:r>
+      <w:r>
+        <w:rPr>
+          <w:b/>
+        </w:rPr>
+        <w:t xml:space="preserve">Forward to another chat</w:t>
+      </w:r>
+      <w:r>
+        <w:t xml:space="preserve">, </w:t>
+      </w:r>
+      <w:r>
+        <w:rPr>
+          <w:b/>
+        </w:rPr>
+        <w:t xml:space="preserve">Send to WhatsApp</w:t>
+      </w:r>
+      <w:r>
+        <w:t xml:space="preserve">, </w:t>
+      </w:r>
+      <w:r>
+        <w:rPr>
+          <w:b/>
+        </w:rPr>
+        <w:t xml:space="preserve">Copy link to this message</w:t>
+      </w:r>
+      <w:r>
+        <w:t xml:space="preserve"> and </w:t>
+      </w:r>
+      <w:r>
+        <w:rPr>
+          <w:b/>
+        </w:rPr>
+        <w:t xml:space="preserve">Delete</w:t>
+      </w:r>
+      <w:r>
+        <w:t xml:space="preserve"> (your own).</w:t>
+      </w:r>
+    </w:p>
+    <w:p>
+      <w:pPr>
+        <w:pStyle w:val="ListParagraph"/>
+        <w:numPr>
+          <w:ilvl w:val="0"/>
+          <w:numId w:val="17"/>
+        </w:numPr>
+      </w:pPr>
+      <w:r>
+        <w:rPr>
+          <w:b/>
+        </w:rPr>
+        <w:t xml:space="preserve">Edit</w:t>
+      </w:r>
+      <w:r>
+        <w:t xml:space="preserve"> changes the message in place: </w:t>
+      </w:r>
+      <w:r>
+        <w:rPr>
+          <w:b/>
+        </w:rPr>
+        <w:t xml:space="preserve">Ctrl+Enter</w:t>
+      </w:r>
+      <w:r>
+        <w:t xml:space="preserve"> saves, </w:t>
+      </w:r>
+      <w:r>
+        <w:rPr>
+          <w:b/>
+        </w:rPr>
+        <w:t xml:space="preserve">Esc</w:t>
+      </w:r>
+      <w:r>
+        <w:t xml:space="preserve"> cancels; others see "(edited)". </w:t>
+      </w:r>
+      <w:r>
+        <w:rPr>
+          <w:b/>
+        </w:rPr>
+        <w:t xml:space="preserve">Edit</w:t>
+      </w:r>
+      <w:r>
+        <w:t xml:space="preserve"> and </w:t>
+      </w:r>
+      <w:r>
+        <w:rPr>
+          <w:b/>
+        </w:rPr>
+        <w:t xml:space="preserve">Delete</w:t>
+      </w:r>
+      <w:r>
+        <w:t xml:space="preserve"> are only for the person who sent the message (not the chat's admin, not a site admin); others see "message deleted".</w:t>
+      </w:r>
+    </w:p>
+    <w:p>
+      <w:pPr>
+        <w:pStyle w:val="ListParagraph"/>
+        <w:numPr>
+          <w:ilvl w:val="0"/>
+          <w:numId w:val="17"/>
+        </w:numPr>
+      </w:pPr>
+      <w:r>
+        <w:rPr>
+          <w:b/>
+        </w:rPr>
+        <w:t xml:space="preserve">Pinned messages:</w:t>
+      </w:r>
+      <w:r>
+        <w:t xml:space="preserve"> anyone in the chat can pin a message, up to 100 a chat. The bar under the chat's name shows the latest one; click it to see the message and move on to the next; </w:t>
+      </w:r>
+      <w:r>
+        <w:rPr>
+          <w:b/>
+        </w:rPr>
+        <w:t xml:space="preserve">All</w:t>
+      </w:r>
+      <w:r>
+        <w:t xml:space="preserve"> lists them, with </w:t>
+      </w:r>
+      <w:r>
+        <w:rPr>
+          <w:b/>
+        </w:rPr>
+        <w:t xml:space="preserve">unpin</w:t>
       </w:r>
       <w:r>
         <w:t xml:space="preserve">.</w:t>
@@ -3457,29 +4243,38 @@
         <w:pStyle w:val="ListParagraph"/>
         <w:numPr>
           <w:ilvl w:val="0"/>
-          <w:numId w:val="14"/>
-        </w:numPr>
-      </w:pPr>
-      <w:r>
-        <w:t xml:space="preserve">The number on </w:t>
-      </w:r>
-      <w:r>
-        <w:rPr>
-          <w:b/>
-        </w:rPr>
-        <w:t xml:space="preserve">Chat</w:t>
-      </w:r>
-      <w:r>
-        <w:t xml:space="preserve"> in the top bar of every page shows unread messages; </w:t>
-      </w:r>
-      <w:r>
-        <w:rPr>
-          <w:b/>
-        </w:rPr>
-        <w:t xml:space="preserve">@</w:t>
-      </w:r>
-      <w:r>
-        <w:t xml:space="preserve"> means you were mentioned.</w:t>
+          <w:numId w:val="17"/>
+        </w:numPr>
+      </w:pPr>
+      <w:r>
+        <w:rPr>
+          <w:b/>
+        </w:rPr>
+        <w:t xml:space="preserve">Reactions</w:t>
+      </w:r>
+      <w:r>
+        <w:t xml:space="preserve"> show under the message with a count; tap one to add or take away yours.</w:t>
+      </w:r>
+    </w:p>
+    <w:p>
+      <w:pPr>
+        <w:pStyle w:val="ListParagraph"/>
+        <w:numPr>
+          <w:ilvl w:val="0"/>
+          <w:numId w:val="17"/>
+        </w:numPr>
+      </w:pPr>
+      <w:r>
+        <w:t xml:space="preserve">A message that could not be sent stays with </w:t>
+      </w:r>
+      <w:r>
+        <w:rPr>
+          <w:b/>
+        </w:rPr>
+        <w:t xml:space="preserve">send again</w:t>
+      </w:r>
+      <w:r>
+        <w:t xml:space="preserve">.</w:t>
       </w:r>
     </w:p>
     <w:p>
@@ -3488,497 +4283,158 @@
         <w:rPr>
           <w:b/>
         </w:rPr>
-        <w:t xml:space="preserve">Writing</w:t>
-      </w:r>
-    </w:p>
-    <w:p>
-      <w:pPr>
-        <w:pStyle w:val="ListParagraph"/>
-        <w:numPr>
-          <w:ilvl w:val="0"/>
-          <w:numId w:val="15"/>
-        </w:numPr>
-      </w:pPr>
-      <w:r>
-        <w:rPr>
-          <w:b/>
-        </w:rPr>
-        <w:t xml:space="preserve">Enter</w:t>
-      </w:r>
-      <w:r>
-        <w:t xml:space="preserve"> makes a new line; the </w:t>
-      </w:r>
-      <w:r>
-        <w:rPr>
-          <w:b/>
-        </w:rPr>
-        <w:t xml:space="preserve">Send</w:t>
-      </w:r>
-      <w:r>
-        <w:t xml:space="preserve"> button sends (on a keyboard, </w:t>
-      </w:r>
-      <w:r>
-        <w:rPr>
-          <w:b/>
-        </w:rPr>
-        <w:t xml:space="preserve">Ctrl+Enter</w:t>
-      </w:r>
-      <w:r>
-        <w:t xml:space="preserve"> sends too).</w:t>
-      </w:r>
-    </w:p>
-    <w:p>
-      <w:pPr>
-        <w:pStyle w:val="ListParagraph"/>
-        <w:numPr>
-          <w:ilvl w:val="0"/>
-          <w:numId w:val="15"/>
-        </w:numPr>
-      </w:pPr>
-      <w:r>
-        <w:t xml:space="preserve">Paste or drop screenshots, or use the paper clip for pictures and files up to 50 MB each. OneDrive, SharePoint and ACC links show as cards; a video link shows a play card, and a pasted OneDrive or SharePoint </w:t>
-      </w:r>
-      <w:r>
-        <w:rPr>
-          <w:b/>
-        </w:rPr>
-        <w:t xml:space="preserve">Embed</w:t>
-      </w:r>
-      <w:r>
-        <w:t xml:space="preserve"> code plays right in the chat.</w:t>
-      </w:r>
-    </w:p>
-    <w:p>
-      <w:pPr>
-        <w:pStyle w:val="ListParagraph"/>
-        <w:numPr>
-          <w:ilvl w:val="0"/>
-          <w:numId w:val="15"/>
-        </w:numPr>
-      </w:pPr>
-      <w:r>
-        <w:rPr>
-          <w:b/>
-        </w:rPr>
-        <w:t xml:space="preserve">@</w:t>
-      </w:r>
-      <w:r>
-        <w:t xml:space="preserve"> a person. </w:t>
-      </w:r>
-      <w:r>
-        <w:rPr>
-          <w:b/>
-        </w:rPr>
-        <w:t xml:space="preserve">#</w:t>
-      </w:r>
-      <w:r>
-        <w:t xml:space="preserve"> a task, </w:t>
-      </w:r>
-      <w:r>
-        <w:rPr>
-          <w:b/>
-        </w:rPr>
-        <w:t xml:space="preserve">!</w:t>
-      </w:r>
-      <w:r>
-        <w:t xml:space="preserve"> an issue, </w:t>
-      </w:r>
-      <w:r>
-        <w:rPr>
-          <w:b/>
-        </w:rPr>
-        <w:t xml:space="preserve">$</w:t>
-      </w:r>
-      <w:r>
-        <w:t xml:space="preserve"> a sheet, </w:t>
-      </w:r>
-      <w:r>
-        <w:rPr>
-          <w:b/>
-        </w:rPr>
-        <w:t xml:space="preserve">%</w:t>
-      </w:r>
-      <w:r>
-        <w:t xml:space="preserve"> the 3D model or a saved view: a list opens as you type. </w:t>
-      </w:r>
-      <w:r>
-        <w:rPr>
-          <w:b/>
-        </w:rPr>
-        <w:t xml:space="preserve">Choose the project first</w:t>
-      </w:r>
-      <w:r>
-        <w:t xml:space="preserve"> in the row of projects at the top of the list (in a project channel its own project is chosen). The </w:t>
-      </w:r>
-      <w:r>
-        <w:rPr>
-          <w:b/>
-        </w:rPr>
-        <w:t xml:space="preserve">#</w:t>
-      </w:r>
-      <w:r>
-        <w:t xml:space="preserve"> button beside the paper clip opens the same lists with tabs.</w:t>
-      </w:r>
-    </w:p>
-    <w:p>
-      <w:pPr>
-        <w:pStyle w:val="ListParagraph"/>
-        <w:numPr>
-          <w:ilvl w:val="0"/>
-          <w:numId w:val="15"/>
-        </w:numPr>
-      </w:pPr>
-      <w:r>
-        <w:t xml:space="preserve">The picked item shows in the message as a named link that opens it.</w:t>
-      </w:r>
-    </w:p>
-    <w:p>
-      <w:pPr>
-        <w:pStyle w:val="ListParagraph"/>
-        <w:numPr>
-          <w:ilvl w:val="0"/>
-          <w:numId w:val="15"/>
-        </w:numPr>
-      </w:pPr>
-      <w:r>
-        <w:t xml:space="preserve">🙂 adds emoji.</w:t>
+        <w:t xml:space="preserve">WhatsApp</w:t>
+      </w:r>
+    </w:p>
+    <w:p>
+      <w:pPr>
+        <w:pStyle w:val="ListParagraph"/>
+        <w:numPr>
+          <w:ilvl w:val="0"/>
+          <w:numId w:val="18"/>
+        </w:numPr>
+      </w:pPr>
+      <w:r>
+        <w:rPr>
+          <w:b/>
+        </w:rPr>
+        <w:t xml:space="preserve">Out:</w:t>
+      </w:r>
+      <w:r>
+        <w:t xml:space="preserve"> </w:t>
+      </w:r>
+      <w:r>
+        <w:rPr>
+          <w:b/>
+        </w:rPr>
+        <w:t xml:space="preserve">Send to WhatsApp</w:t>
+      </w:r>
+      <w:r>
+        <w:t xml:space="preserve"> on a message sends its words, links and files. On a phone, pictures go as themselves through the share sheet; on a computer it opens WhatsApp Desktop or WhatsApp Web.</w:t>
+      </w:r>
+    </w:p>
+    <w:p>
+      <w:pPr>
+        <w:pStyle w:val="ListParagraph"/>
+        <w:numPr>
+          <w:ilvl w:val="0"/>
+          <w:numId w:val="18"/>
+        </w:numPr>
+      </w:pPr>
+      <w:r>
+        <w:rPr>
+          <w:b/>
+        </w:rPr>
+        <w:t xml:space="preserve">Copied messages:</w:t>
+      </w:r>
+      <w:r>
+        <w:t xml:space="preserve"> messages copied in WhatsApp and pasted into the box are offered as one "From WhatsApp" quote.</w:t>
+      </w:r>
+    </w:p>
+    <w:p>
+      <w:pPr>
+        <w:pStyle w:val="ListParagraph"/>
+        <w:numPr>
+          <w:ilvl w:val="0"/>
+          <w:numId w:val="18"/>
+        </w:numPr>
+      </w:pPr>
+      <w:r>
+        <w:rPr>
+          <w:b/>
+        </w:rPr>
+        <w:t xml:space="preserve">Exported chat:</w:t>
+      </w:r>
+      <w:r>
+        <w:t xml:space="preserve"> in WhatsApp, the chat &gt; </w:t>
+      </w:r>
+      <w:r>
+        <w:rPr>
+          <w:b/>
+        </w:rPr>
+        <w:t xml:space="preserve">More</w:t>
+      </w:r>
+      <w:r>
+        <w:t xml:space="preserve"> &gt; </w:t>
+      </w:r>
+      <w:r>
+        <w:rPr>
+          <w:b/>
+        </w:rPr>
+        <w:t xml:space="preserve">Export chat</w:t>
+      </w:r>
+      <w:r>
+        <w:t xml:space="preserve">, and send yourself the .zip (with media) or .txt. Then in a chat's menu choose </w:t>
+      </w:r>
+      <w:r>
+        <w:rPr>
+          <w:b/>
+        </w:rPr>
+        <w:t xml:space="preserve">Import WhatsApp chat ...</w:t>
+      </w:r>
+      <w:r>
+        <w:t xml:space="preserve">: the messages arrive as one quote with the pictures in place.</w:t>
+      </w:r>
+    </w:p>
+    <w:p>
+      <w:pPr>
+        <w:pStyle w:val="ListParagraph"/>
+        <w:numPr>
+          <w:ilvl w:val="0"/>
+          <w:numId w:val="18"/>
+        </w:numPr>
+      </w:pPr>
+      <w:r>
+        <w:rPr>
+          <w:b/>
+        </w:rPr>
+        <w:t xml:space="preserve">Android:</w:t>
+      </w:r>
+      <w:r>
+        <w:t xml:space="preserve"> with the viewer installed as an app, use WhatsApp's </w:t>
+      </w:r>
+      <w:r>
+        <w:rPr>
+          <w:b/>
+        </w:rPr>
+        <w:t xml:space="preserve">Share</w:t>
+      </w:r>
+      <w:r>
+        <w:t xml:space="preserve"> &gt; </w:t>
+      </w:r>
+      <w:r>
+        <w:rPr>
+          <w:b/>
+        </w:rPr>
+        <w:t xml:space="preserve">LWK Viewer</w:t>
+      </w:r>
+      <w:r>
+        <w:t xml:space="preserve"> and choose the chat. (iPhone does not offer this: copy and paste, or export.)</w:t>
+      </w:r>
+    </w:p>
+    <w:p>
+      <w:pPr>
+        <w:pStyle w:val="ListParagraph"/>
+        <w:numPr>
+          <w:ilvl w:val="0"/>
+          <w:numId w:val="18"/>
+        </w:numPr>
+      </w:pPr>
+      <w:r>
+        <w:t xml:space="preserve">There is no automatic two-way link with WhatsApp.</w:t>
+      </w:r>
+    </w:p>
+    <w:p>
+      <w:pPr>
+        <w:pStyle w:val="Heading2"/>
+      </w:pPr>
+      <w:r>
+        <w:t xml:space="preserve">Sheets (2D)</w:t>
       </w:r>
     </w:p>
     <w:p>
       <w:pPr/>
       <w:r>
-        <w:rPr>
-          <w:b/>
-        </w:rPr>
-        <w:t xml:space="preserve">A message</w:t>
-      </w:r>
-    </w:p>
-    <w:p>
-      <w:pPr>
-        <w:pStyle w:val="ListParagraph"/>
-        <w:numPr>
-          <w:ilvl w:val="0"/>
-          <w:numId w:val="16"/>
-        </w:numPr>
-      </w:pPr>
-      <w:r>
-        <w:t xml:space="preserve">Hover a message (tap it on a phone): 🙂 </w:t>
-      </w:r>
-      <w:r>
-        <w:rPr>
-          <w:b/>
-        </w:rPr>
-        <w:t xml:space="preserve">React</w:t>
-      </w:r>
-      <w:r>
-        <w:t xml:space="preserve">, ↩ </w:t>
-      </w:r>
-      <w:r>
-        <w:rPr>
-          <w:b/>
-        </w:rPr>
-        <w:t xml:space="preserve">Reply</w:t>
-      </w:r>
-      <w:r>
-        <w:t xml:space="preserve">, ✏ </w:t>
-      </w:r>
-      <w:r>
-        <w:rPr>
-          <w:b/>
-        </w:rPr>
-        <w:t xml:space="preserve">Edit</w:t>
-      </w:r>
-      <w:r>
-        <w:t xml:space="preserve"> (your own) and ⋯ </w:t>
-      </w:r>
-      <w:r>
-        <w:rPr>
-          <w:b/>
-        </w:rPr>
-        <w:t xml:space="preserve">More</w:t>
-      </w:r>
-      <w:r>
-        <w:t xml:space="preserve">: </w:t>
-      </w:r>
-      <w:r>
-        <w:rPr>
-          <w:b/>
-        </w:rPr>
-        <w:t xml:space="preserve">Copy</w:t>
-      </w:r>
-      <w:r>
-        <w:t xml:space="preserve">, </w:t>
-      </w:r>
-      <w:r>
-        <w:rPr>
-          <w:b/>
-        </w:rPr>
-        <w:t xml:space="preserve">Forward to another chat</w:t>
-      </w:r>
-      <w:r>
-        <w:t xml:space="preserve">, </w:t>
-      </w:r>
-      <w:r>
-        <w:rPr>
-          <w:b/>
-        </w:rPr>
-        <w:t xml:space="preserve">Send to WhatsApp</w:t>
-      </w:r>
-      <w:r>
-        <w:t xml:space="preserve"> and </w:t>
-      </w:r>
-      <w:r>
-        <w:rPr>
-          <w:b/>
-        </w:rPr>
-        <w:t xml:space="preserve">Delete</w:t>
-      </w:r>
-      <w:r>
-        <w:t xml:space="preserve">.</w:t>
-      </w:r>
-    </w:p>
-    <w:p>
-      <w:pPr>
-        <w:pStyle w:val="ListParagraph"/>
-        <w:numPr>
-          <w:ilvl w:val="0"/>
-          <w:numId w:val="16"/>
-        </w:numPr>
-      </w:pPr>
-      <w:r>
-        <w:rPr>
-          <w:b/>
-        </w:rPr>
-        <w:t xml:space="preserve">Edit</w:t>
-      </w:r>
-      <w:r>
-        <w:t xml:space="preserve"> changes the message in place: </w:t>
-      </w:r>
-      <w:r>
-        <w:rPr>
-          <w:b/>
-        </w:rPr>
-        <w:t xml:space="preserve">Ctrl+Enter</w:t>
-      </w:r>
-      <w:r>
-        <w:t xml:space="preserve"> saves, </w:t>
-      </w:r>
-      <w:r>
-        <w:rPr>
-          <w:b/>
-        </w:rPr>
-        <w:t xml:space="preserve">Esc</w:t>
-      </w:r>
-      <w:r>
-        <w:t xml:space="preserve"> cancels; others see "(edited)". </w:t>
-      </w:r>
-      <w:r>
-        <w:rPr>
-          <w:b/>
-        </w:rPr>
-        <w:t xml:space="preserve">Delete</w:t>
-      </w:r>
-      <w:r>
-        <w:t xml:space="preserve"> is for the writer, the chat's admin or a site admin; others see "message deleted".</w:t>
-      </w:r>
-    </w:p>
-    <w:p>
-      <w:pPr>
-        <w:pStyle w:val="ListParagraph"/>
-        <w:numPr>
-          <w:ilvl w:val="0"/>
-          <w:numId w:val="16"/>
-        </w:numPr>
-      </w:pPr>
-      <w:r>
-        <w:rPr>
-          <w:b/>
-        </w:rPr>
-        <w:t xml:space="preserve">Reactions</w:t>
-      </w:r>
-      <w:r>
-        <w:t xml:space="preserve"> show under the message with a count; tap one to add or take away yours.</w:t>
-      </w:r>
-    </w:p>
-    <w:p>
-      <w:pPr>
-        <w:pStyle w:val="ListParagraph"/>
-        <w:numPr>
-          <w:ilvl w:val="0"/>
-          <w:numId w:val="16"/>
-        </w:numPr>
-      </w:pPr>
-      <w:r>
-        <w:t xml:space="preserve">A message that could not be sent stays with </w:t>
-      </w:r>
-      <w:r>
-        <w:rPr>
-          <w:b/>
-        </w:rPr>
-        <w:t xml:space="preserve">send again</w:t>
-      </w:r>
-      <w:r>
-        <w:t xml:space="preserve">.</w:t>
-      </w:r>
-    </w:p>
-    <w:p>
-      <w:pPr/>
-      <w:r>
-        <w:rPr>
-          <w:b/>
-        </w:rPr>
-        <w:t xml:space="preserve">WhatsApp</w:t>
-      </w:r>
-    </w:p>
-    <w:p>
-      <w:pPr>
-        <w:pStyle w:val="ListParagraph"/>
-        <w:numPr>
-          <w:ilvl w:val="0"/>
-          <w:numId w:val="17"/>
-        </w:numPr>
-      </w:pPr>
-      <w:r>
-        <w:rPr>
-          <w:b/>
-        </w:rPr>
-        <w:t xml:space="preserve">Out:</w:t>
-      </w:r>
-      <w:r>
-        <w:t xml:space="preserve"> </w:t>
-      </w:r>
-      <w:r>
-        <w:rPr>
-          <w:b/>
-        </w:rPr>
-        <w:t xml:space="preserve">Send to WhatsApp</w:t>
-      </w:r>
-      <w:r>
-        <w:t xml:space="preserve"> on a message sends its words, links and files. On a phone, pictures go as themselves through the share sheet; on a computer it opens WhatsApp Desktop or WhatsApp Web.</w:t>
-      </w:r>
-    </w:p>
-    <w:p>
-      <w:pPr>
-        <w:pStyle w:val="ListParagraph"/>
-        <w:numPr>
-          <w:ilvl w:val="0"/>
-          <w:numId w:val="17"/>
-        </w:numPr>
-      </w:pPr>
-      <w:r>
-        <w:rPr>
-          <w:b/>
-        </w:rPr>
-        <w:t xml:space="preserve">Copied messages:</w:t>
-      </w:r>
-      <w:r>
-        <w:t xml:space="preserve"> messages copied in WhatsApp and pasted into the box are offered as one "From WhatsApp" quote.</w:t>
-      </w:r>
-    </w:p>
-    <w:p>
-      <w:pPr>
-        <w:pStyle w:val="ListParagraph"/>
-        <w:numPr>
-          <w:ilvl w:val="0"/>
-          <w:numId w:val="17"/>
-        </w:numPr>
-      </w:pPr>
-      <w:r>
-        <w:rPr>
-          <w:b/>
-        </w:rPr>
-        <w:t xml:space="preserve">Exported chat:</w:t>
-      </w:r>
-      <w:r>
-        <w:t xml:space="preserve"> in WhatsApp, the chat &gt; </w:t>
-      </w:r>
-      <w:r>
-        <w:rPr>
-          <w:b/>
-        </w:rPr>
-        <w:t xml:space="preserve">More</w:t>
-      </w:r>
-      <w:r>
-        <w:t xml:space="preserve"> &gt; </w:t>
-      </w:r>
-      <w:r>
-        <w:rPr>
-          <w:b/>
-        </w:rPr>
-        <w:t xml:space="preserve">Export chat</w:t>
-      </w:r>
-      <w:r>
-        <w:t xml:space="preserve">, and send yourself the .zip (with media) or .txt. Then in a chat's menu choose </w:t>
-      </w:r>
-      <w:r>
-        <w:rPr>
-          <w:b/>
-        </w:rPr>
-        <w:t xml:space="preserve">Import WhatsApp chat ...</w:t>
-      </w:r>
-      <w:r>
-        <w:t xml:space="preserve">: the messages arrive as one quote with the pictures in place.</w:t>
-      </w:r>
-    </w:p>
-    <w:p>
-      <w:pPr>
-        <w:pStyle w:val="ListParagraph"/>
-        <w:numPr>
-          <w:ilvl w:val="0"/>
-          <w:numId w:val="17"/>
-        </w:numPr>
-      </w:pPr>
-      <w:r>
-        <w:rPr>
-          <w:b/>
-        </w:rPr>
-        <w:t xml:space="preserve">Android:</w:t>
-      </w:r>
-      <w:r>
-        <w:t xml:space="preserve"> with the viewer installed as an app, use WhatsApp's </w:t>
-      </w:r>
-      <w:r>
-        <w:rPr>
-          <w:b/>
-        </w:rPr>
-        <w:t xml:space="preserve">Share</w:t>
-      </w:r>
-      <w:r>
-        <w:t xml:space="preserve"> &gt; </w:t>
-      </w:r>
-      <w:r>
-        <w:rPr>
-          <w:b/>
-        </w:rPr>
-        <w:t xml:space="preserve">LWK Viewer</w:t>
-      </w:r>
-      <w:r>
-        <w:t xml:space="preserve"> and choose the chat. (iPhone does not offer this: copy and paste, or export.)</w:t>
-      </w:r>
-    </w:p>
-    <w:p>
-      <w:pPr>
-        <w:pStyle w:val="ListParagraph"/>
-        <w:numPr>
-          <w:ilvl w:val="0"/>
-          <w:numId w:val="17"/>
-        </w:numPr>
-      </w:pPr>
-      <w:r>
-        <w:t xml:space="preserve">There is no automatic two-way link with WhatsApp.</w:t>
-      </w:r>
-    </w:p>
-    <w:p>
-      <w:pPr>
-        <w:pStyle w:val="Heading2"/>
-      </w:pPr>
-      <w:r>
-        <w:t xml:space="preserve">Sheets (2D)</w:t>
-      </w:r>
-    </w:p>
-    <w:p>
-      <w:pPr/>
-      <w:r>
         <w:t xml:space="preserve">The Sheets page shows every published sheet as the real PDF, searchable and ready for markup; markups save by themselves, there is no Save button.</w:t>
       </w:r>
     </w:p>
@@ -3995,7 +4451,7 @@
         <w:pStyle w:val="ListParagraph"/>
         <w:numPr>
           <w:ilvl w:val="0"/>
-          <w:numId w:val="18"/>
+          <w:numId w:val="19"/>
         </w:numPr>
       </w:pPr>
       <w:r>
@@ -4016,7 +4472,7 @@
         <w:pStyle w:val="ListParagraph"/>
         <w:numPr>
           <w:ilvl w:val="0"/>
-          <w:numId w:val="18"/>
+          <w:numId w:val="19"/>
         </w:numPr>
       </w:pPr>
       <w:r>
@@ -4028,7 +4484,7 @@
         <w:pStyle w:val="ListParagraph"/>
         <w:numPr>
           <w:ilvl w:val="0"/>
-          <w:numId w:val="18"/>
+          <w:numId w:val="19"/>
         </w:numPr>
       </w:pPr>
       <w:r>
@@ -4046,7 +4502,7 @@
         <w:pStyle w:val="ListParagraph"/>
         <w:numPr>
           <w:ilvl w:val="0"/>
-          <w:numId w:val="18"/>
+          <w:numId w:val="19"/>
         </w:numPr>
       </w:pPr>
       <w:r>
@@ -4064,7 +4520,7 @@
         <w:pStyle w:val="ListParagraph"/>
         <w:numPr>
           <w:ilvl w:val="0"/>
-          <w:numId w:val="18"/>
+          <w:numId w:val="19"/>
         </w:numPr>
       </w:pPr>
       <w:r>
@@ -4389,7 +4845,7 @@
         <w:pStyle w:val="ListParagraph"/>
         <w:numPr>
           <w:ilvl w:val="0"/>
-          <w:numId w:val="19"/>
+          <w:numId w:val="20"/>
         </w:numPr>
       </w:pPr>
       <w:r>
@@ -4407,7 +4863,7 @@
         <w:pStyle w:val="ListParagraph"/>
         <w:numPr>
           <w:ilvl w:val="0"/>
-          <w:numId w:val="19"/>
+          <w:numId w:val="20"/>
         </w:numPr>
       </w:pPr>
       <w:r>
@@ -4434,7 +4890,7 @@
         <w:pStyle w:val="ListParagraph"/>
         <w:numPr>
           <w:ilvl w:val="0"/>
-          <w:numId w:val="19"/>
+          <w:numId w:val="20"/>
         </w:numPr>
       </w:pPr>
       <w:r>
@@ -4461,7 +4917,7 @@
         <w:pStyle w:val="ListParagraph"/>
         <w:numPr>
           <w:ilvl w:val="0"/>
-          <w:numId w:val="19"/>
+          <w:numId w:val="20"/>
         </w:numPr>
       </w:pPr>
       <w:r>
@@ -4708,7 +5164,7 @@
         <w:pStyle w:val="ListParagraph"/>
         <w:numPr>
           <w:ilvl w:val="0"/>
-          <w:numId w:val="20"/>
+          <w:numId w:val="21"/>
         </w:numPr>
       </w:pPr>
       <w:r>
@@ -4735,7 +5191,7 @@
         <w:pStyle w:val="ListParagraph"/>
         <w:numPr>
           <w:ilvl w:val="0"/>
-          <w:numId w:val="20"/>
+          <w:numId w:val="21"/>
         </w:numPr>
       </w:pPr>
       <w:r>
@@ -4753,7 +5209,7 @@
         <w:pStyle w:val="ListParagraph"/>
         <w:numPr>
           <w:ilvl w:val="0"/>
-          <w:numId w:val="20"/>
+          <w:numId w:val="21"/>
         </w:numPr>
       </w:pPr>
       <w:r>
@@ -4771,7 +5227,7 @@
         <w:pStyle w:val="ListParagraph"/>
         <w:numPr>
           <w:ilvl w:val="0"/>
-          <w:numId w:val="20"/>
+          <w:numId w:val="21"/>
         </w:numPr>
       </w:pPr>
       <w:r>
@@ -4834,7 +5290,7 @@
         <w:pStyle w:val="ListParagraph"/>
         <w:numPr>
           <w:ilvl w:val="0"/>
-          <w:numId w:val="20"/>
+          <w:numId w:val="21"/>
         </w:numPr>
       </w:pPr>
       <w:r>
@@ -4860,7 +5316,7 @@
         <w:pStyle w:val="ListParagraph"/>
         <w:numPr>
           <w:ilvl w:val="0"/>
-          <w:numId w:val="21"/>
+          <w:numId w:val="22"/>
         </w:numPr>
       </w:pPr>
       <w:r>
@@ -4896,7 +5352,7 @@
         <w:pStyle w:val="ListParagraph"/>
         <w:numPr>
           <w:ilvl w:val="0"/>
-          <w:numId w:val="21"/>
+          <w:numId w:val="22"/>
         </w:numPr>
       </w:pPr>
       <w:r>
@@ -4914,7 +5370,7 @@
         <w:pStyle w:val="ListParagraph"/>
         <w:numPr>
           <w:ilvl w:val="0"/>
-          <w:numId w:val="21"/>
+          <w:numId w:val="22"/>
         </w:numPr>
       </w:pPr>
       <w:r>
@@ -5515,7 +5971,7 @@
         <w:pStyle w:val="ListParagraph"/>
         <w:numPr>
           <w:ilvl w:val="0"/>
-          <w:numId w:val="22"/>
+          <w:numId w:val="23"/>
         </w:numPr>
       </w:pPr>
       <w:r>
@@ -5554,7 +6010,7 @@
         <w:pStyle w:val="ListParagraph"/>
         <w:numPr>
           <w:ilvl w:val="0"/>
-          <w:numId w:val="22"/>
+          <w:numId w:val="23"/>
         </w:numPr>
       </w:pPr>
       <w:r>
@@ -5575,7 +6031,7 @@
         <w:pStyle w:val="ListParagraph"/>
         <w:numPr>
           <w:ilvl w:val="0"/>
-          <w:numId w:val="22"/>
+          <w:numId w:val="23"/>
         </w:numPr>
       </w:pPr>
       <w:r>
@@ -5593,7 +6049,7 @@
         <w:pStyle w:val="ListParagraph"/>
         <w:numPr>
           <w:ilvl w:val="0"/>
-          <w:numId w:val="22"/>
+          <w:numId w:val="23"/>
         </w:numPr>
       </w:pPr>
       <w:r>
@@ -5628,7 +6084,7 @@
         <w:pStyle w:val="ListParagraph"/>
         <w:numPr>
           <w:ilvl w:val="0"/>
-          <w:numId w:val="23"/>
+          <w:numId w:val="24"/>
         </w:numPr>
       </w:pPr>
       <w:r>
@@ -5658,7 +6114,7 @@
         <w:pStyle w:val="ListParagraph"/>
         <w:numPr>
           <w:ilvl w:val="0"/>
-          <w:numId w:val="23"/>
+          <w:numId w:val="24"/>
         </w:numPr>
       </w:pPr>
       <w:r>
@@ -5670,7 +6126,7 @@
         <w:pStyle w:val="ListParagraph"/>
         <w:numPr>
           <w:ilvl w:val="0"/>
-          <w:numId w:val="23"/>
+          <w:numId w:val="24"/>
         </w:numPr>
       </w:pPr>
       <w:r>
@@ -5697,7 +6153,7 @@
         <w:pStyle w:val="ListParagraph"/>
         <w:numPr>
           <w:ilvl w:val="0"/>
-          <w:numId w:val="23"/>
+          <w:numId w:val="24"/>
         </w:numPr>
       </w:pPr>
       <w:r>
@@ -5723,7 +6179,7 @@
         <w:pStyle w:val="ListParagraph"/>
         <w:numPr>
           <w:ilvl w:val="0"/>
-          <w:numId w:val="24"/>
+          <w:numId w:val="25"/>
         </w:numPr>
       </w:pPr>
       <w:r>
@@ -5744,7 +6200,7 @@
         <w:pStyle w:val="ListParagraph"/>
         <w:numPr>
           <w:ilvl w:val="0"/>
-          <w:numId w:val="24"/>
+          <w:numId w:val="25"/>
         </w:numPr>
       </w:pPr>
       <w:r>
@@ -5771,7 +6227,7 @@
         <w:pStyle w:val="ListParagraph"/>
         <w:numPr>
           <w:ilvl w:val="0"/>
-          <w:numId w:val="24"/>
+          <w:numId w:val="25"/>
         </w:numPr>
       </w:pPr>
       <w:r>
@@ -5789,7 +6245,7 @@
         <w:pStyle w:val="ListParagraph"/>
         <w:numPr>
           <w:ilvl w:val="0"/>
-          <w:numId w:val="24"/>
+          <w:numId w:val="25"/>
         </w:numPr>
       </w:pPr>
       <w:r>
@@ -5807,7 +6263,7 @@
         <w:pStyle w:val="ListParagraph"/>
         <w:numPr>
           <w:ilvl w:val="0"/>
-          <w:numId w:val="24"/>
+          <w:numId w:val="25"/>
         </w:numPr>
       </w:pPr>
       <w:r>
@@ -5928,7 +6384,7 @@
         <w:pStyle w:val="ListParagraph"/>
         <w:numPr>
           <w:ilvl w:val="0"/>
-          <w:numId w:val="25"/>
+          <w:numId w:val="26"/>
         </w:numPr>
       </w:pPr>
       <w:r>
@@ -5973,7 +6429,7 @@
         <w:pStyle w:val="ListParagraph"/>
         <w:numPr>
           <w:ilvl w:val="0"/>
-          <w:numId w:val="25"/>
+          <w:numId w:val="26"/>
         </w:numPr>
       </w:pPr>
       <w:r>
@@ -6009,7 +6465,7 @@
         <w:pStyle w:val="ListParagraph"/>
         <w:numPr>
           <w:ilvl w:val="0"/>
-          <w:numId w:val="25"/>
+          <w:numId w:val="26"/>
         </w:numPr>
       </w:pPr>
       <w:r>
@@ -6052,7 +6508,7 @@
         <w:pStyle w:val="ListParagraph"/>
         <w:numPr>
           <w:ilvl w:val="0"/>
-          <w:numId w:val="26"/>
+          <w:numId w:val="27"/>
         </w:numPr>
       </w:pPr>
       <w:r>
@@ -6073,7 +6529,7 @@
         <w:pStyle w:val="ListParagraph"/>
         <w:numPr>
           <w:ilvl w:val="0"/>
-          <w:numId w:val="26"/>
+          <w:numId w:val="27"/>
         </w:numPr>
       </w:pPr>
       <w:r>
@@ -6100,7 +6556,7 @@
         <w:pStyle w:val="ListParagraph"/>
         <w:numPr>
           <w:ilvl w:val="0"/>
-          <w:numId w:val="26"/>
+          <w:numId w:val="27"/>
         </w:numPr>
       </w:pPr>
       <w:r>
@@ -6163,7 +6619,7 @@
         <w:pStyle w:val="ListParagraph"/>
         <w:numPr>
           <w:ilvl w:val="0"/>
-          <w:numId w:val="26"/>
+          <w:numId w:val="27"/>
         </w:numPr>
       </w:pPr>
       <w:r>
@@ -6328,7 +6784,7 @@
         <w:pStyle w:val="ListParagraph"/>
         <w:numPr>
           <w:ilvl w:val="0"/>
-          <w:numId w:val="27"/>
+          <w:numId w:val="28"/>
         </w:numPr>
       </w:pPr>
       <w:r>
@@ -6355,7 +6811,7 @@
         <w:pStyle w:val="ListParagraph"/>
         <w:numPr>
           <w:ilvl w:val="0"/>
-          <w:numId w:val="27"/>
+          <w:numId w:val="28"/>
         </w:numPr>
       </w:pPr>
       <w:r>
@@ -6376,7 +6832,7 @@
         <w:pStyle w:val="ListParagraph"/>
         <w:numPr>
           <w:ilvl w:val="0"/>
-          <w:numId w:val="27"/>
+          <w:numId w:val="28"/>
         </w:numPr>
       </w:pPr>
       <w:r>
@@ -6657,7 +7113,7 @@
         <w:pStyle w:val="ListParagraph"/>
         <w:numPr>
           <w:ilvl w:val="0"/>
-          <w:numId w:val="28"/>
+          <w:numId w:val="29"/>
         </w:numPr>
       </w:pPr>
       <w:r>
@@ -6678,7 +7134,7 @@
         <w:pStyle w:val="ListParagraph"/>
         <w:numPr>
           <w:ilvl w:val="0"/>
-          <w:numId w:val="28"/>
+          <w:numId w:val="29"/>
         </w:numPr>
       </w:pPr>
       <w:r>
@@ -6696,7 +7152,7 @@
         <w:pStyle w:val="ListParagraph"/>
         <w:numPr>
           <w:ilvl w:val="0"/>
-          <w:numId w:val="28"/>
+          <w:numId w:val="29"/>
         </w:numPr>
       </w:pPr>
       <w:r>
@@ -6714,7 +7170,7 @@
         <w:pStyle w:val="ListParagraph"/>
         <w:numPr>
           <w:ilvl w:val="0"/>
-          <w:numId w:val="28"/>
+          <w:numId w:val="29"/>
         </w:numPr>
       </w:pPr>
       <w:r>
@@ -6734,7 +7190,7 @@
         <w:pStyle w:val="ListParagraph"/>
         <w:numPr>
           <w:ilvl w:val="0"/>
-          <w:numId w:val="29"/>
+          <w:numId w:val="30"/>
         </w:numPr>
       </w:pPr>
       <w:r>
@@ -6764,7 +7220,7 @@
         <w:pStyle w:val="ListParagraph"/>
         <w:numPr>
           <w:ilvl w:val="0"/>
-          <w:numId w:val="29"/>
+          <w:numId w:val="30"/>
         </w:numPr>
       </w:pPr>
       <w:r>
@@ -6807,7 +7263,7 @@
         <w:pStyle w:val="ListParagraph"/>
         <w:numPr>
           <w:ilvl w:val="0"/>
-          <w:numId w:val="30"/>
+          <w:numId w:val="31"/>
         </w:numPr>
       </w:pPr>
       <w:r>
@@ -6864,7 +7320,7 @@
         <w:pStyle w:val="ListParagraph"/>
         <w:numPr>
           <w:ilvl w:val="0"/>
-          <w:numId w:val="30"/>
+          <w:numId w:val="31"/>
         </w:numPr>
       </w:pPr>
       <w:r>
@@ -6876,7 +7332,7 @@
         <w:pStyle w:val="ListParagraph"/>
         <w:numPr>
           <w:ilvl w:val="0"/>
-          <w:numId w:val="30"/>
+          <w:numId w:val="31"/>
         </w:numPr>
       </w:pPr>
       <w:r>
@@ -6906,7 +7362,7 @@
         <w:pStyle w:val="ListParagraph"/>
         <w:numPr>
           <w:ilvl w:val="0"/>
-          <w:numId w:val="30"/>
+          <w:numId w:val="31"/>
         </w:numPr>
       </w:pPr>
       <w:r>
@@ -7332,7 +7788,7 @@
         <w:pStyle w:val="ListParagraph"/>
         <w:numPr>
           <w:ilvl w:val="0"/>
-          <w:numId w:val="31"/>
+          <w:numId w:val="32"/>
         </w:numPr>
       </w:pPr>
       <w:r>
@@ -7344,7 +7800,7 @@
         <w:pStyle w:val="ListParagraph"/>
         <w:numPr>
           <w:ilvl w:val="0"/>
-          <w:numId w:val="31"/>
+          <w:numId w:val="32"/>
         </w:numPr>
       </w:pPr>
       <w:r>
@@ -7356,7 +7812,7 @@
         <w:pStyle w:val="ListParagraph"/>
         <w:numPr>
           <w:ilvl w:val="0"/>
-          <w:numId w:val="31"/>
+          <w:numId w:val="32"/>
         </w:numPr>
       </w:pPr>
       <w:r>
@@ -7376,7 +7832,7 @@
         <w:pStyle w:val="ListParagraph"/>
         <w:numPr>
           <w:ilvl w:val="0"/>
-          <w:numId w:val="32"/>
+          <w:numId w:val="33"/>
         </w:numPr>
       </w:pPr>
       <w:r>
@@ -7403,7 +7859,7 @@
         <w:pStyle w:val="ListParagraph"/>
         <w:numPr>
           <w:ilvl w:val="0"/>
-          <w:numId w:val="32"/>
+          <w:numId w:val="33"/>
         </w:numPr>
       </w:pPr>
       <w:r>
@@ -7430,7 +7886,7 @@
         <w:pStyle w:val="ListParagraph"/>
         <w:numPr>
           <w:ilvl w:val="0"/>
-          <w:numId w:val="32"/>
+          <w:numId w:val="33"/>
         </w:numPr>
       </w:pPr>
       <w:r>
@@ -7900,7 +8356,7 @@
         <w:pStyle w:val="ListParagraph"/>
         <w:numPr>
           <w:ilvl w:val="0"/>
-          <w:numId w:val="33"/>
+          <w:numId w:val="34"/>
         </w:numPr>
       </w:pPr>
       <w:r>
@@ -7918,7 +8374,7 @@
         <w:pStyle w:val="ListParagraph"/>
         <w:numPr>
           <w:ilvl w:val="0"/>
-          <w:numId w:val="33"/>
+          <w:numId w:val="34"/>
         </w:numPr>
       </w:pPr>
       <w:r>
@@ -7936,7 +8392,7 @@
         <w:pStyle w:val="ListParagraph"/>
         <w:numPr>
           <w:ilvl w:val="0"/>
-          <w:numId w:val="33"/>
+          <w:numId w:val="34"/>
         </w:numPr>
       </w:pPr>
       <w:r>
@@ -7954,7 +8410,7 @@
         <w:pStyle w:val="ListParagraph"/>
         <w:numPr>
           <w:ilvl w:val="0"/>
-          <w:numId w:val="33"/>
+          <w:numId w:val="34"/>
         </w:numPr>
       </w:pPr>
       <w:r>
@@ -8441,7 +8897,7 @@
         <w:pStyle w:val="ListParagraph"/>
         <w:numPr>
           <w:ilvl w:val="0"/>
-          <w:numId w:val="34"/>
+          <w:numId w:val="35"/>
         </w:numPr>
       </w:pPr>
       <w:r>
@@ -8453,7 +8909,7 @@
         <w:pStyle w:val="ListParagraph"/>
         <w:numPr>
           <w:ilvl w:val="0"/>
-          <w:numId w:val="34"/>
+          <w:numId w:val="35"/>
         </w:numPr>
       </w:pPr>
       <w:r>
@@ -8501,7 +8957,7 @@
         <w:pStyle w:val="ListParagraph"/>
         <w:numPr>
           <w:ilvl w:val="0"/>
-          <w:numId w:val="34"/>
+          <w:numId w:val="35"/>
         </w:numPr>
       </w:pPr>
       <w:r>
@@ -8528,7 +8984,7 @@
         <w:pStyle w:val="ListParagraph"/>
         <w:numPr>
           <w:ilvl w:val="0"/>
-          <w:numId w:val="34"/>
+          <w:numId w:val="35"/>
         </w:numPr>
       </w:pPr>
       <w:r>
@@ -8546,7 +9002,7 @@
         <w:pStyle w:val="ListParagraph"/>
         <w:numPr>
           <w:ilvl w:val="0"/>
-          <w:numId w:val="34"/>
+          <w:numId w:val="35"/>
         </w:numPr>
       </w:pPr>
       <w:r>
@@ -8564,7 +9020,7 @@
         <w:pStyle w:val="ListParagraph"/>
         <w:numPr>
           <w:ilvl w:val="0"/>
-          <w:numId w:val="34"/>
+          <w:numId w:val="35"/>
         </w:numPr>
       </w:pPr>
       <w:r>
@@ -8609,7 +9065,7 @@
         <w:pStyle w:val="ListParagraph"/>
         <w:numPr>
           <w:ilvl w:val="0"/>
-          <w:numId w:val="34"/>
+          <w:numId w:val="35"/>
         </w:numPr>
       </w:pPr>
       <w:r>
@@ -8645,7 +9101,7 @@
         <w:pStyle w:val="ListParagraph"/>
         <w:numPr>
           <w:ilvl w:val="0"/>
-          <w:numId w:val="34"/>
+          <w:numId w:val="35"/>
         </w:numPr>
       </w:pPr>
       <w:r>
@@ -8894,7 +9350,7 @@
         <w:pStyle w:val="ListParagraph"/>
         <w:numPr>
           <w:ilvl w:val="0"/>
-          <w:numId w:val="35"/>
+          <w:numId w:val="36"/>
         </w:numPr>
       </w:pPr>
       <w:r>
@@ -8930,7 +9386,7 @@
         <w:pStyle w:val="ListParagraph"/>
         <w:numPr>
           <w:ilvl w:val="0"/>
-          <w:numId w:val="35"/>
+          <w:numId w:val="36"/>
         </w:numPr>
       </w:pPr>
       <w:r>
@@ -8975,7 +9431,7 @@
         <w:pStyle w:val="ListParagraph"/>
         <w:numPr>
           <w:ilvl w:val="0"/>
-          <w:numId w:val="35"/>
+          <w:numId w:val="36"/>
         </w:numPr>
       </w:pPr>
       <w:r>
@@ -9001,7 +9457,7 @@
         <w:pStyle w:val="ListParagraph"/>
         <w:numPr>
           <w:ilvl w:val="0"/>
-          <w:numId w:val="36"/>
+          <w:numId w:val="37"/>
         </w:numPr>
       </w:pPr>
       <w:r>
@@ -9028,7 +9484,7 @@
         <w:pStyle w:val="ListParagraph"/>
         <w:numPr>
           <w:ilvl w:val="0"/>
-          <w:numId w:val="36"/>
+          <w:numId w:val="37"/>
         </w:numPr>
       </w:pPr>
       <w:r>
@@ -9049,7 +9505,7 @@
         <w:pStyle w:val="ListParagraph"/>
         <w:numPr>
           <w:ilvl w:val="0"/>
-          <w:numId w:val="36"/>
+          <w:numId w:val="37"/>
         </w:numPr>
       </w:pPr>
       <w:r>
@@ -9090,7 +9546,7 @@
         <w:pStyle w:val="ListParagraph"/>
         <w:numPr>
           <w:ilvl w:val="0"/>
-          <w:numId w:val="37"/>
+          <w:numId w:val="38"/>
         </w:numPr>
       </w:pPr>
       <w:r>
@@ -9135,7 +9591,7 @@
         <w:pStyle w:val="ListParagraph"/>
         <w:numPr>
           <w:ilvl w:val="0"/>
-          <w:numId w:val="37"/>
+          <w:numId w:val="38"/>
         </w:numPr>
       </w:pPr>
       <w:r>
@@ -9171,7 +9627,7 @@
         <w:pStyle w:val="ListParagraph"/>
         <w:numPr>
           <w:ilvl w:val="0"/>
-          <w:numId w:val="37"/>
+          <w:numId w:val="38"/>
         </w:numPr>
       </w:pPr>
       <w:r>
@@ -9198,7 +9654,7 @@
         <w:pStyle w:val="ListParagraph"/>
         <w:numPr>
           <w:ilvl w:val="0"/>
-          <w:numId w:val="37"/>
+          <w:numId w:val="38"/>
         </w:numPr>
       </w:pPr>
       <w:r>
@@ -9513,7 +9969,7 @@
         <w:pStyle w:val="ListParagraph"/>
         <w:numPr>
           <w:ilvl w:val="0"/>
-          <w:numId w:val="38"/>
+          <w:numId w:val="39"/>
         </w:numPr>
       </w:pPr>
       <w:r>
@@ -9588,7 +10044,7 @@
         <w:pStyle w:val="ListParagraph"/>
         <w:numPr>
           <w:ilvl w:val="0"/>
-          <w:numId w:val="38"/>
+          <w:numId w:val="39"/>
         </w:numPr>
       </w:pPr>
       <w:r>
@@ -9618,7 +10074,7 @@
         <w:pStyle w:val="ListParagraph"/>
         <w:numPr>
           <w:ilvl w:val="0"/>
-          <w:numId w:val="38"/>
+          <w:numId w:val="39"/>
         </w:numPr>
       </w:pPr>
       <w:r>
@@ -9644,7 +10100,7 @@
         <w:pStyle w:val="ListParagraph"/>
         <w:numPr>
           <w:ilvl w:val="0"/>
-          <w:numId w:val="39"/>
+          <w:numId w:val="40"/>
         </w:numPr>
       </w:pPr>
       <w:r>
@@ -9674,7 +10130,7 @@
         <w:pStyle w:val="ListParagraph"/>
         <w:numPr>
           <w:ilvl w:val="0"/>
-          <w:numId w:val="39"/>
+          <w:numId w:val="40"/>
         </w:numPr>
       </w:pPr>
       <w:r>
@@ -9695,7 +10151,7 @@
         <w:pStyle w:val="ListParagraph"/>
         <w:numPr>
           <w:ilvl w:val="0"/>
-          <w:numId w:val="39"/>
+          <w:numId w:val="40"/>
         </w:numPr>
       </w:pPr>
       <w:r>
@@ -9725,7 +10181,7 @@
         <w:pStyle w:val="ListParagraph"/>
         <w:numPr>
           <w:ilvl w:val="0"/>
-          <w:numId w:val="40"/>
+          <w:numId w:val="41"/>
         </w:numPr>
       </w:pPr>
       <w:r>
@@ -9737,7 +10193,7 @@
         <w:pStyle w:val="ListParagraph"/>
         <w:numPr>
           <w:ilvl w:val="0"/>
-          <w:numId w:val="40"/>
+          <w:numId w:val="41"/>
         </w:numPr>
       </w:pPr>
       <w:r>
@@ -9781,7 +10237,7 @@
         <w:pStyle w:val="ListParagraph"/>
         <w:numPr>
           <w:ilvl w:val="0"/>
-          <w:numId w:val="41"/>
+          <w:numId w:val="42"/>
         </w:numPr>
       </w:pPr>
       <w:r>
@@ -9829,7 +10285,7 @@
         <w:pStyle w:val="ListParagraph"/>
         <w:numPr>
           <w:ilvl w:val="0"/>
-          <w:numId w:val="41"/>
+          <w:numId w:val="42"/>
         </w:numPr>
       </w:pPr>
       <w:r>
@@ -9841,7 +10297,7 @@
         <w:pStyle w:val="ListParagraph"/>
         <w:numPr>
           <w:ilvl w:val="0"/>
-          <w:numId w:val="41"/>
+          <w:numId w:val="42"/>
         </w:numPr>
       </w:pPr>
       <w:r>
@@ -9859,7 +10315,7 @@
         <w:pStyle w:val="ListParagraph"/>
         <w:numPr>
           <w:ilvl w:val="0"/>
-          <w:numId w:val="41"/>
+          <w:numId w:val="42"/>
         </w:numPr>
       </w:pPr>
       <w:r>
@@ -9871,7 +10327,7 @@
         <w:pStyle w:val="ListParagraph"/>
         <w:numPr>
           <w:ilvl w:val="0"/>
-          <w:numId w:val="41"/>
+          <w:numId w:val="42"/>
         </w:numPr>
       </w:pPr>
       <w:r>
@@ -9883,7 +10339,7 @@
         <w:pStyle w:val="ListParagraph"/>
         <w:numPr>
           <w:ilvl w:val="0"/>
-          <w:numId w:val="41"/>
+          <w:numId w:val="42"/>
         </w:numPr>
       </w:pPr>
       <w:r>
@@ -9895,7 +10351,7 @@
         <w:pStyle w:val="ListParagraph"/>
         <w:numPr>
           <w:ilvl w:val="0"/>
-          <w:numId w:val="41"/>
+          <w:numId w:val="42"/>
         </w:numPr>
       </w:pPr>
       <w:r>
@@ -10169,7 +10625,7 @@
         <w:pStyle w:val="ListParagraph"/>
         <w:numPr>
           <w:ilvl w:val="0"/>
-          <w:numId w:val="42"/>
+          <w:numId w:val="43"/>
         </w:numPr>
       </w:pPr>
       <w:r>
@@ -10181,7 +10637,7 @@
         <w:pStyle w:val="ListParagraph"/>
         <w:numPr>
           <w:ilvl w:val="0"/>
-          <w:numId w:val="42"/>
+          <w:numId w:val="43"/>
         </w:numPr>
       </w:pPr>
       <w:r>
@@ -10193,7 +10649,7 @@
         <w:pStyle w:val="ListParagraph"/>
         <w:numPr>
           <w:ilvl w:val="0"/>
-          <w:numId w:val="42"/>
+          <w:numId w:val="43"/>
         </w:numPr>
       </w:pPr>
       <w:r>
@@ -10467,7 +10923,7 @@
         <w:pStyle w:val="ListParagraph"/>
         <w:numPr>
           <w:ilvl w:val="0"/>
-          <w:numId w:val="43"/>
+          <w:numId w:val="44"/>
         </w:numPr>
       </w:pPr>
       <w:r>
@@ -10479,7 +10935,7 @@
         <w:pStyle w:val="ListParagraph"/>
         <w:numPr>
           <w:ilvl w:val="0"/>
-          <w:numId w:val="43"/>
+          <w:numId w:val="44"/>
         </w:numPr>
       </w:pPr>
       <w:r>
@@ -10491,7 +10947,7 @@
         <w:pStyle w:val="ListParagraph"/>
         <w:numPr>
           <w:ilvl w:val="0"/>
-          <w:numId w:val="43"/>
+          <w:numId w:val="44"/>
         </w:numPr>
       </w:pPr>
       <w:r>
@@ -10534,7 +10990,7 @@
         <w:pStyle w:val="ListParagraph"/>
         <w:numPr>
           <w:ilvl w:val="0"/>
-          <w:numId w:val="44"/>
+          <w:numId w:val="45"/>
         </w:numPr>
       </w:pPr>
       <w:r>
@@ -10591,7 +11047,7 @@
         <w:pStyle w:val="ListParagraph"/>
         <w:numPr>
           <w:ilvl w:val="0"/>
-          <w:numId w:val="44"/>
+          <w:numId w:val="45"/>
         </w:numPr>
       </w:pPr>
       <w:r>
@@ -10621,7 +11077,7 @@
         <w:pStyle w:val="ListParagraph"/>
         <w:numPr>
           <w:ilvl w:val="0"/>
-          <w:numId w:val="44"/>
+          <w:numId w:val="45"/>
         </w:numPr>
       </w:pPr>
       <w:r>
@@ -10659,7 +11115,7 @@
         <w:pStyle w:val="ListParagraph"/>
         <w:numPr>
           <w:ilvl w:val="0"/>
-          <w:numId w:val="45"/>
+          <w:numId w:val="46"/>
         </w:numPr>
       </w:pPr>
       <w:r>
@@ -10680,7 +11136,7 @@
         <w:pStyle w:val="ListParagraph"/>
         <w:numPr>
           <w:ilvl w:val="0"/>
-          <w:numId w:val="45"/>
+          <w:numId w:val="46"/>
         </w:numPr>
       </w:pPr>
       <w:r>
@@ -10725,7 +11181,7 @@
         <w:pStyle w:val="ListParagraph"/>
         <w:numPr>
           <w:ilvl w:val="0"/>
-          <w:numId w:val="45"/>
+          <w:numId w:val="46"/>
         </w:numPr>
       </w:pPr>
       <w:r>
@@ -10824,7 +11280,7 @@
         <w:pStyle w:val="ListParagraph"/>
         <w:numPr>
           <w:ilvl w:val="0"/>
-          <w:numId w:val="45"/>
+          <w:numId w:val="46"/>
         </w:numPr>
       </w:pPr>
       <w:r>
@@ -10869,7 +11325,7 @@
         <w:pStyle w:val="ListParagraph"/>
         <w:numPr>
           <w:ilvl w:val="0"/>
-          <w:numId w:val="45"/>
+          <w:numId w:val="46"/>
         </w:numPr>
       </w:pPr>
       <w:r>
@@ -11226,7 +11682,7 @@
         <w:pStyle w:val="ListParagraph"/>
         <w:numPr>
           <w:ilvl w:val="0"/>
-          <w:numId w:val="46"/>
+          <w:numId w:val="47"/>
         </w:numPr>
       </w:pPr>
       <w:r>
@@ -11247,7 +11703,7 @@
         <w:pStyle w:val="ListParagraph"/>
         <w:numPr>
           <w:ilvl w:val="0"/>
-          <w:numId w:val="46"/>
+          <w:numId w:val="47"/>
         </w:numPr>
       </w:pPr>
       <w:r>
@@ -11283,7 +11739,7 @@
         <w:pStyle w:val="ListParagraph"/>
         <w:numPr>
           <w:ilvl w:val="0"/>
-          <w:numId w:val="46"/>
+          <w:numId w:val="47"/>
         </w:numPr>
       </w:pPr>
       <w:r>
@@ -11319,7 +11775,7 @@
         <w:pStyle w:val="ListParagraph"/>
         <w:numPr>
           <w:ilvl w:val="0"/>
-          <w:numId w:val="46"/>
+          <w:numId w:val="47"/>
         </w:numPr>
       </w:pPr>
       <w:r>
@@ -11348,7 +11804,7 @@
         <w:pStyle w:val="ListParagraph"/>
         <w:numPr>
           <w:ilvl w:val="0"/>
-          <w:numId w:val="47"/>
+          <w:numId w:val="48"/>
         </w:numPr>
       </w:pPr>
       <w:r>
@@ -11369,7 +11825,7 @@
         <w:pStyle w:val="ListParagraph"/>
         <w:numPr>
           <w:ilvl w:val="0"/>
-          <w:numId w:val="47"/>
+          <w:numId w:val="48"/>
         </w:numPr>
       </w:pPr>
       <w:r>
@@ -11590,7 +12046,7 @@
         <w:pStyle w:val="ListParagraph"/>
         <w:numPr>
           <w:ilvl w:val="0"/>
-          <w:numId w:val="48"/>
+          <w:numId w:val="49"/>
         </w:numPr>
       </w:pPr>
       <w:r>
@@ -11653,7 +12109,7 @@
         <w:pStyle w:val="ListParagraph"/>
         <w:numPr>
           <w:ilvl w:val="0"/>
-          <w:numId w:val="48"/>
+          <w:numId w:val="49"/>
         </w:numPr>
       </w:pPr>
       <w:r>
@@ -11683,7 +12139,7 @@
         <w:pStyle w:val="ListParagraph"/>
         <w:numPr>
           <w:ilvl w:val="0"/>
-          <w:numId w:val="48"/>
+          <w:numId w:val="49"/>
         </w:numPr>
       </w:pPr>
       <w:r>
@@ -11704,7 +12160,7 @@
         <w:pStyle w:val="ListParagraph"/>
         <w:numPr>
           <w:ilvl w:val="0"/>
-          <w:numId w:val="48"/>
+          <w:numId w:val="49"/>
         </w:numPr>
       </w:pPr>
       <w:r>
@@ -11740,7 +12196,7 @@
         <w:pStyle w:val="ListParagraph"/>
         <w:numPr>
           <w:ilvl w:val="0"/>
-          <w:numId w:val="48"/>
+          <w:numId w:val="49"/>
         </w:numPr>
       </w:pPr>
       <w:r>
@@ -11758,7 +12214,7 @@
         <w:pStyle w:val="ListParagraph"/>
         <w:numPr>
           <w:ilvl w:val="0"/>
-          <w:numId w:val="48"/>
+          <w:numId w:val="49"/>
         </w:numPr>
       </w:pPr>
       <w:r>
@@ -11802,7 +12258,7 @@
         <w:pStyle w:val="ListParagraph"/>
         <w:numPr>
           <w:ilvl w:val="0"/>
-          <w:numId w:val="49"/>
+          <w:numId w:val="50"/>
         </w:numPr>
       </w:pPr>
       <w:r>
@@ -11883,7 +12339,7 @@
         <w:pStyle w:val="ListParagraph"/>
         <w:numPr>
           <w:ilvl w:val="0"/>
-          <w:numId w:val="49"/>
+          <w:numId w:val="50"/>
         </w:numPr>
       </w:pPr>
       <w:r>
@@ -11901,7 +12357,7 @@
         <w:pStyle w:val="ListParagraph"/>
         <w:numPr>
           <w:ilvl w:val="0"/>
-          <w:numId w:val="49"/>
+          <w:numId w:val="50"/>
         </w:numPr>
       </w:pPr>
       <w:r>
@@ -11922,7 +12378,7 @@
         <w:pStyle w:val="ListParagraph"/>
         <w:numPr>
           <w:ilvl w:val="0"/>
-          <w:numId w:val="49"/>
+          <w:numId w:val="50"/>
         </w:numPr>
       </w:pPr>
       <w:r>
@@ -11948,7 +12404,7 @@
         <w:pStyle w:val="ListParagraph"/>
         <w:numPr>
           <w:ilvl w:val="0"/>
-          <w:numId w:val="50"/>
+          <w:numId w:val="51"/>
         </w:numPr>
       </w:pPr>
       <w:r>
@@ -12011,7 +12467,7 @@
         <w:pStyle w:val="ListParagraph"/>
         <w:numPr>
           <w:ilvl w:val="0"/>
-          <w:numId w:val="50"/>
+          <w:numId w:val="51"/>
         </w:numPr>
       </w:pPr>
       <w:r>
@@ -12038,7 +12494,7 @@
         <w:pStyle w:val="ListParagraph"/>
         <w:numPr>
           <w:ilvl w:val="0"/>
-          <w:numId w:val="50"/>
+          <w:numId w:val="51"/>
         </w:numPr>
       </w:pPr>
       <w:r>
@@ -12056,7 +12512,7 @@
         <w:pStyle w:val="ListParagraph"/>
         <w:numPr>
           <w:ilvl w:val="0"/>
-          <w:numId w:val="50"/>
+          <w:numId w:val="51"/>
         </w:numPr>
       </w:pPr>
       <w:r>
@@ -12627,6 +13083,30 @@
           </w:p>
         </w:tc>
       </w:tr>
+      <w:tr>
+        <w:tc>
+          <w:tcPr>
+            <w:tcW w:w="4680" w:type="dxa"/>
+          </w:tcPr>
+          <w:p>
+            <w:pPr/>
+            <w:r>
+              <w:t xml:space="preserve">There is no Delete for a message or a chat</w:t>
+            </w:r>
+          </w:p>
+        </w:tc>
+        <w:tc>
+          <w:tcPr>
+            <w:tcW w:w="4680" w:type="dxa"/>
+          </w:tcPr>
+          <w:p>
+            <w:pPr/>
+            <w:r>
+              <w:t xml:space="preserve">Only the sender deletes a message. A group is deleted by its admins, a project channel or topic by the project's admins</w:t>
+            </w:r>
+          </w:p>
+        </w:tc>
+      </w:tr>
     </w:tbl>
     <w:p>
       <w:pPr/>
@@ -12663,7 +13143,7 @@
         <w:pStyle w:val="ListParagraph"/>
         <w:numPr>
           <w:ilvl w:val="0"/>
-          <w:numId w:val="51"/>
+          <w:numId w:val="52"/>
         </w:numPr>
       </w:pPr>
       <w:r>
@@ -12681,7 +13161,7 @@
         <w:pStyle w:val="ListParagraph"/>
         <w:numPr>
           <w:ilvl w:val="0"/>
-          <w:numId w:val="51"/>
+          <w:numId w:val="52"/>
         </w:numPr>
       </w:pPr>
       <w:r>
@@ -12699,7 +13179,7 @@
         <w:pStyle w:val="ListParagraph"/>
         <w:numPr>
           <w:ilvl w:val="0"/>
-          <w:numId w:val="51"/>
+          <w:numId w:val="52"/>
         </w:numPr>
       </w:pPr>
       <w:r>
@@ -12717,7 +13197,7 @@
         <w:pStyle w:val="ListParagraph"/>
         <w:numPr>
           <w:ilvl w:val="0"/>
-          <w:numId w:val="51"/>
+          <w:numId w:val="52"/>
         </w:numPr>
       </w:pPr>
       <w:r>
@@ -12735,7 +13215,7 @@
         <w:pStyle w:val="ListParagraph"/>
         <w:numPr>
           <w:ilvl w:val="0"/>
-          <w:numId w:val="51"/>
+          <w:numId w:val="52"/>
         </w:numPr>
       </w:pPr>
       <w:r>
@@ -12753,7 +13233,7 @@
         <w:pStyle w:val="ListParagraph"/>
         <w:numPr>
           <w:ilvl w:val="0"/>
-          <w:numId w:val="51"/>
+          <w:numId w:val="52"/>
         </w:numPr>
       </w:pPr>
       <w:r>
@@ -13796,6 +14276,41 @@
           </w:p>
         </w:tc>
       </w:tr>
+      <w:tr>
+        <w:tc>
+          <w:tcPr>
+            <w:tcW w:w="3120" w:type="dxa"/>
+          </w:tcPr>
+          <w:p>
+            <w:pPr/>
+            <w:r>
+              <w:t xml:space="preserve">Messenger</w:t>
+            </w:r>
+          </w:p>
+        </w:tc>
+        <w:tc>
+          <w:tcPr>
+            <w:tcW w:w="3120" w:type="dxa"/>
+          </w:tcPr>
+          <w:p>
+            <w:pPr/>
+            <w:r>
+              <w:t xml:space="preserve">Ctrl+B / Ctrl+I / Ctrl+Shift+X</w:t>
+            </w:r>
+          </w:p>
+        </w:tc>
+        <w:tc>
+          <w:tcPr>
+            <w:tcW w:w="3120" w:type="dxa"/>
+          </w:tcPr>
+          <w:p>
+            <w:pPr/>
+            <w:r>
+              <w:t xml:space="preserve">Bold / italic / strikethrough</w:t>
+            </w:r>
+          </w:p>
+        </w:tc>
+      </w:tr>
     </w:tbl>
     <w:p>
       <w:pPr>
@@ -13816,7 +14331,7 @@
         <w:pStyle w:val="ListParagraph"/>
         <w:numPr>
           <w:ilvl w:val="0"/>
-          <w:numId w:val="52"/>
+          <w:numId w:val="53"/>
         </w:numPr>
       </w:pPr>
       <w:r>
@@ -13828,7 +14343,7 @@
         <w:pStyle w:val="ListParagraph"/>
         <w:numPr>
           <w:ilvl w:val="0"/>
-          <w:numId w:val="52"/>
+          <w:numId w:val="53"/>
         </w:numPr>
       </w:pPr>
       <w:r>
@@ -13840,7 +14355,7 @@
         <w:pStyle w:val="ListParagraph"/>
         <w:numPr>
           <w:ilvl w:val="0"/>
-          <w:numId w:val="52"/>
+          <w:numId w:val="53"/>
         </w:numPr>
       </w:pPr>
       <w:r>
@@ -13852,7 +14367,7 @@
         <w:pStyle w:val="ListParagraph"/>
         <w:numPr>
           <w:ilvl w:val="0"/>
-          <w:numId w:val="52"/>
+          <w:numId w:val="53"/>
         </w:numPr>
       </w:pPr>
       <w:r>
@@ -13864,7 +14379,7 @@
         <w:pStyle w:val="ListParagraph"/>
         <w:numPr>
           <w:ilvl w:val="0"/>
-          <w:numId w:val="52"/>
+          <w:numId w:val="53"/>
         </w:numPr>
       </w:pPr>
       <w:r>
@@ -13885,7 +14400,7 @@
         <w:pStyle w:val="ListParagraph"/>
         <w:numPr>
           <w:ilvl w:val="0"/>
-          <w:numId w:val="52"/>
+          <w:numId w:val="53"/>
         </w:numPr>
       </w:pPr>
       <w:r>
@@ -13897,7 +14412,7 @@
         <w:pStyle w:val="ListParagraph"/>
         <w:numPr>
           <w:ilvl w:val="0"/>
-          <w:numId w:val="52"/>
+          <w:numId w:val="53"/>
         </w:numPr>
       </w:pPr>
       <w:r>
@@ -13918,7 +14433,7 @@
         <w:pStyle w:val="ListParagraph"/>
         <w:numPr>
           <w:ilvl w:val="0"/>
-          <w:numId w:val="52"/>
+          <w:numId w:val="53"/>
         </w:numPr>
       </w:pPr>
       <w:r>
@@ -13930,7 +14445,7 @@
         <w:pStyle w:val="ListParagraph"/>
         <w:numPr>
           <w:ilvl w:val="0"/>
-          <w:numId w:val="52"/>
+          <w:numId w:val="53"/>
         </w:numPr>
       </w:pPr>
       <w:r>
@@ -13942,7 +14457,7 @@
         <w:pStyle w:val="ListParagraph"/>
         <w:numPr>
           <w:ilvl w:val="0"/>
-          <w:numId w:val="52"/>
+          <w:numId w:val="53"/>
         </w:numPr>
       </w:pPr>
       <w:r>
@@ -13954,7 +14469,19 @@
         <w:pStyle w:val="ListParagraph"/>
         <w:numPr>
           <w:ilvl w:val="0"/>
-          <w:numId w:val="52"/>
+          <w:numId w:val="53"/>
+        </w:numPr>
+      </w:pPr>
+      <w:r>
+        <w:t xml:space="preserve">☐ Open a topic in your project channel, pin a message, and send a poll and an event</w:t>
+      </w:r>
+    </w:p>
+    <w:p>
+      <w:pPr>
+        <w:pStyle w:val="ListParagraph"/>
+        <w:numPr>
+          <w:ilvl w:val="0"/>
+          <w:numId w:val="53"/>
         </w:numPr>
       </w:pPr>
       <w:r>
@@ -13966,7 +14493,7 @@
         <w:pStyle w:val="ListParagraph"/>
         <w:numPr>
           <w:ilvl w:val="0"/>
-          <w:numId w:val="52"/>
+          <w:numId w:val="53"/>
         </w:numPr>
       </w:pPr>
       <w:r>
@@ -13978,7 +14505,7 @@
         <w:pStyle w:val="ListParagraph"/>
         <w:numPr>
           <w:ilvl w:val="0"/>
-          <w:numId w:val="52"/>
+          <w:numId w:val="53"/>
         </w:numPr>
       </w:pPr>
       <w:r>
@@ -14257,10 +14784,10 @@
     <w:abstractNumId w:val="0"/>
   </w:num>
   <w:num w:numId="30">
-    <w:abstractNumId w:val="1"/>
+    <w:abstractNumId w:val="0"/>
   </w:num>
   <w:num w:numId="31">
-    <w:abstractNumId w:val="0"/>
+    <w:abstractNumId w:val="1"/>
   </w:num>
   <w:num w:numId="32">
     <w:abstractNumId w:val="0"/>
@@ -14284,10 +14811,10 @@
     <w:abstractNumId w:val="0"/>
   </w:num>
   <w:num w:numId="39">
-    <w:abstractNumId w:val="1"/>
+    <w:abstractNumId w:val="0"/>
   </w:num>
   <w:num w:numId="40">
-    <w:abstractNumId w:val="0"/>
+    <w:abstractNumId w:val="1"/>
   </w:num>
   <w:num w:numId="41">
     <w:abstractNumId w:val="0"/>
@@ -14302,10 +14829,10 @@
     <w:abstractNumId w:val="0"/>
   </w:num>
   <w:num w:numId="45">
-    <w:abstractNumId w:val="1"/>
+    <w:abstractNumId w:val="0"/>
   </w:num>
   <w:num w:numId="46">
-    <w:abstractNumId w:val="0"/>
+    <w:abstractNumId w:val="1"/>
   </w:num>
   <w:num w:numId="47">
     <w:abstractNumId w:val="0"/>
@@ -14323,6 +14850,9 @@
     <w:abstractNumId w:val="0"/>
   </w:num>
   <w:num w:numId="52">
+    <w:abstractNumId w:val="0"/>
+  </w:num>
+  <w:num w:numId="53">
     <w:abstractNumId w:val="0"/>
   </w:num>
 </w:numbering>

</xml_diff>

<commit_message>
Messenger: Lark-style message box that shows formatting; phone fixes
- The message box shows bold, italic, underline, lists, quotes, links and
  code as they will be sent (richbox.js), instead of the marks; it still
  stores the WhatsApp way of writing. Picked tasks, issues, sheets and 3D
  views sit in it as chips. The edit box of a sent message is the same.
- Lark layout: the box on top, the buttons under it (Aa, emoji, @, #,
  paper clip, +, bigger box, Send). On a phone the format buttons get
  their own row and Send always stays on screen.
- Underline (++text++) and links made with the link button.
- Poll card: a drawn icon and drawn tick boxes.
- Dashboard (and Board) on a phone: the project drop-down no longer
  squeezes the page tabs away.
- Task comments on the Tasks page show the formatting too.

Co-Authored-By: Claude Opus 5.5 <noreply@anthropic.com>
Claude-Session: https://claude.ai/code/session_01HMFznQ3NqvEPBkq88avjvR
</commit_message>
<xml_diff>
--- a/docs/manual/LWK_Viewer_User_Manual_EN.docx
+++ b/docs/manual/LWK_Viewer_User_Manual_EN.docx
@@ -3764,7 +3764,16 @@
         <w:t xml:space="preserve">Formatting (Aa):</w:t>
       </w:r>
       <w:r>
-        <w:t xml:space="preserve"> the bar above the box has </w:t>
+        <w:t xml:space="preserve"> the box shows the words as they will be sent, as in Lark. </w:t>
+      </w:r>
+      <w:r>
+        <w:rPr>
+          <w:b/>
+        </w:rPr>
+        <w:t xml:space="preserve">Aa</w:t>
+      </w:r>
+      <w:r>
+        <w:t xml:space="preserve"> shows the format buttons: </w:t>
       </w:r>
       <w:r>
         <w:rPr>
@@ -3779,6 +3788,15 @@
         <w:rPr>
           <w:b/>
         </w:rPr>
+        <w:t xml:space="preserve">S</w:t>
+      </w:r>
+      <w:r>
+        <w:t xml:space="preserve">, </w:t>
+      </w:r>
+      <w:r>
+        <w:rPr>
+          <w:b/>
+        </w:rPr>
         <w:t xml:space="preserve">I</w:t>
       </w:r>
       <w:r>
@@ -3788,10 +3806,10 @@
         <w:rPr>
           <w:b/>
         </w:rPr>
-        <w:t xml:space="preserve">S</w:t>
-      </w:r>
-      <w:r>
-        <w:t xml:space="preserve">, code, bullet and numbered lists, quote and code block; </w:t>
+        <w:t xml:space="preserve">U</w:t>
+      </w:r>
+      <w:r>
+        <w:t xml:space="preserve">, numbered and bulleted lists, quote, link, code and block of code; </w:t>
       </w:r>
       <w:r>
         <w:rPr>
@@ -3809,6 +3827,15 @@
         <w:t xml:space="preserve">Ctrl+I</w:t>
       </w:r>
       <w:r>
+        <w:t xml:space="preserve">, </w:t>
+      </w:r>
+      <w:r>
+        <w:rPr>
+          <w:b/>
+        </w:rPr>
+        <w:t xml:space="preserve">Ctrl+U</w:t>
+      </w:r>
+      <w:r>
         <w:t xml:space="preserve"> and </w:t>
       </w:r>
       <w:r>
@@ -3818,7 +3845,79 @@
         <w:t xml:space="preserve">Ctrl+Shift+X</w:t>
       </w:r>
       <w:r>
-        <w:t xml:space="preserve"> work on the selection. It is written the WhatsApp way (*bold*, _italic_, ~strike~), so forwarded messages look the same in WhatsApp. Enter on a list line starts the next item.</w:t>
+        <w:t xml:space="preserve"> work on the selection. On a phone they appear in their own row after </w:t>
+      </w:r>
+      <w:r>
+        <w:rPr>
+          <w:b/>
+        </w:rPr>
+        <w:t xml:space="preserve">Aa</w:t>
+      </w:r>
+      <w:r>
+        <w:t xml:space="preserve">. Forwarded to WhatsApp, a message keeps its bold, italic and strikethrough.</w:t>
+      </w:r>
+    </w:p>
+    <w:p>
+      <w:pPr>
+        <w:pStyle w:val="ListParagraph"/>
+        <w:numPr>
+          <w:ilvl w:val="0"/>
+          <w:numId w:val="15"/>
+        </w:numPr>
+      </w:pPr>
+      <w:r>
+        <w:rPr>
+          <w:b/>
+        </w:rPr>
+        <w:t xml:space="preserve">The buttons under the box:</w:t>
+      </w:r>
+      <w:r>
+        <w:t xml:space="preserve"> </w:t>
+      </w:r>
+      <w:r>
+        <w:rPr>
+          <w:b/>
+        </w:rPr>
+        <w:t xml:space="preserve">Aa</w:t>
+      </w:r>
+      <w:r>
+        <w:t xml:space="preserve">, 🙂 emoji, </w:t>
+      </w:r>
+      <w:r>
+        <w:rPr>
+          <w:b/>
+        </w:rPr>
+        <w:t xml:space="preserve">@</w:t>
+      </w:r>
+      <w:r>
+        <w:t xml:space="preserve"> a person, </w:t>
+      </w:r>
+      <w:r>
+        <w:rPr>
+          <w:b/>
+        </w:rPr>
+        <w:t xml:space="preserve">#</w:t>
+      </w:r>
+      <w:r>
+        <w:t xml:space="preserve"> a task, issue, sheet or 3D view (it shows in the box as a chip), the paper clip, </w:t>
+      </w:r>
+      <w:r>
+        <w:rPr>
+          <w:b/>
+        </w:rPr>
+        <w:t xml:space="preserve">+</w:t>
+      </w:r>
+      <w:r>
+        <w:t xml:space="preserve"> and </w:t>
+      </w:r>
+      <w:r>
+        <w:rPr>
+          <w:b/>
+        </w:rPr>
+        <w:t xml:space="preserve">Send</w:t>
+      </w:r>
+      <w:r>
+        <w:t xml:space="preserve">, which is always on screen, on a phone too.</w:t>
       </w:r>
     </w:p>
     <w:p>

</xml_diff>

<commit_message>
Manuals rebuilt (EN and Cantonese)
Co-Authored-By: Claude Opus 5.5 <noreply@anthropic.com>
Claude-Session: https://claude.ai/code/session_01HMFznQ3NqvEPBkq88avjvR
</commit_message>
<xml_diff>
--- a/docs/manual/LWK_Viewer_User_Manual_EN.docx
+++ b/docs/manual/LWK_Viewer_User_Manual_EN.docx
@@ -2621,8 +2621,35 @@
         <w:t xml:space="preserve">Kanban:</w:t>
       </w:r>
       <w:r>
-        <w:t xml:space="preserve"> cards in columns; drag a card to another column. </w:t>
-      </w:r>
+        <w:t xml:space="preserve"> cards in columns; drag a card to another column. The board fills the window, so the sideways scroll bar is always at the bottom of the screen; </w:t>
+      </w:r>
+      <w:r>
+        <w:rPr>
+          <w:b/>
+        </w:rPr>
+        <w:t xml:space="preserve">Shift + mouse wheel</w:t>
+      </w:r>
+      <w:r>
+        <w:t xml:space="preserve">, dragging an empty part of the board, or the </w:t>
+      </w:r>
+      <w:r>
+        <w:rPr>
+          <w:b/>
+        </w:rPr>
+        <w:t xml:space="preserve">‹ ›</w:t>
+      </w:r>
+      <w:r>
+        <w:t xml:space="preserve"> buttons at its edges also scroll it.</w:t>
+      </w:r>
+    </w:p>
+    <w:p>
+      <w:pPr>
+        <w:pStyle w:val="ListParagraph"/>
+        <w:numPr>
+          <w:ilvl w:val="0"/>
+          <w:numId w:val="10"/>
+        </w:numPr>
+      </w:pPr>
       <w:r>
         <w:rPr>
           <w:b/>
@@ -2630,7 +2657,43 @@
         <w:t xml:space="preserve">Gantt:</w:t>
       </w:r>
       <w:r>
-        <w:t xml:space="preserve"> bars on a timeline; drag a bar, or drag its ends to change the dates. The legend explains the colours; milestones are gold.</w:t>
+        <w:t xml:space="preserve"> bars on a timeline; drag a bar, or drag its ends to change the dates. Each change asks </w:t>
+      </w:r>
+      <w:r>
+        <w:rPr>
+          <w:b/>
+        </w:rPr>
+        <w:t xml:space="preserve">Change the dates?</w:t>
+      </w:r>
+      <w:r>
+        <w:t xml:space="preserve"> first: </w:t>
+      </w:r>
+      <w:r>
+        <w:rPr>
+          <w:b/>
+        </w:rPr>
+        <w:t xml:space="preserve">Save</w:t>
+      </w:r>
+      <w:r>
+        <w:t xml:space="preserve"> keeps it, </w:t>
+      </w:r>
+      <w:r>
+        <w:rPr>
+          <w:b/>
+        </w:rPr>
+        <w:t xml:space="preserve">Cancel</w:t>
+      </w:r>
+      <w:r>
+        <w:t xml:space="preserve"> puts the bar back (tick </w:t>
+      </w:r>
+      <w:r>
+        <w:rPr>
+          <w:b/>
+        </w:rPr>
+        <w:t xml:space="preserve">Don't ask again today</w:t>
+      </w:r>
+      <w:r>
+        <w:t xml:space="preserve"> to skip the question on this device). The legend explains the colours; milestones are gold.</w:t>
       </w:r>
     </w:p>
     <w:p>
@@ -2815,7 +2878,25 @@
         <w:t xml:space="preserve">+ Add sub-task</w:t>
       </w:r>
       <w:r>
-        <w:t xml:space="preserve"> and press Enter.</w:t>
+        <w:t xml:space="preserve"> and press Enter. A sub-task can have sub-tasks of its own, as in Lark, up to 5 levels: open the sub-task and add them there, or use the </w:t>
+      </w:r>
+      <w:r>
+        <w:rPr>
+          <w:b/>
+        </w:rPr>
+        <w:t xml:space="preserve">+</w:t>
+      </w:r>
+      <w:r>
+        <w:t xml:space="preserve"> that shows on a row in the List. Drop a task on the right half of another task's title to make it its sub-task. Deleting a task deletes everything under it (</w:t>
+      </w:r>
+      <w:r>
+        <w:rPr>
+          <w:b/>
+        </w:rPr>
+        <w:t xml:space="preserve">Ctrl+Z</w:t>
+      </w:r>
+      <w:r>
+        <w:t xml:space="preserve"> brings it all back).</w:t>
       </w:r>
     </w:p>
     <w:p>
@@ -4719,6 +4800,621 @@
         <w:pStyle w:val="Heading2"/>
       </w:pPr>
       <w:r>
+        <w:t xml:space="preserve">Notifications and the app</w:t>
+      </w:r>
+    </w:p>
+    <w:p>
+      <w:pPr/>
+      <w:r>
+        <w:t xml:space="preserve">New chat messages reach you without reloading any page, and the viewer can be installed as an app.</w:t>
+      </w:r>
+    </w:p>
+    <w:p>
+      <w:pPr>
+        <w:pStyle w:val="ListParagraph"/>
+        <w:numPr>
+          <w:ilvl w:val="0"/>
+          <w:numId w:val="20"/>
+        </w:numPr>
+      </w:pPr>
+      <w:r>
+        <w:rPr>
+          <w:b/>
+        </w:rPr>
+        <w:t xml:space="preserve">While a viewer page is open</w:t>
+      </w:r>
+      <w:r>
+        <w:t xml:space="preserve"> (any page, a tab in the background, or the app): new messages show as notifications on Windows, Mac and Android; a click opens the chat at the message. The chat you are looking at stays quiet. The tab title shows the unread count, e.g. </w:t>
+      </w:r>
+      <w:r>
+        <w:rPr>
+          <w:b/>
+        </w:rPr>
+        <w:t xml:space="preserve">(3) LWK Viewer</w:t>
+      </w:r>
+      <w:r>
+        <w:t xml:space="preserve">, and so does the app's icon.</w:t>
+      </w:r>
+    </w:p>
+    <w:p>
+      <w:pPr>
+        <w:pStyle w:val="ListParagraph"/>
+        <w:numPr>
+          <w:ilvl w:val="0"/>
+          <w:numId w:val="20"/>
+        </w:numPr>
+      </w:pPr>
+      <w:r>
+        <w:rPr>
+          <w:b/>
+        </w:rPr>
+        <w:t xml:space="preserve">The bell</w:t>
+      </w:r>
+      <w:r>
+        <w:t xml:space="preserve"> in the top bar: </w:t>
+      </w:r>
+      <w:r>
+        <w:rPr>
+          <w:b/>
+        </w:rPr>
+        <w:t xml:space="preserve">Turn on notifications</w:t>
+      </w:r>
+      <w:r>
+        <w:t xml:space="preserve"> (the browser asks once), then choose </w:t>
+      </w:r>
+      <w:r>
+        <w:rPr>
+          <w:b/>
+        </w:rPr>
+        <w:t xml:space="preserve">Every message</w:t>
+      </w:r>
+      <w:r>
+        <w:t xml:space="preserve">, </w:t>
+      </w:r>
+      <w:r>
+        <w:rPr>
+          <w:b/>
+        </w:rPr>
+        <w:t xml:space="preserve">@mentions and direct messages</w:t>
+      </w:r>
+      <w:r>
+        <w:t xml:space="preserve"> or </w:t>
+      </w:r>
+      <w:r>
+        <w:rPr>
+          <w:b/>
+        </w:rPr>
+        <w:t xml:space="preserve">Nothing</w:t>
+      </w:r>
+      <w:r>
+        <w:t xml:space="preserve">.</w:t>
+      </w:r>
+    </w:p>
+    <w:p>
+      <w:pPr>
+        <w:pStyle w:val="ListParagraph"/>
+        <w:numPr>
+          <w:ilvl w:val="0"/>
+          <w:numId w:val="20"/>
+        </w:numPr>
+      </w:pPr>
+      <w:r>
+        <w:rPr>
+          <w:b/>
+        </w:rPr>
+        <w:t xml:space="preserve">Mute a chat:</w:t>
+      </w:r>
+      <w:r>
+        <w:t xml:space="preserve"> Chat info &gt; </w:t>
+      </w:r>
+      <w:r>
+        <w:rPr>
+          <w:b/>
+        </w:rPr>
+        <w:t xml:space="preserve">Mute notifications</w:t>
+      </w:r>
+      <w:r>
+        <w:t xml:space="preserve">. A muted chat still tells you when you are @mentioned.</w:t>
+      </w:r>
+    </w:p>
+    <w:p>
+      <w:pPr>
+        <w:pStyle w:val="ListParagraph"/>
+        <w:numPr>
+          <w:ilvl w:val="0"/>
+          <w:numId w:val="20"/>
+        </w:numPr>
+      </w:pPr>
+      <w:r>
+        <w:rPr>
+          <w:b/>
+        </w:rPr>
+        <w:t xml:space="preserve">Install the app:</w:t>
+      </w:r>
+      <w:r>
+        <w:t xml:space="preserve"> the bell &gt; </w:t>
+      </w:r>
+      <w:r>
+        <w:rPr>
+          <w:b/>
+        </w:rPr>
+        <w:t xml:space="preserve">Install the app</w:t>
+      </w:r>
+      <w:r>
+        <w:t xml:space="preserve"> (Edge, Chrome), or the install icon at the right of the address bar. On Android: menu &gt; </w:t>
+      </w:r>
+      <w:r>
+        <w:rPr>
+          <w:b/>
+        </w:rPr>
+        <w:t xml:space="preserve">Add to Home screen</w:t>
+      </w:r>
+      <w:r>
+        <w:t xml:space="preserve">. On iPhone and iPad: Safari &gt; Share &gt; </w:t>
+      </w:r>
+      <w:r>
+        <w:rPr>
+          <w:b/>
+        </w:rPr>
+        <w:t xml:space="preserve">Add to Home Screen</w:t>
+      </w:r>
+      <w:r>
+        <w:t xml:space="preserve">. The app opens in its own window, with shortcuts to Chat, Tasks, Calendar, Folders and Projects (right-click the icon).</w:t>
+      </w:r>
+    </w:p>
+    <w:p>
+      <w:pPr>
+        <w:pStyle w:val="ListParagraph"/>
+        <w:numPr>
+          <w:ilvl w:val="0"/>
+          <w:numId w:val="20"/>
+        </w:numPr>
+      </w:pPr>
+      <w:r>
+        <w:rPr>
+          <w:b/>
+        </w:rPr>
+        <w:t xml:space="preserve">When no page is open (push):</w:t>
+      </w:r>
+      <w:r>
+        <w:t xml:space="preserve"> the bell &gt; </w:t>
+      </w:r>
+      <w:r>
+        <w:rPr>
+          <w:b/>
+        </w:rPr>
+        <w:t xml:space="preserve">Turn on for this device</w:t>
+      </w:r>
+      <w:r>
+        <w:t xml:space="preserve">. This works when the viewer is opened by its </w:t>
+      </w:r>
+      <w:r>
+        <w:rPr>
+          <w:b/>
+        </w:rPr>
+        <w:t xml:space="preserve">https</w:t>
+      </w:r>
+      <w:r>
+        <w:t xml:space="preserve"> address; ask your admin. Messages then arrive on that phone or computer even with the app closed.</w:t>
+      </w:r>
+    </w:p>
+    <w:p>
+      <w:pPr>
+        <w:pStyle w:val="Heading2"/>
+      </w:pPr>
+      <w:r>
+        <w:t xml:space="preserve">Undo</w:t>
+      </w:r>
+    </w:p>
+    <w:p>
+      <w:pPr>
+        <w:pStyle w:val="ListParagraph"/>
+        <w:numPr>
+          <w:ilvl w:val="0"/>
+          <w:numId w:val="21"/>
+        </w:numPr>
+      </w:pPr>
+      <w:r>
+        <w:rPr>
+          <w:b/>
+        </w:rPr>
+        <w:t xml:space="preserve">Ctrl+Z</w:t>
+      </w:r>
+      <w:r>
+        <w:t xml:space="preserve"> (Cmd+Z on a Mac) undoes the last change; </w:t>
+      </w:r>
+      <w:r>
+        <w:rPr>
+          <w:b/>
+        </w:rPr>
+        <w:t xml:space="preserve">Ctrl+Y</w:t>
+      </w:r>
+      <w:r>
+        <w:t xml:space="preserve"> (or Ctrl+Shift+Z) redoes it. A note at the bottom says what was undone, with </w:t>
+      </w:r>
+      <w:r>
+        <w:rPr>
+          <w:b/>
+        </w:rPr>
+        <w:t xml:space="preserve">Redo</w:t>
+      </w:r>
+      <w:r>
+        <w:t xml:space="preserve">.</w:t>
+      </w:r>
+    </w:p>
+    <w:p>
+      <w:pPr>
+        <w:pStyle w:val="ListParagraph"/>
+        <w:numPr>
+          <w:ilvl w:val="0"/>
+          <w:numId w:val="21"/>
+        </w:numPr>
+      </w:pPr>
+      <w:r>
+        <w:rPr>
+          <w:b/>
+        </w:rPr>
+        <w:t xml:space="preserve">Tasks:</w:t>
+      </w:r>
+      <w:r>
+        <w:t xml:space="preserve"> changed fields, Kanban moves, list drags, Gantt moves, a new task and a deleted task (with its sub-tasks).</w:t>
+      </w:r>
+    </w:p>
+    <w:p>
+      <w:pPr>
+        <w:pStyle w:val="ListParagraph"/>
+        <w:numPr>
+          <w:ilvl w:val="0"/>
+          <w:numId w:val="21"/>
+        </w:numPr>
+      </w:pPr>
+      <w:r>
+        <w:rPr>
+          <w:b/>
+        </w:rPr>
+        <w:t xml:space="preserve">Messenger:</w:t>
+      </w:r>
+      <w:r>
+        <w:t xml:space="preserve"> a deleted message (your own, within a day), an edit, a pin and a reaction.</w:t>
+      </w:r>
+    </w:p>
+    <w:p>
+      <w:pPr>
+        <w:pStyle w:val="ListParagraph"/>
+        <w:numPr>
+          <w:ilvl w:val="0"/>
+          <w:numId w:val="21"/>
+        </w:numPr>
+      </w:pPr>
+      <w:r>
+        <w:rPr>
+          <w:b/>
+        </w:rPr>
+        <w:t xml:space="preserve">Folders:</w:t>
+      </w:r>
+      <w:r>
+        <w:t xml:space="preserve"> delete, rename, move, upload and a new folder.</w:t>
+      </w:r>
+    </w:p>
+    <w:p>
+      <w:pPr>
+        <w:pStyle w:val="ListParagraph"/>
+        <w:numPr>
+          <w:ilvl w:val="0"/>
+          <w:numId w:val="21"/>
+        </w:numPr>
+      </w:pPr>
+      <w:r>
+        <w:t xml:space="preserve">While you type in a box, Ctrl+Z undoes the typing as usual. The Sheets and 3D pages keep their own undo for markups.</w:t>
+      </w:r>
+    </w:p>
+    <w:p>
+      <w:pPr>
+        <w:pStyle w:val="Heading2"/>
+      </w:pPr>
+      <w:r>
+        <w:t xml:space="preserve">Folders</w:t>
+      </w:r>
+    </w:p>
+    <w:p>
+      <w:pPr/>
+      <w:r>
+        <w:rPr>
+          <w:b/>
+        </w:rPr>
+        <w:t xml:space="preserve">Folders</w:t>
+      </w:r>
+      <w:r>
+        <w:t xml:space="preserve"> holds each project's files in a folder on the server, like ACC Docs or a shared drive. Pick the project at the top left.</w:t>
+      </w:r>
+    </w:p>
+    <w:p>
+      <w:pPr>
+        <w:pStyle w:val="ListParagraph"/>
+        <w:numPr>
+          <w:ilvl w:val="0"/>
+          <w:numId w:val="22"/>
+        </w:numPr>
+      </w:pPr>
+      <w:r>
+        <w:rPr>
+          <w:b/>
+        </w:rPr>
+        <w:t xml:space="preserve">Browse:</w:t>
+      </w:r>
+      <w:r>
+        <w:t xml:space="preserve"> the folder tree on the left, the path at the top, or </w:t>
+      </w:r>
+      <w:r>
+        <w:rPr>
+          <w:b/>
+        </w:rPr>
+        <w:t xml:space="preserve">Search this project's files</w:t>
+      </w:r>
+      <w:r>
+        <w:t xml:space="preserve">. Double-click a folder to open it; click a PDF, picture or video to preview it.</w:t>
+      </w:r>
+    </w:p>
+    <w:p>
+      <w:pPr>
+        <w:pStyle w:val="ListParagraph"/>
+        <w:numPr>
+          <w:ilvl w:val="0"/>
+          <w:numId w:val="22"/>
+        </w:numPr>
+      </w:pPr>
+      <w:r>
+        <w:rPr>
+          <w:b/>
+        </w:rPr>
+        <w:t xml:space="preserve">Upload:</w:t>
+      </w:r>
+      <w:r>
+        <w:t xml:space="preserve"> drop files, or whole folders, onto the page (or onto a folder in the list), or press </w:t>
+      </w:r>
+      <w:r>
+        <w:rPr>
+          <w:b/>
+        </w:rPr>
+        <w:t xml:space="preserve">Upload</w:t>
+      </w:r>
+      <w:r>
+        <w:t xml:space="preserve">. </w:t>
+      </w:r>
+      <w:r>
+        <w:rPr>
+          <w:b/>
+        </w:rPr>
+        <w:t xml:space="preserve">+ Folder</w:t>
+      </w:r>
+      <w:r>
+        <w:t xml:space="preserve"> makes a folder.</w:t>
+      </w:r>
+    </w:p>
+    <w:p>
+      <w:pPr>
+        <w:pStyle w:val="ListParagraph"/>
+        <w:numPr>
+          <w:ilvl w:val="0"/>
+          <w:numId w:val="22"/>
+        </w:numPr>
+      </w:pPr>
+      <w:r>
+        <w:rPr>
+          <w:b/>
+        </w:rPr>
+        <w:t xml:space="preserve">⋯ on a file</w:t>
+      </w:r>
+      <w:r>
+        <w:t xml:space="preserve"> (or right-click): Preview, Download, </w:t>
+      </w:r>
+      <w:r>
+        <w:rPr>
+          <w:b/>
+        </w:rPr>
+        <w:t xml:space="preserve">Add to the Sheets page</w:t>
+      </w:r>
+      <w:r>
+        <w:t xml:space="preserve"> (PDFs), </w:t>
+      </w:r>
+      <w:r>
+        <w:rPr>
+          <w:b/>
+        </w:rPr>
+        <w:t xml:space="preserve">Star</w:t>
+      </w:r>
+      <w:r>
+        <w:t xml:space="preserve">, </w:t>
+      </w:r>
+      <w:r>
+        <w:rPr>
+          <w:b/>
+        </w:rPr>
+        <w:t xml:space="preserve">Pin for everyone</w:t>
+      </w:r>
+      <w:r>
+        <w:t xml:space="preserve"> (project admins), Copy link, Rename, </w:t>
+      </w:r>
+      <w:r>
+        <w:rPr>
+          <w:b/>
+        </w:rPr>
+        <w:t xml:space="preserve">Move to ...</w:t>
+      </w:r>
+      <w:r>
+        <w:t xml:space="preserve"> and Delete. Drag files onto a folder to move them; </w:t>
+      </w:r>
+      <w:r>
+        <w:rPr>
+          <w:b/>
+        </w:rPr>
+        <w:t xml:space="preserve">Delete</w:t>
+      </w:r>
+      <w:r>
+        <w:t xml:space="preserve"> and </w:t>
+      </w:r>
+      <w:r>
+        <w:rPr>
+          <w:b/>
+        </w:rPr>
+        <w:t xml:space="preserve">F2</w:t>
+      </w:r>
+      <w:r>
+        <w:t xml:space="preserve"> work on the selected file.</w:t>
+      </w:r>
+    </w:p>
+    <w:p>
+      <w:pPr>
+        <w:pStyle w:val="ListParagraph"/>
+        <w:numPr>
+          <w:ilvl w:val="0"/>
+          <w:numId w:val="22"/>
+        </w:numPr>
+      </w:pPr>
+      <w:r>
+        <w:rPr>
+          <w:b/>
+        </w:rPr>
+        <w:t xml:space="preserve">Pinned</w:t>
+      </w:r>
+      <w:r>
+        <w:t xml:space="preserve"> shows the documents a project admin pinned for everyone; </w:t>
+      </w:r>
+      <w:r>
+        <w:rPr>
+          <w:b/>
+        </w:rPr>
+        <w:t xml:space="preserve">Starred</w:t>
+      </w:r>
+      <w:r>
+        <w:t xml:space="preserve"> shows your own. </w:t>
+      </w:r>
+      <w:r>
+        <w:rPr>
+          <w:b/>
+        </w:rPr>
+        <w:t xml:space="preserve">Recent</w:t>
+      </w:r>
+      <w:r>
+        <w:t xml:space="preserve"> lists the newest files.</w:t>
+      </w:r>
+    </w:p>
+    <w:p>
+      <w:pPr>
+        <w:pStyle w:val="ListParagraph"/>
+        <w:numPr>
+          <w:ilvl w:val="0"/>
+          <w:numId w:val="22"/>
+        </w:numPr>
+      </w:pPr>
+      <w:r>
+        <w:rPr>
+          <w:b/>
+        </w:rPr>
+        <w:t xml:space="preserve">Deleting:</w:t>
+      </w:r>
+      <w:r>
+        <w:t xml:space="preserve"> the person who uploaded a file, or a project admin. Deleted things go to </w:t>
+      </w:r>
+      <w:r>
+        <w:rPr>
+          <w:b/>
+        </w:rPr>
+        <w:t xml:space="preserve">Recently deleted</w:t>
+      </w:r>
+      <w:r>
+        <w:t xml:space="preserve">, from where they can be put back; </w:t>
+      </w:r>
+      <w:r>
+        <w:rPr>
+          <w:b/>
+        </w:rPr>
+        <w:t xml:space="preserve">Ctrl+Z</w:t>
+      </w:r>
+      <w:r>
+        <w:t xml:space="preserve"> also brings them back at once.</w:t>
+      </w:r>
+    </w:p>
+    <w:p>
+      <w:pPr>
+        <w:pStyle w:val="ListParagraph"/>
+        <w:numPr>
+          <w:ilvl w:val="0"/>
+          <w:numId w:val="22"/>
+        </w:numPr>
+      </w:pPr>
+      <w:r>
+        <w:rPr>
+          <w:b/>
+        </w:rPr>
+        <w:t xml:space="preserve">Folder templates (project admins):</w:t>
+      </w:r>
+      <w:r>
+        <w:t xml:space="preserve"> ⋯ (top right) &gt; </w:t>
+      </w:r>
+      <w:r>
+        <w:rPr>
+          <w:b/>
+        </w:rPr>
+        <w:t xml:space="preserve">Save these folders as a template</w:t>
+      </w:r>
+      <w:r>
+        <w:t xml:space="preserve"> keeps this project's folders (no files) by name. In another project, </w:t>
+      </w:r>
+      <w:r>
+        <w:rPr>
+          <w:b/>
+        </w:rPr>
+        <w:t xml:space="preserve">Lay out folders from a template</w:t>
+      </w:r>
+      <w:r>
+        <w:t xml:space="preserve"> makes the folders it is missing; nothing is deleted.</w:t>
+      </w:r>
+    </w:p>
+    <w:p>
+      <w:pPr>
+        <w:pStyle w:val="ListParagraph"/>
+        <w:numPr>
+          <w:ilvl w:val="0"/>
+          <w:numId w:val="22"/>
+        </w:numPr>
+      </w:pPr>
+      <w:r>
+        <w:rPr>
+          <w:b/>
+        </w:rPr>
+        <w:t xml:space="preserve">To the Sheets page:</w:t>
+      </w:r>
+      <w:r>
+        <w:t xml:space="preserve"> a PDF's ⋯ &gt; </w:t>
+      </w:r>
+      <w:r>
+        <w:rPr>
+          <w:b/>
+        </w:rPr>
+        <w:t xml:space="preserve">Add to the Sheets page</w:t>
+      </w:r>
+      <w:r>
+        <w:t xml:space="preserve"> turns its pages into sheets in a set of their own (choose the set and the sheet number), ready for markups and issues.</w:t>
+      </w:r>
+    </w:p>
+    <w:p>
+      <w:pPr>
+        <w:pStyle w:val="ListParagraph"/>
+        <w:numPr>
+          <w:ilvl w:val="0"/>
+          <w:numId w:val="22"/>
+        </w:numPr>
+      </w:pPr>
+      <w:r>
+        <w:t xml:space="preserve">Files put into the project's folder on the server some other way (for example from Windows Explorer) show up here too.</w:t>
+      </w:r>
+    </w:p>
+    <w:p>
+      <w:pPr>
+        <w:pStyle w:val="Heading2"/>
+      </w:pPr>
+      <w:r>
         <w:t xml:space="preserve">Sheets (2D)</w:t>
       </w:r>
     </w:p>
@@ -4741,7 +5437,7 @@
         <w:pStyle w:val="ListParagraph"/>
         <w:numPr>
           <w:ilvl w:val="0"/>
-          <w:numId w:val="20"/>
+          <w:numId w:val="23"/>
         </w:numPr>
       </w:pPr>
       <w:r>
@@ -4762,7 +5458,7 @@
         <w:pStyle w:val="ListParagraph"/>
         <w:numPr>
           <w:ilvl w:val="0"/>
-          <w:numId w:val="20"/>
+          <w:numId w:val="23"/>
         </w:numPr>
       </w:pPr>
       <w:r>
@@ -4774,7 +5470,7 @@
         <w:pStyle w:val="ListParagraph"/>
         <w:numPr>
           <w:ilvl w:val="0"/>
-          <w:numId w:val="20"/>
+          <w:numId w:val="23"/>
         </w:numPr>
       </w:pPr>
       <w:r>
@@ -4792,7 +5488,7 @@
         <w:pStyle w:val="ListParagraph"/>
         <w:numPr>
           <w:ilvl w:val="0"/>
-          <w:numId w:val="20"/>
+          <w:numId w:val="23"/>
         </w:numPr>
       </w:pPr>
       <w:r>
@@ -4810,7 +5506,7 @@
         <w:pStyle w:val="ListParagraph"/>
         <w:numPr>
           <w:ilvl w:val="0"/>
-          <w:numId w:val="20"/>
+          <w:numId w:val="23"/>
         </w:numPr>
       </w:pPr>
       <w:r>
@@ -5144,7 +5840,7 @@
         <w:pStyle w:val="ListParagraph"/>
         <w:numPr>
           <w:ilvl w:val="0"/>
-          <w:numId w:val="21"/>
+          <w:numId w:val="24"/>
         </w:numPr>
       </w:pPr>
       <w:r>
@@ -5162,7 +5858,7 @@
         <w:pStyle w:val="ListParagraph"/>
         <w:numPr>
           <w:ilvl w:val="0"/>
-          <w:numId w:val="21"/>
+          <w:numId w:val="24"/>
         </w:numPr>
       </w:pPr>
       <w:r>
@@ -5189,7 +5885,7 @@
         <w:pStyle w:val="ListParagraph"/>
         <w:numPr>
           <w:ilvl w:val="0"/>
-          <w:numId w:val="21"/>
+          <w:numId w:val="24"/>
         </w:numPr>
       </w:pPr>
       <w:r>
@@ -5216,7 +5912,7 @@
         <w:pStyle w:val="ListParagraph"/>
         <w:numPr>
           <w:ilvl w:val="0"/>
-          <w:numId w:val="21"/>
+          <w:numId w:val="24"/>
         </w:numPr>
       </w:pPr>
       <w:r>
@@ -5463,7 +6159,7 @@
         <w:pStyle w:val="ListParagraph"/>
         <w:numPr>
           <w:ilvl w:val="0"/>
-          <w:numId w:val="22"/>
+          <w:numId w:val="25"/>
         </w:numPr>
       </w:pPr>
       <w:r>
@@ -5490,7 +6186,7 @@
         <w:pStyle w:val="ListParagraph"/>
         <w:numPr>
           <w:ilvl w:val="0"/>
-          <w:numId w:val="22"/>
+          <w:numId w:val="25"/>
         </w:numPr>
       </w:pPr>
       <w:r>
@@ -5508,7 +6204,7 @@
         <w:pStyle w:val="ListParagraph"/>
         <w:numPr>
           <w:ilvl w:val="0"/>
-          <w:numId w:val="22"/>
+          <w:numId w:val="25"/>
         </w:numPr>
       </w:pPr>
       <w:r>
@@ -5526,7 +6222,7 @@
         <w:pStyle w:val="ListParagraph"/>
         <w:numPr>
           <w:ilvl w:val="0"/>
-          <w:numId w:val="22"/>
+          <w:numId w:val="25"/>
         </w:numPr>
       </w:pPr>
       <w:r>
@@ -5589,7 +6285,7 @@
         <w:pStyle w:val="ListParagraph"/>
         <w:numPr>
           <w:ilvl w:val="0"/>
-          <w:numId w:val="22"/>
+          <w:numId w:val="25"/>
         </w:numPr>
       </w:pPr>
       <w:r>
@@ -5615,7 +6311,7 @@
         <w:pStyle w:val="ListParagraph"/>
         <w:numPr>
           <w:ilvl w:val="0"/>
-          <w:numId w:val="23"/>
+          <w:numId w:val="26"/>
         </w:numPr>
       </w:pPr>
       <w:r>
@@ -5651,7 +6347,7 @@
         <w:pStyle w:val="ListParagraph"/>
         <w:numPr>
           <w:ilvl w:val="0"/>
-          <w:numId w:val="23"/>
+          <w:numId w:val="26"/>
         </w:numPr>
       </w:pPr>
       <w:r>
@@ -5669,7 +6365,7 @@
         <w:pStyle w:val="ListParagraph"/>
         <w:numPr>
           <w:ilvl w:val="0"/>
-          <w:numId w:val="23"/>
+          <w:numId w:val="26"/>
         </w:numPr>
       </w:pPr>
       <w:r>
@@ -6270,7 +6966,7 @@
         <w:pStyle w:val="ListParagraph"/>
         <w:numPr>
           <w:ilvl w:val="0"/>
-          <w:numId w:val="24"/>
+          <w:numId w:val="27"/>
         </w:numPr>
       </w:pPr>
       <w:r>
@@ -6309,7 +7005,7 @@
         <w:pStyle w:val="ListParagraph"/>
         <w:numPr>
           <w:ilvl w:val="0"/>
-          <w:numId w:val="24"/>
+          <w:numId w:val="27"/>
         </w:numPr>
       </w:pPr>
       <w:r>
@@ -6330,7 +7026,7 @@
         <w:pStyle w:val="ListParagraph"/>
         <w:numPr>
           <w:ilvl w:val="0"/>
-          <w:numId w:val="24"/>
+          <w:numId w:val="27"/>
         </w:numPr>
       </w:pPr>
       <w:r>
@@ -6348,7 +7044,7 @@
         <w:pStyle w:val="ListParagraph"/>
         <w:numPr>
           <w:ilvl w:val="0"/>
-          <w:numId w:val="24"/>
+          <w:numId w:val="27"/>
         </w:numPr>
       </w:pPr>
       <w:r>
@@ -6383,7 +7079,7 @@
         <w:pStyle w:val="ListParagraph"/>
         <w:numPr>
           <w:ilvl w:val="0"/>
-          <w:numId w:val="25"/>
+          <w:numId w:val="28"/>
         </w:numPr>
       </w:pPr>
       <w:r>
@@ -6413,7 +7109,7 @@
         <w:pStyle w:val="ListParagraph"/>
         <w:numPr>
           <w:ilvl w:val="0"/>
-          <w:numId w:val="25"/>
+          <w:numId w:val="28"/>
         </w:numPr>
       </w:pPr>
       <w:r>
@@ -6425,7 +7121,7 @@
         <w:pStyle w:val="ListParagraph"/>
         <w:numPr>
           <w:ilvl w:val="0"/>
-          <w:numId w:val="25"/>
+          <w:numId w:val="28"/>
         </w:numPr>
       </w:pPr>
       <w:r>
@@ -6452,7 +7148,7 @@
         <w:pStyle w:val="ListParagraph"/>
         <w:numPr>
           <w:ilvl w:val="0"/>
-          <w:numId w:val="25"/>
+          <w:numId w:val="28"/>
         </w:numPr>
       </w:pPr>
       <w:r>
@@ -6478,7 +7174,7 @@
         <w:pStyle w:val="ListParagraph"/>
         <w:numPr>
           <w:ilvl w:val="0"/>
-          <w:numId w:val="26"/>
+          <w:numId w:val="29"/>
         </w:numPr>
       </w:pPr>
       <w:r>
@@ -6499,7 +7195,7 @@
         <w:pStyle w:val="ListParagraph"/>
         <w:numPr>
           <w:ilvl w:val="0"/>
-          <w:numId w:val="26"/>
+          <w:numId w:val="29"/>
         </w:numPr>
       </w:pPr>
       <w:r>
@@ -6526,7 +7222,7 @@
         <w:pStyle w:val="ListParagraph"/>
         <w:numPr>
           <w:ilvl w:val="0"/>
-          <w:numId w:val="26"/>
+          <w:numId w:val="29"/>
         </w:numPr>
       </w:pPr>
       <w:r>
@@ -6544,7 +7240,7 @@
         <w:pStyle w:val="ListParagraph"/>
         <w:numPr>
           <w:ilvl w:val="0"/>
-          <w:numId w:val="26"/>
+          <w:numId w:val="29"/>
         </w:numPr>
       </w:pPr>
       <w:r>
@@ -6562,7 +7258,7 @@
         <w:pStyle w:val="ListParagraph"/>
         <w:numPr>
           <w:ilvl w:val="0"/>
-          <w:numId w:val="26"/>
+          <w:numId w:val="29"/>
         </w:numPr>
       </w:pPr>
       <w:r>
@@ -6683,7 +7379,7 @@
         <w:pStyle w:val="ListParagraph"/>
         <w:numPr>
           <w:ilvl w:val="0"/>
-          <w:numId w:val="27"/>
+          <w:numId w:val="30"/>
         </w:numPr>
       </w:pPr>
       <w:r>
@@ -6728,7 +7424,7 @@
         <w:pStyle w:val="ListParagraph"/>
         <w:numPr>
           <w:ilvl w:val="0"/>
-          <w:numId w:val="27"/>
+          <w:numId w:val="30"/>
         </w:numPr>
       </w:pPr>
       <w:r>
@@ -6764,7 +7460,7 @@
         <w:pStyle w:val="ListParagraph"/>
         <w:numPr>
           <w:ilvl w:val="0"/>
-          <w:numId w:val="27"/>
+          <w:numId w:val="30"/>
         </w:numPr>
       </w:pPr>
       <w:r>
@@ -6807,7 +7503,7 @@
         <w:pStyle w:val="ListParagraph"/>
         <w:numPr>
           <w:ilvl w:val="0"/>
-          <w:numId w:val="28"/>
+          <w:numId w:val="31"/>
         </w:numPr>
       </w:pPr>
       <w:r>
@@ -6828,7 +7524,7 @@
         <w:pStyle w:val="ListParagraph"/>
         <w:numPr>
           <w:ilvl w:val="0"/>
-          <w:numId w:val="28"/>
+          <w:numId w:val="31"/>
         </w:numPr>
       </w:pPr>
       <w:r>
@@ -6855,7 +7551,7 @@
         <w:pStyle w:val="ListParagraph"/>
         <w:numPr>
           <w:ilvl w:val="0"/>
-          <w:numId w:val="28"/>
+          <w:numId w:val="31"/>
         </w:numPr>
       </w:pPr>
       <w:r>
@@ -6918,7 +7614,7 @@
         <w:pStyle w:val="ListParagraph"/>
         <w:numPr>
           <w:ilvl w:val="0"/>
-          <w:numId w:val="28"/>
+          <w:numId w:val="31"/>
         </w:numPr>
       </w:pPr>
       <w:r>
@@ -7083,7 +7779,7 @@
         <w:pStyle w:val="ListParagraph"/>
         <w:numPr>
           <w:ilvl w:val="0"/>
-          <w:numId w:val="29"/>
+          <w:numId w:val="32"/>
         </w:numPr>
       </w:pPr>
       <w:r>
@@ -7110,7 +7806,7 @@
         <w:pStyle w:val="ListParagraph"/>
         <w:numPr>
           <w:ilvl w:val="0"/>
-          <w:numId w:val="29"/>
+          <w:numId w:val="32"/>
         </w:numPr>
       </w:pPr>
       <w:r>
@@ -7131,7 +7827,7 @@
         <w:pStyle w:val="ListParagraph"/>
         <w:numPr>
           <w:ilvl w:val="0"/>
-          <w:numId w:val="29"/>
+          <w:numId w:val="32"/>
         </w:numPr>
       </w:pPr>
       <w:r>
@@ -7412,7 +8108,7 @@
         <w:pStyle w:val="ListParagraph"/>
         <w:numPr>
           <w:ilvl w:val="0"/>
-          <w:numId w:val="30"/>
+          <w:numId w:val="33"/>
         </w:numPr>
       </w:pPr>
       <w:r>
@@ -7433,7 +8129,7 @@
         <w:pStyle w:val="ListParagraph"/>
         <w:numPr>
           <w:ilvl w:val="0"/>
-          <w:numId w:val="30"/>
+          <w:numId w:val="33"/>
         </w:numPr>
       </w:pPr>
       <w:r>
@@ -7451,7 +8147,7 @@
         <w:pStyle w:val="ListParagraph"/>
         <w:numPr>
           <w:ilvl w:val="0"/>
-          <w:numId w:val="30"/>
+          <w:numId w:val="33"/>
         </w:numPr>
       </w:pPr>
       <w:r>
@@ -7469,7 +8165,7 @@
         <w:pStyle w:val="ListParagraph"/>
         <w:numPr>
           <w:ilvl w:val="0"/>
-          <w:numId w:val="30"/>
+          <w:numId w:val="33"/>
         </w:numPr>
       </w:pPr>
       <w:r>
@@ -7489,7 +8185,7 @@
         <w:pStyle w:val="ListParagraph"/>
         <w:numPr>
           <w:ilvl w:val="0"/>
-          <w:numId w:val="31"/>
+          <w:numId w:val="34"/>
         </w:numPr>
       </w:pPr>
       <w:r>
@@ -7519,7 +8215,7 @@
         <w:pStyle w:val="ListParagraph"/>
         <w:numPr>
           <w:ilvl w:val="0"/>
-          <w:numId w:val="31"/>
+          <w:numId w:val="34"/>
         </w:numPr>
       </w:pPr>
       <w:r>
@@ -7562,7 +8258,7 @@
         <w:pStyle w:val="ListParagraph"/>
         <w:numPr>
           <w:ilvl w:val="0"/>
-          <w:numId w:val="32"/>
+          <w:numId w:val="35"/>
         </w:numPr>
       </w:pPr>
       <w:r>
@@ -7619,7 +8315,7 @@
         <w:pStyle w:val="ListParagraph"/>
         <w:numPr>
           <w:ilvl w:val="0"/>
-          <w:numId w:val="32"/>
+          <w:numId w:val="35"/>
         </w:numPr>
       </w:pPr>
       <w:r>
@@ -7631,7 +8327,7 @@
         <w:pStyle w:val="ListParagraph"/>
         <w:numPr>
           <w:ilvl w:val="0"/>
-          <w:numId w:val="32"/>
+          <w:numId w:val="35"/>
         </w:numPr>
       </w:pPr>
       <w:r>
@@ -7661,7 +8357,7 @@
         <w:pStyle w:val="ListParagraph"/>
         <w:numPr>
           <w:ilvl w:val="0"/>
-          <w:numId w:val="32"/>
+          <w:numId w:val="35"/>
         </w:numPr>
       </w:pPr>
       <w:r>
@@ -8087,7 +8783,7 @@
         <w:pStyle w:val="ListParagraph"/>
         <w:numPr>
           <w:ilvl w:val="0"/>
-          <w:numId w:val="33"/>
+          <w:numId w:val="36"/>
         </w:numPr>
       </w:pPr>
       <w:r>
@@ -8099,7 +8795,7 @@
         <w:pStyle w:val="ListParagraph"/>
         <w:numPr>
           <w:ilvl w:val="0"/>
-          <w:numId w:val="33"/>
+          <w:numId w:val="36"/>
         </w:numPr>
       </w:pPr>
       <w:r>
@@ -8111,7 +8807,7 @@
         <w:pStyle w:val="ListParagraph"/>
         <w:numPr>
           <w:ilvl w:val="0"/>
-          <w:numId w:val="33"/>
+          <w:numId w:val="36"/>
         </w:numPr>
       </w:pPr>
       <w:r>
@@ -8131,7 +8827,7 @@
         <w:pStyle w:val="ListParagraph"/>
         <w:numPr>
           <w:ilvl w:val="0"/>
-          <w:numId w:val="34"/>
+          <w:numId w:val="37"/>
         </w:numPr>
       </w:pPr>
       <w:r>
@@ -8158,7 +8854,7 @@
         <w:pStyle w:val="ListParagraph"/>
         <w:numPr>
           <w:ilvl w:val="0"/>
-          <w:numId w:val="34"/>
+          <w:numId w:val="37"/>
         </w:numPr>
       </w:pPr>
       <w:r>
@@ -8185,7 +8881,7 @@
         <w:pStyle w:val="ListParagraph"/>
         <w:numPr>
           <w:ilvl w:val="0"/>
-          <w:numId w:val="34"/>
+          <w:numId w:val="37"/>
         </w:numPr>
       </w:pPr>
       <w:r>
@@ -8655,7 +9351,7 @@
         <w:pStyle w:val="ListParagraph"/>
         <w:numPr>
           <w:ilvl w:val="0"/>
-          <w:numId w:val="35"/>
+          <w:numId w:val="38"/>
         </w:numPr>
       </w:pPr>
       <w:r>
@@ -8673,7 +9369,7 @@
         <w:pStyle w:val="ListParagraph"/>
         <w:numPr>
           <w:ilvl w:val="0"/>
-          <w:numId w:val="35"/>
+          <w:numId w:val="38"/>
         </w:numPr>
       </w:pPr>
       <w:r>
@@ -8691,7 +9387,7 @@
         <w:pStyle w:val="ListParagraph"/>
         <w:numPr>
           <w:ilvl w:val="0"/>
-          <w:numId w:val="35"/>
+          <w:numId w:val="38"/>
         </w:numPr>
       </w:pPr>
       <w:r>
@@ -8709,7 +9405,7 @@
         <w:pStyle w:val="ListParagraph"/>
         <w:numPr>
           <w:ilvl w:val="0"/>
-          <w:numId w:val="35"/>
+          <w:numId w:val="38"/>
         </w:numPr>
       </w:pPr>
       <w:r>
@@ -8751,21 +9447,22 @@
         <w:pStyle w:val="Heading2"/>
       </w:pPr>
       <w:r>
-        <w:t xml:space="preserve">Issues and BCF</w:t>
+        <w:t xml:space="preserve">Consultant models (IFC)</w:t>
       </w:r>
     </w:p>
     <w:p>
       <w:pPr/>
       <w:r>
-        <w:t xml:space="preserve">An issue is a markup or a 3D point with a title, type, owner, due date and a conversation; it is numbered by the server (#N) and the same issue appears on Sheets, in 3D, on the Dashboard and in Revit.</w:t>
-      </w:r>
-    </w:p>
-    <w:p>
-      <w:pPr>
-        <w:pStyle w:val="Heading3"/>
-      </w:pPr>
-      <w:r>
-        <w:t xml:space="preserve">Raising an issue</w:t>
+        <w:t xml:space="preserve">Models from other companies (structure, MEP, interior, facade) can be shown with the project's own. Ask them for </w:t>
+      </w:r>
+      <w:r>
+        <w:rPr>
+          <w:b/>
+        </w:rPr>
+        <w:t xml:space="preserve">IFC</w:t>
+      </w:r>
+      <w:r>
+        <w:t xml:space="preserve"> (IFC 2x3 or IFC4): SketchUp, Revit, Tekla, ArchiCAD and Rhino all export it, and it keeps the elements, their properties and their real coordinates. ("WebGL" is how a browser draws; it is not a file to exchange.)</w:t>
       </w:r>
     </w:p>
     <w:tbl>
@@ -8791,7 +9488,7 @@
           <w:p>
             <w:pPr/>
             <w:r>
-              <w:t xml:space="preserve">Where</w:t>
+              <w:t xml:space="preserve">Use</w:t>
             </w:r>
           </w:p>
         </w:tc>
@@ -8816,105 +9513,259 @@
           <w:p>
             <w:pPr/>
             <w:r>
-              <w:t xml:space="preserve">On a sheet</w:t>
-            </w:r>
-          </w:p>
-        </w:tc>
-        <w:tc>
-          <w:tcPr>
-            <w:tcW w:w="4680" w:type="dxa"/>
-          </w:tcPr>
-          <w:p>
-            <w:pPr/>
-            <w:r>
-              <w:t xml:space="preserve">Switch the top bar to </w:t>
-            </w:r>
+              <w:t xml:space="preserve">Add to this project's 3D</w:t>
+            </w:r>
+          </w:p>
+        </w:tc>
+        <w:tc>
+          <w:tcPr>
+            <w:tcW w:w="4680" w:type="dxa"/>
+          </w:tcPr>
+          <w:p>
+            <w:pPr/>
             <w:r>
               <w:rPr>
                 <w:b/>
               </w:rPr>
-              <w:t xml:space="preserve">Issue</w:t>
-            </w:r>
-            <w:r>
-              <w:t xml:space="preserve"> and draw a markup; or select a markup and press </w:t>
+              <w:t xml:space="preserve">Models</w:t>
+            </w:r>
+            <w:r>
+              <w:t xml:space="preserve"> panel &gt; </w:t>
             </w:r>
             <w:r>
               <w:rPr>
                 <w:b/>
               </w:rPr>
-              <w:t xml:space="preserve">Issue</w:t>
-            </w:r>
-            <w:r>
-              <w:t xml:space="preserve">; or right-click it and choose </w:t>
+              <w:t xml:space="preserve">+ Consultant model (IFC)</w:t>
+            </w:r>
+            <w:r>
+              <w:t xml:space="preserve">: choose the .ifc, give its name, company and discipline, </w:t>
             </w:r>
             <w:r>
               <w:rPr>
                 <w:b/>
               </w:rPr>
-              <w:t xml:space="preserve">Raise issue</w:t>
-            </w:r>
-            <w:r>
-              <w:t xml:space="preserve">. A picture of the drawing is attached automatically.</w:t>
-            </w:r>
-          </w:p>
-        </w:tc>
-      </w:tr>
-      <w:tr>
-        <w:tc>
-          <w:tcPr>
-            <w:tcW w:w="4680" w:type="dxa"/>
-          </w:tcPr>
-          <w:p>
-            <w:pPr/>
-            <w:r>
-              <w:t xml:space="preserve">In 3D</w:t>
-            </w:r>
-          </w:p>
-        </w:tc>
-        <w:tc>
-          <w:tcPr>
-            <w:tcW w:w="4680" w:type="dxa"/>
-          </w:tcPr>
-          <w:p>
-            <w:pPr/>
-            <w:r>
-              <w:t xml:space="preserve">Click </w:t>
+              <w:t xml:space="preserve">Upload and convert</w:t>
+            </w:r>
+            <w:r>
+              <w:t xml:space="preserve">. The server converts it (a bar shows the progress); it then appears under </w:t>
             </w:r>
             <w:r>
               <w:rPr>
                 <w:b/>
               </w:rPr>
-              <w:t xml:space="preserve">Add issue</w:t>
-            </w:r>
-            <w:r>
-              <w:t xml:space="preserve">, then click the spot (on iPad: long press). The camera, section and hidden elements are saved with it, and a snapshot is attached. </w:t>
-            </w:r>
+              <w:t xml:space="preserve">Consultant models</w:t>
+            </w:r>
+          </w:p>
+        </w:tc>
+      </w:tr>
+      <w:tr>
+        <w:tc>
+          <w:tcPr>
+            <w:tcW w:w="4680" w:type="dxa"/>
+          </w:tcPr>
+          <w:p>
+            <w:pPr/>
+            <w:r>
+              <w:t xml:space="preserve">Overlay another project's model</w:t>
+            </w:r>
+          </w:p>
+        </w:tc>
+        <w:tc>
+          <w:tcPr>
+            <w:tcW w:w="4680" w:type="dxa"/>
+          </w:tcPr>
+          <w:p>
+            <w:pPr/>
             <w:r>
               <w:rPr>
                 <w:b/>
               </w:rPr>
-              <w:t xml:space="preserve">Mark up snapshot</w:t>
-            </w:r>
-            <w:r>
-              <w:t xml:space="preserve"> lets you draw on the picture (clouds, arrows, text and more).</w:t>
+              <w:t xml:space="preserve">+ Overlay another project</w:t>
+            </w:r>
+            <w:r>
+              <w:t xml:space="preserve">: pick a project you can open and one of its models. It is shown here on the shared coordinates both use</w:t>
+            </w:r>
+          </w:p>
+        </w:tc>
+      </w:tr>
+      <w:tr>
+        <w:tc>
+          <w:tcPr>
+            <w:tcW w:w="4680" w:type="dxa"/>
+          </w:tcPr>
+          <w:p>
+            <w:pPr/>
+            <w:r>
+              <w:t xml:space="preserve">A 3D page of its own</w:t>
+            </w:r>
+          </w:p>
+        </w:tc>
+        <w:tc>
+          <w:tcPr>
+            <w:tcW w:w="4680" w:type="dxa"/>
+          </w:tcPr>
+          <w:p>
+            <w:pPr/>
+            <w:r>
+              <w:t xml:space="preserve">An admin makes it with </w:t>
+            </w:r>
+            <w:r>
+              <w:rPr>
+                <w:b/>
+              </w:rPr>
+              <w:t xml:space="preserve">New 3D project from IFC</w:t>
+            </w:r>
+            <w:r>
+              <w:t xml:space="preserve"> (Admin). For a model whose coordinates match nothing: a standalone reference, which can still be overlaid later</w:t>
             </w:r>
           </w:p>
         </w:tc>
       </w:tr>
     </w:tbl>
     <w:p>
+      <w:pPr>
+        <w:pStyle w:val="ListParagraph"/>
+        <w:numPr>
+          <w:ilvl w:val="0"/>
+          <w:numId w:val="39"/>
+        </w:numPr>
+      </w:pPr>
+      <w:r>
+        <w:t xml:space="preserve">Each consultant model has a tick box (on / off for you) and a slider to make it see-through.</w:t>
+      </w:r>
+    </w:p>
+    <w:p>
+      <w:pPr>
+        <w:pStyle w:val="ListParagraph"/>
+        <w:numPr>
+          <w:ilvl w:val="0"/>
+          <w:numId w:val="39"/>
+        </w:numPr>
+      </w:pPr>
+      <w:r>
+        <w:rPr>
+          <w:b/>
+        </w:rPr>
+        <w:t xml:space="preserve">Place</w:t>
+      </w:r>
+      <w:r>
+        <w:t xml:space="preserve"> (the person who added it, or a project admin) sets where it sits for everyone: </w:t>
+      </w:r>
+      <w:r>
+        <w:rPr>
+          <w:b/>
+        </w:rPr>
+        <w:t xml:space="preserve">Shared coordinates</w:t>
+      </w:r>
+      <w:r>
+        <w:t xml:space="preserve"> (what a coordinated consultant exports), </w:t>
+      </w:r>
+      <w:r>
+        <w:rPr>
+          <w:b/>
+        </w:rPr>
+        <w:t xml:space="preserve">This model's origin</w:t>
+      </w:r>
+      <w:r>
+        <w:t xml:space="preserve">, or </w:t>
+      </w:r>
+      <w:r>
+        <w:rPr>
+          <w:b/>
+        </w:rPr>
+        <w:t xml:space="preserve">No coordinates: set in the middle</w:t>
+      </w:r>
+      <w:r>
+        <w:t xml:space="preserve">; then </w:t>
+      </w:r>
+      <w:r>
+        <w:rPr>
+          <w:b/>
+        </w:rPr>
+        <w:t xml:space="preserve">East / North / Up</w:t>
+      </w:r>
+      <w:r>
+        <w:t xml:space="preserve"> (mm) and </w:t>
+      </w:r>
+      <w:r>
+        <w:rPr>
+          <w:b/>
+        </w:rPr>
+        <w:t xml:space="preserve">Turn</w:t>
+      </w:r>
+      <w:r>
+        <w:t xml:space="preserve"> (°) move it by hand while you watch. </w:t>
+      </w:r>
+      <w:r>
+        <w:rPr>
+          <w:b/>
+        </w:rPr>
+        <w:t xml:space="preserve">Save for everyone</w:t>
+      </w:r>
+      <w:r>
+        <w:t xml:space="preserve"> keeps it; </w:t>
+      </w:r>
+      <w:r>
+        <w:rPr>
+          <w:b/>
+        </w:rPr>
+        <w:t xml:space="preserve">Cancel</w:t>
+      </w:r>
+      <w:r>
+        <w:t xml:space="preserve"> puts it back.</w:t>
+      </w:r>
+    </w:p>
+    <w:p>
+      <w:pPr>
+        <w:pStyle w:val="ListParagraph"/>
+        <w:numPr>
+          <w:ilvl w:val="0"/>
+          <w:numId w:val="39"/>
+        </w:numPr>
+      </w:pPr>
+      <w:r>
+        <w:t xml:space="preserve">Its elements can be clicked and issues raised on them like the project's own.</w:t>
+      </w:r>
+    </w:p>
+    <w:p>
+      <w:pPr>
+        <w:pStyle w:val="ListParagraph"/>
+        <w:numPr>
+          <w:ilvl w:val="0"/>
+          <w:numId w:val="39"/>
+        </w:numPr>
+      </w:pPr>
+      <w:r>
+        <w:rPr>
+          <w:b/>
+        </w:rPr>
+        <w:t xml:space="preserve">×</w:t>
+      </w:r>
+      <w:r>
+        <w:t xml:space="preserve"> removes it from the project (who added it, or a project admin).</w:t>
+      </w:r>
+    </w:p>
+    <w:p>
+      <w:pPr>
+        <w:pStyle w:val="Heading2"/>
+      </w:pPr>
+      <w:r>
+        <w:t xml:space="preserve">Issues and BCF</w:t>
+      </w:r>
+    </w:p>
+    <w:p>
       <w:pPr/>
       <w:r>
-        <w:t xml:space="preserve">Fill in the issue window, then </w:t>
-      </w:r>
-      <w:r>
-        <w:rPr>
-          <w:b/>
-        </w:rPr>
-        <w:t xml:space="preserve">Save issue</w:t>
-      </w:r>
-      <w:r>
-        <w:t xml:space="preserve">:</w:t>
+        <w:t xml:space="preserve">An issue is a markup or a 3D point with a title, type, owner, due date and a conversation; it is numbered by the server (#N) and the same issue appears on Sheets, in 3D, on the Dashboard and in Revit.</w:t>
+      </w:r>
+    </w:p>
+    <w:p>
+      <w:pPr>
+        <w:pStyle w:val="Heading3"/>
+      </w:pPr>
+      <w:r>
+        <w:t xml:space="preserve">Raising an issue</w:t>
       </w:r>
     </w:p>
     <w:tbl>
@@ -8940,6 +9791,155 @@
           <w:p>
             <w:pPr/>
             <w:r>
+              <w:t xml:space="preserve">Where</w:t>
+            </w:r>
+          </w:p>
+        </w:tc>
+        <w:tc>
+          <w:tcPr>
+            <w:tcW w:w="4680" w:type="dxa"/>
+            <w:shd w:val="clear" w:color="auto" w:fill="F2F2F2"/>
+          </w:tcPr>
+          <w:p>
+            <w:pPr/>
+            <w:r>
+              <w:t xml:space="preserve">How</w:t>
+            </w:r>
+          </w:p>
+        </w:tc>
+      </w:tr>
+      <w:tr>
+        <w:tc>
+          <w:tcPr>
+            <w:tcW w:w="4680" w:type="dxa"/>
+          </w:tcPr>
+          <w:p>
+            <w:pPr/>
+            <w:r>
+              <w:t xml:space="preserve">On a sheet</w:t>
+            </w:r>
+          </w:p>
+        </w:tc>
+        <w:tc>
+          <w:tcPr>
+            <w:tcW w:w="4680" w:type="dxa"/>
+          </w:tcPr>
+          <w:p>
+            <w:pPr/>
+            <w:r>
+              <w:t xml:space="preserve">Switch the top bar to </w:t>
+            </w:r>
+            <w:r>
+              <w:rPr>
+                <w:b/>
+              </w:rPr>
+              <w:t xml:space="preserve">Issue</w:t>
+            </w:r>
+            <w:r>
+              <w:t xml:space="preserve"> and draw a markup; or select a markup and press </w:t>
+            </w:r>
+            <w:r>
+              <w:rPr>
+                <w:b/>
+              </w:rPr>
+              <w:t xml:space="preserve">Issue</w:t>
+            </w:r>
+            <w:r>
+              <w:t xml:space="preserve">; or right-click it and choose </w:t>
+            </w:r>
+            <w:r>
+              <w:rPr>
+                <w:b/>
+              </w:rPr>
+              <w:t xml:space="preserve">Raise issue</w:t>
+            </w:r>
+            <w:r>
+              <w:t xml:space="preserve">. A sharp picture of the drawing is attached automatically: it is drawn from the PDF itself at about 200 dpi, whatever the zoom or the speed settings of your computer.</w:t>
+            </w:r>
+          </w:p>
+        </w:tc>
+      </w:tr>
+      <w:tr>
+        <w:tc>
+          <w:tcPr>
+            <w:tcW w:w="4680" w:type="dxa"/>
+          </w:tcPr>
+          <w:p>
+            <w:pPr/>
+            <w:r>
+              <w:t xml:space="preserve">In 3D</w:t>
+            </w:r>
+          </w:p>
+        </w:tc>
+        <w:tc>
+          <w:tcPr>
+            <w:tcW w:w="4680" w:type="dxa"/>
+          </w:tcPr>
+          <w:p>
+            <w:pPr/>
+            <w:r>
+              <w:t xml:space="preserve">Click </w:t>
+            </w:r>
+            <w:r>
+              <w:rPr>
+                <w:b/>
+              </w:rPr>
+              <w:t xml:space="preserve">Add issue</w:t>
+            </w:r>
+            <w:r>
+              <w:t xml:space="preserve">, then click the spot (on iPad: long press). The camera, section and hidden elements are saved with it, and a snapshot is attached. </w:t>
+            </w:r>
+            <w:r>
+              <w:rPr>
+                <w:b/>
+              </w:rPr>
+              <w:t xml:space="preserve">Mark up snapshot</w:t>
+            </w:r>
+            <w:r>
+              <w:t xml:space="preserve"> lets you draw on the picture (clouds, arrows, text and more).</w:t>
+            </w:r>
+          </w:p>
+        </w:tc>
+      </w:tr>
+    </w:tbl>
+    <w:p>
+      <w:pPr/>
+      <w:r>
+        <w:t xml:space="preserve">Fill in the issue window, then </w:t>
+      </w:r>
+      <w:r>
+        <w:rPr>
+          <w:b/>
+        </w:rPr>
+        <w:t xml:space="preserve">Save issue</w:t>
+      </w:r>
+      <w:r>
+        <w:t xml:space="preserve">:</w:t>
+      </w:r>
+    </w:p>
+    <w:tbl>
+      <w:tblPr>
+        <w:tblStyle w:val="TableGrid"/>
+        <w:tblW w:w="0" w:type="auto"/>
+        <w:tblLayout w:type="fixed"/>
+        <w:tblLook w:val="04A0" w:firstRow="1" w:lastRow="0" w:firstColumn="0" w:lastColumn="0" w:noHBand="0" w:noVBand="1"/>
+      </w:tblPr>
+      <w:tblGrid>
+        <w:gridCol w:w="4680"/>
+        <w:gridCol w:w="4680"/>
+      </w:tblGrid>
+      <w:tr>
+        <w:trPr>
+          <w:tblHeader/>
+        </w:trPr>
+        <w:tc>
+          <w:tcPr>
+            <w:tcW w:w="4680" w:type="dxa"/>
+            <w:shd w:val="clear" w:color="auto" w:fill="F2F2F2"/>
+          </w:tcPr>
+          <w:p>
+            <w:pPr/>
+            <w:r>
               <w:t xml:space="preserve">Field</w:t>
             </w:r>
           </w:p>
@@ -9196,19 +10196,64 @@
         <w:pStyle w:val="ListParagraph"/>
         <w:numPr>
           <w:ilvl w:val="0"/>
-          <w:numId w:val="36"/>
-        </w:numPr>
-      </w:pPr>
-      <w:r>
-        <w:t xml:space="preserve">Click an issue in the list (or its pin in 3D) to open it. In 3D the view flies back to where the author stood, with their section and hidden elements.</w:t>
-      </w:r>
-    </w:p>
-    <w:p>
-      <w:pPr>
-        <w:pStyle w:val="ListParagraph"/>
-        <w:numPr>
-          <w:ilvl w:val="0"/>
-          <w:numId w:val="36"/>
+          <w:numId w:val="40"/>
+        </w:numPr>
+      </w:pPr>
+      <w:r>
+        <w:t xml:space="preserve">Click an issue in the list (or its pin in 3D) to open it. In 3D the view goes back to exactly what the author saw: the same eye and direction, the section box with its turn (or the section plane), hidden elements, parallel or perspective view and the floor plan. </w:t>
+      </w:r>
+      <w:r>
+        <w:rPr>
+          <w:b/>
+        </w:rPr>
+        <w:t xml:space="preserve">Show in view</w:t>
+      </w:r>
+      <w:r>
+        <w:t xml:space="preserve"> and links to the issue do the same.</w:t>
+      </w:r>
+    </w:p>
+    <w:p>
+      <w:pPr>
+        <w:pStyle w:val="ListParagraph"/>
+        <w:numPr>
+          <w:ilvl w:val="0"/>
+          <w:numId w:val="40"/>
+        </w:numPr>
+      </w:pPr>
+      <w:r>
+        <w:rPr>
+          <w:b/>
+        </w:rPr>
+        <w:t xml:space="preserve">In Revit</w:t>
+      </w:r>
+      <w:r>
+        <w:t xml:space="preserve"> (LWK Issues &gt; </w:t>
+      </w:r>
+      <w:r>
+        <w:rPr>
+          <w:b/>
+        </w:rPr>
+        <w:t xml:space="preserve">Go to</w:t>
+      </w:r>
+      <w:r>
+        <w:t xml:space="preserve">): an issue seen through the viewer's normal camera, or raised while walking, opens in a perspective camera view </w:t>
+      </w:r>
+      <w:r>
+        <w:rPr>
+          <w:b/>
+        </w:rPr>
+        <w:t xml:space="preserve">LWK Issue - &lt;you&gt; (camera)</w:t>
+      </w:r>
+      <w:r>
+        <w:t xml:space="preserve"> from the same eye, with the same section box, not a view of the whole building from outside.</w:t>
+      </w:r>
+    </w:p>
+    <w:p>
+      <w:pPr>
+        <w:pStyle w:val="ListParagraph"/>
+        <w:numPr>
+          <w:ilvl w:val="0"/>
+          <w:numId w:val="40"/>
         </w:numPr>
       </w:pPr>
       <w:r>
@@ -9256,7 +10301,7 @@
         <w:pStyle w:val="ListParagraph"/>
         <w:numPr>
           <w:ilvl w:val="0"/>
-          <w:numId w:val="36"/>
+          <w:numId w:val="40"/>
         </w:numPr>
       </w:pPr>
       <w:r>
@@ -9283,7 +10328,7 @@
         <w:pStyle w:val="ListParagraph"/>
         <w:numPr>
           <w:ilvl w:val="0"/>
-          <w:numId w:val="36"/>
+          <w:numId w:val="40"/>
         </w:numPr>
       </w:pPr>
       <w:r>
@@ -9301,7 +10346,7 @@
         <w:pStyle w:val="ListParagraph"/>
         <w:numPr>
           <w:ilvl w:val="0"/>
-          <w:numId w:val="36"/>
+          <w:numId w:val="40"/>
         </w:numPr>
       </w:pPr>
       <w:r>
@@ -9319,7 +10364,7 @@
         <w:pStyle w:val="ListParagraph"/>
         <w:numPr>
           <w:ilvl w:val="0"/>
-          <w:numId w:val="36"/>
+          <w:numId w:val="40"/>
         </w:numPr>
       </w:pPr>
       <w:r>
@@ -9364,7 +10409,7 @@
         <w:pStyle w:val="ListParagraph"/>
         <w:numPr>
           <w:ilvl w:val="0"/>
-          <w:numId w:val="36"/>
+          <w:numId w:val="40"/>
         </w:numPr>
       </w:pPr>
       <w:r>
@@ -9400,7 +10445,7 @@
         <w:pStyle w:val="ListParagraph"/>
         <w:numPr>
           <w:ilvl w:val="0"/>
-          <w:numId w:val="36"/>
+          <w:numId w:val="40"/>
         </w:numPr>
       </w:pPr>
       <w:r>
@@ -9649,7 +10694,7 @@
         <w:pStyle w:val="ListParagraph"/>
         <w:numPr>
           <w:ilvl w:val="0"/>
-          <w:numId w:val="37"/>
+          <w:numId w:val="41"/>
         </w:numPr>
       </w:pPr>
       <w:r>
@@ -9685,7 +10730,7 @@
         <w:pStyle w:val="ListParagraph"/>
         <w:numPr>
           <w:ilvl w:val="0"/>
-          <w:numId w:val="37"/>
+          <w:numId w:val="41"/>
         </w:numPr>
       </w:pPr>
       <w:r>
@@ -9730,7 +10775,7 @@
         <w:pStyle w:val="ListParagraph"/>
         <w:numPr>
           <w:ilvl w:val="0"/>
-          <w:numId w:val="37"/>
+          <w:numId w:val="41"/>
         </w:numPr>
       </w:pPr>
       <w:r>
@@ -9756,7 +10801,7 @@
         <w:pStyle w:val="ListParagraph"/>
         <w:numPr>
           <w:ilvl w:val="0"/>
-          <w:numId w:val="38"/>
+          <w:numId w:val="42"/>
         </w:numPr>
       </w:pPr>
       <w:r>
@@ -9783,7 +10828,7 @@
         <w:pStyle w:val="ListParagraph"/>
         <w:numPr>
           <w:ilvl w:val="0"/>
-          <w:numId w:val="38"/>
+          <w:numId w:val="42"/>
         </w:numPr>
       </w:pPr>
       <w:r>
@@ -9804,7 +10849,7 @@
         <w:pStyle w:val="ListParagraph"/>
         <w:numPr>
           <w:ilvl w:val="0"/>
-          <w:numId w:val="38"/>
+          <w:numId w:val="42"/>
         </w:numPr>
       </w:pPr>
       <w:r>
@@ -9845,7 +10890,7 @@
         <w:pStyle w:val="ListParagraph"/>
         <w:numPr>
           <w:ilvl w:val="0"/>
-          <w:numId w:val="39"/>
+          <w:numId w:val="43"/>
         </w:numPr>
       </w:pPr>
       <w:r>
@@ -9890,7 +10935,7 @@
         <w:pStyle w:val="ListParagraph"/>
         <w:numPr>
           <w:ilvl w:val="0"/>
-          <w:numId w:val="39"/>
+          <w:numId w:val="43"/>
         </w:numPr>
       </w:pPr>
       <w:r>
@@ -9926,7 +10971,7 @@
         <w:pStyle w:val="ListParagraph"/>
         <w:numPr>
           <w:ilvl w:val="0"/>
-          <w:numId w:val="39"/>
+          <w:numId w:val="43"/>
         </w:numPr>
       </w:pPr>
       <w:r>
@@ -9953,7 +10998,7 @@
         <w:pStyle w:val="ListParagraph"/>
         <w:numPr>
           <w:ilvl w:val="0"/>
-          <w:numId w:val="39"/>
+          <w:numId w:val="43"/>
         </w:numPr>
       </w:pPr>
       <w:r>
@@ -10268,7 +11313,7 @@
         <w:pStyle w:val="ListParagraph"/>
         <w:numPr>
           <w:ilvl w:val="0"/>
-          <w:numId w:val="40"/>
+          <w:numId w:val="44"/>
         </w:numPr>
       </w:pPr>
       <w:r>
@@ -10343,7 +11388,7 @@
         <w:pStyle w:val="ListParagraph"/>
         <w:numPr>
           <w:ilvl w:val="0"/>
-          <w:numId w:val="40"/>
+          <w:numId w:val="44"/>
         </w:numPr>
       </w:pPr>
       <w:r>
@@ -10373,7 +11418,7 @@
         <w:pStyle w:val="ListParagraph"/>
         <w:numPr>
           <w:ilvl w:val="0"/>
-          <w:numId w:val="40"/>
+          <w:numId w:val="44"/>
         </w:numPr>
       </w:pPr>
       <w:r>
@@ -10399,7 +11444,7 @@
         <w:pStyle w:val="ListParagraph"/>
         <w:numPr>
           <w:ilvl w:val="0"/>
-          <w:numId w:val="41"/>
+          <w:numId w:val="45"/>
         </w:numPr>
       </w:pPr>
       <w:r>
@@ -10429,7 +11474,7 @@
         <w:pStyle w:val="ListParagraph"/>
         <w:numPr>
           <w:ilvl w:val="0"/>
-          <w:numId w:val="41"/>
+          <w:numId w:val="45"/>
         </w:numPr>
       </w:pPr>
       <w:r>
@@ -10450,7 +11495,7 @@
         <w:pStyle w:val="ListParagraph"/>
         <w:numPr>
           <w:ilvl w:val="0"/>
-          <w:numId w:val="41"/>
+          <w:numId w:val="45"/>
         </w:numPr>
       </w:pPr>
       <w:r>
@@ -10480,7 +11525,7 @@
         <w:pStyle w:val="ListParagraph"/>
         <w:numPr>
           <w:ilvl w:val="0"/>
-          <w:numId w:val="42"/>
+          <w:numId w:val="46"/>
         </w:numPr>
       </w:pPr>
       <w:r>
@@ -10492,7 +11537,7 @@
         <w:pStyle w:val="ListParagraph"/>
         <w:numPr>
           <w:ilvl w:val="0"/>
-          <w:numId w:val="42"/>
+          <w:numId w:val="46"/>
         </w:numPr>
       </w:pPr>
       <w:r>
@@ -10536,7 +11581,7 @@
         <w:pStyle w:val="ListParagraph"/>
         <w:numPr>
           <w:ilvl w:val="0"/>
-          <w:numId w:val="43"/>
+          <w:numId w:val="47"/>
         </w:numPr>
       </w:pPr>
       <w:r>
@@ -10584,7 +11629,7 @@
         <w:pStyle w:val="ListParagraph"/>
         <w:numPr>
           <w:ilvl w:val="0"/>
-          <w:numId w:val="43"/>
+          <w:numId w:val="47"/>
         </w:numPr>
       </w:pPr>
       <w:r>
@@ -10596,7 +11641,7 @@
         <w:pStyle w:val="ListParagraph"/>
         <w:numPr>
           <w:ilvl w:val="0"/>
-          <w:numId w:val="43"/>
+          <w:numId w:val="47"/>
         </w:numPr>
       </w:pPr>
       <w:r>
@@ -10614,7 +11659,7 @@
         <w:pStyle w:val="ListParagraph"/>
         <w:numPr>
           <w:ilvl w:val="0"/>
-          <w:numId w:val="43"/>
+          <w:numId w:val="47"/>
         </w:numPr>
       </w:pPr>
       <w:r>
@@ -10626,7 +11671,7 @@
         <w:pStyle w:val="ListParagraph"/>
         <w:numPr>
           <w:ilvl w:val="0"/>
-          <w:numId w:val="43"/>
+          <w:numId w:val="47"/>
         </w:numPr>
       </w:pPr>
       <w:r>
@@ -10638,7 +11683,7 @@
         <w:pStyle w:val="ListParagraph"/>
         <w:numPr>
           <w:ilvl w:val="0"/>
-          <w:numId w:val="43"/>
+          <w:numId w:val="47"/>
         </w:numPr>
       </w:pPr>
       <w:r>
@@ -10650,7 +11695,7 @@
         <w:pStyle w:val="ListParagraph"/>
         <w:numPr>
           <w:ilvl w:val="0"/>
-          <w:numId w:val="43"/>
+          <w:numId w:val="47"/>
         </w:numPr>
       </w:pPr>
       <w:r>
@@ -10924,7 +11969,7 @@
         <w:pStyle w:val="ListParagraph"/>
         <w:numPr>
           <w:ilvl w:val="0"/>
-          <w:numId w:val="44"/>
+          <w:numId w:val="48"/>
         </w:numPr>
       </w:pPr>
       <w:r>
@@ -10936,7 +11981,7 @@
         <w:pStyle w:val="ListParagraph"/>
         <w:numPr>
           <w:ilvl w:val="0"/>
-          <w:numId w:val="44"/>
+          <w:numId w:val="48"/>
         </w:numPr>
       </w:pPr>
       <w:r>
@@ -10948,7 +11993,7 @@
         <w:pStyle w:val="ListParagraph"/>
         <w:numPr>
           <w:ilvl w:val="0"/>
-          <w:numId w:val="44"/>
+          <w:numId w:val="48"/>
         </w:numPr>
       </w:pPr>
       <w:r>
@@ -11222,7 +12267,7 @@
         <w:pStyle w:val="ListParagraph"/>
         <w:numPr>
           <w:ilvl w:val="0"/>
-          <w:numId w:val="45"/>
+          <w:numId w:val="49"/>
         </w:numPr>
       </w:pPr>
       <w:r>
@@ -11234,7 +12279,7 @@
         <w:pStyle w:val="ListParagraph"/>
         <w:numPr>
           <w:ilvl w:val="0"/>
-          <w:numId w:val="45"/>
+          <w:numId w:val="49"/>
         </w:numPr>
       </w:pPr>
       <w:r>
@@ -11246,7 +12291,7 @@
         <w:pStyle w:val="ListParagraph"/>
         <w:numPr>
           <w:ilvl w:val="0"/>
-          <w:numId w:val="45"/>
+          <w:numId w:val="49"/>
         </w:numPr>
       </w:pPr>
       <w:r>
@@ -11289,7 +12334,7 @@
         <w:pStyle w:val="ListParagraph"/>
         <w:numPr>
           <w:ilvl w:val="0"/>
-          <w:numId w:val="46"/>
+          <w:numId w:val="50"/>
         </w:numPr>
       </w:pPr>
       <w:r>
@@ -11346,7 +12391,7 @@
         <w:pStyle w:val="ListParagraph"/>
         <w:numPr>
           <w:ilvl w:val="0"/>
-          <w:numId w:val="46"/>
+          <w:numId w:val="50"/>
         </w:numPr>
       </w:pPr>
       <w:r>
@@ -11376,7 +12421,7 @@
         <w:pStyle w:val="ListParagraph"/>
         <w:numPr>
           <w:ilvl w:val="0"/>
-          <w:numId w:val="46"/>
+          <w:numId w:val="50"/>
         </w:numPr>
       </w:pPr>
       <w:r>
@@ -11414,7 +12459,7 @@
         <w:pStyle w:val="ListParagraph"/>
         <w:numPr>
           <w:ilvl w:val="0"/>
-          <w:numId w:val="47"/>
+          <w:numId w:val="51"/>
         </w:numPr>
       </w:pPr>
       <w:r>
@@ -11435,7 +12480,7 @@
         <w:pStyle w:val="ListParagraph"/>
         <w:numPr>
           <w:ilvl w:val="0"/>
-          <w:numId w:val="47"/>
+          <w:numId w:val="51"/>
         </w:numPr>
       </w:pPr>
       <w:r>
@@ -11480,7 +12525,7 @@
         <w:pStyle w:val="ListParagraph"/>
         <w:numPr>
           <w:ilvl w:val="0"/>
-          <w:numId w:val="47"/>
+          <w:numId w:val="51"/>
         </w:numPr>
       </w:pPr>
       <w:r>
@@ -11579,7 +12624,7 @@
         <w:pStyle w:val="ListParagraph"/>
         <w:numPr>
           <w:ilvl w:val="0"/>
-          <w:numId w:val="47"/>
+          <w:numId w:val="51"/>
         </w:numPr>
       </w:pPr>
       <w:r>
@@ -11624,7 +12669,7 @@
         <w:pStyle w:val="ListParagraph"/>
         <w:numPr>
           <w:ilvl w:val="0"/>
-          <w:numId w:val="47"/>
+          <w:numId w:val="51"/>
         </w:numPr>
       </w:pPr>
       <w:r>
@@ -11973,7 +13018,7 @@
         <w:pStyle w:val="ListParagraph"/>
         <w:numPr>
           <w:ilvl w:val="0"/>
-          <w:numId w:val="48"/>
+          <w:numId w:val="52"/>
         </w:numPr>
       </w:pPr>
       <w:r>
@@ -12003,7 +13048,7 @@
         <w:pStyle w:val="ListParagraph"/>
         <w:numPr>
           <w:ilvl w:val="0"/>
-          <w:numId w:val="48"/>
+          <w:numId w:val="52"/>
         </w:numPr>
       </w:pPr>
       <w:r>
@@ -12032,7 +13077,7 @@
         <w:pStyle w:val="ListParagraph"/>
         <w:numPr>
           <w:ilvl w:val="0"/>
-          <w:numId w:val="49"/>
+          <w:numId w:val="53"/>
         </w:numPr>
       </w:pPr>
       <w:r>
@@ -12053,7 +13098,7 @@
         <w:pStyle w:val="ListParagraph"/>
         <w:numPr>
           <w:ilvl w:val="0"/>
-          <w:numId w:val="49"/>
+          <w:numId w:val="53"/>
         </w:numPr>
       </w:pPr>
       <w:r>
@@ -12089,7 +13134,7 @@
         <w:pStyle w:val="ListParagraph"/>
         <w:numPr>
           <w:ilvl w:val="0"/>
-          <w:numId w:val="49"/>
+          <w:numId w:val="53"/>
         </w:numPr>
       </w:pPr>
       <w:r>
@@ -12125,7 +13170,7 @@
         <w:pStyle w:val="ListParagraph"/>
         <w:numPr>
           <w:ilvl w:val="0"/>
-          <w:numId w:val="49"/>
+          <w:numId w:val="53"/>
         </w:numPr>
       </w:pPr>
       <w:r>
@@ -12154,7 +13199,7 @@
         <w:pStyle w:val="ListParagraph"/>
         <w:numPr>
           <w:ilvl w:val="0"/>
-          <w:numId w:val="50"/>
+          <w:numId w:val="54"/>
         </w:numPr>
       </w:pPr>
       <w:r>
@@ -12175,7 +13220,7 @@
         <w:pStyle w:val="ListParagraph"/>
         <w:numPr>
           <w:ilvl w:val="0"/>
-          <w:numId w:val="50"/>
+          <w:numId w:val="54"/>
         </w:numPr>
       </w:pPr>
       <w:r>
@@ -12396,7 +13441,7 @@
         <w:pStyle w:val="ListParagraph"/>
         <w:numPr>
           <w:ilvl w:val="0"/>
-          <w:numId w:val="51"/>
+          <w:numId w:val="55"/>
         </w:numPr>
       </w:pPr>
       <w:r>
@@ -12486,7 +13531,7 @@
         <w:pStyle w:val="ListParagraph"/>
         <w:numPr>
           <w:ilvl w:val="0"/>
-          <w:numId w:val="51"/>
+          <w:numId w:val="55"/>
         </w:numPr>
       </w:pPr>
       <w:r>
@@ -12516,7 +13561,7 @@
         <w:pStyle w:val="ListParagraph"/>
         <w:numPr>
           <w:ilvl w:val="0"/>
-          <w:numId w:val="51"/>
+          <w:numId w:val="55"/>
         </w:numPr>
       </w:pPr>
       <w:r>
@@ -12537,7 +13582,7 @@
         <w:pStyle w:val="ListParagraph"/>
         <w:numPr>
           <w:ilvl w:val="0"/>
-          <w:numId w:val="51"/>
+          <w:numId w:val="55"/>
         </w:numPr>
       </w:pPr>
       <w:r>
@@ -12573,7 +13618,7 @@
         <w:pStyle w:val="ListParagraph"/>
         <w:numPr>
           <w:ilvl w:val="0"/>
-          <w:numId w:val="51"/>
+          <w:numId w:val="55"/>
         </w:numPr>
       </w:pPr>
       <w:r>
@@ -12591,7 +13636,7 @@
         <w:pStyle w:val="ListParagraph"/>
         <w:numPr>
           <w:ilvl w:val="0"/>
-          <w:numId w:val="51"/>
+          <w:numId w:val="55"/>
         </w:numPr>
       </w:pPr>
       <w:r>
@@ -12635,7 +13680,7 @@
         <w:pStyle w:val="ListParagraph"/>
         <w:numPr>
           <w:ilvl w:val="0"/>
-          <w:numId w:val="52"/>
+          <w:numId w:val="56"/>
         </w:numPr>
       </w:pPr>
       <w:r>
@@ -12716,7 +13761,7 @@
         <w:pStyle w:val="ListParagraph"/>
         <w:numPr>
           <w:ilvl w:val="0"/>
-          <w:numId w:val="52"/>
+          <w:numId w:val="56"/>
         </w:numPr>
       </w:pPr>
       <w:r>
@@ -12734,7 +13779,7 @@
         <w:pStyle w:val="ListParagraph"/>
         <w:numPr>
           <w:ilvl w:val="0"/>
-          <w:numId w:val="52"/>
+          <w:numId w:val="56"/>
         </w:numPr>
       </w:pPr>
       <w:r>
@@ -12755,7 +13800,7 @@
         <w:pStyle w:val="ListParagraph"/>
         <w:numPr>
           <w:ilvl w:val="0"/>
-          <w:numId w:val="52"/>
+          <w:numId w:val="56"/>
         </w:numPr>
       </w:pPr>
       <w:r>
@@ -12781,7 +13826,7 @@
         <w:pStyle w:val="ListParagraph"/>
         <w:numPr>
           <w:ilvl w:val="0"/>
-          <w:numId w:val="53"/>
+          <w:numId w:val="57"/>
         </w:numPr>
       </w:pPr>
       <w:r>
@@ -12844,7 +13889,7 @@
         <w:pStyle w:val="ListParagraph"/>
         <w:numPr>
           <w:ilvl w:val="0"/>
-          <w:numId w:val="53"/>
+          <w:numId w:val="57"/>
         </w:numPr>
       </w:pPr>
       <w:r>
@@ -12871,7 +13916,7 @@
         <w:pStyle w:val="ListParagraph"/>
         <w:numPr>
           <w:ilvl w:val="0"/>
-          <w:numId w:val="53"/>
+          <w:numId w:val="57"/>
         </w:numPr>
       </w:pPr>
       <w:r>
@@ -12889,7 +13934,7 @@
         <w:pStyle w:val="ListParagraph"/>
         <w:numPr>
           <w:ilvl w:val="0"/>
-          <w:numId w:val="53"/>
+          <w:numId w:val="57"/>
         </w:numPr>
       </w:pPr>
       <w:r>
@@ -13520,7 +14565,7 @@
         <w:pStyle w:val="ListParagraph"/>
         <w:numPr>
           <w:ilvl w:val="0"/>
-          <w:numId w:val="54"/>
+          <w:numId w:val="58"/>
         </w:numPr>
       </w:pPr>
       <w:r>
@@ -13538,7 +14583,7 @@
         <w:pStyle w:val="ListParagraph"/>
         <w:numPr>
           <w:ilvl w:val="0"/>
-          <w:numId w:val="54"/>
+          <w:numId w:val="58"/>
         </w:numPr>
       </w:pPr>
       <w:r>
@@ -13556,7 +14601,7 @@
         <w:pStyle w:val="ListParagraph"/>
         <w:numPr>
           <w:ilvl w:val="0"/>
-          <w:numId w:val="54"/>
+          <w:numId w:val="58"/>
         </w:numPr>
       </w:pPr>
       <w:r>
@@ -13574,7 +14619,7 @@
         <w:pStyle w:val="ListParagraph"/>
         <w:numPr>
           <w:ilvl w:val="0"/>
-          <w:numId w:val="54"/>
+          <w:numId w:val="58"/>
         </w:numPr>
       </w:pPr>
       <w:r>
@@ -13592,7 +14637,7 @@
         <w:pStyle w:val="ListParagraph"/>
         <w:numPr>
           <w:ilvl w:val="0"/>
-          <w:numId w:val="54"/>
+          <w:numId w:val="58"/>
         </w:numPr>
       </w:pPr>
       <w:r>
@@ -13610,7 +14655,7 @@
         <w:pStyle w:val="ListParagraph"/>
         <w:numPr>
           <w:ilvl w:val="0"/>
-          <w:numId w:val="54"/>
+          <w:numId w:val="58"/>
         </w:numPr>
       </w:pPr>
       <w:r>
@@ -14708,7 +15753,7 @@
         <w:pStyle w:val="ListParagraph"/>
         <w:numPr>
           <w:ilvl w:val="0"/>
-          <w:numId w:val="55"/>
+          <w:numId w:val="59"/>
         </w:numPr>
       </w:pPr>
       <w:r>
@@ -14720,7 +15765,7 @@
         <w:pStyle w:val="ListParagraph"/>
         <w:numPr>
           <w:ilvl w:val="0"/>
-          <w:numId w:val="55"/>
+          <w:numId w:val="59"/>
         </w:numPr>
       </w:pPr>
       <w:r>
@@ -14732,7 +15777,7 @@
         <w:pStyle w:val="ListParagraph"/>
         <w:numPr>
           <w:ilvl w:val="0"/>
-          <w:numId w:val="55"/>
+          <w:numId w:val="59"/>
         </w:numPr>
       </w:pPr>
       <w:r>
@@ -14744,7 +15789,7 @@
         <w:pStyle w:val="ListParagraph"/>
         <w:numPr>
           <w:ilvl w:val="0"/>
-          <w:numId w:val="55"/>
+          <w:numId w:val="59"/>
         </w:numPr>
       </w:pPr>
       <w:r>
@@ -14756,7 +15801,7 @@
         <w:pStyle w:val="ListParagraph"/>
         <w:numPr>
           <w:ilvl w:val="0"/>
-          <w:numId w:val="55"/>
+          <w:numId w:val="59"/>
         </w:numPr>
       </w:pPr>
       <w:r>
@@ -14777,7 +15822,7 @@
         <w:pStyle w:val="ListParagraph"/>
         <w:numPr>
           <w:ilvl w:val="0"/>
-          <w:numId w:val="55"/>
+          <w:numId w:val="59"/>
         </w:numPr>
       </w:pPr>
       <w:r>
@@ -14789,7 +15834,7 @@
         <w:pStyle w:val="ListParagraph"/>
         <w:numPr>
           <w:ilvl w:val="0"/>
-          <w:numId w:val="55"/>
+          <w:numId w:val="59"/>
         </w:numPr>
       </w:pPr>
       <w:r>
@@ -14810,7 +15855,7 @@
         <w:pStyle w:val="ListParagraph"/>
         <w:numPr>
           <w:ilvl w:val="0"/>
-          <w:numId w:val="55"/>
+          <w:numId w:val="59"/>
         </w:numPr>
       </w:pPr>
       <w:r>
@@ -14822,7 +15867,7 @@
         <w:pStyle w:val="ListParagraph"/>
         <w:numPr>
           <w:ilvl w:val="0"/>
-          <w:numId w:val="55"/>
+          <w:numId w:val="59"/>
         </w:numPr>
       </w:pPr>
       <w:r>
@@ -14834,7 +15879,7 @@
         <w:pStyle w:val="ListParagraph"/>
         <w:numPr>
           <w:ilvl w:val="0"/>
-          <w:numId w:val="55"/>
+          <w:numId w:val="59"/>
         </w:numPr>
       </w:pPr>
       <w:r>
@@ -14846,7 +15891,7 @@
         <w:pStyle w:val="ListParagraph"/>
         <w:numPr>
           <w:ilvl w:val="0"/>
-          <w:numId w:val="55"/>
+          <w:numId w:val="59"/>
         </w:numPr>
       </w:pPr>
       <w:r>
@@ -14858,7 +15903,7 @@
         <w:pStyle w:val="ListParagraph"/>
         <w:numPr>
           <w:ilvl w:val="0"/>
-          <w:numId w:val="55"/>
+          <w:numId w:val="59"/>
         </w:numPr>
       </w:pPr>
       <w:r>
@@ -14870,7 +15915,7 @@
         <w:pStyle w:val="ListParagraph"/>
         <w:numPr>
           <w:ilvl w:val="0"/>
-          <w:numId w:val="55"/>
+          <w:numId w:val="59"/>
         </w:numPr>
       </w:pPr>
       <w:r>
@@ -14882,7 +15927,7 @@
         <w:pStyle w:val="ListParagraph"/>
         <w:numPr>
           <w:ilvl w:val="0"/>
-          <w:numId w:val="55"/>
+          <w:numId w:val="59"/>
         </w:numPr>
       </w:pPr>
       <w:r>
@@ -15167,7 +16212,7 @@
     <w:abstractNumId w:val="0"/>
   </w:num>
   <w:num w:numId="32">
-    <w:abstractNumId w:val="1"/>
+    <w:abstractNumId w:val="0"/>
   </w:num>
   <w:num w:numId="33">
     <w:abstractNumId w:val="0"/>
@@ -15176,7 +16221,7 @@
     <w:abstractNumId w:val="0"/>
   </w:num>
   <w:num w:numId="35">
-    <w:abstractNumId w:val="0"/>
+    <w:abstractNumId w:val="1"/>
   </w:num>
   <w:num w:numId="36">
     <w:abstractNumId w:val="0"/>
@@ -15194,7 +16239,7 @@
     <w:abstractNumId w:val="0"/>
   </w:num>
   <w:num w:numId="41">
-    <w:abstractNumId w:val="1"/>
+    <w:abstractNumId w:val="0"/>
   </w:num>
   <w:num w:numId="42">
     <w:abstractNumId w:val="0"/>
@@ -15206,13 +16251,13 @@
     <w:abstractNumId w:val="0"/>
   </w:num>
   <w:num w:numId="45">
-    <w:abstractNumId w:val="0"/>
+    <w:abstractNumId w:val="1"/>
   </w:num>
   <w:num w:numId="46">
     <w:abstractNumId w:val="0"/>
   </w:num>
   <w:num w:numId="47">
-    <w:abstractNumId w:val="1"/>
+    <w:abstractNumId w:val="0"/>
   </w:num>
   <w:num w:numId="48">
     <w:abstractNumId w:val="0"/>
@@ -15224,7 +16269,7 @@
     <w:abstractNumId w:val="0"/>
   </w:num>
   <w:num w:numId="51">
-    <w:abstractNumId w:val="0"/>
+    <w:abstractNumId w:val="1"/>
   </w:num>
   <w:num w:numId="52">
     <w:abstractNumId w:val="0"/>
@@ -15236,6 +16281,18 @@
     <w:abstractNumId w:val="0"/>
   </w:num>
   <w:num w:numId="55">
+    <w:abstractNumId w:val="0"/>
+  </w:num>
+  <w:num w:numId="56">
+    <w:abstractNumId w:val="0"/>
+  </w:num>
+  <w:num w:numId="57">
+    <w:abstractNumId w:val="0"/>
+  </w:num>
+  <w:num w:numId="58">
+    <w:abstractNumId w:val="0"/>
+  </w:num>
+  <w:num w:numId="59">
     <w:abstractNumId w:val="0"/>
   </w:num>
 </w:numbering>

</xml_diff>

<commit_message>
Folders: 00 BIM - each project's sheets and 3D models, read-only
Every project's folder starts with a locked '00 BIM' folder built from
what the viewer holds, always up to date and nothing copied:
- 2D Sheets: the Revit sheets (named by number and name) and the PDF
  sets uploaded on the Sheets page, to preview and download;
- 3D Models: open on the 3D page; IFC files (IFC projects, consultant
  models) can be downloaded;
- a project with several parts gets a folder per part.
Everyone in the project can open and download there. Upload, new
folder, rename, move, delete, pin and star are refused by the server
(and hidden on the page); nothing else can be named 00 BIM.

Co-Authored-By: Claude Opus 5.5 <noreply@anthropic.com>
Claude-Session: https://claude.ai/code/session_01HMFznQ3NqvEPBkq88avjvR
</commit_message>
<xml_diff>
--- a/docs/manual/LWK_Viewer_User_Manual_EN.docx
+++ b/docs/manual/LWK_Viewer_User_Manual_EN.docx
@@ -5555,6 +5555,36 @@
       </w:r>
       <w:r>
         <w:t xml:space="preserve"> holds each project's files in a folder on the server, like ACC Docs or a shared drive. Pick the project at the top left.</w:t>
+      </w:r>
+    </w:p>
+    <w:p>
+      <w:pPr/>
+      <w:r>
+        <w:rPr>
+          <w:b/>
+        </w:rPr>
+        <w:t xml:space="preserve">00 BIM</w:t>
+      </w:r>
+      <w:r>
+        <w:t xml:space="preserve"> (🔒, always first) holds what the viewer has for the project, always up to date: </w:t>
+      </w:r>
+      <w:r>
+        <w:rPr>
+          <w:b/>
+        </w:rPr>
+        <w:t xml:space="preserve">2D Sheets</w:t>
+      </w:r>
+      <w:r>
+        <w:t xml:space="preserve"> (the sheets exported from Revit, named by number and name, and the PDF sets uploaded on the Sheets page) and </w:t>
+      </w:r>
+      <w:r>
+        <w:rPr>
+          <w:b/>
+        </w:rPr>
+        <w:t xml:space="preserve">3D Models</w:t>
+      </w:r>
+      <w:r>
+        <w:t xml:space="preserve"> (opened on the 3D page; IFC files - IFC projects and consultant models - can be downloaded). Everyone in the project can open and download there; nobody can add, rename, move or delete. A project with several parts has a folder per part.</w:t>
       </w:r>
     </w:p>
     <w:p>

</xml_diff>

<commit_message>
Night export: answer 'Elements Lost on Import' (Revit 2023 test run)
The dialog says 'Some elements were lost during import. ActiveX and
some proprietary components cannot be imported' - the rules knew only
'some entities were lost'. Now matched by its title and wording, both
in Revit (DialogBoxShowing) and in the launcher's watcher (Close).
The watcher also logs the Revit it found and, every 10 minutes, how
many dialogs it has looked at and pressed.

Co-Authored-By: Claude Opus 5.5 <noreply@anthropic.com>
Claude-Session: https://claude.ai/code/session_01HMFznQ3NqvEPBkq88avjvR
</commit_message>
<xml_diff>
--- a/docs/manual/LWK_Viewer_User_Manual_EN.docx
+++ b/docs/manual/LWK_Viewer_User_Manual_EN.docx
@@ -13661,7 +13661,16 @@
         <w:t xml:space="preserve">extents greater than 1E9</w:t>
       </w:r>
       <w:r>
-        <w:t xml:space="preserve"> (OK: it is imported without the far part), DWG import notes (Close), </w:t>
+        <w:t xml:space="preserve"> (OK: it is imported without the far part), DWG import notes such as </w:t>
+      </w:r>
+      <w:r>
+        <w:rPr>
+          <w:b/>
+        </w:rPr>
+        <w:t xml:space="preserve">Elements Lost on Import</w:t>
+      </w:r>
+      <w:r>
+        <w:t xml:space="preserve"> (Close), </w:t>
       </w:r>
       <w:r>
         <w:rPr>

</xml_diff>

<commit_message>
Help: the user manual inside the viewer (docsify), from the same source
- docs/manual/build_markdown.py writes the manual as web pages - one
  per chapter, English and Cantonese, a sidebar each - into viewer/help/,
  from the same content as the Word manuals; build_manual.py runs it, so
  one command makes both.
- viewer/help/index.html shows them with docsify (vendored in
  vendor/docsify, MIT, no CDN): search, English / Cantonese switch that
  keeps the page, LWK colours, works on phones.
- A '?' in every page's header opens the chapter for that page.

Co-Authored-By: Claude Opus 5.5 <noreply@anthropic.com>
Claude-Session: https://claude.ai/code/session_01HMFznQ3NqvEPBkq88avjvR
</commit_message>
<xml_diff>
--- a/docs/manual/LWK_Viewer_User_Manual_EN.docx
+++ b/docs/manual/LWK_Viewer_User_Manual_EN.docx
@@ -488,6 +488,27 @@
       <w:pPr/>
       <w:r>
         <w:t xml:space="preserve">You need an account, a supported browser and the viewer's web address; nothing is installed on your computer.</w:t>
+      </w:r>
+    </w:p>
+    <w:p>
+      <w:pPr/>
+      <w:r>
+        <w:rPr>
+          <w:b/>
+        </w:rPr>
+        <w:t xml:space="preserve">This manual is also online:</w:t>
+      </w:r>
+      <w:r>
+        <w:t xml:space="preserve"> the </w:t>
+      </w:r>
+      <w:r>
+        <w:rPr>
+          <w:b/>
+        </w:rPr>
+        <w:t xml:space="preserve">?</w:t>
+      </w:r>
+      <w:r>
+        <w:t xml:space="preserve"> at the top of every page opens it in the viewer at the chapter for that page, with search and English / 廣東話. It is always the latest version.</w:t>
       </w:r>
     </w:p>
     <w:p>

</xml_diff>

<commit_message>
Revert "Help: the user manual inside the viewer (docsify), from the same source"
This reverts commit b60ce37cd7717a694c289c6c194c2e8b41ae8125.
</commit_message>
<xml_diff>
--- a/docs/manual/LWK_Viewer_User_Manual_EN.docx
+++ b/docs/manual/LWK_Viewer_User_Manual_EN.docx
@@ -488,27 +488,6 @@
       <w:pPr/>
       <w:r>
         <w:t xml:space="preserve">You need an account, a supported browser and the viewer's web address; nothing is installed on your computer.</w:t>
-      </w:r>
-    </w:p>
-    <w:p>
-      <w:pPr/>
-      <w:r>
-        <w:rPr>
-          <w:b/>
-        </w:rPr>
-        <w:t xml:space="preserve">This manual is also online:</w:t>
-      </w:r>
-      <w:r>
-        <w:t xml:space="preserve"> the </w:t>
-      </w:r>
-      <w:r>
-        <w:rPr>
-          <w:b/>
-        </w:rPr>
-        <w:t xml:space="preserve">?</w:t>
-      </w:r>
-      <w:r>
-        <w:t xml:space="preserve"> at the top of every page opens it in the viewer at the chapter for that page, with search and English / 廣東話. It is always the latest version.</w:t>
       </w:r>
     </w:p>
     <w:p>

</xml_diff>

<commit_message>
Manuals: Look, links and what's new (dark mode, Copy link, What's new, folding sections, lists that keep your place)
Co-Authored-By: Claude Opus 5.5 <noreply@anthropic.com>
Claude-Session: https://claude.ai/code/session_01HMFznQ3NqvEPBkq88avjvR
</commit_message>
<xml_diff>
--- a/docs/manual/LWK_Viewer_User_Manual_EN.docx
+++ b/docs/manual/LWK_Viewer_User_Manual_EN.docx
@@ -5237,6 +5237,236 @@
         <w:pStyle w:val="Heading2"/>
       </w:pPr>
       <w:r>
+        <w:t xml:space="preserve">Look, links and what's new</w:t>
+      </w:r>
+    </w:p>
+    <w:p>
+      <w:pPr/>
+      <w:r>
+        <w:t xml:space="preserve">Small things that make the viewer easier to find your way around and to share.</w:t>
+      </w:r>
+    </w:p>
+    <w:p>
+      <w:pPr>
+        <w:pStyle w:val="ListParagraph"/>
+        <w:numPr>
+          <w:ilvl w:val="0"/>
+          <w:numId w:val="21"/>
+        </w:numPr>
+      </w:pPr>
+      <w:r>
+        <w:rPr>
+          <w:b/>
+        </w:rPr>
+        <w:t xml:space="preserve">Dark mode:</w:t>
+      </w:r>
+      <w:r>
+        <w:t xml:space="preserve"> the bell &gt; </w:t>
+      </w:r>
+      <w:r>
+        <w:rPr>
+          <w:b/>
+        </w:rPr>
+        <w:t xml:space="preserve">Look</w:t>
+      </w:r>
+      <w:r>
+        <w:t xml:space="preserve"> &gt; </w:t>
+      </w:r>
+      <w:r>
+        <w:rPr>
+          <w:b/>
+        </w:rPr>
+        <w:t xml:space="preserve">Dark</w:t>
+      </w:r>
+      <w:r>
+        <w:t xml:space="preserve">. </w:t>
+      </w:r>
+      <w:r>
+        <w:rPr>
+          <w:b/>
+        </w:rPr>
+        <w:t xml:space="preserve">Auto</w:t>
+      </w:r>
+      <w:r>
+        <w:t xml:space="preserve"> follows your computer or phone (dark at night if it is set so); </w:t>
+      </w:r>
+      <w:r>
+        <w:rPr>
+          <w:b/>
+        </w:rPr>
+        <w:t xml:space="preserve">Light</w:t>
+      </w:r>
+      <w:r>
+        <w:t xml:space="preserve"> is the usual look. It is kept on each computer or phone. Drawings, PDFs, document previews and the whiteboard stay white, as paper; the 3D background turns dark grey unless you picked a colour in Display.</w:t>
+      </w:r>
+    </w:p>
+    <w:p>
+      <w:pPr>
+        <w:pStyle w:val="ListParagraph"/>
+        <w:numPr>
+          <w:ilvl w:val="0"/>
+          <w:numId w:val="21"/>
+        </w:numPr>
+      </w:pPr>
+      <w:r>
+        <w:rPr>
+          <w:b/>
+        </w:rPr>
+        <w:t xml:space="preserve">What's new:</w:t>
+      </w:r>
+      <w:r>
+        <w:t xml:space="preserve"> after each update a small card lists what changed, once. </w:t>
+      </w:r>
+      <w:r>
+        <w:rPr>
+          <w:b/>
+        </w:rPr>
+        <w:t xml:space="preserve">Got it</w:t>
+      </w:r>
+      <w:r>
+        <w:t xml:space="preserve"> closes it; the bell &gt; </w:t>
+      </w:r>
+      <w:r>
+        <w:rPr>
+          <w:b/>
+        </w:rPr>
+        <w:t xml:space="preserve">What's new in the viewer</w:t>
+      </w:r>
+      <w:r>
+        <w:t xml:space="preserve"> shows the whole list at any time.</w:t>
+      </w:r>
+    </w:p>
+    <w:p>
+      <w:pPr>
+        <w:pStyle w:val="ListParagraph"/>
+        <w:numPr>
+          <w:ilvl w:val="0"/>
+          <w:numId w:val="21"/>
+        </w:numPr>
+      </w:pPr>
+      <w:r>
+        <w:rPr>
+          <w:b/>
+        </w:rPr>
+        <w:t xml:space="preserve">Copy link</w:t>
+      </w:r>
+      <w:r>
+        <w:t xml:space="preserve"> (the 🔗 buttons) copies an address to paste into a chat or an email. Only people in the project can open it.</w:t>
+      </w:r>
+    </w:p>
+    <w:p>
+      <w:pPr>
+        <w:pStyle w:val="ListParagraph"/>
+        <w:numPr>
+          <w:ilvl w:val="0"/>
+          <w:numId w:val="21"/>
+        </w:numPr>
+      </w:pPr>
+      <w:r>
+        <w:rPr>
+          <w:b/>
+        </w:rPr>
+        <w:t xml:space="preserve">A sheet:</w:t>
+      </w:r>
+      <w:r>
+        <w:t xml:space="preserve"> the 🔗 in the sheet toolbar. </w:t>
+      </w:r>
+      <w:r>
+        <w:rPr>
+          <w:b/>
+        </w:rPr>
+        <w:t xml:space="preserve">An issue:</w:t>
+      </w:r>
+      <w:r>
+        <w:t xml:space="preserve"> the 🔗 at the top of the issue (2D or 3D). </w:t>
+      </w:r>
+      <w:r>
+        <w:rPr>
+          <w:b/>
+        </w:rPr>
+        <w:t xml:space="preserve">A project:</w:t>
+      </w:r>
+      <w:r>
+        <w:t xml:space="preserve"> the 🔗 on the project's panel (Projects page). </w:t>
+      </w:r>
+      <w:r>
+        <w:rPr>
+          <w:b/>
+        </w:rPr>
+        <w:t xml:space="preserve">A 3D view:</w:t>
+      </w:r>
+      <w:r>
+        <w:t xml:space="preserve"> the 🔗 next to </w:t>
+      </w:r>
+      <w:r>
+        <w:rPr>
+          <w:b/>
+        </w:rPr>
+        <w:t xml:space="preserve">Fit</w:t>
+      </w:r>
+      <w:r>
+        <w:t xml:space="preserve"> in the 3D header copies the exact view - camera, section box or plane, floor, display mode and hidden elements - and whoever opens it sees the same.</w:t>
+      </w:r>
+    </w:p>
+    <w:p>
+      <w:pPr>
+        <w:pStyle w:val="ListParagraph"/>
+        <w:numPr>
+          <w:ilvl w:val="0"/>
+          <w:numId w:val="21"/>
+        </w:numPr>
+      </w:pPr>
+      <w:r>
+        <w:rPr>
+          <w:b/>
+        </w:rPr>
+        <w:t xml:space="preserve">Sections fold:</w:t>
+      </w:r>
+      <w:r>
+        <w:t xml:space="preserve"> click a heading on a project's panel (Projects page), on the Admin page or in the 3D left panel to fold or open it. The viewer remembers which ones you folded.</w:t>
+      </w:r>
+    </w:p>
+    <w:p>
+      <w:pPr>
+        <w:pStyle w:val="ListParagraph"/>
+        <w:numPr>
+          <w:ilvl w:val="0"/>
+          <w:numId w:val="21"/>
+        </w:numPr>
+      </w:pPr>
+      <w:r>
+        <w:rPr>
+          <w:b/>
+        </w:rPr>
+        <w:t xml:space="preserve">Lists keep your place:</w:t>
+      </w:r>
+      <w:r>
+        <w:t xml:space="preserve"> Folders reopens the folders you had open in the tree, and the sheet list and the chat list keep the one you are on in view.</w:t>
+      </w:r>
+    </w:p>
+    <w:p>
+      <w:pPr>
+        <w:pStyle w:val="ListParagraph"/>
+        <w:numPr>
+          <w:ilvl w:val="0"/>
+          <w:numId w:val="21"/>
+        </w:numPr>
+      </w:pPr>
+      <w:r>
+        <w:rPr>
+          <w:b/>
+        </w:rPr>
+        <w:t xml:space="preserve">While a list loads</w:t>
+      </w:r>
+      <w:r>
+        <w:t xml:space="preserve"> grey placeholder rows show where it will be.</w:t>
+      </w:r>
+    </w:p>
+    <w:p>
+      <w:pPr>
+        <w:pStyle w:val="Heading2"/>
+      </w:pPr>
+      <w:r>
         <w:t xml:space="preserve">Undo</w:t>
       </w:r>
     </w:p>
@@ -5245,7 +5475,7 @@
         <w:pStyle w:val="ListParagraph"/>
         <w:numPr>
           <w:ilvl w:val="0"/>
-          <w:numId w:val="21"/>
+          <w:numId w:val="22"/>
         </w:numPr>
       </w:pPr>
       <w:r>
@@ -5281,7 +5511,7 @@
         <w:pStyle w:val="ListParagraph"/>
         <w:numPr>
           <w:ilvl w:val="0"/>
-          <w:numId w:val="21"/>
+          <w:numId w:val="22"/>
         </w:numPr>
       </w:pPr>
       <w:r>
@@ -5299,7 +5529,7 @@
         <w:pStyle w:val="ListParagraph"/>
         <w:numPr>
           <w:ilvl w:val="0"/>
-          <w:numId w:val="21"/>
+          <w:numId w:val="22"/>
         </w:numPr>
       </w:pPr>
       <w:r>
@@ -5317,7 +5547,7 @@
         <w:pStyle w:val="ListParagraph"/>
         <w:numPr>
           <w:ilvl w:val="0"/>
-          <w:numId w:val="21"/>
+          <w:numId w:val="22"/>
         </w:numPr>
       </w:pPr>
       <w:r>
@@ -5335,7 +5565,7 @@
         <w:pStyle w:val="ListParagraph"/>
         <w:numPr>
           <w:ilvl w:val="0"/>
-          <w:numId w:val="21"/>
+          <w:numId w:val="22"/>
         </w:numPr>
       </w:pPr>
       <w:r>
@@ -5445,7 +5675,7 @@
         <w:pStyle w:val="ListParagraph"/>
         <w:numPr>
           <w:ilvl w:val="0"/>
-          <w:numId w:val="22"/>
+          <w:numId w:val="23"/>
         </w:numPr>
       </w:pPr>
       <w:r>
@@ -5490,7 +5720,7 @@
         <w:pStyle w:val="ListParagraph"/>
         <w:numPr>
           <w:ilvl w:val="0"/>
-          <w:numId w:val="22"/>
+          <w:numId w:val="23"/>
         </w:numPr>
       </w:pPr>
       <w:r>
@@ -5544,7 +5774,7 @@
         <w:pStyle w:val="ListParagraph"/>
         <w:numPr>
           <w:ilvl w:val="0"/>
-          <w:numId w:val="22"/>
+          <w:numId w:val="23"/>
         </w:numPr>
       </w:pPr>
       <w:r>
@@ -5589,7 +5819,7 @@
         <w:pStyle w:val="ListParagraph"/>
         <w:numPr>
           <w:ilvl w:val="0"/>
-          <w:numId w:val="22"/>
+          <w:numId w:val="23"/>
         </w:numPr>
       </w:pPr>
       <w:r>
@@ -5649,7 +5879,7 @@
         <w:pStyle w:val="ListParagraph"/>
         <w:numPr>
           <w:ilvl w:val="0"/>
-          <w:numId w:val="23"/>
+          <w:numId w:val="24"/>
         </w:numPr>
       </w:pPr>
       <w:r>
@@ -5676,7 +5906,7 @@
         <w:pStyle w:val="ListParagraph"/>
         <w:numPr>
           <w:ilvl w:val="0"/>
-          <w:numId w:val="23"/>
+          <w:numId w:val="24"/>
         </w:numPr>
       </w:pPr>
       <w:r>
@@ -5712,7 +5942,7 @@
         <w:pStyle w:val="ListParagraph"/>
         <w:numPr>
           <w:ilvl w:val="0"/>
-          <w:numId w:val="23"/>
+          <w:numId w:val="24"/>
         </w:numPr>
       </w:pPr>
       <w:r>
@@ -5784,7 +6014,7 @@
         <w:pStyle w:val="ListParagraph"/>
         <w:numPr>
           <w:ilvl w:val="0"/>
-          <w:numId w:val="23"/>
+          <w:numId w:val="24"/>
         </w:numPr>
       </w:pPr>
       <w:r>
@@ -5820,7 +6050,7 @@
         <w:pStyle w:val="ListParagraph"/>
         <w:numPr>
           <w:ilvl w:val="0"/>
-          <w:numId w:val="23"/>
+          <w:numId w:val="24"/>
         </w:numPr>
       </w:pPr>
       <w:r>
@@ -5856,7 +6086,7 @@
         <w:pStyle w:val="ListParagraph"/>
         <w:numPr>
           <w:ilvl w:val="0"/>
-          <w:numId w:val="23"/>
+          <w:numId w:val="24"/>
         </w:numPr>
       </w:pPr>
       <w:r>
@@ -5892,7 +6122,7 @@
         <w:pStyle w:val="ListParagraph"/>
         <w:numPr>
           <w:ilvl w:val="0"/>
-          <w:numId w:val="23"/>
+          <w:numId w:val="24"/>
         </w:numPr>
       </w:pPr>
       <w:r>
@@ -5919,7 +6149,7 @@
         <w:pStyle w:val="ListParagraph"/>
         <w:numPr>
           <w:ilvl w:val="0"/>
-          <w:numId w:val="23"/>
+          <w:numId w:val="24"/>
         </w:numPr>
       </w:pPr>
       <w:r>
@@ -5953,7 +6183,7 @@
         <w:pStyle w:val="ListParagraph"/>
         <w:numPr>
           <w:ilvl w:val="0"/>
-          <w:numId w:val="24"/>
+          <w:numId w:val="25"/>
         </w:numPr>
       </w:pPr>
       <w:r>
@@ -5974,7 +6204,7 @@
         <w:pStyle w:val="ListParagraph"/>
         <w:numPr>
           <w:ilvl w:val="0"/>
-          <w:numId w:val="24"/>
+          <w:numId w:val="25"/>
         </w:numPr>
       </w:pPr>
       <w:r>
@@ -5986,7 +6216,7 @@
         <w:pStyle w:val="ListParagraph"/>
         <w:numPr>
           <w:ilvl w:val="0"/>
-          <w:numId w:val="24"/>
+          <w:numId w:val="25"/>
         </w:numPr>
       </w:pPr>
       <w:r>
@@ -6004,7 +6234,7 @@
         <w:pStyle w:val="ListParagraph"/>
         <w:numPr>
           <w:ilvl w:val="0"/>
-          <w:numId w:val="24"/>
+          <w:numId w:val="25"/>
         </w:numPr>
       </w:pPr>
       <w:r>
@@ -6022,7 +6252,7 @@
         <w:pStyle w:val="ListParagraph"/>
         <w:numPr>
           <w:ilvl w:val="0"/>
-          <w:numId w:val="24"/>
+          <w:numId w:val="25"/>
         </w:numPr>
       </w:pPr>
       <w:r>
@@ -6356,7 +6586,7 @@
         <w:pStyle w:val="ListParagraph"/>
         <w:numPr>
           <w:ilvl w:val="0"/>
-          <w:numId w:val="25"/>
+          <w:numId w:val="26"/>
         </w:numPr>
       </w:pPr>
       <w:r>
@@ -6374,7 +6604,7 @@
         <w:pStyle w:val="ListParagraph"/>
         <w:numPr>
           <w:ilvl w:val="0"/>
-          <w:numId w:val="25"/>
+          <w:numId w:val="26"/>
         </w:numPr>
       </w:pPr>
       <w:r>
@@ -6401,7 +6631,7 @@
         <w:pStyle w:val="ListParagraph"/>
         <w:numPr>
           <w:ilvl w:val="0"/>
-          <w:numId w:val="25"/>
+          <w:numId w:val="26"/>
         </w:numPr>
       </w:pPr>
       <w:r>
@@ -6428,7 +6658,7 @@
         <w:pStyle w:val="ListParagraph"/>
         <w:numPr>
           <w:ilvl w:val="0"/>
-          <w:numId w:val="25"/>
+          <w:numId w:val="26"/>
         </w:numPr>
       </w:pPr>
       <w:r>
@@ -6675,7 +6905,7 @@
         <w:pStyle w:val="ListParagraph"/>
         <w:numPr>
           <w:ilvl w:val="0"/>
-          <w:numId w:val="26"/>
+          <w:numId w:val="27"/>
         </w:numPr>
       </w:pPr>
       <w:r>
@@ -6702,7 +6932,7 @@
         <w:pStyle w:val="ListParagraph"/>
         <w:numPr>
           <w:ilvl w:val="0"/>
-          <w:numId w:val="26"/>
+          <w:numId w:val="27"/>
         </w:numPr>
       </w:pPr>
       <w:r>
@@ -6720,7 +6950,7 @@
         <w:pStyle w:val="ListParagraph"/>
         <w:numPr>
           <w:ilvl w:val="0"/>
-          <w:numId w:val="26"/>
+          <w:numId w:val="27"/>
         </w:numPr>
       </w:pPr>
       <w:r>
@@ -6738,7 +6968,7 @@
         <w:pStyle w:val="ListParagraph"/>
         <w:numPr>
           <w:ilvl w:val="0"/>
-          <w:numId w:val="26"/>
+          <w:numId w:val="27"/>
         </w:numPr>
       </w:pPr>
       <w:r>
@@ -6801,7 +7031,7 @@
         <w:pStyle w:val="ListParagraph"/>
         <w:numPr>
           <w:ilvl w:val="0"/>
-          <w:numId w:val="26"/>
+          <w:numId w:val="27"/>
         </w:numPr>
       </w:pPr>
       <w:r>
@@ -6827,7 +7057,7 @@
         <w:pStyle w:val="ListParagraph"/>
         <w:numPr>
           <w:ilvl w:val="0"/>
-          <w:numId w:val="27"/>
+          <w:numId w:val="28"/>
         </w:numPr>
       </w:pPr>
       <w:r>
@@ -6863,7 +7093,7 @@
         <w:pStyle w:val="ListParagraph"/>
         <w:numPr>
           <w:ilvl w:val="0"/>
-          <w:numId w:val="27"/>
+          <w:numId w:val="28"/>
         </w:numPr>
       </w:pPr>
       <w:r>
@@ -6881,7 +7111,7 @@
         <w:pStyle w:val="ListParagraph"/>
         <w:numPr>
           <w:ilvl w:val="0"/>
-          <w:numId w:val="27"/>
+          <w:numId w:val="28"/>
         </w:numPr>
       </w:pPr>
       <w:r>
@@ -7482,7 +7712,7 @@
         <w:pStyle w:val="ListParagraph"/>
         <w:numPr>
           <w:ilvl w:val="0"/>
-          <w:numId w:val="28"/>
+          <w:numId w:val="29"/>
         </w:numPr>
       </w:pPr>
       <w:r>
@@ -7521,7 +7751,7 @@
         <w:pStyle w:val="ListParagraph"/>
         <w:numPr>
           <w:ilvl w:val="0"/>
-          <w:numId w:val="28"/>
+          <w:numId w:val="29"/>
         </w:numPr>
       </w:pPr>
       <w:r>
@@ -7542,7 +7772,7 @@
         <w:pStyle w:val="ListParagraph"/>
         <w:numPr>
           <w:ilvl w:val="0"/>
-          <w:numId w:val="28"/>
+          <w:numId w:val="29"/>
         </w:numPr>
       </w:pPr>
       <w:r>
@@ -7560,7 +7790,7 @@
         <w:pStyle w:val="ListParagraph"/>
         <w:numPr>
           <w:ilvl w:val="0"/>
-          <w:numId w:val="28"/>
+          <w:numId w:val="29"/>
         </w:numPr>
       </w:pPr>
       <w:r>
@@ -7595,7 +7825,7 @@
         <w:pStyle w:val="ListParagraph"/>
         <w:numPr>
           <w:ilvl w:val="0"/>
-          <w:numId w:val="29"/>
+          <w:numId w:val="30"/>
         </w:numPr>
       </w:pPr>
       <w:r>
@@ -7625,7 +7855,7 @@
         <w:pStyle w:val="ListParagraph"/>
         <w:numPr>
           <w:ilvl w:val="0"/>
-          <w:numId w:val="29"/>
+          <w:numId w:val="30"/>
         </w:numPr>
       </w:pPr>
       <w:r>
@@ -7637,7 +7867,7 @@
         <w:pStyle w:val="ListParagraph"/>
         <w:numPr>
           <w:ilvl w:val="0"/>
-          <w:numId w:val="29"/>
+          <w:numId w:val="30"/>
         </w:numPr>
       </w:pPr>
       <w:r>
@@ -7664,7 +7894,7 @@
         <w:pStyle w:val="ListParagraph"/>
         <w:numPr>
           <w:ilvl w:val="0"/>
-          <w:numId w:val="29"/>
+          <w:numId w:val="30"/>
         </w:numPr>
       </w:pPr>
       <w:r>
@@ -7690,7 +7920,7 @@
         <w:pStyle w:val="ListParagraph"/>
         <w:numPr>
           <w:ilvl w:val="0"/>
-          <w:numId w:val="30"/>
+          <w:numId w:val="31"/>
         </w:numPr>
       </w:pPr>
       <w:r>
@@ -7711,7 +7941,7 @@
         <w:pStyle w:val="ListParagraph"/>
         <w:numPr>
           <w:ilvl w:val="0"/>
-          <w:numId w:val="30"/>
+          <w:numId w:val="31"/>
         </w:numPr>
       </w:pPr>
       <w:r>
@@ -7738,7 +7968,7 @@
         <w:pStyle w:val="ListParagraph"/>
         <w:numPr>
           <w:ilvl w:val="0"/>
-          <w:numId w:val="30"/>
+          <w:numId w:val="31"/>
         </w:numPr>
       </w:pPr>
       <w:r>
@@ -7756,7 +7986,7 @@
         <w:pStyle w:val="ListParagraph"/>
         <w:numPr>
           <w:ilvl w:val="0"/>
-          <w:numId w:val="30"/>
+          <w:numId w:val="31"/>
         </w:numPr>
       </w:pPr>
       <w:r>
@@ -7774,7 +8004,7 @@
         <w:pStyle w:val="ListParagraph"/>
         <w:numPr>
           <w:ilvl w:val="0"/>
-          <w:numId w:val="30"/>
+          <w:numId w:val="31"/>
         </w:numPr>
       </w:pPr>
       <w:r>
@@ -7895,7 +8125,7 @@
         <w:pStyle w:val="ListParagraph"/>
         <w:numPr>
           <w:ilvl w:val="0"/>
-          <w:numId w:val="31"/>
+          <w:numId w:val="32"/>
         </w:numPr>
       </w:pPr>
       <w:r>
@@ -7940,7 +8170,7 @@
         <w:pStyle w:val="ListParagraph"/>
         <w:numPr>
           <w:ilvl w:val="0"/>
-          <w:numId w:val="31"/>
+          <w:numId w:val="32"/>
         </w:numPr>
       </w:pPr>
       <w:r>
@@ -7976,7 +8206,7 @@
         <w:pStyle w:val="ListParagraph"/>
         <w:numPr>
           <w:ilvl w:val="0"/>
-          <w:numId w:val="31"/>
+          <w:numId w:val="32"/>
         </w:numPr>
       </w:pPr>
       <w:r>
@@ -8019,7 +8249,7 @@
         <w:pStyle w:val="ListParagraph"/>
         <w:numPr>
           <w:ilvl w:val="0"/>
-          <w:numId w:val="32"/>
+          <w:numId w:val="33"/>
         </w:numPr>
       </w:pPr>
       <w:r>
@@ -8040,7 +8270,7 @@
         <w:pStyle w:val="ListParagraph"/>
         <w:numPr>
           <w:ilvl w:val="0"/>
-          <w:numId w:val="32"/>
+          <w:numId w:val="33"/>
         </w:numPr>
       </w:pPr>
       <w:r>
@@ -8067,7 +8297,7 @@
         <w:pStyle w:val="ListParagraph"/>
         <w:numPr>
           <w:ilvl w:val="0"/>
-          <w:numId w:val="32"/>
+          <w:numId w:val="33"/>
         </w:numPr>
       </w:pPr>
       <w:r>
@@ -8130,7 +8360,7 @@
         <w:pStyle w:val="ListParagraph"/>
         <w:numPr>
           <w:ilvl w:val="0"/>
-          <w:numId w:val="32"/>
+          <w:numId w:val="33"/>
         </w:numPr>
       </w:pPr>
       <w:r>
@@ -8295,7 +8525,7 @@
         <w:pStyle w:val="ListParagraph"/>
         <w:numPr>
           <w:ilvl w:val="0"/>
-          <w:numId w:val="33"/>
+          <w:numId w:val="34"/>
         </w:numPr>
       </w:pPr>
       <w:r>
@@ -8322,7 +8552,7 @@
         <w:pStyle w:val="ListParagraph"/>
         <w:numPr>
           <w:ilvl w:val="0"/>
-          <w:numId w:val="33"/>
+          <w:numId w:val="34"/>
         </w:numPr>
       </w:pPr>
       <w:r>
@@ -8343,7 +8573,7 @@
         <w:pStyle w:val="ListParagraph"/>
         <w:numPr>
           <w:ilvl w:val="0"/>
-          <w:numId w:val="33"/>
+          <w:numId w:val="34"/>
         </w:numPr>
       </w:pPr>
       <w:r>
@@ -8624,7 +8854,7 @@
         <w:pStyle w:val="ListParagraph"/>
         <w:numPr>
           <w:ilvl w:val="0"/>
-          <w:numId w:val="34"/>
+          <w:numId w:val="35"/>
         </w:numPr>
       </w:pPr>
       <w:r>
@@ -8645,7 +8875,7 @@
         <w:pStyle w:val="ListParagraph"/>
         <w:numPr>
           <w:ilvl w:val="0"/>
-          <w:numId w:val="34"/>
+          <w:numId w:val="35"/>
         </w:numPr>
       </w:pPr>
       <w:r>
@@ -8663,7 +8893,7 @@
         <w:pStyle w:val="ListParagraph"/>
         <w:numPr>
           <w:ilvl w:val="0"/>
-          <w:numId w:val="34"/>
+          <w:numId w:val="35"/>
         </w:numPr>
       </w:pPr>
       <w:r>
@@ -8681,7 +8911,7 @@
         <w:pStyle w:val="ListParagraph"/>
         <w:numPr>
           <w:ilvl w:val="0"/>
-          <w:numId w:val="34"/>
+          <w:numId w:val="35"/>
         </w:numPr>
       </w:pPr>
       <w:r>
@@ -8701,7 +8931,7 @@
         <w:pStyle w:val="ListParagraph"/>
         <w:numPr>
           <w:ilvl w:val="0"/>
-          <w:numId w:val="35"/>
+          <w:numId w:val="36"/>
         </w:numPr>
       </w:pPr>
       <w:r>
@@ -8731,7 +8961,7 @@
         <w:pStyle w:val="ListParagraph"/>
         <w:numPr>
           <w:ilvl w:val="0"/>
-          <w:numId w:val="35"/>
+          <w:numId w:val="36"/>
         </w:numPr>
       </w:pPr>
       <w:r>
@@ -8774,7 +9004,7 @@
         <w:pStyle w:val="ListParagraph"/>
         <w:numPr>
           <w:ilvl w:val="0"/>
-          <w:numId w:val="36"/>
+          <w:numId w:val="37"/>
         </w:numPr>
       </w:pPr>
       <w:r>
@@ -8831,7 +9061,7 @@
         <w:pStyle w:val="ListParagraph"/>
         <w:numPr>
           <w:ilvl w:val="0"/>
-          <w:numId w:val="36"/>
+          <w:numId w:val="37"/>
         </w:numPr>
       </w:pPr>
       <w:r>
@@ -8843,7 +9073,7 @@
         <w:pStyle w:val="ListParagraph"/>
         <w:numPr>
           <w:ilvl w:val="0"/>
-          <w:numId w:val="36"/>
+          <w:numId w:val="37"/>
         </w:numPr>
       </w:pPr>
       <w:r>
@@ -8873,7 +9103,7 @@
         <w:pStyle w:val="ListParagraph"/>
         <w:numPr>
           <w:ilvl w:val="0"/>
-          <w:numId w:val="36"/>
+          <w:numId w:val="37"/>
         </w:numPr>
       </w:pPr>
       <w:r>
@@ -9299,7 +9529,7 @@
         <w:pStyle w:val="ListParagraph"/>
         <w:numPr>
           <w:ilvl w:val="0"/>
-          <w:numId w:val="37"/>
+          <w:numId w:val="38"/>
         </w:numPr>
       </w:pPr>
       <w:r>
@@ -9311,7 +9541,7 @@
         <w:pStyle w:val="ListParagraph"/>
         <w:numPr>
           <w:ilvl w:val="0"/>
-          <w:numId w:val="37"/>
+          <w:numId w:val="38"/>
         </w:numPr>
       </w:pPr>
       <w:r>
@@ -9323,7 +9553,7 @@
         <w:pStyle w:val="ListParagraph"/>
         <w:numPr>
           <w:ilvl w:val="0"/>
-          <w:numId w:val="37"/>
+          <w:numId w:val="38"/>
         </w:numPr>
       </w:pPr>
       <w:r>
@@ -9343,7 +9573,7 @@
         <w:pStyle w:val="ListParagraph"/>
         <w:numPr>
           <w:ilvl w:val="0"/>
-          <w:numId w:val="38"/>
+          <w:numId w:val="39"/>
         </w:numPr>
       </w:pPr>
       <w:r>
@@ -9370,7 +9600,7 @@
         <w:pStyle w:val="ListParagraph"/>
         <w:numPr>
           <w:ilvl w:val="0"/>
-          <w:numId w:val="38"/>
+          <w:numId w:val="39"/>
         </w:numPr>
       </w:pPr>
       <w:r>
@@ -9397,7 +9627,7 @@
         <w:pStyle w:val="ListParagraph"/>
         <w:numPr>
           <w:ilvl w:val="0"/>
-          <w:numId w:val="38"/>
+          <w:numId w:val="39"/>
         </w:numPr>
       </w:pPr>
       <w:r>
@@ -9867,7 +10097,7 @@
         <w:pStyle w:val="ListParagraph"/>
         <w:numPr>
           <w:ilvl w:val="0"/>
-          <w:numId w:val="39"/>
+          <w:numId w:val="40"/>
         </w:numPr>
       </w:pPr>
       <w:r>
@@ -9885,7 +10115,7 @@
         <w:pStyle w:val="ListParagraph"/>
         <w:numPr>
           <w:ilvl w:val="0"/>
-          <w:numId w:val="39"/>
+          <w:numId w:val="40"/>
         </w:numPr>
       </w:pPr>
       <w:r>
@@ -9903,7 +10133,7 @@
         <w:pStyle w:val="ListParagraph"/>
         <w:numPr>
           <w:ilvl w:val="0"/>
-          <w:numId w:val="39"/>
+          <w:numId w:val="40"/>
         </w:numPr>
       </w:pPr>
       <w:r>
@@ -9921,7 +10151,7 @@
         <w:pStyle w:val="ListParagraph"/>
         <w:numPr>
           <w:ilvl w:val="0"/>
-          <w:numId w:val="39"/>
+          <w:numId w:val="40"/>
         </w:numPr>
       </w:pPr>
       <w:r>
@@ -10144,7 +10374,7 @@
         <w:pStyle w:val="ListParagraph"/>
         <w:numPr>
           <w:ilvl w:val="0"/>
-          <w:numId w:val="40"/>
+          <w:numId w:val="41"/>
         </w:numPr>
       </w:pPr>
       <w:r>
@@ -10156,7 +10386,7 @@
         <w:pStyle w:val="ListParagraph"/>
         <w:numPr>
           <w:ilvl w:val="0"/>
-          <w:numId w:val="40"/>
+          <w:numId w:val="41"/>
         </w:numPr>
       </w:pPr>
       <w:r>
@@ -10219,7 +10449,7 @@
         <w:pStyle w:val="ListParagraph"/>
         <w:numPr>
           <w:ilvl w:val="0"/>
-          <w:numId w:val="40"/>
+          <w:numId w:val="41"/>
         </w:numPr>
       </w:pPr>
       <w:r>
@@ -10240,7 +10470,7 @@
         <w:pStyle w:val="ListParagraph"/>
         <w:numPr>
           <w:ilvl w:val="0"/>
-          <w:numId w:val="40"/>
+          <w:numId w:val="41"/>
         </w:numPr>
       </w:pPr>
       <w:r>
@@ -10321,7 +10551,7 @@
         <w:pStyle w:val="ListParagraph"/>
         <w:numPr>
           <w:ilvl w:val="0"/>
-          <w:numId w:val="40"/>
+          <w:numId w:val="41"/>
         </w:numPr>
       </w:pPr>
       <w:r>
@@ -10333,7 +10563,7 @@
         <w:pStyle w:val="ListParagraph"/>
         <w:numPr>
           <w:ilvl w:val="0"/>
-          <w:numId w:val="40"/>
+          <w:numId w:val="41"/>
         </w:numPr>
       </w:pPr>
       <w:r>
@@ -10796,7 +11026,7 @@
         <w:pStyle w:val="ListParagraph"/>
         <w:numPr>
           <w:ilvl w:val="0"/>
-          <w:numId w:val="41"/>
+          <w:numId w:val="42"/>
         </w:numPr>
       </w:pPr>
       <w:r>
@@ -10817,7 +11047,7 @@
         <w:pStyle w:val="ListParagraph"/>
         <w:numPr>
           <w:ilvl w:val="0"/>
-          <w:numId w:val="41"/>
+          <w:numId w:val="42"/>
         </w:numPr>
       </w:pPr>
       <w:r>
@@ -10853,7 +11083,7 @@
         <w:pStyle w:val="ListParagraph"/>
         <w:numPr>
           <w:ilvl w:val="0"/>
-          <w:numId w:val="41"/>
+          <w:numId w:val="42"/>
         </w:numPr>
       </w:pPr>
       <w:r>
@@ -10901,7 +11131,7 @@
         <w:pStyle w:val="ListParagraph"/>
         <w:numPr>
           <w:ilvl w:val="0"/>
-          <w:numId w:val="41"/>
+          <w:numId w:val="42"/>
         </w:numPr>
       </w:pPr>
       <w:r>
@@ -10928,7 +11158,7 @@
         <w:pStyle w:val="ListParagraph"/>
         <w:numPr>
           <w:ilvl w:val="0"/>
-          <w:numId w:val="41"/>
+          <w:numId w:val="42"/>
         </w:numPr>
       </w:pPr>
       <w:r>
@@ -10946,7 +11176,7 @@
         <w:pStyle w:val="ListParagraph"/>
         <w:numPr>
           <w:ilvl w:val="0"/>
-          <w:numId w:val="41"/>
+          <w:numId w:val="42"/>
         </w:numPr>
       </w:pPr>
       <w:r>
@@ -10964,7 +11194,7 @@
         <w:pStyle w:val="ListParagraph"/>
         <w:numPr>
           <w:ilvl w:val="0"/>
-          <w:numId w:val="41"/>
+          <w:numId w:val="42"/>
         </w:numPr>
       </w:pPr>
       <w:r>
@@ -11009,7 +11239,7 @@
         <w:pStyle w:val="ListParagraph"/>
         <w:numPr>
           <w:ilvl w:val="0"/>
-          <w:numId w:val="41"/>
+          <w:numId w:val="42"/>
         </w:numPr>
       </w:pPr>
       <w:r>
@@ -11045,7 +11275,7 @@
         <w:pStyle w:val="ListParagraph"/>
         <w:numPr>
           <w:ilvl w:val="0"/>
-          <w:numId w:val="41"/>
+          <w:numId w:val="42"/>
         </w:numPr>
       </w:pPr>
       <w:r>
@@ -11294,7 +11524,7 @@
         <w:pStyle w:val="ListParagraph"/>
         <w:numPr>
           <w:ilvl w:val="0"/>
-          <w:numId w:val="42"/>
+          <w:numId w:val="43"/>
         </w:numPr>
       </w:pPr>
       <w:r>
@@ -11330,7 +11560,7 @@
         <w:pStyle w:val="ListParagraph"/>
         <w:numPr>
           <w:ilvl w:val="0"/>
-          <w:numId w:val="42"/>
+          <w:numId w:val="43"/>
         </w:numPr>
       </w:pPr>
       <w:r>
@@ -11375,7 +11605,7 @@
         <w:pStyle w:val="ListParagraph"/>
         <w:numPr>
           <w:ilvl w:val="0"/>
-          <w:numId w:val="42"/>
+          <w:numId w:val="43"/>
         </w:numPr>
       </w:pPr>
       <w:r>
@@ -11401,7 +11631,7 @@
         <w:pStyle w:val="ListParagraph"/>
         <w:numPr>
           <w:ilvl w:val="0"/>
-          <w:numId w:val="43"/>
+          <w:numId w:val="44"/>
         </w:numPr>
       </w:pPr>
       <w:r>
@@ -11428,7 +11658,7 @@
         <w:pStyle w:val="ListParagraph"/>
         <w:numPr>
           <w:ilvl w:val="0"/>
-          <w:numId w:val="43"/>
+          <w:numId w:val="44"/>
         </w:numPr>
       </w:pPr>
       <w:r>
@@ -11449,7 +11679,7 @@
         <w:pStyle w:val="ListParagraph"/>
         <w:numPr>
           <w:ilvl w:val="0"/>
-          <w:numId w:val="43"/>
+          <w:numId w:val="44"/>
         </w:numPr>
       </w:pPr>
       <w:r>
@@ -11490,7 +11720,7 @@
         <w:pStyle w:val="ListParagraph"/>
         <w:numPr>
           <w:ilvl w:val="0"/>
-          <w:numId w:val="44"/>
+          <w:numId w:val="45"/>
         </w:numPr>
       </w:pPr>
       <w:r>
@@ -11535,7 +11765,7 @@
         <w:pStyle w:val="ListParagraph"/>
         <w:numPr>
           <w:ilvl w:val="0"/>
-          <w:numId w:val="44"/>
+          <w:numId w:val="45"/>
         </w:numPr>
       </w:pPr>
       <w:r>
@@ -11571,7 +11801,7 @@
         <w:pStyle w:val="ListParagraph"/>
         <w:numPr>
           <w:ilvl w:val="0"/>
-          <w:numId w:val="44"/>
+          <w:numId w:val="45"/>
         </w:numPr>
       </w:pPr>
       <w:r>
@@ -11598,7 +11828,7 @@
         <w:pStyle w:val="ListParagraph"/>
         <w:numPr>
           <w:ilvl w:val="0"/>
-          <w:numId w:val="44"/>
+          <w:numId w:val="45"/>
         </w:numPr>
       </w:pPr>
       <w:r>
@@ -11913,7 +12143,7 @@
         <w:pStyle w:val="ListParagraph"/>
         <w:numPr>
           <w:ilvl w:val="0"/>
-          <w:numId w:val="45"/>
+          <w:numId w:val="46"/>
         </w:numPr>
       </w:pPr>
       <w:r>
@@ -11988,7 +12218,7 @@
         <w:pStyle w:val="ListParagraph"/>
         <w:numPr>
           <w:ilvl w:val="0"/>
-          <w:numId w:val="45"/>
+          <w:numId w:val="46"/>
         </w:numPr>
       </w:pPr>
       <w:r>
@@ -12018,7 +12248,7 @@
         <w:pStyle w:val="ListParagraph"/>
         <w:numPr>
           <w:ilvl w:val="0"/>
-          <w:numId w:val="45"/>
+          <w:numId w:val="46"/>
         </w:numPr>
       </w:pPr>
       <w:r>
@@ -12044,7 +12274,7 @@
         <w:pStyle w:val="ListParagraph"/>
         <w:numPr>
           <w:ilvl w:val="0"/>
-          <w:numId w:val="46"/>
+          <w:numId w:val="47"/>
         </w:numPr>
       </w:pPr>
       <w:r>
@@ -12074,7 +12304,7 @@
         <w:pStyle w:val="ListParagraph"/>
         <w:numPr>
           <w:ilvl w:val="0"/>
-          <w:numId w:val="46"/>
+          <w:numId w:val="47"/>
         </w:numPr>
       </w:pPr>
       <w:r>
@@ -12095,7 +12325,7 @@
         <w:pStyle w:val="ListParagraph"/>
         <w:numPr>
           <w:ilvl w:val="0"/>
-          <w:numId w:val="46"/>
+          <w:numId w:val="47"/>
         </w:numPr>
       </w:pPr>
       <w:r>
@@ -12125,7 +12355,7 @@
         <w:pStyle w:val="ListParagraph"/>
         <w:numPr>
           <w:ilvl w:val="0"/>
-          <w:numId w:val="47"/>
+          <w:numId w:val="48"/>
         </w:numPr>
       </w:pPr>
       <w:r>
@@ -12137,7 +12367,7 @@
         <w:pStyle w:val="ListParagraph"/>
         <w:numPr>
           <w:ilvl w:val="0"/>
-          <w:numId w:val="47"/>
+          <w:numId w:val="48"/>
         </w:numPr>
       </w:pPr>
       <w:r>
@@ -12181,7 +12411,7 @@
         <w:pStyle w:val="ListParagraph"/>
         <w:numPr>
           <w:ilvl w:val="0"/>
-          <w:numId w:val="48"/>
+          <w:numId w:val="49"/>
         </w:numPr>
       </w:pPr>
       <w:r>
@@ -12229,7 +12459,7 @@
         <w:pStyle w:val="ListParagraph"/>
         <w:numPr>
           <w:ilvl w:val="0"/>
-          <w:numId w:val="48"/>
+          <w:numId w:val="49"/>
         </w:numPr>
       </w:pPr>
       <w:r>
@@ -12241,7 +12471,7 @@
         <w:pStyle w:val="ListParagraph"/>
         <w:numPr>
           <w:ilvl w:val="0"/>
-          <w:numId w:val="48"/>
+          <w:numId w:val="49"/>
         </w:numPr>
       </w:pPr>
       <w:r>
@@ -12259,7 +12489,7 @@
         <w:pStyle w:val="ListParagraph"/>
         <w:numPr>
           <w:ilvl w:val="0"/>
-          <w:numId w:val="48"/>
+          <w:numId w:val="49"/>
         </w:numPr>
       </w:pPr>
       <w:r>
@@ -12271,7 +12501,7 @@
         <w:pStyle w:val="ListParagraph"/>
         <w:numPr>
           <w:ilvl w:val="0"/>
-          <w:numId w:val="48"/>
+          <w:numId w:val="49"/>
         </w:numPr>
       </w:pPr>
       <w:r>
@@ -12283,7 +12513,7 @@
         <w:pStyle w:val="ListParagraph"/>
         <w:numPr>
           <w:ilvl w:val="0"/>
-          <w:numId w:val="48"/>
+          <w:numId w:val="49"/>
         </w:numPr>
       </w:pPr>
       <w:r>
@@ -12295,7 +12525,7 @@
         <w:pStyle w:val="ListParagraph"/>
         <w:numPr>
           <w:ilvl w:val="0"/>
-          <w:numId w:val="48"/>
+          <w:numId w:val="49"/>
         </w:numPr>
       </w:pPr>
       <w:r>
@@ -12569,7 +12799,7 @@
         <w:pStyle w:val="ListParagraph"/>
         <w:numPr>
           <w:ilvl w:val="0"/>
-          <w:numId w:val="49"/>
+          <w:numId w:val="50"/>
         </w:numPr>
       </w:pPr>
       <w:r>
@@ -12581,7 +12811,7 @@
         <w:pStyle w:val="ListParagraph"/>
         <w:numPr>
           <w:ilvl w:val="0"/>
-          <w:numId w:val="49"/>
+          <w:numId w:val="50"/>
         </w:numPr>
       </w:pPr>
       <w:r>
@@ -12593,7 +12823,7 @@
         <w:pStyle w:val="ListParagraph"/>
         <w:numPr>
           <w:ilvl w:val="0"/>
-          <w:numId w:val="49"/>
+          <w:numId w:val="50"/>
         </w:numPr>
       </w:pPr>
       <w:r>
@@ -12867,7 +13097,7 @@
         <w:pStyle w:val="ListParagraph"/>
         <w:numPr>
           <w:ilvl w:val="0"/>
-          <w:numId w:val="50"/>
+          <w:numId w:val="51"/>
         </w:numPr>
       </w:pPr>
       <w:r>
@@ -12879,7 +13109,7 @@
         <w:pStyle w:val="ListParagraph"/>
         <w:numPr>
           <w:ilvl w:val="0"/>
-          <w:numId w:val="50"/>
+          <w:numId w:val="51"/>
         </w:numPr>
       </w:pPr>
       <w:r>
@@ -12891,7 +13121,7 @@
         <w:pStyle w:val="ListParagraph"/>
         <w:numPr>
           <w:ilvl w:val="0"/>
-          <w:numId w:val="50"/>
+          <w:numId w:val="51"/>
         </w:numPr>
       </w:pPr>
       <w:r>
@@ -12934,7 +13164,7 @@
         <w:pStyle w:val="ListParagraph"/>
         <w:numPr>
           <w:ilvl w:val="0"/>
-          <w:numId w:val="51"/>
+          <w:numId w:val="52"/>
         </w:numPr>
       </w:pPr>
       <w:r>
@@ -12991,7 +13221,7 @@
         <w:pStyle w:val="ListParagraph"/>
         <w:numPr>
           <w:ilvl w:val="0"/>
-          <w:numId w:val="51"/>
+          <w:numId w:val="52"/>
         </w:numPr>
       </w:pPr>
       <w:r>
@@ -13021,7 +13251,7 @@
         <w:pStyle w:val="ListParagraph"/>
         <w:numPr>
           <w:ilvl w:val="0"/>
-          <w:numId w:val="51"/>
+          <w:numId w:val="52"/>
         </w:numPr>
       </w:pPr>
       <w:r>
@@ -13059,7 +13289,7 @@
         <w:pStyle w:val="ListParagraph"/>
         <w:numPr>
           <w:ilvl w:val="0"/>
-          <w:numId w:val="52"/>
+          <w:numId w:val="53"/>
         </w:numPr>
       </w:pPr>
       <w:r>
@@ -13080,7 +13310,7 @@
         <w:pStyle w:val="ListParagraph"/>
         <w:numPr>
           <w:ilvl w:val="0"/>
-          <w:numId w:val="52"/>
+          <w:numId w:val="53"/>
         </w:numPr>
       </w:pPr>
       <w:r>
@@ -13125,7 +13355,7 @@
         <w:pStyle w:val="ListParagraph"/>
         <w:numPr>
           <w:ilvl w:val="0"/>
-          <w:numId w:val="52"/>
+          <w:numId w:val="53"/>
         </w:numPr>
       </w:pPr>
       <w:r>
@@ -13224,7 +13454,7 @@
         <w:pStyle w:val="ListParagraph"/>
         <w:numPr>
           <w:ilvl w:val="0"/>
-          <w:numId w:val="52"/>
+          <w:numId w:val="53"/>
         </w:numPr>
       </w:pPr>
       <w:r>
@@ -13269,7 +13499,7 @@
         <w:pStyle w:val="ListParagraph"/>
         <w:numPr>
           <w:ilvl w:val="0"/>
-          <w:numId w:val="52"/>
+          <w:numId w:val="53"/>
         </w:numPr>
       </w:pPr>
       <w:r>
@@ -13618,7 +13848,7 @@
         <w:pStyle w:val="ListParagraph"/>
         <w:numPr>
           <w:ilvl w:val="0"/>
-          <w:numId w:val="53"/>
+          <w:numId w:val="54"/>
         </w:numPr>
       </w:pPr>
       <w:r>
@@ -13648,7 +13878,7 @@
         <w:pStyle w:val="ListParagraph"/>
         <w:numPr>
           <w:ilvl w:val="0"/>
-          <w:numId w:val="53"/>
+          <w:numId w:val="54"/>
         </w:numPr>
       </w:pPr>
       <w:r>
@@ -13696,7 +13926,7 @@
         <w:pStyle w:val="ListParagraph"/>
         <w:numPr>
           <w:ilvl w:val="0"/>
-          <w:numId w:val="53"/>
+          <w:numId w:val="54"/>
         </w:numPr>
       </w:pPr>
       <w:r>
@@ -13723,7 +13953,7 @@
         <w:pStyle w:val="ListParagraph"/>
         <w:numPr>
           <w:ilvl w:val="0"/>
-          <w:numId w:val="53"/>
+          <w:numId w:val="54"/>
         </w:numPr>
       </w:pPr>
       <w:r>
@@ -13749,7 +13979,7 @@
         <w:pStyle w:val="ListParagraph"/>
         <w:numPr>
           <w:ilvl w:val="0"/>
-          <w:numId w:val="54"/>
+          <w:numId w:val="55"/>
         </w:numPr>
       </w:pPr>
       <w:r>
@@ -13770,7 +14000,7 @@
         <w:pStyle w:val="ListParagraph"/>
         <w:numPr>
           <w:ilvl w:val="0"/>
-          <w:numId w:val="54"/>
+          <w:numId w:val="55"/>
         </w:numPr>
       </w:pPr>
       <w:r>
@@ -13806,7 +14036,7 @@
         <w:pStyle w:val="ListParagraph"/>
         <w:numPr>
           <w:ilvl w:val="0"/>
-          <w:numId w:val="54"/>
+          <w:numId w:val="55"/>
         </w:numPr>
       </w:pPr>
       <w:r>
@@ -13842,7 +14072,7 @@
         <w:pStyle w:val="ListParagraph"/>
         <w:numPr>
           <w:ilvl w:val="0"/>
-          <w:numId w:val="54"/>
+          <w:numId w:val="55"/>
         </w:numPr>
       </w:pPr>
       <w:r>
@@ -13871,7 +14101,7 @@
         <w:pStyle w:val="ListParagraph"/>
         <w:numPr>
           <w:ilvl w:val="0"/>
-          <w:numId w:val="55"/>
+          <w:numId w:val="56"/>
         </w:numPr>
       </w:pPr>
       <w:r>
@@ -13892,7 +14122,7 @@
         <w:pStyle w:val="ListParagraph"/>
         <w:numPr>
           <w:ilvl w:val="0"/>
-          <w:numId w:val="55"/>
+          <w:numId w:val="56"/>
         </w:numPr>
       </w:pPr>
       <w:r>
@@ -14113,7 +14343,7 @@
         <w:pStyle w:val="ListParagraph"/>
         <w:numPr>
           <w:ilvl w:val="0"/>
-          <w:numId w:val="56"/>
+          <w:numId w:val="57"/>
         </w:numPr>
       </w:pPr>
       <w:r>
@@ -14203,7 +14433,7 @@
         <w:pStyle w:val="ListParagraph"/>
         <w:numPr>
           <w:ilvl w:val="0"/>
-          <w:numId w:val="56"/>
+          <w:numId w:val="57"/>
         </w:numPr>
       </w:pPr>
       <w:r>
@@ -14233,7 +14463,7 @@
         <w:pStyle w:val="ListParagraph"/>
         <w:numPr>
           <w:ilvl w:val="0"/>
-          <w:numId w:val="56"/>
+          <w:numId w:val="57"/>
         </w:numPr>
       </w:pPr>
       <w:r>
@@ -14254,7 +14484,7 @@
         <w:pStyle w:val="ListParagraph"/>
         <w:numPr>
           <w:ilvl w:val="0"/>
-          <w:numId w:val="56"/>
+          <w:numId w:val="57"/>
         </w:numPr>
       </w:pPr>
       <w:r>
@@ -14290,7 +14520,7 @@
         <w:pStyle w:val="ListParagraph"/>
         <w:numPr>
           <w:ilvl w:val="0"/>
-          <w:numId w:val="56"/>
+          <w:numId w:val="57"/>
         </w:numPr>
       </w:pPr>
       <w:r>
@@ -14308,7 +14538,7 @@
         <w:pStyle w:val="ListParagraph"/>
         <w:numPr>
           <w:ilvl w:val="0"/>
-          <w:numId w:val="56"/>
+          <w:numId w:val="57"/>
         </w:numPr>
       </w:pPr>
       <w:r>
@@ -14352,7 +14582,7 @@
         <w:pStyle w:val="ListParagraph"/>
         <w:numPr>
           <w:ilvl w:val="0"/>
-          <w:numId w:val="57"/>
+          <w:numId w:val="58"/>
         </w:numPr>
       </w:pPr>
       <w:r>
@@ -14433,7 +14663,7 @@
         <w:pStyle w:val="ListParagraph"/>
         <w:numPr>
           <w:ilvl w:val="0"/>
-          <w:numId w:val="57"/>
+          <w:numId w:val="58"/>
         </w:numPr>
       </w:pPr>
       <w:r>
@@ -14451,7 +14681,7 @@
         <w:pStyle w:val="ListParagraph"/>
         <w:numPr>
           <w:ilvl w:val="0"/>
-          <w:numId w:val="57"/>
+          <w:numId w:val="58"/>
         </w:numPr>
       </w:pPr>
       <w:r>
@@ -14472,7 +14702,7 @@
         <w:pStyle w:val="ListParagraph"/>
         <w:numPr>
           <w:ilvl w:val="0"/>
-          <w:numId w:val="57"/>
+          <w:numId w:val="58"/>
         </w:numPr>
       </w:pPr>
       <w:r>
@@ -14498,7 +14728,7 @@
         <w:pStyle w:val="ListParagraph"/>
         <w:numPr>
           <w:ilvl w:val="0"/>
-          <w:numId w:val="58"/>
+          <w:numId w:val="59"/>
         </w:numPr>
       </w:pPr>
       <w:r>
@@ -14561,7 +14791,7 @@
         <w:pStyle w:val="ListParagraph"/>
         <w:numPr>
           <w:ilvl w:val="0"/>
-          <w:numId w:val="58"/>
+          <w:numId w:val="59"/>
         </w:numPr>
       </w:pPr>
       <w:r>
@@ -14588,7 +14818,7 @@
         <w:pStyle w:val="ListParagraph"/>
         <w:numPr>
           <w:ilvl w:val="0"/>
-          <w:numId w:val="58"/>
+          <w:numId w:val="59"/>
         </w:numPr>
       </w:pPr>
       <w:r>
@@ -14606,7 +14836,7 @@
         <w:pStyle w:val="ListParagraph"/>
         <w:numPr>
           <w:ilvl w:val="0"/>
-          <w:numId w:val="58"/>
+          <w:numId w:val="59"/>
         </w:numPr>
       </w:pPr>
       <w:r>
@@ -15237,7 +15467,7 @@
         <w:pStyle w:val="ListParagraph"/>
         <w:numPr>
           <w:ilvl w:val="0"/>
-          <w:numId w:val="59"/>
+          <w:numId w:val="60"/>
         </w:numPr>
       </w:pPr>
       <w:r>
@@ -15255,7 +15485,7 @@
         <w:pStyle w:val="ListParagraph"/>
         <w:numPr>
           <w:ilvl w:val="0"/>
-          <w:numId w:val="59"/>
+          <w:numId w:val="60"/>
         </w:numPr>
       </w:pPr>
       <w:r>
@@ -15273,7 +15503,7 @@
         <w:pStyle w:val="ListParagraph"/>
         <w:numPr>
           <w:ilvl w:val="0"/>
-          <w:numId w:val="59"/>
+          <w:numId w:val="60"/>
         </w:numPr>
       </w:pPr>
       <w:r>
@@ -15291,7 +15521,7 @@
         <w:pStyle w:val="ListParagraph"/>
         <w:numPr>
           <w:ilvl w:val="0"/>
-          <w:numId w:val="59"/>
+          <w:numId w:val="60"/>
         </w:numPr>
       </w:pPr>
       <w:r>
@@ -15309,7 +15539,7 @@
         <w:pStyle w:val="ListParagraph"/>
         <w:numPr>
           <w:ilvl w:val="0"/>
-          <w:numId w:val="59"/>
+          <w:numId w:val="60"/>
         </w:numPr>
       </w:pPr>
       <w:r>
@@ -15327,7 +15557,7 @@
         <w:pStyle w:val="ListParagraph"/>
         <w:numPr>
           <w:ilvl w:val="0"/>
-          <w:numId w:val="59"/>
+          <w:numId w:val="60"/>
         </w:numPr>
       </w:pPr>
       <w:r>
@@ -16425,7 +16655,7 @@
         <w:pStyle w:val="ListParagraph"/>
         <w:numPr>
           <w:ilvl w:val="0"/>
-          <w:numId w:val="60"/>
+          <w:numId w:val="61"/>
         </w:numPr>
       </w:pPr>
       <w:r>
@@ -16437,7 +16667,7 @@
         <w:pStyle w:val="ListParagraph"/>
         <w:numPr>
           <w:ilvl w:val="0"/>
-          <w:numId w:val="60"/>
+          <w:numId w:val="61"/>
         </w:numPr>
       </w:pPr>
       <w:r>
@@ -16449,7 +16679,7 @@
         <w:pStyle w:val="ListParagraph"/>
         <w:numPr>
           <w:ilvl w:val="0"/>
-          <w:numId w:val="60"/>
+          <w:numId w:val="61"/>
         </w:numPr>
       </w:pPr>
       <w:r>
@@ -16461,7 +16691,7 @@
         <w:pStyle w:val="ListParagraph"/>
         <w:numPr>
           <w:ilvl w:val="0"/>
-          <w:numId w:val="60"/>
+          <w:numId w:val="61"/>
         </w:numPr>
       </w:pPr>
       <w:r>
@@ -16473,7 +16703,7 @@
         <w:pStyle w:val="ListParagraph"/>
         <w:numPr>
           <w:ilvl w:val="0"/>
-          <w:numId w:val="60"/>
+          <w:numId w:val="61"/>
         </w:numPr>
       </w:pPr>
       <w:r>
@@ -16494,7 +16724,7 @@
         <w:pStyle w:val="ListParagraph"/>
         <w:numPr>
           <w:ilvl w:val="0"/>
-          <w:numId w:val="60"/>
+          <w:numId w:val="61"/>
         </w:numPr>
       </w:pPr>
       <w:r>
@@ -16506,7 +16736,7 @@
         <w:pStyle w:val="ListParagraph"/>
         <w:numPr>
           <w:ilvl w:val="0"/>
-          <w:numId w:val="60"/>
+          <w:numId w:val="61"/>
         </w:numPr>
       </w:pPr>
       <w:r>
@@ -16527,7 +16757,7 @@
         <w:pStyle w:val="ListParagraph"/>
         <w:numPr>
           <w:ilvl w:val="0"/>
-          <w:numId w:val="60"/>
+          <w:numId w:val="61"/>
         </w:numPr>
       </w:pPr>
       <w:r>
@@ -16539,7 +16769,7 @@
         <w:pStyle w:val="ListParagraph"/>
         <w:numPr>
           <w:ilvl w:val="0"/>
-          <w:numId w:val="60"/>
+          <w:numId w:val="61"/>
         </w:numPr>
       </w:pPr>
       <w:r>
@@ -16551,7 +16781,7 @@
         <w:pStyle w:val="ListParagraph"/>
         <w:numPr>
           <w:ilvl w:val="0"/>
-          <w:numId w:val="60"/>
+          <w:numId w:val="61"/>
         </w:numPr>
       </w:pPr>
       <w:r>
@@ -16563,7 +16793,7 @@
         <w:pStyle w:val="ListParagraph"/>
         <w:numPr>
           <w:ilvl w:val="0"/>
-          <w:numId w:val="60"/>
+          <w:numId w:val="61"/>
         </w:numPr>
       </w:pPr>
       <w:r>
@@ -16575,7 +16805,7 @@
         <w:pStyle w:val="ListParagraph"/>
         <w:numPr>
           <w:ilvl w:val="0"/>
-          <w:numId w:val="60"/>
+          <w:numId w:val="61"/>
         </w:numPr>
       </w:pPr>
       <w:r>
@@ -16587,7 +16817,7 @@
         <w:pStyle w:val="ListParagraph"/>
         <w:numPr>
           <w:ilvl w:val="0"/>
-          <w:numId w:val="60"/>
+          <w:numId w:val="61"/>
         </w:numPr>
       </w:pPr>
       <w:r>
@@ -16599,7 +16829,7 @@
         <w:pStyle w:val="ListParagraph"/>
         <w:numPr>
           <w:ilvl w:val="0"/>
-          <w:numId w:val="60"/>
+          <w:numId w:val="61"/>
         </w:numPr>
       </w:pPr>
       <w:r>
@@ -16896,10 +17126,10 @@
     <w:abstractNumId w:val="0"/>
   </w:num>
   <w:num w:numId="36">
-    <w:abstractNumId w:val="1"/>
+    <w:abstractNumId w:val="0"/>
   </w:num>
   <w:num w:numId="37">
-    <w:abstractNumId w:val="0"/>
+    <w:abstractNumId w:val="1"/>
   </w:num>
   <w:num w:numId="38">
     <w:abstractNumId w:val="0"/>
@@ -16926,10 +17156,10 @@
     <w:abstractNumId w:val="0"/>
   </w:num>
   <w:num w:numId="46">
-    <w:abstractNumId w:val="1"/>
+    <w:abstractNumId w:val="0"/>
   </w:num>
   <w:num w:numId="47">
-    <w:abstractNumId w:val="0"/>
+    <w:abstractNumId w:val="1"/>
   </w:num>
   <w:num w:numId="48">
     <w:abstractNumId w:val="0"/>
@@ -16944,10 +17174,10 @@
     <w:abstractNumId w:val="0"/>
   </w:num>
   <w:num w:numId="52">
-    <w:abstractNumId w:val="1"/>
+    <w:abstractNumId w:val="0"/>
   </w:num>
   <w:num w:numId="53">
-    <w:abstractNumId w:val="0"/>
+    <w:abstractNumId w:val="1"/>
   </w:num>
   <w:num w:numId="54">
     <w:abstractNumId w:val="0"/>
@@ -16968,6 +17198,9 @@
     <w:abstractNumId w:val="0"/>
   </w:num>
   <w:num w:numId="60">
+    <w:abstractNumId w:val="0"/>
+  </w:num>
+  <w:num w:numId="61">
     <w:abstractNumId w:val="0"/>
   </w:num>
 </w:numbering>

</xml_diff>

<commit_message>
Manuals: clash and headroom checks; What's new for the update
Co-Authored-By: Claude Opus 5.5 <noreply@anthropic.com>
Claude-Session: https://claude.ai/code/session_01HMFznQ3NqvEPBkq88avjvR
</commit_message>
<xml_diff>
--- a/docs/manual/LWK_Viewer_User_Manual_EN.docx
+++ b/docs/manual/LWK_Viewer_User_Manual_EN.docx
@@ -9663,6 +9663,638 @@
         <w:pStyle w:val="Heading2"/>
       </w:pPr>
       <w:r>
+        <w:t xml:space="preserve">Clash and headroom checks</w:t>
+      </w:r>
+    </w:p>
+    <w:p>
+      <w:pPr/>
+      <w:r>
+        <w:t xml:space="preserve">The </w:t>
+      </w:r>
+      <w:r>
+        <w:rPr>
+          <w:b/>
+        </w:rPr>
+        <w:t xml:space="preserve">Checks</w:t>
+      </w:r>
+      <w:r>
+        <w:t xml:space="preserve"> section of the 3D page's left panel finds elements that run into each other, and places where the clear height is too low - in the project's own model and against the consultants' models loaded with it. It checks what the viewer draws (Revit at medium detail, the IFC as converted): quick everyday coordination, not a formal clash report.</w:t>
+      </w:r>
+    </w:p>
+    <w:p>
+      <w:pPr>
+        <w:pStyle w:val="Heading3"/>
+      </w:pPr>
+      <w:r>
+        <w:t xml:space="preserve">Clash: a rule, then Run</w:t>
+      </w:r>
+    </w:p>
+    <w:p>
+      <w:pPr>
+        <w:pStyle w:val="ListParagraph"/>
+        <w:numPr>
+          <w:ilvl w:val="0"/>
+          <w:numId w:val="40"/>
+        </w:numPr>
+      </w:pPr>
+      <w:r>
+        <w:t xml:space="preserve">Load the models you want in the Models panel (a consultant's IFC, another project overlaid).</w:t>
+      </w:r>
+    </w:p>
+    <w:p>
+      <w:pPr>
+        <w:pStyle w:val="ListParagraph"/>
+        <w:numPr>
+          <w:ilvl w:val="0"/>
+          <w:numId w:val="40"/>
+        </w:numPr>
+      </w:pPr>
+      <w:r>
+        <w:t xml:space="preserve">Checks &gt; </w:t>
+      </w:r>
+      <w:r>
+        <w:rPr>
+          <w:b/>
+        </w:rPr>
+        <w:t xml:space="preserve">Clash</w:t>
+      </w:r>
+      <w:r>
+        <w:t xml:space="preserve"> &gt; </w:t>
+      </w:r>
+      <w:r>
+        <w:rPr>
+          <w:b/>
+        </w:rPr>
+        <w:t xml:space="preserve">+</w:t>
+      </w:r>
+      <w:r>
+        <w:t xml:space="preserve">. Name the rule, and choose </w:t>
+      </w:r>
+      <w:r>
+        <w:rPr>
+          <w:b/>
+        </w:rPr>
+        <w:t xml:space="preserve">Set A</w:t>
+      </w:r>
+      <w:r>
+        <w:t xml:space="preserve"> and </w:t>
+      </w:r>
+      <w:r>
+        <w:rPr>
+          <w:b/>
+        </w:rPr>
+        <w:t xml:space="preserve">Set B</w:t>
+      </w:r>
+      <w:r>
+        <w:t xml:space="preserve">: a model and its categories on each side - for example *Ceilings* in the architectural model against *Beams* in the structural one. A and B can be the same model: clashes inside it.</w:t>
+      </w:r>
+    </w:p>
+    <w:p>
+      <w:pPr>
+        <w:pStyle w:val="ListParagraph"/>
+        <w:numPr>
+          <w:ilvl w:val="0"/>
+          <w:numId w:val="40"/>
+        </w:numPr>
+      </w:pPr>
+      <w:r>
+        <w:rPr>
+          <w:b/>
+        </w:rPr>
+        <w:t xml:space="preserve">Overlap that counts</w:t>
+      </w:r>
+      <w:r>
+        <w:t xml:space="preserve"> (default 10 mm): two elements overlapping less than this are touching, not clashing. </w:t>
+      </w:r>
+      <w:r>
+        <w:rPr>
+          <w:b/>
+        </w:rPr>
+        <w:t xml:space="preserve">Clearance</w:t>
+      </w:r>
+      <w:r>
+        <w:t xml:space="preserve">: also report elements that come closer than this without touching (0 = off).</w:t>
+      </w:r>
+    </w:p>
+    <w:p>
+      <w:pPr>
+        <w:pStyle w:val="ListParagraph"/>
+        <w:numPr>
+          <w:ilvl w:val="0"/>
+          <w:numId w:val="40"/>
+        </w:numPr>
+      </w:pPr>
+      <w:r>
+        <w:t xml:space="preserve">Choose where: </w:t>
+      </w:r>
+      <w:r>
+        <w:rPr>
+          <w:b/>
+        </w:rPr>
+        <w:t xml:space="preserve">Whole model</w:t>
+      </w:r>
+      <w:r>
+        <w:t xml:space="preserve">, one </w:t>
+      </w:r>
+      <w:r>
+        <w:rPr>
+          <w:b/>
+        </w:rPr>
+        <w:t xml:space="preserve">Floor</w:t>
+      </w:r>
+      <w:r>
+        <w:t xml:space="preserve">, or </w:t>
+      </w:r>
+      <w:r>
+        <w:rPr>
+          <w:b/>
+        </w:rPr>
+        <w:t xml:space="preserve">Inside the section box</w:t>
+      </w:r>
+      <w:r>
+        <w:t xml:space="preserve"> (quicker on a big model), then </w:t>
+      </w:r>
+      <w:r>
+        <w:rPr>
+          <w:b/>
+        </w:rPr>
+        <w:t xml:space="preserve">Run</w:t>
+      </w:r>
+      <w:r>
+        <w:t xml:space="preserve">.</w:t>
+      </w:r>
+    </w:p>
+    <w:p>
+      <w:pPr/>
+      <w:r>
+        <w:t xml:space="preserve">Rules are saved for everyone on the project, with their last result. A consultant model is named by its name and company, so a rule still works after they send the next version.</w:t>
+      </w:r>
+    </w:p>
+    <w:tbl>
+      <w:tblPr>
+        <w:tblStyle w:val="TableGrid"/>
+        <w:tblW w:w="0" w:type="auto"/>
+        <w:tblLayout w:type="fixed"/>
+        <w:tblLook w:val="04A0" w:firstRow="1" w:lastRow="0" w:firstColumn="0" w:lastColumn="0" w:noHBand="0" w:noVBand="1"/>
+      </w:tblPr>
+      <w:tblGrid>
+        <w:gridCol w:w="4680"/>
+        <w:gridCol w:w="4680"/>
+      </w:tblGrid>
+      <w:tr>
+        <w:trPr>
+          <w:tblHeader/>
+        </w:trPr>
+        <w:tc>
+          <w:tcPr>
+            <w:tcW w:w="4680" w:type="dxa"/>
+            <w:shd w:val="clear" w:color="auto" w:fill="F2F2F2"/>
+          </w:tcPr>
+          <w:p>
+            <w:pPr/>
+            <w:r>
+              <w:t xml:space="preserve">Shown as</w:t>
+            </w:r>
+          </w:p>
+        </w:tc>
+        <w:tc>
+          <w:tcPr>
+            <w:tcW w:w="4680" w:type="dxa"/>
+            <w:shd w:val="clear" w:color="auto" w:fill="F2F2F2"/>
+          </w:tcPr>
+          <w:p>
+            <w:pPr/>
+            <w:r>
+              <w:t xml:space="preserve">Meaning</w:t>
+            </w:r>
+          </w:p>
+        </w:tc>
+      </w:tr>
+      <w:tr>
+        <w:tc>
+          <w:tcPr>
+            <w:tcW w:w="4680" w:type="dxa"/>
+          </w:tcPr>
+          <w:p>
+            <w:pPr/>
+            <w:r>
+              <w:rPr>
+                <w:b/>
+              </w:rPr>
+              <w:t xml:space="preserve">Overlap 120 mm</w:t>
+            </w:r>
+          </w:p>
+        </w:tc>
+        <w:tc>
+          <w:tcPr>
+            <w:tcW w:w="4680" w:type="dxa"/>
+          </w:tcPr>
+          <w:p>
+            <w:pPr/>
+            <w:r>
+              <w:t xml:space="preserve">The two solids overlap; the figure is how deep, at the thinnest</w:t>
+            </w:r>
+          </w:p>
+        </w:tc>
+      </w:tr>
+      <w:tr>
+        <w:tc>
+          <w:tcPr>
+            <w:tcW w:w="4680" w:type="dxa"/>
+          </w:tcPr>
+          <w:p>
+            <w:pPr/>
+            <w:r>
+              <w:rPr>
+                <w:b/>
+              </w:rPr>
+              <w:t xml:space="preserve">Inside</w:t>
+            </w:r>
+          </w:p>
+        </w:tc>
+        <w:tc>
+          <w:tcPr>
+            <w:tcW w:w="4680" w:type="dxa"/>
+          </w:tcPr>
+          <w:p>
+            <w:pPr/>
+            <w:r>
+              <w:t xml:space="preserve">One element is buried in the other (a pipe inside a wall)</w:t>
+            </w:r>
+          </w:p>
+        </w:tc>
+      </w:tr>
+      <w:tr>
+        <w:tc>
+          <w:tcPr>
+            <w:tcW w:w="4680" w:type="dxa"/>
+          </w:tcPr>
+          <w:p>
+            <w:pPr/>
+            <w:r>
+              <w:rPr>
+                <w:b/>
+              </w:rPr>
+              <w:t xml:space="preserve">Too close 30 mm apart</w:t>
+            </w:r>
+          </w:p>
+        </w:tc>
+        <w:tc>
+          <w:tcPr>
+            <w:tcW w:w="4680" w:type="dxa"/>
+          </w:tcPr>
+          <w:p>
+            <w:pPr/>
+            <w:r>
+              <w:t xml:space="preserve">They do not touch, but are closer than the clearance</w:t>
+            </w:r>
+          </w:p>
+        </w:tc>
+      </w:tr>
+      <w:tr>
+        <w:tc>
+          <w:tcPr>
+            <w:tcW w:w="4680" w:type="dxa"/>
+          </w:tcPr>
+          <w:p>
+            <w:pPr/>
+            <w:r>
+              <w:rPr>
+                <w:b/>
+              </w:rPr>
+              <w:t xml:space="preserve">Crossing</w:t>
+            </w:r>
+          </w:p>
+        </w:tc>
+        <w:tc>
+          <w:tcPr>
+            <w:tcW w:w="4680" w:type="dxa"/>
+          </w:tcPr>
+          <w:p>
+            <w:pPr/>
+            <w:r>
+              <w:t xml:space="preserve">Surfaces that are not closed solids cross each other (no depth can be given)</w:t>
+            </w:r>
+          </w:p>
+        </w:tc>
+      </w:tr>
+    </w:tbl>
+    <w:p>
+      <w:pPr>
+        <w:pStyle w:val="ListParagraph"/>
+        <w:numPr>
+          <w:ilvl w:val="0"/>
+          <w:numId w:val="41"/>
+        </w:numPr>
+      </w:pPr>
+      <w:r>
+        <w:t xml:space="preserve">Not reported: walls butting into each other, walls standing on floors, and (ticked by default) doors and windows in their walls, floors and roofs.</w:t>
+      </w:r>
+    </w:p>
+    <w:p>
+      <w:pPr>
+        <w:pStyle w:val="ListParagraph"/>
+        <w:numPr>
+          <w:ilvl w:val="0"/>
+          <w:numId w:val="41"/>
+        </w:numPr>
+      </w:pPr>
+      <w:r>
+        <w:t xml:space="preserve">Clashes that sit together and share an element are grouped ("5 clashes around Beam 12").</w:t>
+      </w:r>
+    </w:p>
+    <w:p>
+      <w:pPr>
+        <w:pStyle w:val="ListParagraph"/>
+        <w:numPr>
+          <w:ilvl w:val="0"/>
+          <w:numId w:val="41"/>
+        </w:numPr>
+      </w:pPr>
+      <w:r>
+        <w:t xml:space="preserve">Click a clash: the view goes there, the two elements are coloured (orange and blue) and a red dot marks the spot. </w:t>
+      </w:r>
+      <w:r>
+        <w:rPr>
+          <w:b/>
+        </w:rPr>
+        <w:t xml:space="preserve">Only these</w:t>
+      </w:r>
+      <w:r>
+        <w:t xml:space="preserve"> hides everything else; </w:t>
+      </w:r>
+      <w:r>
+        <w:rPr>
+          <w:b/>
+        </w:rPr>
+        <w:t xml:space="preserve">Show all</w:t>
+      </w:r>
+      <w:r>
+        <w:t xml:space="preserve"> brings it back.</w:t>
+      </w:r>
+    </w:p>
+    <w:p>
+      <w:pPr>
+        <w:pStyle w:val="ListParagraph"/>
+        <w:numPr>
+          <w:ilvl w:val="0"/>
+          <w:numId w:val="41"/>
+        </w:numPr>
+      </w:pPr>
+      <w:r>
+        <w:rPr>
+          <w:b/>
+        </w:rPr>
+        <w:t xml:space="preserve">Make issue</w:t>
+      </w:r>
+      <w:r>
+        <w:t xml:space="preserve"> raises a *Clash* issue there, with a picture and both elements' ids, ready to assign and to send by BCF to Revit or Navisworks.</w:t>
+      </w:r>
+    </w:p>
+    <w:p>
+      <w:pPr>
+        <w:pStyle w:val="ListParagraph"/>
+        <w:numPr>
+          <w:ilvl w:val="0"/>
+          <w:numId w:val="41"/>
+        </w:numPr>
+      </w:pPr>
+      <w:r>
+        <w:rPr>
+          <w:b/>
+        </w:rPr>
+        <w:t xml:space="preserve">Not an issue</w:t>
+      </w:r>
+      <w:r>
+        <w:t xml:space="preserve"> keeps that pair off the list in later runs too (find them under </w:t>
+      </w:r>
+      <w:r>
+        <w:rPr>
+          <w:b/>
+        </w:rPr>
+        <w:t xml:space="preserve">Not an issue</w:t>
+      </w:r>
+      <w:r>
+        <w:t xml:space="preserve">).</w:t>
+      </w:r>
+    </w:p>
+    <w:p>
+      <w:pPr>
+        <w:pStyle w:val="ListParagraph"/>
+        <w:numPr>
+          <w:ilvl w:val="0"/>
+          <w:numId w:val="41"/>
+        </w:numPr>
+      </w:pPr>
+      <w:r>
+        <w:rPr>
+          <w:b/>
+        </w:rPr>
+        <w:t xml:space="preserve">Run again</w:t>
+      </w:r>
+      <w:r>
+        <w:t xml:space="preserve"> after a new publish or a new consultant model: each clash is marked </w:t>
+      </w:r>
+      <w:r>
+        <w:rPr>
+          <w:b/>
+        </w:rPr>
+        <w:t xml:space="preserve">New</w:t>
+      </w:r>
+      <w:r>
+        <w:t xml:space="preserve">, still there, or </w:t>
+      </w:r>
+      <w:r>
+        <w:rPr>
+          <w:b/>
+        </w:rPr>
+        <w:t xml:space="preserve">Gone</w:t>
+      </w:r>
+      <w:r>
+        <w:t xml:space="preserve">. A clash that has gone still shows its issue, so it can be closed.</w:t>
+      </w:r>
+    </w:p>
+    <w:p>
+      <w:pPr>
+        <w:pStyle w:val="Heading3"/>
+      </w:pPr>
+      <w:r>
+        <w:t xml:space="preserve">Headroom</w:t>
+      </w:r>
+    </w:p>
+    <w:p>
+      <w:pPr>
+        <w:pStyle w:val="ListParagraph"/>
+        <w:numPr>
+          <w:ilvl w:val="0"/>
+          <w:numId w:val="42"/>
+        </w:numPr>
+      </w:pPr>
+      <w:r>
+        <w:rPr>
+          <w:b/>
+        </w:rPr>
+        <w:t xml:space="preserve">Probe:</w:t>
+      </w:r>
+      <w:r>
+        <w:t xml:space="preserve"> Checks &gt; </w:t>
+      </w:r>
+      <w:r>
+        <w:rPr>
+          <w:b/>
+        </w:rPr>
+        <w:t xml:space="preserve">Headroom</w:t>
+      </w:r>
+      <w:r>
+        <w:t xml:space="preserve"> &gt; </w:t>
+      </w:r>
+      <w:r>
+        <w:rPr>
+          <w:b/>
+        </w:rPr>
+        <w:t xml:space="preserve">Probe</w:t>
+      </w:r>
+      <w:r>
+        <w:t xml:space="preserve">, then click a floor, a stair tread or a landing. A line goes straight up to the first thing above, with its height - red under the stair limit, amber under the floor limit, green otherwise. </w:t>
+      </w:r>
+      <w:r>
+        <w:rPr>
+          <w:b/>
+        </w:rPr>
+        <w:t xml:space="preserve">Keep</w:t>
+      </w:r>
+      <w:r>
+        <w:t xml:space="preserve"> saves it as a dimension for everyone. </w:t>
+      </w:r>
+      <w:r>
+        <w:rPr>
+          <w:b/>
+        </w:rPr>
+        <w:t xml:space="preserve">Esc</w:t>
+      </w:r>
+      <w:r>
+        <w:t xml:space="preserve"> stops.</w:t>
+      </w:r>
+    </w:p>
+    <w:p>
+      <w:pPr>
+        <w:pStyle w:val="ListParagraph"/>
+        <w:numPr>
+          <w:ilvl w:val="0"/>
+          <w:numId w:val="42"/>
+        </w:numPr>
+      </w:pPr>
+      <w:r>
+        <w:rPr>
+          <w:b/>
+        </w:rPr>
+        <w:t xml:space="preserve">Scan:</w:t>
+      </w:r>
+      <w:r>
+        <w:t xml:space="preserve"> set the limits (</w:t>
+      </w:r>
+      <w:r>
+        <w:rPr>
+          <w:b/>
+        </w:rPr>
+        <w:t xml:space="preserve">Floors</w:t>
+      </w:r>
+      <w:r>
+        <w:t xml:space="preserve">, default 2.30 m; </w:t>
+      </w:r>
+      <w:r>
+        <w:rPr>
+          <w:b/>
+        </w:rPr>
+        <w:t xml:space="preserve">Stairs, ramps</w:t>
+      </w:r>
+      <w:r>
+        <w:t xml:space="preserve">, default 2.00 m), choose a floor (or inside the section box), then </w:t>
+      </w:r>
+      <w:r>
+        <w:rPr>
+          <w:b/>
+        </w:rPr>
+        <w:t xml:space="preserve">Scan</w:t>
+      </w:r>
+      <w:r>
+        <w:t xml:space="preserve">. Floors, stairs, landings and ramps are measured on a 0.25 m grid (0.2 m on stairs, finer under narrow ducts, pipes and beams) up to what is overhead: slabs, ceilings, beams, stairs above, ducts, pipes, trays, equipment.</w:t>
+      </w:r>
+    </w:p>
+    <w:p>
+      <w:pPr>
+        <w:pStyle w:val="ListParagraph"/>
+        <w:numPr>
+          <w:ilvl w:val="0"/>
+          <w:numId w:val="42"/>
+        </w:numPr>
+      </w:pPr>
+      <w:r>
+        <w:rPr>
+          <w:b/>
+        </w:rPr>
+        <w:t xml:space="preserve">Models counted</w:t>
+      </w:r>
+      <w:r>
+        <w:t xml:space="preserve"> chooses which models count as overhead - tick the consultants' MEP and structure models to see their effect.</w:t>
+      </w:r>
+    </w:p>
+    <w:p>
+      <w:pPr>
+        <w:pStyle w:val="ListParagraph"/>
+        <w:numPr>
+          <w:ilvl w:val="0"/>
+          <w:numId w:val="42"/>
+        </w:numPr>
+      </w:pPr>
+      <w:r>
+        <w:t xml:space="preserve">Places under the limit are red squares on the floor (amber: within 100 mm over it), and each place is listed with its lowest height, what is overhead and its area. </w:t>
+      </w:r>
+      <w:r>
+        <w:rPr>
+          <w:b/>
+        </w:rPr>
+        <w:t xml:space="preserve">Look</w:t>
+      </w:r>
+      <w:r>
+        <w:t xml:space="preserve"> cuts the storey round it; </w:t>
+      </w:r>
+      <w:r>
+        <w:rPr>
+          <w:b/>
+        </w:rPr>
+        <w:t xml:space="preserve">Make issue</w:t>
+      </w:r>
+      <w:r>
+        <w:t xml:space="preserve"> raises it. </w:t>
+      </w:r>
+      <w:r>
+        <w:rPr>
+          <w:b/>
+        </w:rPr>
+        <w:t xml:space="preserve">Clear</w:t>
+      </w:r>
+      <w:r>
+        <w:t xml:space="preserve"> takes the squares away.</w:t>
+      </w:r>
+    </w:p>
+    <w:p>
+      <w:pPr>
+        <w:pStyle w:val="ListParagraph"/>
+        <w:numPr>
+          <w:ilvl w:val="0"/>
+          <w:numId w:val="42"/>
+        </w:numPr>
+      </w:pPr>
+      <w:r>
+        <w:t xml:space="preserve">A floor finish laid on a slab, or a stair standing on a floor, is not counted as overhead. Height is measured vertically from where people stand (on a stair, from the treads).</w:t>
+      </w:r>
+    </w:p>
+    <w:p>
+      <w:pPr>
+        <w:pStyle w:val="Heading2"/>
+      </w:pPr>
+      <w:r>
         <w:t xml:space="preserve">Walking through the model</w:t>
       </w:r>
     </w:p>
@@ -10097,7 +10729,7 @@
         <w:pStyle w:val="ListParagraph"/>
         <w:numPr>
           <w:ilvl w:val="0"/>
-          <w:numId w:val="40"/>
+          <w:numId w:val="43"/>
         </w:numPr>
       </w:pPr>
       <w:r>
@@ -10115,7 +10747,7 @@
         <w:pStyle w:val="ListParagraph"/>
         <w:numPr>
           <w:ilvl w:val="0"/>
-          <w:numId w:val="40"/>
+          <w:numId w:val="43"/>
         </w:numPr>
       </w:pPr>
       <w:r>
@@ -10133,7 +10765,7 @@
         <w:pStyle w:val="ListParagraph"/>
         <w:numPr>
           <w:ilvl w:val="0"/>
-          <w:numId w:val="40"/>
+          <w:numId w:val="43"/>
         </w:numPr>
       </w:pPr>
       <w:r>
@@ -10151,7 +10783,7 @@
         <w:pStyle w:val="ListParagraph"/>
         <w:numPr>
           <w:ilvl w:val="0"/>
-          <w:numId w:val="40"/>
+          <w:numId w:val="43"/>
         </w:numPr>
       </w:pPr>
       <w:r>
@@ -10374,7 +11006,7 @@
         <w:pStyle w:val="ListParagraph"/>
         <w:numPr>
           <w:ilvl w:val="0"/>
-          <w:numId w:val="41"/>
+          <w:numId w:val="44"/>
         </w:numPr>
       </w:pPr>
       <w:r>
@@ -10386,7 +11018,7 @@
         <w:pStyle w:val="ListParagraph"/>
         <w:numPr>
           <w:ilvl w:val="0"/>
-          <w:numId w:val="41"/>
+          <w:numId w:val="44"/>
         </w:numPr>
       </w:pPr>
       <w:r>
@@ -10449,7 +11081,7 @@
         <w:pStyle w:val="ListParagraph"/>
         <w:numPr>
           <w:ilvl w:val="0"/>
-          <w:numId w:val="41"/>
+          <w:numId w:val="44"/>
         </w:numPr>
       </w:pPr>
       <w:r>
@@ -10470,7 +11102,7 @@
         <w:pStyle w:val="ListParagraph"/>
         <w:numPr>
           <w:ilvl w:val="0"/>
-          <w:numId w:val="41"/>
+          <w:numId w:val="44"/>
         </w:numPr>
       </w:pPr>
       <w:r>
@@ -10551,7 +11183,7 @@
         <w:pStyle w:val="ListParagraph"/>
         <w:numPr>
           <w:ilvl w:val="0"/>
-          <w:numId w:val="41"/>
+          <w:numId w:val="44"/>
         </w:numPr>
       </w:pPr>
       <w:r>
@@ -10563,7 +11195,7 @@
         <w:pStyle w:val="ListParagraph"/>
         <w:numPr>
           <w:ilvl w:val="0"/>
-          <w:numId w:val="41"/>
+          <w:numId w:val="44"/>
         </w:numPr>
       </w:pPr>
       <w:r>
@@ -11026,7 +11658,7 @@
         <w:pStyle w:val="ListParagraph"/>
         <w:numPr>
           <w:ilvl w:val="0"/>
-          <w:numId w:val="42"/>
+          <w:numId w:val="45"/>
         </w:numPr>
       </w:pPr>
       <w:r>
@@ -11047,7 +11679,7 @@
         <w:pStyle w:val="ListParagraph"/>
         <w:numPr>
           <w:ilvl w:val="0"/>
-          <w:numId w:val="42"/>
+          <w:numId w:val="45"/>
         </w:numPr>
       </w:pPr>
       <w:r>
@@ -11083,7 +11715,7 @@
         <w:pStyle w:val="ListParagraph"/>
         <w:numPr>
           <w:ilvl w:val="0"/>
-          <w:numId w:val="42"/>
+          <w:numId w:val="45"/>
         </w:numPr>
       </w:pPr>
       <w:r>
@@ -11131,7 +11763,7 @@
         <w:pStyle w:val="ListParagraph"/>
         <w:numPr>
           <w:ilvl w:val="0"/>
-          <w:numId w:val="42"/>
+          <w:numId w:val="45"/>
         </w:numPr>
       </w:pPr>
       <w:r>
@@ -11158,7 +11790,7 @@
         <w:pStyle w:val="ListParagraph"/>
         <w:numPr>
           <w:ilvl w:val="0"/>
-          <w:numId w:val="42"/>
+          <w:numId w:val="45"/>
         </w:numPr>
       </w:pPr>
       <w:r>
@@ -11176,7 +11808,7 @@
         <w:pStyle w:val="ListParagraph"/>
         <w:numPr>
           <w:ilvl w:val="0"/>
-          <w:numId w:val="42"/>
+          <w:numId w:val="45"/>
         </w:numPr>
       </w:pPr>
       <w:r>
@@ -11194,7 +11826,7 @@
         <w:pStyle w:val="ListParagraph"/>
         <w:numPr>
           <w:ilvl w:val="0"/>
-          <w:numId w:val="42"/>
+          <w:numId w:val="45"/>
         </w:numPr>
       </w:pPr>
       <w:r>
@@ -11239,7 +11871,7 @@
         <w:pStyle w:val="ListParagraph"/>
         <w:numPr>
           <w:ilvl w:val="0"/>
-          <w:numId w:val="42"/>
+          <w:numId w:val="45"/>
         </w:numPr>
       </w:pPr>
       <w:r>
@@ -11275,7 +11907,7 @@
         <w:pStyle w:val="ListParagraph"/>
         <w:numPr>
           <w:ilvl w:val="0"/>
-          <w:numId w:val="42"/>
+          <w:numId w:val="45"/>
         </w:numPr>
       </w:pPr>
       <w:r>
@@ -11524,7 +12156,7 @@
         <w:pStyle w:val="ListParagraph"/>
         <w:numPr>
           <w:ilvl w:val="0"/>
-          <w:numId w:val="43"/>
+          <w:numId w:val="46"/>
         </w:numPr>
       </w:pPr>
       <w:r>
@@ -11560,7 +12192,7 @@
         <w:pStyle w:val="ListParagraph"/>
         <w:numPr>
           <w:ilvl w:val="0"/>
-          <w:numId w:val="43"/>
+          <w:numId w:val="46"/>
         </w:numPr>
       </w:pPr>
       <w:r>
@@ -11605,7 +12237,7 @@
         <w:pStyle w:val="ListParagraph"/>
         <w:numPr>
           <w:ilvl w:val="0"/>
-          <w:numId w:val="43"/>
+          <w:numId w:val="46"/>
         </w:numPr>
       </w:pPr>
       <w:r>
@@ -11631,7 +12263,7 @@
         <w:pStyle w:val="ListParagraph"/>
         <w:numPr>
           <w:ilvl w:val="0"/>
-          <w:numId w:val="44"/>
+          <w:numId w:val="47"/>
         </w:numPr>
       </w:pPr>
       <w:r>
@@ -11658,7 +12290,7 @@
         <w:pStyle w:val="ListParagraph"/>
         <w:numPr>
           <w:ilvl w:val="0"/>
-          <w:numId w:val="44"/>
+          <w:numId w:val="47"/>
         </w:numPr>
       </w:pPr>
       <w:r>
@@ -11679,7 +12311,7 @@
         <w:pStyle w:val="ListParagraph"/>
         <w:numPr>
           <w:ilvl w:val="0"/>
-          <w:numId w:val="44"/>
+          <w:numId w:val="47"/>
         </w:numPr>
       </w:pPr>
       <w:r>
@@ -11720,7 +12352,7 @@
         <w:pStyle w:val="ListParagraph"/>
         <w:numPr>
           <w:ilvl w:val="0"/>
-          <w:numId w:val="45"/>
+          <w:numId w:val="48"/>
         </w:numPr>
       </w:pPr>
       <w:r>
@@ -11765,7 +12397,7 @@
         <w:pStyle w:val="ListParagraph"/>
         <w:numPr>
           <w:ilvl w:val="0"/>
-          <w:numId w:val="45"/>
+          <w:numId w:val="48"/>
         </w:numPr>
       </w:pPr>
       <w:r>
@@ -11801,7 +12433,7 @@
         <w:pStyle w:val="ListParagraph"/>
         <w:numPr>
           <w:ilvl w:val="0"/>
-          <w:numId w:val="45"/>
+          <w:numId w:val="48"/>
         </w:numPr>
       </w:pPr>
       <w:r>
@@ -11828,7 +12460,7 @@
         <w:pStyle w:val="ListParagraph"/>
         <w:numPr>
           <w:ilvl w:val="0"/>
-          <w:numId w:val="45"/>
+          <w:numId w:val="48"/>
         </w:numPr>
       </w:pPr>
       <w:r>
@@ -12143,7 +12775,7 @@
         <w:pStyle w:val="ListParagraph"/>
         <w:numPr>
           <w:ilvl w:val="0"/>
-          <w:numId w:val="46"/>
+          <w:numId w:val="49"/>
         </w:numPr>
       </w:pPr>
       <w:r>
@@ -12218,7 +12850,7 @@
         <w:pStyle w:val="ListParagraph"/>
         <w:numPr>
           <w:ilvl w:val="0"/>
-          <w:numId w:val="46"/>
+          <w:numId w:val="49"/>
         </w:numPr>
       </w:pPr>
       <w:r>
@@ -12248,7 +12880,7 @@
         <w:pStyle w:val="ListParagraph"/>
         <w:numPr>
           <w:ilvl w:val="0"/>
-          <w:numId w:val="46"/>
+          <w:numId w:val="49"/>
         </w:numPr>
       </w:pPr>
       <w:r>
@@ -12274,7 +12906,7 @@
         <w:pStyle w:val="ListParagraph"/>
         <w:numPr>
           <w:ilvl w:val="0"/>
-          <w:numId w:val="47"/>
+          <w:numId w:val="50"/>
         </w:numPr>
       </w:pPr>
       <w:r>
@@ -12304,7 +12936,7 @@
         <w:pStyle w:val="ListParagraph"/>
         <w:numPr>
           <w:ilvl w:val="0"/>
-          <w:numId w:val="47"/>
+          <w:numId w:val="50"/>
         </w:numPr>
       </w:pPr>
       <w:r>
@@ -12325,7 +12957,7 @@
         <w:pStyle w:val="ListParagraph"/>
         <w:numPr>
           <w:ilvl w:val="0"/>
-          <w:numId w:val="47"/>
+          <w:numId w:val="50"/>
         </w:numPr>
       </w:pPr>
       <w:r>
@@ -12355,7 +12987,7 @@
         <w:pStyle w:val="ListParagraph"/>
         <w:numPr>
           <w:ilvl w:val="0"/>
-          <w:numId w:val="48"/>
+          <w:numId w:val="51"/>
         </w:numPr>
       </w:pPr>
       <w:r>
@@ -12367,7 +12999,7 @@
         <w:pStyle w:val="ListParagraph"/>
         <w:numPr>
           <w:ilvl w:val="0"/>
-          <w:numId w:val="48"/>
+          <w:numId w:val="51"/>
         </w:numPr>
       </w:pPr>
       <w:r>
@@ -12411,7 +13043,7 @@
         <w:pStyle w:val="ListParagraph"/>
         <w:numPr>
           <w:ilvl w:val="0"/>
-          <w:numId w:val="49"/>
+          <w:numId w:val="52"/>
         </w:numPr>
       </w:pPr>
       <w:r>
@@ -12459,7 +13091,7 @@
         <w:pStyle w:val="ListParagraph"/>
         <w:numPr>
           <w:ilvl w:val="0"/>
-          <w:numId w:val="49"/>
+          <w:numId w:val="52"/>
         </w:numPr>
       </w:pPr>
       <w:r>
@@ -12471,7 +13103,7 @@
         <w:pStyle w:val="ListParagraph"/>
         <w:numPr>
           <w:ilvl w:val="0"/>
-          <w:numId w:val="49"/>
+          <w:numId w:val="52"/>
         </w:numPr>
       </w:pPr>
       <w:r>
@@ -12489,7 +13121,7 @@
         <w:pStyle w:val="ListParagraph"/>
         <w:numPr>
           <w:ilvl w:val="0"/>
-          <w:numId w:val="49"/>
+          <w:numId w:val="52"/>
         </w:numPr>
       </w:pPr>
       <w:r>
@@ -12501,7 +13133,7 @@
         <w:pStyle w:val="ListParagraph"/>
         <w:numPr>
           <w:ilvl w:val="0"/>
-          <w:numId w:val="49"/>
+          <w:numId w:val="52"/>
         </w:numPr>
       </w:pPr>
       <w:r>
@@ -12513,7 +13145,7 @@
         <w:pStyle w:val="ListParagraph"/>
         <w:numPr>
           <w:ilvl w:val="0"/>
-          <w:numId w:val="49"/>
+          <w:numId w:val="52"/>
         </w:numPr>
       </w:pPr>
       <w:r>
@@ -12525,7 +13157,7 @@
         <w:pStyle w:val="ListParagraph"/>
         <w:numPr>
           <w:ilvl w:val="0"/>
-          <w:numId w:val="49"/>
+          <w:numId w:val="52"/>
         </w:numPr>
       </w:pPr>
       <w:r>
@@ -12799,7 +13431,7 @@
         <w:pStyle w:val="ListParagraph"/>
         <w:numPr>
           <w:ilvl w:val="0"/>
-          <w:numId w:val="50"/>
+          <w:numId w:val="53"/>
         </w:numPr>
       </w:pPr>
       <w:r>
@@ -12811,7 +13443,7 @@
         <w:pStyle w:val="ListParagraph"/>
         <w:numPr>
           <w:ilvl w:val="0"/>
-          <w:numId w:val="50"/>
+          <w:numId w:val="53"/>
         </w:numPr>
       </w:pPr>
       <w:r>
@@ -12823,7 +13455,7 @@
         <w:pStyle w:val="ListParagraph"/>
         <w:numPr>
           <w:ilvl w:val="0"/>
-          <w:numId w:val="50"/>
+          <w:numId w:val="53"/>
         </w:numPr>
       </w:pPr>
       <w:r>
@@ -13097,7 +13729,7 @@
         <w:pStyle w:val="ListParagraph"/>
         <w:numPr>
           <w:ilvl w:val="0"/>
-          <w:numId w:val="51"/>
+          <w:numId w:val="54"/>
         </w:numPr>
       </w:pPr>
       <w:r>
@@ -13109,7 +13741,7 @@
         <w:pStyle w:val="ListParagraph"/>
         <w:numPr>
           <w:ilvl w:val="0"/>
-          <w:numId w:val="51"/>
+          <w:numId w:val="54"/>
         </w:numPr>
       </w:pPr>
       <w:r>
@@ -13121,7 +13753,7 @@
         <w:pStyle w:val="ListParagraph"/>
         <w:numPr>
           <w:ilvl w:val="0"/>
-          <w:numId w:val="51"/>
+          <w:numId w:val="54"/>
         </w:numPr>
       </w:pPr>
       <w:r>
@@ -13164,7 +13796,7 @@
         <w:pStyle w:val="ListParagraph"/>
         <w:numPr>
           <w:ilvl w:val="0"/>
-          <w:numId w:val="52"/>
+          <w:numId w:val="55"/>
         </w:numPr>
       </w:pPr>
       <w:r>
@@ -13221,7 +13853,7 @@
         <w:pStyle w:val="ListParagraph"/>
         <w:numPr>
           <w:ilvl w:val="0"/>
-          <w:numId w:val="52"/>
+          <w:numId w:val="55"/>
         </w:numPr>
       </w:pPr>
       <w:r>
@@ -13251,7 +13883,7 @@
         <w:pStyle w:val="ListParagraph"/>
         <w:numPr>
           <w:ilvl w:val="0"/>
-          <w:numId w:val="52"/>
+          <w:numId w:val="55"/>
         </w:numPr>
       </w:pPr>
       <w:r>
@@ -13289,7 +13921,7 @@
         <w:pStyle w:val="ListParagraph"/>
         <w:numPr>
           <w:ilvl w:val="0"/>
-          <w:numId w:val="53"/>
+          <w:numId w:val="56"/>
         </w:numPr>
       </w:pPr>
       <w:r>
@@ -13310,7 +13942,7 @@
         <w:pStyle w:val="ListParagraph"/>
         <w:numPr>
           <w:ilvl w:val="0"/>
-          <w:numId w:val="53"/>
+          <w:numId w:val="56"/>
         </w:numPr>
       </w:pPr>
       <w:r>
@@ -13355,7 +13987,7 @@
         <w:pStyle w:val="ListParagraph"/>
         <w:numPr>
           <w:ilvl w:val="0"/>
-          <w:numId w:val="53"/>
+          <w:numId w:val="56"/>
         </w:numPr>
       </w:pPr>
       <w:r>
@@ -13454,7 +14086,7 @@
         <w:pStyle w:val="ListParagraph"/>
         <w:numPr>
           <w:ilvl w:val="0"/>
-          <w:numId w:val="53"/>
+          <w:numId w:val="56"/>
         </w:numPr>
       </w:pPr>
       <w:r>
@@ -13499,7 +14131,7 @@
         <w:pStyle w:val="ListParagraph"/>
         <w:numPr>
           <w:ilvl w:val="0"/>
-          <w:numId w:val="53"/>
+          <w:numId w:val="56"/>
         </w:numPr>
       </w:pPr>
       <w:r>
@@ -13848,7 +14480,7 @@
         <w:pStyle w:val="ListParagraph"/>
         <w:numPr>
           <w:ilvl w:val="0"/>
-          <w:numId w:val="54"/>
+          <w:numId w:val="57"/>
         </w:numPr>
       </w:pPr>
       <w:r>
@@ -13878,7 +14510,7 @@
         <w:pStyle w:val="ListParagraph"/>
         <w:numPr>
           <w:ilvl w:val="0"/>
-          <w:numId w:val="54"/>
+          <w:numId w:val="57"/>
         </w:numPr>
       </w:pPr>
       <w:r>
@@ -13926,7 +14558,7 @@
         <w:pStyle w:val="ListParagraph"/>
         <w:numPr>
           <w:ilvl w:val="0"/>
-          <w:numId w:val="54"/>
+          <w:numId w:val="57"/>
         </w:numPr>
       </w:pPr>
       <w:r>
@@ -13953,7 +14585,7 @@
         <w:pStyle w:val="ListParagraph"/>
         <w:numPr>
           <w:ilvl w:val="0"/>
-          <w:numId w:val="54"/>
+          <w:numId w:val="57"/>
         </w:numPr>
       </w:pPr>
       <w:r>
@@ -13979,7 +14611,7 @@
         <w:pStyle w:val="ListParagraph"/>
         <w:numPr>
           <w:ilvl w:val="0"/>
-          <w:numId w:val="55"/>
+          <w:numId w:val="58"/>
         </w:numPr>
       </w:pPr>
       <w:r>
@@ -14000,7 +14632,7 @@
         <w:pStyle w:val="ListParagraph"/>
         <w:numPr>
           <w:ilvl w:val="0"/>
-          <w:numId w:val="55"/>
+          <w:numId w:val="58"/>
         </w:numPr>
       </w:pPr>
       <w:r>
@@ -14036,7 +14668,7 @@
         <w:pStyle w:val="ListParagraph"/>
         <w:numPr>
           <w:ilvl w:val="0"/>
-          <w:numId w:val="55"/>
+          <w:numId w:val="58"/>
         </w:numPr>
       </w:pPr>
       <w:r>
@@ -14072,7 +14704,7 @@
         <w:pStyle w:val="ListParagraph"/>
         <w:numPr>
           <w:ilvl w:val="0"/>
-          <w:numId w:val="55"/>
+          <w:numId w:val="58"/>
         </w:numPr>
       </w:pPr>
       <w:r>
@@ -14101,7 +14733,7 @@
         <w:pStyle w:val="ListParagraph"/>
         <w:numPr>
           <w:ilvl w:val="0"/>
-          <w:numId w:val="56"/>
+          <w:numId w:val="59"/>
         </w:numPr>
       </w:pPr>
       <w:r>
@@ -14122,7 +14754,7 @@
         <w:pStyle w:val="ListParagraph"/>
         <w:numPr>
           <w:ilvl w:val="0"/>
-          <w:numId w:val="56"/>
+          <w:numId w:val="59"/>
         </w:numPr>
       </w:pPr>
       <w:r>
@@ -14343,7 +14975,7 @@
         <w:pStyle w:val="ListParagraph"/>
         <w:numPr>
           <w:ilvl w:val="0"/>
-          <w:numId w:val="57"/>
+          <w:numId w:val="60"/>
         </w:numPr>
       </w:pPr>
       <w:r>
@@ -14433,7 +15065,7 @@
         <w:pStyle w:val="ListParagraph"/>
         <w:numPr>
           <w:ilvl w:val="0"/>
-          <w:numId w:val="57"/>
+          <w:numId w:val="60"/>
         </w:numPr>
       </w:pPr>
       <w:r>
@@ -14463,7 +15095,7 @@
         <w:pStyle w:val="ListParagraph"/>
         <w:numPr>
           <w:ilvl w:val="0"/>
-          <w:numId w:val="57"/>
+          <w:numId w:val="60"/>
         </w:numPr>
       </w:pPr>
       <w:r>
@@ -14484,7 +15116,7 @@
         <w:pStyle w:val="ListParagraph"/>
         <w:numPr>
           <w:ilvl w:val="0"/>
-          <w:numId w:val="57"/>
+          <w:numId w:val="60"/>
         </w:numPr>
       </w:pPr>
       <w:r>
@@ -14520,7 +15152,7 @@
         <w:pStyle w:val="ListParagraph"/>
         <w:numPr>
           <w:ilvl w:val="0"/>
-          <w:numId w:val="57"/>
+          <w:numId w:val="60"/>
         </w:numPr>
       </w:pPr>
       <w:r>
@@ -14538,7 +15170,7 @@
         <w:pStyle w:val="ListParagraph"/>
         <w:numPr>
           <w:ilvl w:val="0"/>
-          <w:numId w:val="57"/>
+          <w:numId w:val="60"/>
         </w:numPr>
       </w:pPr>
       <w:r>
@@ -14582,7 +15214,7 @@
         <w:pStyle w:val="ListParagraph"/>
         <w:numPr>
           <w:ilvl w:val="0"/>
-          <w:numId w:val="58"/>
+          <w:numId w:val="61"/>
         </w:numPr>
       </w:pPr>
       <w:r>
@@ -14663,7 +15295,7 @@
         <w:pStyle w:val="ListParagraph"/>
         <w:numPr>
           <w:ilvl w:val="0"/>
-          <w:numId w:val="58"/>
+          <w:numId w:val="61"/>
         </w:numPr>
       </w:pPr>
       <w:r>
@@ -14681,7 +15313,7 @@
         <w:pStyle w:val="ListParagraph"/>
         <w:numPr>
           <w:ilvl w:val="0"/>
-          <w:numId w:val="58"/>
+          <w:numId w:val="61"/>
         </w:numPr>
       </w:pPr>
       <w:r>
@@ -14702,7 +15334,7 @@
         <w:pStyle w:val="ListParagraph"/>
         <w:numPr>
           <w:ilvl w:val="0"/>
-          <w:numId w:val="58"/>
+          <w:numId w:val="61"/>
         </w:numPr>
       </w:pPr>
       <w:r>
@@ -14728,7 +15360,7 @@
         <w:pStyle w:val="ListParagraph"/>
         <w:numPr>
           <w:ilvl w:val="0"/>
-          <w:numId w:val="59"/>
+          <w:numId w:val="62"/>
         </w:numPr>
       </w:pPr>
       <w:r>
@@ -14791,7 +15423,7 @@
         <w:pStyle w:val="ListParagraph"/>
         <w:numPr>
           <w:ilvl w:val="0"/>
-          <w:numId w:val="59"/>
+          <w:numId w:val="62"/>
         </w:numPr>
       </w:pPr>
       <w:r>
@@ -14818,7 +15450,7 @@
         <w:pStyle w:val="ListParagraph"/>
         <w:numPr>
           <w:ilvl w:val="0"/>
-          <w:numId w:val="59"/>
+          <w:numId w:val="62"/>
         </w:numPr>
       </w:pPr>
       <w:r>
@@ -14836,7 +15468,7 @@
         <w:pStyle w:val="ListParagraph"/>
         <w:numPr>
           <w:ilvl w:val="0"/>
-          <w:numId w:val="59"/>
+          <w:numId w:val="62"/>
         </w:numPr>
       </w:pPr>
       <w:r>
@@ -15467,7 +16099,7 @@
         <w:pStyle w:val="ListParagraph"/>
         <w:numPr>
           <w:ilvl w:val="0"/>
-          <w:numId w:val="60"/>
+          <w:numId w:val="63"/>
         </w:numPr>
       </w:pPr>
       <w:r>
@@ -15485,7 +16117,7 @@
         <w:pStyle w:val="ListParagraph"/>
         <w:numPr>
           <w:ilvl w:val="0"/>
-          <w:numId w:val="60"/>
+          <w:numId w:val="63"/>
         </w:numPr>
       </w:pPr>
       <w:r>
@@ -15503,7 +16135,7 @@
         <w:pStyle w:val="ListParagraph"/>
         <w:numPr>
           <w:ilvl w:val="0"/>
-          <w:numId w:val="60"/>
+          <w:numId w:val="63"/>
         </w:numPr>
       </w:pPr>
       <w:r>
@@ -15521,7 +16153,7 @@
         <w:pStyle w:val="ListParagraph"/>
         <w:numPr>
           <w:ilvl w:val="0"/>
-          <w:numId w:val="60"/>
+          <w:numId w:val="63"/>
         </w:numPr>
       </w:pPr>
       <w:r>
@@ -15539,7 +16171,7 @@
         <w:pStyle w:val="ListParagraph"/>
         <w:numPr>
           <w:ilvl w:val="0"/>
-          <w:numId w:val="60"/>
+          <w:numId w:val="63"/>
         </w:numPr>
       </w:pPr>
       <w:r>
@@ -15557,7 +16189,7 @@
         <w:pStyle w:val="ListParagraph"/>
         <w:numPr>
           <w:ilvl w:val="0"/>
-          <w:numId w:val="60"/>
+          <w:numId w:val="63"/>
         </w:numPr>
       </w:pPr>
       <w:r>
@@ -16655,7 +17287,7 @@
         <w:pStyle w:val="ListParagraph"/>
         <w:numPr>
           <w:ilvl w:val="0"/>
-          <w:numId w:val="61"/>
+          <w:numId w:val="64"/>
         </w:numPr>
       </w:pPr>
       <w:r>
@@ -16667,7 +17299,7 @@
         <w:pStyle w:val="ListParagraph"/>
         <w:numPr>
           <w:ilvl w:val="0"/>
-          <w:numId w:val="61"/>
+          <w:numId w:val="64"/>
         </w:numPr>
       </w:pPr>
       <w:r>
@@ -16679,7 +17311,7 @@
         <w:pStyle w:val="ListParagraph"/>
         <w:numPr>
           <w:ilvl w:val="0"/>
-          <w:numId w:val="61"/>
+          <w:numId w:val="64"/>
         </w:numPr>
       </w:pPr>
       <w:r>
@@ -16691,7 +17323,7 @@
         <w:pStyle w:val="ListParagraph"/>
         <w:numPr>
           <w:ilvl w:val="0"/>
-          <w:numId w:val="61"/>
+          <w:numId w:val="64"/>
         </w:numPr>
       </w:pPr>
       <w:r>
@@ -16703,7 +17335,7 @@
         <w:pStyle w:val="ListParagraph"/>
         <w:numPr>
           <w:ilvl w:val="0"/>
-          <w:numId w:val="61"/>
+          <w:numId w:val="64"/>
         </w:numPr>
       </w:pPr>
       <w:r>
@@ -16724,7 +17356,7 @@
         <w:pStyle w:val="ListParagraph"/>
         <w:numPr>
           <w:ilvl w:val="0"/>
-          <w:numId w:val="61"/>
+          <w:numId w:val="64"/>
         </w:numPr>
       </w:pPr>
       <w:r>
@@ -16736,7 +17368,7 @@
         <w:pStyle w:val="ListParagraph"/>
         <w:numPr>
           <w:ilvl w:val="0"/>
-          <w:numId w:val="61"/>
+          <w:numId w:val="64"/>
         </w:numPr>
       </w:pPr>
       <w:r>
@@ -16757,7 +17389,7 @@
         <w:pStyle w:val="ListParagraph"/>
         <w:numPr>
           <w:ilvl w:val="0"/>
-          <w:numId w:val="61"/>
+          <w:numId w:val="64"/>
         </w:numPr>
       </w:pPr>
       <w:r>
@@ -16769,7 +17401,7 @@
         <w:pStyle w:val="ListParagraph"/>
         <w:numPr>
           <w:ilvl w:val="0"/>
-          <w:numId w:val="61"/>
+          <w:numId w:val="64"/>
         </w:numPr>
       </w:pPr>
       <w:r>
@@ -16781,7 +17413,7 @@
         <w:pStyle w:val="ListParagraph"/>
         <w:numPr>
           <w:ilvl w:val="0"/>
-          <w:numId w:val="61"/>
+          <w:numId w:val="64"/>
         </w:numPr>
       </w:pPr>
       <w:r>
@@ -16793,7 +17425,7 @@
         <w:pStyle w:val="ListParagraph"/>
         <w:numPr>
           <w:ilvl w:val="0"/>
-          <w:numId w:val="61"/>
+          <w:numId w:val="64"/>
         </w:numPr>
       </w:pPr>
       <w:r>
@@ -16805,7 +17437,7 @@
         <w:pStyle w:val="ListParagraph"/>
         <w:numPr>
           <w:ilvl w:val="0"/>
-          <w:numId w:val="61"/>
+          <w:numId w:val="64"/>
         </w:numPr>
       </w:pPr>
       <w:r>
@@ -16817,7 +17449,7 @@
         <w:pStyle w:val="ListParagraph"/>
         <w:numPr>
           <w:ilvl w:val="0"/>
-          <w:numId w:val="61"/>
+          <w:numId w:val="64"/>
         </w:numPr>
       </w:pPr>
       <w:r>
@@ -16829,7 +17461,7 @@
         <w:pStyle w:val="ListParagraph"/>
         <w:numPr>
           <w:ilvl w:val="0"/>
-          <w:numId w:val="61"/>
+          <w:numId w:val="64"/>
         </w:numPr>
       </w:pPr>
       <w:r>
@@ -17138,7 +17770,7 @@
     <w:abstractNumId w:val="0"/>
   </w:num>
   <w:num w:numId="40">
-    <w:abstractNumId w:val="0"/>
+    <w:abstractNumId w:val="1"/>
   </w:num>
   <w:num w:numId="41">
     <w:abstractNumId w:val="0"/>
@@ -17159,7 +17791,7 @@
     <w:abstractNumId w:val="0"/>
   </w:num>
   <w:num w:numId="47">
-    <w:abstractNumId w:val="1"/>
+    <w:abstractNumId w:val="0"/>
   </w:num>
   <w:num w:numId="48">
     <w:abstractNumId w:val="0"/>
@@ -17168,7 +17800,7 @@
     <w:abstractNumId w:val="0"/>
   </w:num>
   <w:num w:numId="50">
-    <w:abstractNumId w:val="0"/>
+    <w:abstractNumId w:val="1"/>
   </w:num>
   <w:num w:numId="51">
     <w:abstractNumId w:val="0"/>
@@ -17177,7 +17809,7 @@
     <w:abstractNumId w:val="0"/>
   </w:num>
   <w:num w:numId="53">
-    <w:abstractNumId w:val="1"/>
+    <w:abstractNumId w:val="0"/>
   </w:num>
   <w:num w:numId="54">
     <w:abstractNumId w:val="0"/>
@@ -17186,7 +17818,7 @@
     <w:abstractNumId w:val="0"/>
   </w:num>
   <w:num w:numId="56">
-    <w:abstractNumId w:val="0"/>
+    <w:abstractNumId w:val="1"/>
   </w:num>
   <w:num w:numId="57">
     <w:abstractNumId w:val="0"/>
@@ -17201,6 +17833,15 @@
     <w:abstractNumId w:val="0"/>
   </w:num>
   <w:num w:numId="61">
+    <w:abstractNumId w:val="0"/>
+  </w:num>
+  <w:num w:numId="62">
+    <w:abstractNumId w:val="0"/>
+  </w:num>
+  <w:num w:numId="63">
+    <w:abstractNumId w:val="0"/>
+  </w:num>
+  <w:num w:numId="64">
     <w:abstractNumId w:val="0"/>
   </w:num>
 </w:numbering>

</xml_diff>

<commit_message>
Checks: big runs, list per place, selection sets, A/B colours, export
- Clash: over 30,000 touching pairs the panel says how many and how long,
  with Check them all (Stop keeps what was found) or Choose floors instead;
  errors show in the panel, not only the status bar.
- The clash list follows the place chosen (whole model, floors, section
  box), with when it was last checked there; clashes from earlier runs
  elsewhere stay one click away.
- Rule dialog: All / None for models, a name filter (has / has not), and
  selection sets shared with the project; each option explained.
- A and B colours chosen per person, with a key in the 3D view; headroom
  colour too.
- Export clashes and headroom places as a CSV spreadsheet or a printable
  report with pictures (checkexport.js).
- Manuals EN/YUE, What's new, version 2026-10-20.

Co-Authored-By: Claude Opus 5.5 <noreply@anthropic.com>
Claude-Session: https://claude.ai/code/session_01HMFznQ3NqvEPBkq88avjvR
</commit_message>
<xml_diff>
--- a/docs/manual/LWK_Viewer_User_Manual_EN.docx
+++ b/docs/manual/LWK_Viewer_User_Manual_EN.docx
@@ -9755,7 +9755,43 @@
         <w:t xml:space="preserve">All models</w:t>
       </w:r>
       <w:r>
-        <w:t xml:space="preserve">, which also takes in links loaded later) and the categories to check - for example *Ceilings* in the architectural model against *Beams* in the structural one, or *Walls* in every architectural link against *Ducts* and *Pipes* in every MEP link. A and B can be the same models: clashes inside them.</w:t>
+        <w:t xml:space="preserve">, which also takes in links loaded later) and the categories to check - for example *Ceilings* in the architectural model against *Beams* in the structural one, or *Walls* in every architectural link against *Ducts* and *Pipes* in every MEP link. A and B can be the same models: clashes inside them. </w:t>
+      </w:r>
+      <w:r>
+        <w:rPr>
+          <w:b/>
+        </w:rPr>
+        <w:t xml:space="preserve">All</w:t>
+      </w:r>
+      <w:r>
+        <w:t xml:space="preserve"> / </w:t>
+      </w:r>
+      <w:r>
+        <w:rPr>
+          <w:b/>
+        </w:rPr>
+        <w:t xml:space="preserve">None</w:t>
+      </w:r>
+      <w:r>
+        <w:t xml:space="preserve"> above the models tick or untick them all at once. </w:t>
+      </w:r>
+      <w:r>
+        <w:rPr>
+          <w:b/>
+        </w:rPr>
+        <w:t xml:space="preserve">Name has</w:t>
+      </w:r>
+      <w:r>
+        <w:t xml:space="preserve"> / </w:t>
+      </w:r>
+      <w:r>
+        <w:rPr>
+          <w:b/>
+        </w:rPr>
+        <w:t xml:space="preserve">Name has not</w:t>
+      </w:r>
+      <w:r>
+        <w:t xml:space="preserve"> keeps only elements with (or without) those words in their name, type or family - for example *Name has not: Finish* (a comma between words: any of them).</w:t>
       </w:r>
     </w:p>
     <w:p>
@@ -9770,6 +9806,51 @@
         <w:rPr>
           <w:b/>
         </w:rPr>
+        <w:t xml:space="preserve">Selection sets</w:t>
+      </w:r>
+      <w:r>
+        <w:t xml:space="preserve"> (like Navisworks): </w:t>
+      </w:r>
+      <w:r>
+        <w:rPr>
+          <w:b/>
+        </w:rPr>
+        <w:t xml:space="preserve">Save as set</w:t>
+      </w:r>
+      <w:r>
+        <w:t xml:space="preserve"> keeps a side's models, categories and name filter under a name, shared with the project. In any rule, pick it from the list at the top of a side. A rule following a set checks the set as it is now, so changing the set (pick it, change the ticks, </w:t>
+      </w:r>
+      <w:r>
+        <w:rPr>
+          <w:b/>
+        </w:rPr>
+        <w:t xml:space="preserve">Save as set</w:t>
+      </w:r>
+      <w:r>
+        <w:t xml:space="preserve"> with the same name) changes every rule using it. </w:t>
+      </w:r>
+      <w:r>
+        <w:rPr>
+          <w:b/>
+        </w:rPr>
+        <w:t xml:space="preserve">Delete set</w:t>
+      </w:r>
+      <w:r>
+        <w:t xml:space="preserve"> removes it; rules that used it keep its selection.</w:t>
+      </w:r>
+    </w:p>
+    <w:p>
+      <w:pPr>
+        <w:pStyle w:val="ListParagraph"/>
+        <w:numPr>
+          <w:ilvl w:val="0"/>
+          <w:numId w:val="40"/>
+        </w:numPr>
+      </w:pPr>
+      <w:r>
+        <w:rPr>
+          <w:b/>
+        </w:rPr>
         <w:t xml:space="preserve">Overlap that counts</w:t>
       </w:r>
       <w:r>
@@ -9830,13 +9911,40 @@
         <w:t xml:space="preserve">Run</w:t>
       </w:r>
       <w:r>
+        <w:t xml:space="preserve">. When very many elements touch (more than 30,000 pairs), the panel says how many and about how long it takes, with </w:t>
+      </w:r>
+      <w:r>
+        <w:rPr>
+          <w:b/>
+        </w:rPr>
+        <w:t xml:space="preserve">Check them all</w:t>
+      </w:r>
+      <w:r>
+        <w:t xml:space="preserve"> (it runs with a progress bar; </w:t>
+      </w:r>
+      <w:r>
+        <w:rPr>
+          <w:b/>
+        </w:rPr>
+        <w:t xml:space="preserve">Stop</w:t>
+      </w:r>
+      <w:r>
+        <w:t xml:space="preserve"> keeps what is found so far) or </w:t>
+      </w:r>
+      <w:r>
+        <w:rPr>
+          <w:b/>
+        </w:rPr>
+        <w:t xml:space="preserve">Choose floors instead</w:t>
+      </w:r>
+      <w:r>
         <w:t xml:space="preserve">.</w:t>
       </w:r>
     </w:p>
     <w:p>
       <w:pPr/>
       <w:r>
-        <w:t xml:space="preserve">Rules are shared: everyone on the project sees them under the rule list, can run them and change them, and sees the last result (people who can only view can run a rule, but its result is not saved). A consultant model is named by its name and company, so a rule still works after they send the next version.</w:t>
+        <w:t xml:space="preserve">The three options at the bottom of a rule:</w:t>
       </w:r>
     </w:p>
     <w:tbl>
@@ -9862,6 +9970,134 @@
           <w:p>
             <w:pPr/>
             <w:r>
+              <w:t xml:space="preserve">Option</w:t>
+            </w:r>
+          </w:p>
+        </w:tc>
+        <w:tc>
+          <w:tcPr>
+            <w:tcW w:w="4680" w:type="dxa"/>
+            <w:shd w:val="clear" w:color="auto" w:fill="F2F2F2"/>
+          </w:tcPr>
+          <w:p>
+            <w:pPr/>
+            <w:r>
+              <w:t xml:space="preserve">What it does</w:t>
+            </w:r>
+          </w:p>
+        </w:tc>
+      </w:tr>
+      <w:tr>
+        <w:tc>
+          <w:tcPr>
+            <w:tcW w:w="4680" w:type="dxa"/>
+          </w:tcPr>
+          <w:p>
+            <w:pPr/>
+            <w:r>
+              <w:rPr>
+                <w:b/>
+              </w:rPr>
+              <w:t xml:space="preserve">Leave out doors and windows in their walls, floors and roofs</w:t>
+            </w:r>
+          </w:p>
+        </w:tc>
+        <w:tc>
+          <w:tcPr>
+            <w:tcW w:w="4680" w:type="dxa"/>
+          </w:tcPr>
+          <w:p>
+            <w:pPr/>
+            <w:r>
+              <w:t xml:space="preserve">A door or a window always sits inside the wall it is in; without this, every one is reported against its own wall.</w:t>
+            </w:r>
+          </w:p>
+        </w:tc>
+      </w:tr>
+      <w:tr>
+        <w:tc>
+          <w:tcPr>
+            <w:tcW w:w="4680" w:type="dxa"/>
+          </w:tcPr>
+          <w:p>
+            <w:pPr/>
+            <w:r>
+              <w:rPr>
+                <w:b/>
+              </w:rPr>
+              <w:t xml:space="preserve">Leave out joins between walls, floors, roofs, columns, beams and stairs</w:t>
+            </w:r>
+          </w:p>
+        </w:tc>
+        <w:tc>
+          <w:tcPr>
+            <w:tcW w:w="4680" w:type="dxa"/>
+          </w:tcPr>
+          <w:p>
+            <w:pPr/>
+            <w:r>
+              <w:t xml:space="preserve">Where these meet (a wall on a slab, a finish under a wall, a landing into a wall) Revit cleans the join up, but each element is exported whole, so they overlap. On: only one mostly inside the other (a duplicate, one buried in another) counts. Services, furniture and ceilings are not affected. Off: every join is listed - usually hundreds.</w:t>
+            </w:r>
+          </w:p>
+        </w:tc>
+      </w:tr>
+      <w:tr>
+        <w:tc>
+          <w:tcPr>
+            <w:tcW w:w="4680" w:type="dxa"/>
+          </w:tcPr>
+          <w:p>
+            <w:pPr/>
+            <w:r>
+              <w:rPr>
+                <w:b/>
+              </w:rPr>
+              <w:t xml:space="preserve">Report open surfaces crossing each other</w:t>
+            </w:r>
+          </w:p>
+        </w:tc>
+        <w:tc>
+          <w:tcPr>
+            <w:tcW w:w="4680" w:type="dxa"/>
+          </w:tcPr>
+          <w:p>
+            <w:pPr/>
+            <w:r>
+              <w:t xml:space="preserve">Some elements are surfaces, not closed solids (some IFC exports, a pipe without end caps); they have no inside, so how deep they cross cannot be measured. Off: a surface counts only where it goes into a solid. On: two surfaces that just cross are reported too - more thorough, more noise.</w:t>
+            </w:r>
+          </w:p>
+        </w:tc>
+      </w:tr>
+    </w:tbl>
+    <w:p>
+      <w:pPr/>
+      <w:r>
+        <w:t xml:space="preserve">Rules are shared: everyone on the project sees them under the rule list, can run them and change them, and sees the last result (people who can only view can run a rule, but its result is not saved). A consultant model is named by its name and company, so a rule still works after they send the next version.</w:t>
+      </w:r>
+    </w:p>
+    <w:tbl>
+      <w:tblPr>
+        <w:tblStyle w:val="TableGrid"/>
+        <w:tblW w:w="0" w:type="auto"/>
+        <w:tblLayout w:type="fixed"/>
+        <w:tblLook w:val="04A0" w:firstRow="1" w:lastRow="0" w:firstColumn="0" w:lastColumn="0" w:noHBand="0" w:noVBand="1"/>
+      </w:tblPr>
+      <w:tblGrid>
+        <w:gridCol w:w="4680"/>
+        <w:gridCol w:w="4680"/>
+      </w:tblGrid>
+      <w:tr>
+        <w:trPr>
+          <w:tblHeader/>
+        </w:trPr>
+        <w:tc>
+          <w:tcPr>
+            <w:tcW w:w="4680" w:type="dxa"/>
+            <w:shd w:val="clear" w:color="auto" w:fill="F2F2F2"/>
+          </w:tcPr>
+          <w:p>
+            <w:pPr/>
+            <w:r>
               <w:t xml:space="preserve">Shown as</w:t>
             </w:r>
           </w:p>
@@ -10033,6 +10269,27 @@
         </w:numPr>
       </w:pPr>
       <w:r>
+        <w:t xml:space="preserve">The list shows the clashes of the place chosen above it: the whole model, the floors chosen, or inside the section box, with when it was last checked there ("Not checked on L2 yet" until it is). Clashes found elsewhere in earlier runs are kept: "*N* more elsewhere" - </w:t>
+      </w:r>
+      <w:r>
+        <w:rPr>
+          <w:b/>
+        </w:rPr>
+        <w:t xml:space="preserve">Show</w:t>
+      </w:r>
+      <w:r>
+        <w:t xml:space="preserve"> lists them too.</w:t>
+      </w:r>
+    </w:p>
+    <w:p>
+      <w:pPr>
+        <w:pStyle w:val="ListParagraph"/>
+        <w:numPr>
+          <w:ilvl w:val="0"/>
+          <w:numId w:val="41"/>
+        </w:numPr>
+      </w:pPr>
+      <w:r>
         <w:rPr>
           <w:b/>
         </w:rPr>
@@ -10072,7 +10329,25 @@
         </w:numPr>
       </w:pPr>
       <w:r>
-        <w:t xml:space="preserve">Click a clash: the storey is cut out round it with a section box a few metres across, the two elements are coloured (orange and blue) and a red dot marks the spot. </w:t>
+        <w:t xml:space="preserve">Click a clash: the storey is cut out round it with a section box a few metres across, the two elements are coloured (A orange, B blue - choose your own colours with the two colour boxes </w:t>
+      </w:r>
+      <w:r>
+        <w:rPr>
+          <w:b/>
+        </w:rPr>
+        <w:t xml:space="preserve">A</w:t>
+      </w:r>
+      <w:r>
+        <w:t xml:space="preserve"> and </w:t>
+      </w:r>
+      <w:r>
+        <w:rPr>
+          <w:b/>
+        </w:rPr>
+        <w:t xml:space="preserve">B</w:t>
+      </w:r>
+      <w:r>
+        <w:t xml:space="preserve"> above the list; they are kept on this computer) and a red dot marks the spot. A key at the bottom left of the 3D view says which element is A and which is B. When both are in the same Revit model they share colour A (one highlight colour per model), and the key says so. </w:t>
       </w:r>
       <w:r>
         <w:rPr>
@@ -10159,6 +10434,78 @@
         <w:rPr>
           <w:b/>
         </w:rPr>
+        <w:t xml:space="preserve">Export the list</w:t>
+      </w:r>
+      <w:r>
+        <w:t xml:space="preserve">: </w:t>
+      </w:r>
+      <w:r>
+        <w:rPr>
+          <w:b/>
+        </w:rPr>
+        <w:t xml:space="preserve">Spreadsheet</w:t>
+      </w:r>
+      <w:r>
+        <w:t xml:space="preserve"> saves the clashes listed as a CSV file for Excel (status, kind, depth, floor, both elements with their ids, where in project coordinates, the issue). </w:t>
+      </w:r>
+      <w:r>
+        <w:rPr>
+          <w:b/>
+        </w:rPr>
+        <w:t xml:space="preserve">Report</w:t>
+      </w:r>
+      <w:r>
+        <w:t xml:space="preserve"> opens a report in a new tab - </w:t>
+      </w:r>
+      <w:r>
+        <w:rPr>
+          <w:b/>
+        </w:rPr>
+        <w:t xml:space="preserve">With pictures</w:t>
+      </w:r>
+      <w:r>
+        <w:t xml:space="preserve"> shows and pictures each clash in turn (about a second each; </w:t>
+      </w:r>
+      <w:r>
+        <w:rPr>
+          <w:b/>
+        </w:rPr>
+        <w:t xml:space="preserve">Stop</w:t>
+      </w:r>
+      <w:r>
+        <w:t xml:space="preserve"> ends it), </w:t>
+      </w:r>
+      <w:r>
+        <w:rPr>
+          <w:b/>
+        </w:rPr>
+        <w:t xml:space="preserve">Without</w:t>
+      </w:r>
+      <w:r>
+        <w:t xml:space="preserve"> is immediate - then </w:t>
+      </w:r>
+      <w:r>
+        <w:rPr>
+          <w:b/>
+        </w:rPr>
+        <w:t xml:space="preserve">Print / Save as PDF</w:t>
+      </w:r>
+      <w:r>
+        <w:t xml:space="preserve">. Allow pop-ups for the site if the browser blocks the tab.</w:t>
+      </w:r>
+    </w:p>
+    <w:p>
+      <w:pPr>
+        <w:pStyle w:val="ListParagraph"/>
+        <w:numPr>
+          <w:ilvl w:val="0"/>
+          <w:numId w:val="41"/>
+        </w:numPr>
+      </w:pPr>
+      <w:r>
+        <w:rPr>
+          <w:b/>
+        </w:rPr>
         <w:t xml:space="preserve">Run again</w:t>
       </w:r>
       <w:r>
@@ -10398,7 +10745,43 @@
         <w:t xml:space="preserve">Clear</w:t>
       </w:r>
       <w:r>
-        <w:t xml:space="preserve"> takes the squares away.</w:t>
+        <w:t xml:space="preserve"> takes the squares away. The colour box beside *under the limit* chooses its colour (kept on this computer); a key in the 3D view names what is overhead.</w:t>
+      </w:r>
+    </w:p>
+    <w:p>
+      <w:pPr>
+        <w:pStyle w:val="ListParagraph"/>
+        <w:numPr>
+          <w:ilvl w:val="0"/>
+          <w:numId w:val="42"/>
+        </w:numPr>
+      </w:pPr>
+      <w:r>
+        <w:rPr>
+          <w:b/>
+        </w:rPr>
+        <w:t xml:space="preserve">Export</w:t>
+      </w:r>
+      <w:r>
+        <w:t xml:space="preserve">: </w:t>
+      </w:r>
+      <w:r>
+        <w:rPr>
+          <w:b/>
+        </w:rPr>
+        <w:t xml:space="preserve">Spreadsheet</w:t>
+      </w:r>
+      <w:r>
+        <w:t xml:space="preserve"> (each place: floor, standing on, lowest height, limit, area, what is overhead, where) or </w:t>
+      </w:r>
+      <w:r>
+        <w:rPr>
+          <w:b/>
+        </w:rPr>
+        <w:t xml:space="preserve">Report</w:t>
+      </w:r>
+      <w:r>
+        <w:t xml:space="preserve">, with or without a picture of each place, to print or save as PDF.</w:t>
       </w:r>
     </w:p>
     <w:p>

</xml_diff>

<commit_message>
Simpler headers and toolbars: profile menu, View menu, Filter, Export
- Every page: one profile button (initials, online dot) holding Work
  offline, Admin, Account, Theme and Sign out (profile.js). The
  connection chip and Offline show only when they have something to say.
- Sheets: View menu with Split, Compare, 2D + 3D and Links; the markup
  properties only while drawing or editing, the scale only for the
  measuring tools; Markups / Hide closed at the top of the issue list.
- Tasks and Calendar: one Filter button with a count (filterbtn.js).
- Dashboard: Export menu - Report, Spreadsheet and BCF of the filtered
  issues.
- Manuals EN/YUE, What's new, version 2026-10-22.

Co-Authored-By: Claude Opus 5.5 <noreply@anthropic.com>
Claude-Session: https://claude.ai/code/session_01HMFznQ3NqvEPBkq88avjvR
</commit_message>
<xml_diff>
--- a/docs/manual/LWK_Viewer_User_Manual_EN.docx
+++ b/docs/manual/LWK_Viewer_User_Manual_EN.docx
@@ -1546,7 +1546,7 @@
         <w:t xml:space="preserve">Search</w:t>
       </w:r>
       <w:r>
-        <w:t xml:space="preserve"> magnifier, </w:t>
+        <w:t xml:space="preserve"> magnifier, the bell, </w:t>
       </w:r>
       <w:r>
         <w:rPr>
@@ -1555,7 +1555,25 @@
         <w:t xml:space="preserve">+ Task</w:t>
       </w:r>
       <w:r>
-        <w:t xml:space="preserve"> (on Sheets and 3D: keeps this sheet or 3D view on a task), </w:t>
+        <w:t xml:space="preserve"> (on Sheets and 3D: keeps this sheet or 3D view on a task) and </w:t>
+      </w:r>
+      <w:r>
+        <w:rPr>
+          <w:b/>
+        </w:rPr>
+        <w:t xml:space="preserve">your profile button</w:t>
+      </w:r>
+      <w:r>
+        <w:t xml:space="preserve"> (your initials, with a green dot when online). Click it for </w:t>
+      </w:r>
+      <w:r>
+        <w:rPr>
+          <w:b/>
+        </w:rPr>
+        <w:t xml:space="preserve">Work offline ...</w:t>
+      </w:r>
+      <w:r>
+        <w:t xml:space="preserve">, </w:t>
       </w:r>
       <w:r>
         <w:rPr>
@@ -1573,7 +1591,16 @@
         <w:t xml:space="preserve">Account</w:t>
       </w:r>
       <w:r>
-        <w:t xml:space="preserve"> and </w:t>
+        <w:t xml:space="preserve"> (your password), </w:t>
+      </w:r>
+      <w:r>
+        <w:rPr>
+          <w:b/>
+        </w:rPr>
+        <w:t xml:space="preserve">Theme</w:t>
+      </w:r>
+      <w:r>
+        <w:t xml:space="preserve"> (Light, Dark, Auto) and </w:t>
       </w:r>
       <w:r>
         <w:rPr>
@@ -1615,16 +1642,7 @@
         </w:numPr>
       </w:pPr>
       <w:r>
-        <w:t xml:space="preserve">The connection chip shows </w:t>
-      </w:r>
-      <w:r>
-        <w:rPr>
-          <w:b/>
-        </w:rPr>
-        <w:t xml:space="preserve">online - your name</w:t>
-      </w:r>
-      <w:r>
-        <w:t xml:space="preserve">, </w:t>
+        <w:t xml:space="preserve">The connection chip appears only when there is something to say: </w:t>
       </w:r>
       <w:r>
         <w:rPr>
@@ -1941,10 +1959,10 @@
         <w:rPr>
           <w:b/>
         </w:rPr>
-        <w:t xml:space="preserve">Export CSV</w:t>
-      </w:r>
-      <w:r>
-        <w:t xml:space="preserve"> downloads the filtered issues for Excel. </w:t>
+        <w:t xml:space="preserve">Export ▾</w:t>
+      </w:r>
+      <w:r>
+        <w:t xml:space="preserve"> takes the issues the filters show: </w:t>
       </w:r>
       <w:r>
         <w:rPr>
@@ -1953,7 +1971,25 @@
         <w:t xml:space="preserve">Report</w:t>
       </w:r>
       <w:r>
-        <w:t xml:space="preserve"> opens a printable issue report with pictures.</w:t>
+        <w:t xml:space="preserve"> (a printable report with pictures - save it as PDF), </w:t>
+      </w:r>
+      <w:r>
+        <w:rPr>
+          <w:b/>
+        </w:rPr>
+        <w:t xml:space="preserve">Spreadsheet (CSV)</w:t>
+      </w:r>
+      <w:r>
+        <w:t xml:space="preserve"> for Excel, or </w:t>
+      </w:r>
+      <w:r>
+        <w:rPr>
+          <w:b/>
+        </w:rPr>
+        <w:t xml:space="preserve">BCF</w:t>
+      </w:r>
+      <w:r>
+        <w:t xml:space="preserve"> for Revit, Navisworks or Solibri.</w:t>
       </w:r>
     </w:p>
     <w:p>
@@ -2846,7 +2882,22 @@
         </w:numPr>
       </w:pPr>
       <w:r>
-        <w:t xml:space="preserve">Filter by owner and priority, sort, </w:t>
+        <w:rPr>
+          <w:b/>
+        </w:rPr>
+        <w:t xml:space="preserve">Filter ▾</w:t>
+      </w:r>
+      <w:r>
+        <w:t xml:space="preserve"> (beside the search) holds which tasks (all, not done, done, overdue, mine), owner and priority, and the order (</w:t>
+      </w:r>
+      <w:r>
+        <w:rPr>
+          <w:b/>
+        </w:rPr>
+        <w:t xml:space="preserve">Sort</w:t>
+      </w:r>
+      <w:r>
+        <w:t xml:space="preserve">, </w:t>
       </w:r>
       <w:r>
         <w:rPr>
@@ -2855,7 +2906,16 @@
         <w:t xml:space="preserve">Group by</w:t>
       </w:r>
       <w:r>
-        <w:t xml:space="preserve">, and </w:t>
+        <w:t xml:space="preserve">); it says how many filters are set ("Filter · 2"), and </w:t>
+      </w:r>
+      <w:r>
+        <w:rPr>
+          <w:b/>
+        </w:rPr>
+        <w:t xml:space="preserve">Clear filters</w:t>
+      </w:r>
+      <w:r>
+        <w:t xml:space="preserve"> resets them. </w:t>
       </w:r>
       <w:r>
         <w:rPr>
@@ -4831,7 +4891,16 @@
         <w:t xml:space="preserve">List</w:t>
       </w:r>
       <w:r>
-        <w:t xml:space="preserve">). The tick boxes show or hide meetings, tasks and issues. </w:t>
+        <w:t xml:space="preserve">). </w:t>
+      </w:r>
+      <w:r>
+        <w:rPr>
+          <w:b/>
+        </w:rPr>
+        <w:t xml:space="preserve">Filter ▾</w:t>
+      </w:r>
+      <w:r>
+        <w:t xml:space="preserve"> shows or hides meetings, tasks and issues (it says how many are left out). </w:t>
       </w:r>
       <w:r>
         <w:rPr>
@@ -6735,6 +6804,81 @@
       </w:r>
     </w:p>
     <w:p>
+      <w:pPr/>
+      <w:r>
+        <w:rPr>
+          <w:b/>
+        </w:rPr>
+        <w:t xml:space="preserve">Split</w:t>
+      </w:r>
+      <w:r>
+        <w:t xml:space="preserve">, </w:t>
+      </w:r>
+      <w:r>
+        <w:rPr>
+          <w:b/>
+        </w:rPr>
+        <w:t xml:space="preserve">Compare</w:t>
+      </w:r>
+      <w:r>
+        <w:t xml:space="preserve">, </w:t>
+      </w:r>
+      <w:r>
+        <w:rPr>
+          <w:b/>
+        </w:rPr>
+        <w:t xml:space="preserve">2D + 3D</w:t>
+      </w:r>
+      <w:r>
+        <w:t xml:space="preserve"> and </w:t>
+      </w:r>
+      <w:r>
+        <w:rPr>
+          <w:b/>
+        </w:rPr>
+        <w:t xml:space="preserve">Links</w:t>
+      </w:r>
+      <w:r>
+        <w:t xml:space="preserve"> are under </w:t>
+      </w:r>
+      <w:r>
+        <w:rPr>
+          <w:b/>
+        </w:rPr>
+        <w:t xml:space="preserve">View ▾</w:t>
+      </w:r>
+      <w:r>
+        <w:t xml:space="preserve"> in the sheet toolbar (a dot on View says Split, Compare or 2D + 3D is on). The markup properties bar (layer, line, fill, text, font) shows only while a drawing tool is in hand or markups are selected, and the </w:t>
+      </w:r>
+      <w:r>
+        <w:rPr>
+          <w:b/>
+        </w:rPr>
+        <w:t xml:space="preserve">1:</w:t>
+      </w:r>
+      <w:r>
+        <w:t xml:space="preserve"> scale only with Measure, Dimension, Area and Angle - the rest of the time the drawing gets the room. </w:t>
+      </w:r>
+      <w:r>
+        <w:rPr>
+          <w:b/>
+        </w:rPr>
+        <w:t xml:space="preserve">👁 Markups</w:t>
+      </w:r>
+      <w:r>
+        <w:t xml:space="preserve"> and </w:t>
+      </w:r>
+      <w:r>
+        <w:rPr>
+          <w:b/>
+        </w:rPr>
+        <w:t xml:space="preserve">Hide closed</w:t>
+      </w:r>
+      <w:r>
+        <w:t xml:space="preserve"> are at the top of the issue list on the right, as on the 3D page.</w:t>
+      </w:r>
+    </w:p>
+    <w:p>
       <w:pPr>
         <w:pStyle w:val="ListParagraph"/>
         <w:numPr>
@@ -7194,7 +7338,16 @@
         <w:t xml:space="preserve">Layers:</w:t>
       </w:r>
       <w:r>
-        <w:t xml:space="preserve"> markups sit on layers (default "General"). Admins can lock a layer or hide it from some people. The eye button hides all markups.</w:t>
+        <w:t xml:space="preserve"> markups sit on layers (default "General"). Admins can lock a layer or hide it from some people. </w:t>
+      </w:r>
+      <w:r>
+        <w:rPr>
+          <w:b/>
+        </w:rPr>
+        <w:t xml:space="preserve">👁 Markups</w:t>
+      </w:r>
+      <w:r>
+        <w:t xml:space="preserve"> at the top of the issue list hides all markups.</w:t>
       </w:r>
     </w:p>
     <w:p>
@@ -13203,7 +13356,16 @@
         <w:t xml:space="preserve">Hide issues</w:t>
       </w:r>
       <w:r>
-        <w:t xml:space="preserve"> (at the top of the panel) hides the pins, and </w:t>
+        <w:t xml:space="preserve"> (at the top of the panel; on Sheets, </w:t>
+      </w:r>
+      <w:r>
+        <w:rPr>
+          <w:b/>
+        </w:rPr>
+        <w:t xml:space="preserve">👁 Markups</w:t>
+      </w:r>
+      <w:r>
+        <w:t xml:space="preserve">) hides the pins, and </w:t>
       </w:r>
       <w:r>
         <w:rPr>
@@ -13893,16 +14055,16 @@
         </w:numPr>
       </w:pPr>
       <w:r>
-        <w:t xml:space="preserve">With a connection, open the project and press </w:t>
-      </w:r>
-      <w:r>
-        <w:rPr>
-          <w:b/>
-        </w:rPr>
-        <w:t xml:space="preserve">Offline</w:t>
-      </w:r>
-      <w:r>
-        <w:t xml:space="preserve"> in the top bar, then </w:t>
+        <w:t xml:space="preserve">With a connection, open the project and choose </w:t>
+      </w:r>
+      <w:r>
+        <w:rPr>
+          <w:b/>
+        </w:rPr>
+        <w:t xml:space="preserve">Work offline ...</w:t>
+      </w:r>
+      <w:r>
+        <w:t xml:space="preserve"> in your profile menu (top right), then </w:t>
       </w:r>
       <w:r>
         <w:rPr>

</xml_diff>

<commit_message>
Fit to the section box, project colours in chat, phone dialogs
- 3D: with a section box on, Fit frames what is inside it (the box's
  world extent kept as it is applied) instead of the whole model.
- Profile menu placed under its button and kept inside the window, the
  button at the right of its row when the header wraps.
- Chat: each project channel its own colour (in turn over the projects)
  and initials; its topics the same colour.
- Phones: clash and other dialogs inside the safe area (dvh, insets),
  Cancel / Save in a bar kept at the bottom, bigger to tap.
- Manuals EN/YUE, What's new, version 2026-10-23.

Co-Authored-By: Claude Opus 5.5 <noreply@anthropic.com>
Claude-Session: https://claude.ai/code/session_01HMFznQ3NqvEPBkq88avjvR
</commit_message>
<xml_diff>
--- a/docs/manual/LWK_Viewer_User_Manual_EN.docx
+++ b/docs/manual/LWK_Viewer_User_Manual_EN.docx
@@ -3518,7 +3518,7 @@
           <w:p>
             <w:pPr/>
             <w:r>
-              <w:t xml:space="preserve">One per project. Everyone on the project is in it. New tasks, assignments, completions, task comments and new or changed issues are posted into it as cards</w:t>
+              <w:t xml:space="preserve">One per project, with its own colour and initials (its topics take the same colour). Everyone on the project is in it. New tasks, assignments, completions, task comments and new or changed issues are posted into it as cards</w:t>
             </w:r>
           </w:p>
         </w:tc>
@@ -8079,7 +8079,7 @@
         <w:t xml:space="preserve">Fit</w:t>
       </w:r>
       <w:r>
-        <w:t xml:space="preserve">, which frames all loaded models.</w:t>
+        <w:t xml:space="preserve">, which frames all loaded models - or, with a section box on, what is inside the box.</w:t>
       </w:r>
     </w:p>
     <w:p>

</xml_diff>

<commit_message>
LWK BIM Workflow board for every project
Each project's Board page makes an LWK BIM Workflow board once (roles,
work stages, workflow charts, CDE states, QA/QC, the BIM audit checklist,
reference diagrams); a blank audit checklist Excel goes into Folders >
BIM QA. Projects that already had boards add it from New board. Shapes
set to left/right alignment keep a single line there.

Co-Authored-By: Claude Opus 5.5 <noreply@anthropic.com>
Claude-Session: https://claude.ai/code/session_01HMFznQ3NqvEPBkq88avjvR
</commit_message>
<xml_diff>
--- a/docs/manual/LWK_Viewer_User_Manual_EN.docx
+++ b/docs/manual/LWK_Viewer_User_Manual_EN.docx
@@ -3431,6 +3431,159 @@
       </w:r>
     </w:p>
     <w:p>
+      <w:pPr/>
+      <w:r>
+        <w:rPr>
+          <w:b/>
+        </w:rPr>
+        <w:t xml:space="preserve">The LWK BIM Workflow board</w:t>
+      </w:r>
+    </w:p>
+    <w:p>
+      <w:pPr/>
+      <w:r>
+        <w:t xml:space="preserve">Every project starts with a board called </w:t>
+      </w:r>
+      <w:r>
+        <w:rPr>
+          <w:b/>
+        </w:rPr>
+        <w:t xml:space="preserve">LWK BIM Workflow</w:t>
+      </w:r>
+      <w:r>
+        <w:t xml:space="preserve">: the company's BIM workflow as the project's own copy, to change to suit the project. It is made the first time someone who can edit opens the project's Board page.</w:t>
+      </w:r>
+    </w:p>
+    <w:p>
+      <w:pPr>
+        <w:pStyle w:val="ListParagraph"/>
+        <w:numPr>
+          <w:ilvl w:val="0"/>
+          <w:numId w:val="14"/>
+        </w:numPr>
+      </w:pPr>
+      <w:r>
+        <w:rPr>
+          <w:b/>
+        </w:rPr>
+        <w:t xml:space="preserve">What is on it:</w:t>
+      </w:r>
+      <w:r>
+        <w:t xml:space="preserve"> 0 Project card (number, name, stage, software, CDE location - fill in at kick-off) · 1 How to use this board · 2 Team &amp; roles (responsibilities, knowledge, a column for the names) · 3 Work stages (who leads and what comes out, from Inception to Completion) · 4.0-4.6 the workflow charts: Project setup (1.0), Modelling (2.0), Model review / design changes (2.1), Model development using SAM (2.3), clash detection in ACC (3.0), GBP submission with BD's Area Tool (4.0 / 4.1) · 5 CDE folder states (ISO 19650) · 6 QA/QC checks · 7 BIM audit checklist · 8 Meetings · 9 How the viewer supports each step · 10 Project notes · 11 Reference diagrams.</w:t>
+      </w:r>
+    </w:p>
+    <w:p>
+      <w:pPr>
+        <w:pStyle w:val="ListParagraph"/>
+        <w:numPr>
+          <w:ilvl w:val="0"/>
+          <w:numId w:val="14"/>
+        </w:numPr>
+      </w:pPr>
+      <w:r>
+        <w:rPr>
+          <w:b/>
+        </w:rPr>
+        <w:t xml:space="preserve">Colours:</w:t>
+      </w:r>
+      <w:r>
+        <w:t xml:space="preserve"> each role has one colour in every chart (BIM Manager, HK Coordinator, Manila Senior Coordinator, Task Team Lead, BIM Authors, Project Team, Design Team, CAD Team); the key is under each chart.</w:t>
+      </w:r>
+    </w:p>
+    <w:p>
+      <w:pPr>
+        <w:pStyle w:val="ListParagraph"/>
+        <w:numPr>
+          <w:ilvl w:val="0"/>
+          <w:numId w:val="14"/>
+        </w:numPr>
+      </w:pPr>
+      <w:r>
+        <w:rPr>
+          <w:b/>
+        </w:rPr>
+        <w:t xml:space="preserve">The audit checklist:</w:t>
+      </w:r>
+      <w:r>
+        <w:t xml:space="preserve"> the board shows all the items as a guide. The record of an audit is still the Excel: a blank </w:t>
+      </w:r>
+      <w:r>
+        <w:rPr>
+          <w:b/>
+        </w:rPr>
+        <w:t xml:space="preserve">LWK BIM Audit Checklist.xlsx</w:t>
+      </w:r>
+      <w:r>
+        <w:t xml:space="preserve"> is put in the project's </w:t>
+      </w:r>
+      <w:r>
+        <w:rPr>
+          <w:b/>
+        </w:rPr>
+        <w:t xml:space="preserve">Folders</w:t>
+      </w:r>
+      <w:r>
+        <w:t xml:space="preserve"> under </w:t>
+      </w:r>
+      <w:r>
+        <w:rPr>
+          <w:b/>
+        </w:rPr>
+        <w:t xml:space="preserve">BIM QA</w:t>
+      </w:r>
+      <w:r>
+        <w:t xml:space="preserve"> when the board is made (if one of that name is not there already).</w:t>
+      </w:r>
+    </w:p>
+    <w:p>
+      <w:pPr>
+        <w:pStyle w:val="ListParagraph"/>
+        <w:numPr>
+          <w:ilvl w:val="0"/>
+          <w:numId w:val="14"/>
+        </w:numPr>
+      </w:pPr>
+      <w:r>
+        <w:rPr>
+          <w:b/>
+        </w:rPr>
+        <w:t xml:space="preserve">A project that already had boards</w:t>
+      </w:r>
+      <w:r>
+        <w:t xml:space="preserve"> is not given one by itself. Add it with </w:t>
+      </w:r>
+      <w:r>
+        <w:rPr>
+          <w:b/>
+        </w:rPr>
+        <w:t xml:space="preserve">New board</w:t>
+      </w:r>
+      <w:r>
+        <w:t xml:space="preserve"> &gt; </w:t>
+      </w:r>
+      <w:r>
+        <w:rPr>
+          <w:b/>
+        </w:rPr>
+        <w:t xml:space="preserve">LWK BIM Workflow</w:t>
+      </w:r>
+      <w:r>
+        <w:t xml:space="preserve">; the same adds another copy to any project.</w:t>
+      </w:r>
+    </w:p>
+    <w:p>
+      <w:pPr>
+        <w:pStyle w:val="ListParagraph"/>
+        <w:numPr>
+          <w:ilvl w:val="0"/>
+          <w:numId w:val="14"/>
+        </w:numPr>
+      </w:pPr>
+      <w:r>
+        <w:t xml:space="preserve">Everything on it is ordinary board content: move, recolour, add or delete anything. Deleting the board does not bring it back by itself.</w:t>
+      </w:r>
+    </w:p>
+    <w:p>
       <w:pPr>
         <w:pStyle w:val="Heading2"/>
       </w:pPr>
@@ -3634,7 +3787,7 @@
         <w:pStyle w:val="ListParagraph"/>
         <w:numPr>
           <w:ilvl w:val="0"/>
-          <w:numId w:val="14"/>
+          <w:numId w:val="15"/>
         </w:numPr>
       </w:pPr>
       <w:r>
@@ -3709,7 +3862,7 @@
         <w:pStyle w:val="ListParagraph"/>
         <w:numPr>
           <w:ilvl w:val="0"/>
-          <w:numId w:val="14"/>
+          <w:numId w:val="15"/>
         </w:numPr>
       </w:pPr>
       <w:r>
@@ -3754,7 +3907,7 @@
         <w:pStyle w:val="ListParagraph"/>
         <w:numPr>
           <w:ilvl w:val="0"/>
-          <w:numId w:val="14"/>
+          <w:numId w:val="15"/>
         </w:numPr>
       </w:pPr>
       <w:r>
@@ -3772,7 +3925,7 @@
         <w:pStyle w:val="ListParagraph"/>
         <w:numPr>
           <w:ilvl w:val="0"/>
-          <w:numId w:val="14"/>
+          <w:numId w:val="15"/>
         </w:numPr>
       </w:pPr>
       <w:r>
@@ -3817,7 +3970,7 @@
         <w:pStyle w:val="ListParagraph"/>
         <w:numPr>
           <w:ilvl w:val="0"/>
-          <w:numId w:val="14"/>
+          <w:numId w:val="15"/>
         </w:numPr>
       </w:pPr>
       <w:r>
@@ -3856,7 +4009,7 @@
         <w:pStyle w:val="ListParagraph"/>
         <w:numPr>
           <w:ilvl w:val="0"/>
-          <w:numId w:val="15"/>
+          <w:numId w:val="16"/>
         </w:numPr>
       </w:pPr>
       <w:r>
@@ -3892,7 +4045,7 @@
         <w:pStyle w:val="ListParagraph"/>
         <w:numPr>
           <w:ilvl w:val="0"/>
-          <w:numId w:val="15"/>
+          <w:numId w:val="16"/>
         </w:numPr>
       </w:pPr>
       <w:r>
@@ -3913,7 +4066,7 @@
         <w:pStyle w:val="ListParagraph"/>
         <w:numPr>
           <w:ilvl w:val="0"/>
-          <w:numId w:val="15"/>
+          <w:numId w:val="16"/>
         </w:numPr>
       </w:pPr>
       <w:r>
@@ -3985,7 +4138,7 @@
         <w:pStyle w:val="ListParagraph"/>
         <w:numPr>
           <w:ilvl w:val="0"/>
-          <w:numId w:val="15"/>
+          <w:numId w:val="16"/>
         </w:numPr>
       </w:pPr>
       <w:r>
@@ -3997,7 +4150,7 @@
         <w:pStyle w:val="ListParagraph"/>
         <w:numPr>
           <w:ilvl w:val="0"/>
-          <w:numId w:val="15"/>
+          <w:numId w:val="16"/>
         </w:numPr>
       </w:pPr>
       <w:r>
@@ -4009,7 +4162,7 @@
         <w:pStyle w:val="ListParagraph"/>
         <w:numPr>
           <w:ilvl w:val="0"/>
-          <w:numId w:val="15"/>
+          <w:numId w:val="16"/>
         </w:numPr>
       </w:pPr>
       <w:r>
@@ -4117,7 +4270,7 @@
         <w:pStyle w:val="ListParagraph"/>
         <w:numPr>
           <w:ilvl w:val="0"/>
-          <w:numId w:val="15"/>
+          <w:numId w:val="16"/>
         </w:numPr>
       </w:pPr>
       <w:r>
@@ -4180,7 +4333,7 @@
         <w:pStyle w:val="ListParagraph"/>
         <w:numPr>
           <w:ilvl w:val="0"/>
-          <w:numId w:val="15"/>
+          <w:numId w:val="16"/>
         </w:numPr>
       </w:pPr>
       <w:r>
@@ -4234,7 +4387,7 @@
         <w:pStyle w:val="ListParagraph"/>
         <w:numPr>
           <w:ilvl w:val="0"/>
-          <w:numId w:val="16"/>
+          <w:numId w:val="17"/>
         </w:numPr>
       </w:pPr>
       <w:r>
@@ -4279,7 +4432,7 @@
         <w:pStyle w:val="ListParagraph"/>
         <w:numPr>
           <w:ilvl w:val="0"/>
-          <w:numId w:val="16"/>
+          <w:numId w:val="17"/>
         </w:numPr>
       </w:pPr>
       <w:r>
@@ -4360,7 +4513,7 @@
         <w:pStyle w:val="ListParagraph"/>
         <w:numPr>
           <w:ilvl w:val="0"/>
-          <w:numId w:val="16"/>
+          <w:numId w:val="17"/>
         </w:numPr>
       </w:pPr>
       <w:r>
@@ -4396,7 +4549,7 @@
         <w:pStyle w:val="ListParagraph"/>
         <w:numPr>
           <w:ilvl w:val="0"/>
-          <w:numId w:val="17"/>
+          <w:numId w:val="18"/>
         </w:numPr>
       </w:pPr>
       <w:r>
@@ -4507,7 +4660,7 @@
         <w:pStyle w:val="ListParagraph"/>
         <w:numPr>
           <w:ilvl w:val="0"/>
-          <w:numId w:val="17"/>
+          <w:numId w:val="18"/>
         </w:numPr>
       </w:pPr>
       <w:r>
@@ -4561,7 +4714,7 @@
         <w:pStyle w:val="ListParagraph"/>
         <w:numPr>
           <w:ilvl w:val="0"/>
-          <w:numId w:val="17"/>
+          <w:numId w:val="18"/>
         </w:numPr>
       </w:pPr>
       <w:r>
@@ -4597,7 +4750,7 @@
         <w:pStyle w:val="ListParagraph"/>
         <w:numPr>
           <w:ilvl w:val="0"/>
-          <w:numId w:val="17"/>
+          <w:numId w:val="18"/>
         </w:numPr>
       </w:pPr>
       <w:r>
@@ -4615,7 +4768,7 @@
         <w:pStyle w:val="ListParagraph"/>
         <w:numPr>
           <w:ilvl w:val="0"/>
-          <w:numId w:val="17"/>
+          <w:numId w:val="18"/>
         </w:numPr>
       </w:pPr>
       <w:r>
@@ -4645,7 +4798,7 @@
         <w:pStyle w:val="ListParagraph"/>
         <w:numPr>
           <w:ilvl w:val="0"/>
-          <w:numId w:val="18"/>
+          <w:numId w:val="19"/>
         </w:numPr>
       </w:pPr>
       <w:r>
@@ -4672,7 +4825,7 @@
         <w:pStyle w:val="ListParagraph"/>
         <w:numPr>
           <w:ilvl w:val="0"/>
-          <w:numId w:val="18"/>
+          <w:numId w:val="19"/>
         </w:numPr>
       </w:pPr>
       <w:r>
@@ -4690,7 +4843,7 @@
         <w:pStyle w:val="ListParagraph"/>
         <w:numPr>
           <w:ilvl w:val="0"/>
-          <w:numId w:val="18"/>
+          <w:numId w:val="19"/>
         </w:numPr>
       </w:pPr>
       <w:r>
@@ -4735,7 +4888,7 @@
         <w:pStyle w:val="ListParagraph"/>
         <w:numPr>
           <w:ilvl w:val="0"/>
-          <w:numId w:val="18"/>
+          <w:numId w:val="19"/>
         </w:numPr>
       </w:pPr>
       <w:r>
@@ -4771,7 +4924,7 @@
         <w:pStyle w:val="ListParagraph"/>
         <w:numPr>
           <w:ilvl w:val="0"/>
-          <w:numId w:val="18"/>
+          <w:numId w:val="19"/>
         </w:numPr>
       </w:pPr>
       <w:r>
@@ -4869,7 +5022,7 @@
         <w:pStyle w:val="ListParagraph"/>
         <w:numPr>
           <w:ilvl w:val="0"/>
-          <w:numId w:val="19"/>
+          <w:numId w:val="20"/>
         </w:numPr>
       </w:pPr>
       <w:r>
@@ -4926,7 +5079,7 @@
         <w:pStyle w:val="ListParagraph"/>
         <w:numPr>
           <w:ilvl w:val="0"/>
-          <w:numId w:val="19"/>
+          <w:numId w:val="20"/>
         </w:numPr>
       </w:pPr>
       <w:r>
@@ -4938,7 +5091,7 @@
         <w:pStyle w:val="ListParagraph"/>
         <w:numPr>
           <w:ilvl w:val="0"/>
-          <w:numId w:val="19"/>
+          <w:numId w:val="20"/>
         </w:numPr>
       </w:pPr>
       <w:r>
@@ -4956,7 +5109,7 @@
         <w:pStyle w:val="ListParagraph"/>
         <w:numPr>
           <w:ilvl w:val="0"/>
-          <w:numId w:val="19"/>
+          <w:numId w:val="20"/>
         </w:numPr>
       </w:pPr>
       <w:r>
@@ -5001,7 +5154,7 @@
         <w:pStyle w:val="ListParagraph"/>
         <w:numPr>
           <w:ilvl w:val="0"/>
-          <w:numId w:val="19"/>
+          <w:numId w:val="20"/>
         </w:numPr>
       </w:pPr>
       <w:r>
@@ -5036,7 +5189,7 @@
         <w:pStyle w:val="ListParagraph"/>
         <w:numPr>
           <w:ilvl w:val="0"/>
-          <w:numId w:val="20"/>
+          <w:numId w:val="21"/>
         </w:numPr>
       </w:pPr>
       <w:r>
@@ -5063,7 +5216,7 @@
         <w:pStyle w:val="ListParagraph"/>
         <w:numPr>
           <w:ilvl w:val="0"/>
-          <w:numId w:val="20"/>
+          <w:numId w:val="21"/>
         </w:numPr>
       </w:pPr>
       <w:r>
@@ -5117,7 +5270,7 @@
         <w:pStyle w:val="ListParagraph"/>
         <w:numPr>
           <w:ilvl w:val="0"/>
-          <w:numId w:val="20"/>
+          <w:numId w:val="21"/>
         </w:numPr>
       </w:pPr>
       <w:r>
@@ -5144,7 +5297,7 @@
         <w:pStyle w:val="ListParagraph"/>
         <w:numPr>
           <w:ilvl w:val="0"/>
-          <w:numId w:val="20"/>
+          <w:numId w:val="21"/>
         </w:numPr>
       </w:pPr>
       <w:r>
@@ -5180,7 +5333,7 @@
         <w:pStyle w:val="ListParagraph"/>
         <w:numPr>
           <w:ilvl w:val="0"/>
-          <w:numId w:val="20"/>
+          <w:numId w:val="21"/>
         </w:numPr>
       </w:pPr>
       <w:r>
@@ -5225,7 +5378,7 @@
         <w:pStyle w:val="ListParagraph"/>
         <w:numPr>
           <w:ilvl w:val="0"/>
-          <w:numId w:val="20"/>
+          <w:numId w:val="21"/>
         </w:numPr>
       </w:pPr>
       <w:r>
@@ -5261,7 +5414,7 @@
         <w:pStyle w:val="ListParagraph"/>
         <w:numPr>
           <w:ilvl w:val="0"/>
-          <w:numId w:val="20"/>
+          <w:numId w:val="21"/>
         </w:numPr>
       </w:pPr>
       <w:r>
@@ -5320,7 +5473,7 @@
         <w:pStyle w:val="ListParagraph"/>
         <w:numPr>
           <w:ilvl w:val="0"/>
-          <w:numId w:val="21"/>
+          <w:numId w:val="22"/>
         </w:numPr>
       </w:pPr>
       <w:r>
@@ -5374,7 +5527,7 @@
         <w:pStyle w:val="ListParagraph"/>
         <w:numPr>
           <w:ilvl w:val="0"/>
-          <w:numId w:val="21"/>
+          <w:numId w:val="22"/>
         </w:numPr>
       </w:pPr>
       <w:r>
@@ -5410,7 +5563,7 @@
         <w:pStyle w:val="ListParagraph"/>
         <w:numPr>
           <w:ilvl w:val="0"/>
-          <w:numId w:val="21"/>
+          <w:numId w:val="22"/>
         </w:numPr>
       </w:pPr>
       <w:r>
@@ -5428,7 +5581,7 @@
         <w:pStyle w:val="ListParagraph"/>
         <w:numPr>
           <w:ilvl w:val="0"/>
-          <w:numId w:val="21"/>
+          <w:numId w:val="22"/>
         </w:numPr>
       </w:pPr>
       <w:r>
@@ -5482,7 +5635,7 @@
         <w:pStyle w:val="ListParagraph"/>
         <w:numPr>
           <w:ilvl w:val="0"/>
-          <w:numId w:val="21"/>
+          <w:numId w:val="22"/>
         </w:numPr>
       </w:pPr>
       <w:r>
@@ -5500,7 +5653,7 @@
         <w:pStyle w:val="ListParagraph"/>
         <w:numPr>
           <w:ilvl w:val="0"/>
-          <w:numId w:val="21"/>
+          <w:numId w:val="22"/>
         </w:numPr>
       </w:pPr>
       <w:r>
@@ -5518,7 +5671,7 @@
         <w:pStyle w:val="ListParagraph"/>
         <w:numPr>
           <w:ilvl w:val="0"/>
-          <w:numId w:val="21"/>
+          <w:numId w:val="22"/>
         </w:numPr>
       </w:pPr>
       <w:r>
@@ -5544,7 +5697,7 @@
         <w:pStyle w:val="ListParagraph"/>
         <w:numPr>
           <w:ilvl w:val="0"/>
-          <w:numId w:val="22"/>
+          <w:numId w:val="23"/>
         </w:numPr>
       </w:pPr>
       <w:r>
@@ -5580,7 +5733,7 @@
         <w:pStyle w:val="ListParagraph"/>
         <w:numPr>
           <w:ilvl w:val="0"/>
-          <w:numId w:val="22"/>
+          <w:numId w:val="23"/>
         </w:numPr>
       </w:pPr>
       <w:r>
@@ -5598,7 +5751,7 @@
         <w:pStyle w:val="ListParagraph"/>
         <w:numPr>
           <w:ilvl w:val="0"/>
-          <w:numId w:val="22"/>
+          <w:numId w:val="23"/>
         </w:numPr>
       </w:pPr>
       <w:r>
@@ -5616,7 +5769,7 @@
         <w:pStyle w:val="ListParagraph"/>
         <w:numPr>
           <w:ilvl w:val="0"/>
-          <w:numId w:val="22"/>
+          <w:numId w:val="23"/>
         </w:numPr>
       </w:pPr>
       <w:r>
@@ -5634,7 +5787,7 @@
         <w:pStyle w:val="ListParagraph"/>
         <w:numPr>
           <w:ilvl w:val="0"/>
-          <w:numId w:val="22"/>
+          <w:numId w:val="23"/>
         </w:numPr>
       </w:pPr>
       <w:r>
@@ -5744,7 +5897,7 @@
         <w:pStyle w:val="ListParagraph"/>
         <w:numPr>
           <w:ilvl w:val="0"/>
-          <w:numId w:val="23"/>
+          <w:numId w:val="24"/>
         </w:numPr>
       </w:pPr>
       <w:r>
@@ -5789,7 +5942,7 @@
         <w:pStyle w:val="ListParagraph"/>
         <w:numPr>
           <w:ilvl w:val="0"/>
-          <w:numId w:val="23"/>
+          <w:numId w:val="24"/>
         </w:numPr>
       </w:pPr>
       <w:r>
@@ -5843,7 +5996,7 @@
         <w:pStyle w:val="ListParagraph"/>
         <w:numPr>
           <w:ilvl w:val="0"/>
-          <w:numId w:val="23"/>
+          <w:numId w:val="24"/>
         </w:numPr>
       </w:pPr>
       <w:r>
@@ -5888,7 +6041,7 @@
         <w:pStyle w:val="ListParagraph"/>
         <w:numPr>
           <w:ilvl w:val="0"/>
-          <w:numId w:val="23"/>
+          <w:numId w:val="24"/>
         </w:numPr>
       </w:pPr>
       <w:r>
@@ -5948,7 +6101,7 @@
         <w:pStyle w:val="ListParagraph"/>
         <w:numPr>
           <w:ilvl w:val="0"/>
-          <w:numId w:val="24"/>
+          <w:numId w:val="25"/>
         </w:numPr>
       </w:pPr>
       <w:r>
@@ -5975,7 +6128,7 @@
         <w:pStyle w:val="ListParagraph"/>
         <w:numPr>
           <w:ilvl w:val="0"/>
-          <w:numId w:val="24"/>
+          <w:numId w:val="25"/>
         </w:numPr>
       </w:pPr>
       <w:r>
@@ -6011,7 +6164,7 @@
         <w:pStyle w:val="ListParagraph"/>
         <w:numPr>
           <w:ilvl w:val="0"/>
-          <w:numId w:val="24"/>
+          <w:numId w:val="25"/>
         </w:numPr>
       </w:pPr>
       <w:r>
@@ -6083,7 +6236,7 @@
         <w:pStyle w:val="ListParagraph"/>
         <w:numPr>
           <w:ilvl w:val="0"/>
-          <w:numId w:val="24"/>
+          <w:numId w:val="25"/>
         </w:numPr>
       </w:pPr>
       <w:r>
@@ -6128,7 +6281,7 @@
         <w:pStyle w:val="ListParagraph"/>
         <w:numPr>
           <w:ilvl w:val="0"/>
-          <w:numId w:val="24"/>
+          <w:numId w:val="25"/>
         </w:numPr>
       </w:pPr>
       <w:r>
@@ -6236,7 +6389,7 @@
         <w:pStyle w:val="ListParagraph"/>
         <w:numPr>
           <w:ilvl w:val="0"/>
-          <w:numId w:val="24"/>
+          <w:numId w:val="25"/>
         </w:numPr>
       </w:pPr>
       <w:r>
@@ -6272,7 +6425,7 @@
         <w:pStyle w:val="ListParagraph"/>
         <w:numPr>
           <w:ilvl w:val="0"/>
-          <w:numId w:val="24"/>
+          <w:numId w:val="25"/>
         </w:numPr>
       </w:pPr>
       <w:r>
@@ -6308,7 +6461,7 @@
         <w:pStyle w:val="ListParagraph"/>
         <w:numPr>
           <w:ilvl w:val="0"/>
-          <w:numId w:val="24"/>
+          <w:numId w:val="25"/>
         </w:numPr>
       </w:pPr>
       <w:r>
@@ -6344,7 +6497,7 @@
         <w:pStyle w:val="ListParagraph"/>
         <w:numPr>
           <w:ilvl w:val="0"/>
-          <w:numId w:val="24"/>
+          <w:numId w:val="25"/>
         </w:numPr>
       </w:pPr>
       <w:r>
@@ -6371,7 +6524,7 @@
         <w:pStyle w:val="ListParagraph"/>
         <w:numPr>
           <w:ilvl w:val="0"/>
-          <w:numId w:val="24"/>
+          <w:numId w:val="25"/>
         </w:numPr>
       </w:pPr>
       <w:r>
@@ -6405,7 +6558,7 @@
         <w:pStyle w:val="ListParagraph"/>
         <w:numPr>
           <w:ilvl w:val="0"/>
-          <w:numId w:val="25"/>
+          <w:numId w:val="26"/>
         </w:numPr>
       </w:pPr>
       <w:r>
@@ -6426,7 +6579,7 @@
         <w:pStyle w:val="ListParagraph"/>
         <w:numPr>
           <w:ilvl w:val="0"/>
-          <w:numId w:val="25"/>
+          <w:numId w:val="26"/>
         </w:numPr>
       </w:pPr>
       <w:r>
@@ -6438,7 +6591,7 @@
         <w:pStyle w:val="ListParagraph"/>
         <w:numPr>
           <w:ilvl w:val="0"/>
-          <w:numId w:val="25"/>
+          <w:numId w:val="26"/>
         </w:numPr>
       </w:pPr>
       <w:r>
@@ -6456,7 +6609,7 @@
         <w:pStyle w:val="ListParagraph"/>
         <w:numPr>
           <w:ilvl w:val="0"/>
-          <w:numId w:val="25"/>
+          <w:numId w:val="26"/>
         </w:numPr>
       </w:pPr>
       <w:r>
@@ -6474,7 +6627,7 @@
         <w:pStyle w:val="ListParagraph"/>
         <w:numPr>
           <w:ilvl w:val="0"/>
-          <w:numId w:val="25"/>
+          <w:numId w:val="26"/>
         </w:numPr>
       </w:pPr>
       <w:r>
@@ -6883,7 +7036,7 @@
         <w:pStyle w:val="ListParagraph"/>
         <w:numPr>
           <w:ilvl w:val="0"/>
-          <w:numId w:val="26"/>
+          <w:numId w:val="27"/>
         </w:numPr>
       </w:pPr>
       <w:r>
@@ -6901,7 +7054,7 @@
         <w:pStyle w:val="ListParagraph"/>
         <w:numPr>
           <w:ilvl w:val="0"/>
-          <w:numId w:val="26"/>
+          <w:numId w:val="27"/>
         </w:numPr>
       </w:pPr>
       <w:r>
@@ -6928,7 +7081,7 @@
         <w:pStyle w:val="ListParagraph"/>
         <w:numPr>
           <w:ilvl w:val="0"/>
-          <w:numId w:val="26"/>
+          <w:numId w:val="27"/>
         </w:numPr>
       </w:pPr>
       <w:r>
@@ -6955,7 +7108,7 @@
         <w:pStyle w:val="ListParagraph"/>
         <w:numPr>
           <w:ilvl w:val="0"/>
-          <w:numId w:val="26"/>
+          <w:numId w:val="27"/>
         </w:numPr>
       </w:pPr>
       <w:r>
@@ -7202,7 +7355,7 @@
         <w:pStyle w:val="ListParagraph"/>
         <w:numPr>
           <w:ilvl w:val="0"/>
-          <w:numId w:val="27"/>
+          <w:numId w:val="28"/>
         </w:numPr>
       </w:pPr>
       <w:r>
@@ -7229,7 +7382,7 @@
         <w:pStyle w:val="ListParagraph"/>
         <w:numPr>
           <w:ilvl w:val="0"/>
-          <w:numId w:val="27"/>
+          <w:numId w:val="28"/>
         </w:numPr>
       </w:pPr>
       <w:r>
@@ -7247,7 +7400,7 @@
         <w:pStyle w:val="ListParagraph"/>
         <w:numPr>
           <w:ilvl w:val="0"/>
-          <w:numId w:val="27"/>
+          <w:numId w:val="28"/>
         </w:numPr>
       </w:pPr>
       <w:r>
@@ -7265,7 +7418,7 @@
         <w:pStyle w:val="ListParagraph"/>
         <w:numPr>
           <w:ilvl w:val="0"/>
-          <w:numId w:val="27"/>
+          <w:numId w:val="28"/>
         </w:numPr>
       </w:pPr>
       <w:r>
@@ -7328,7 +7481,7 @@
         <w:pStyle w:val="ListParagraph"/>
         <w:numPr>
           <w:ilvl w:val="0"/>
-          <w:numId w:val="27"/>
+          <w:numId w:val="28"/>
         </w:numPr>
       </w:pPr>
       <w:r>
@@ -7363,7 +7516,7 @@
         <w:pStyle w:val="ListParagraph"/>
         <w:numPr>
           <w:ilvl w:val="0"/>
-          <w:numId w:val="28"/>
+          <w:numId w:val="29"/>
         </w:numPr>
       </w:pPr>
       <w:r>
@@ -7399,7 +7552,7 @@
         <w:pStyle w:val="ListParagraph"/>
         <w:numPr>
           <w:ilvl w:val="0"/>
-          <w:numId w:val="28"/>
+          <w:numId w:val="29"/>
         </w:numPr>
       </w:pPr>
       <w:r>
@@ -7417,7 +7570,7 @@
         <w:pStyle w:val="ListParagraph"/>
         <w:numPr>
           <w:ilvl w:val="0"/>
-          <w:numId w:val="28"/>
+          <w:numId w:val="29"/>
         </w:numPr>
       </w:pPr>
       <w:r>
@@ -8018,7 +8171,7 @@
         <w:pStyle w:val="ListParagraph"/>
         <w:numPr>
           <w:ilvl w:val="0"/>
-          <w:numId w:val="29"/>
+          <w:numId w:val="30"/>
         </w:numPr>
       </w:pPr>
       <w:r>
@@ -8057,7 +8210,7 @@
         <w:pStyle w:val="ListParagraph"/>
         <w:numPr>
           <w:ilvl w:val="0"/>
-          <w:numId w:val="29"/>
+          <w:numId w:val="30"/>
         </w:numPr>
       </w:pPr>
       <w:r>
@@ -8087,7 +8240,7 @@
         <w:pStyle w:val="ListParagraph"/>
         <w:numPr>
           <w:ilvl w:val="0"/>
-          <w:numId w:val="29"/>
+          <w:numId w:val="30"/>
         </w:numPr>
       </w:pPr>
       <w:r>
@@ -8105,7 +8258,7 @@
         <w:pStyle w:val="ListParagraph"/>
         <w:numPr>
           <w:ilvl w:val="0"/>
-          <w:numId w:val="29"/>
+          <w:numId w:val="30"/>
         </w:numPr>
       </w:pPr>
       <w:r>
@@ -8140,7 +8293,7 @@
         <w:pStyle w:val="ListParagraph"/>
         <w:numPr>
           <w:ilvl w:val="0"/>
-          <w:numId w:val="30"/>
+          <w:numId w:val="31"/>
         </w:numPr>
       </w:pPr>
       <w:r>
@@ -8170,7 +8323,7 @@
         <w:pStyle w:val="ListParagraph"/>
         <w:numPr>
           <w:ilvl w:val="0"/>
-          <w:numId w:val="30"/>
+          <w:numId w:val="31"/>
         </w:numPr>
       </w:pPr>
       <w:r>
@@ -8182,7 +8335,7 @@
         <w:pStyle w:val="ListParagraph"/>
         <w:numPr>
           <w:ilvl w:val="0"/>
-          <w:numId w:val="30"/>
+          <w:numId w:val="31"/>
         </w:numPr>
       </w:pPr>
       <w:r>
@@ -8209,7 +8362,7 @@
         <w:pStyle w:val="ListParagraph"/>
         <w:numPr>
           <w:ilvl w:val="0"/>
-          <w:numId w:val="30"/>
+          <w:numId w:val="31"/>
         </w:numPr>
       </w:pPr>
       <w:r>
@@ -8235,7 +8388,7 @@
         <w:pStyle w:val="ListParagraph"/>
         <w:numPr>
           <w:ilvl w:val="0"/>
-          <w:numId w:val="31"/>
+          <w:numId w:val="32"/>
         </w:numPr>
       </w:pPr>
       <w:r>
@@ -8256,7 +8409,7 @@
         <w:pStyle w:val="ListParagraph"/>
         <w:numPr>
           <w:ilvl w:val="0"/>
-          <w:numId w:val="31"/>
+          <w:numId w:val="32"/>
         </w:numPr>
       </w:pPr>
       <w:r>
@@ -8283,7 +8436,7 @@
         <w:pStyle w:val="ListParagraph"/>
         <w:numPr>
           <w:ilvl w:val="0"/>
-          <w:numId w:val="31"/>
+          <w:numId w:val="32"/>
         </w:numPr>
       </w:pPr>
       <w:r>
@@ -8301,7 +8454,7 @@
         <w:pStyle w:val="ListParagraph"/>
         <w:numPr>
           <w:ilvl w:val="0"/>
-          <w:numId w:val="31"/>
+          <w:numId w:val="32"/>
         </w:numPr>
       </w:pPr>
       <w:r>
@@ -8319,7 +8472,7 @@
         <w:pStyle w:val="ListParagraph"/>
         <w:numPr>
           <w:ilvl w:val="0"/>
-          <w:numId w:val="31"/>
+          <w:numId w:val="32"/>
         </w:numPr>
       </w:pPr>
       <w:r>
@@ -8737,7 +8890,7 @@
         <w:pStyle w:val="ListParagraph"/>
         <w:numPr>
           <w:ilvl w:val="0"/>
-          <w:numId w:val="32"/>
+          <w:numId w:val="33"/>
         </w:numPr>
       </w:pPr>
       <w:r>
@@ -8782,7 +8935,7 @@
         <w:pStyle w:val="ListParagraph"/>
         <w:numPr>
           <w:ilvl w:val="0"/>
-          <w:numId w:val="32"/>
+          <w:numId w:val="33"/>
         </w:numPr>
       </w:pPr>
       <w:r>
@@ -8818,7 +8971,7 @@
         <w:pStyle w:val="ListParagraph"/>
         <w:numPr>
           <w:ilvl w:val="0"/>
-          <w:numId w:val="32"/>
+          <w:numId w:val="33"/>
         </w:numPr>
       </w:pPr>
       <w:r>
@@ -8861,7 +9014,7 @@
         <w:pStyle w:val="ListParagraph"/>
         <w:numPr>
           <w:ilvl w:val="0"/>
-          <w:numId w:val="33"/>
+          <w:numId w:val="34"/>
         </w:numPr>
       </w:pPr>
       <w:r>
@@ -8882,7 +9035,7 @@
         <w:pStyle w:val="ListParagraph"/>
         <w:numPr>
           <w:ilvl w:val="0"/>
-          <w:numId w:val="33"/>
+          <w:numId w:val="34"/>
         </w:numPr>
       </w:pPr>
       <w:r>
@@ -8909,7 +9062,7 @@
         <w:pStyle w:val="ListParagraph"/>
         <w:numPr>
           <w:ilvl w:val="0"/>
-          <w:numId w:val="33"/>
+          <w:numId w:val="34"/>
         </w:numPr>
       </w:pPr>
       <w:r>
@@ -8972,7 +9125,7 @@
         <w:pStyle w:val="ListParagraph"/>
         <w:numPr>
           <w:ilvl w:val="0"/>
-          <w:numId w:val="33"/>
+          <w:numId w:val="34"/>
         </w:numPr>
       </w:pPr>
       <w:r>
@@ -9146,7 +9299,7 @@
         <w:pStyle w:val="ListParagraph"/>
         <w:numPr>
           <w:ilvl w:val="0"/>
-          <w:numId w:val="34"/>
+          <w:numId w:val="35"/>
         </w:numPr>
       </w:pPr>
       <w:r>
@@ -9173,7 +9326,7 @@
         <w:pStyle w:val="ListParagraph"/>
         <w:numPr>
           <w:ilvl w:val="0"/>
-          <w:numId w:val="34"/>
+          <w:numId w:val="35"/>
         </w:numPr>
       </w:pPr>
       <w:r>
@@ -9194,7 +9347,7 @@
         <w:pStyle w:val="ListParagraph"/>
         <w:numPr>
           <w:ilvl w:val="0"/>
-          <w:numId w:val="34"/>
+          <w:numId w:val="35"/>
         </w:numPr>
       </w:pPr>
       <w:r>
@@ -9475,7 +9628,7 @@
         <w:pStyle w:val="ListParagraph"/>
         <w:numPr>
           <w:ilvl w:val="0"/>
-          <w:numId w:val="35"/>
+          <w:numId w:val="36"/>
         </w:numPr>
       </w:pPr>
       <w:r>
@@ -9496,7 +9649,7 @@
         <w:pStyle w:val="ListParagraph"/>
         <w:numPr>
           <w:ilvl w:val="0"/>
-          <w:numId w:val="35"/>
+          <w:numId w:val="36"/>
         </w:numPr>
       </w:pPr>
       <w:r>
@@ -9514,7 +9667,7 @@
         <w:pStyle w:val="ListParagraph"/>
         <w:numPr>
           <w:ilvl w:val="0"/>
-          <w:numId w:val="35"/>
+          <w:numId w:val="36"/>
         </w:numPr>
       </w:pPr>
       <w:r>
@@ -9532,7 +9685,7 @@
         <w:pStyle w:val="ListParagraph"/>
         <w:numPr>
           <w:ilvl w:val="0"/>
-          <w:numId w:val="35"/>
+          <w:numId w:val="36"/>
         </w:numPr>
       </w:pPr>
       <w:r>
@@ -9552,7 +9705,7 @@
         <w:pStyle w:val="ListParagraph"/>
         <w:numPr>
           <w:ilvl w:val="0"/>
-          <w:numId w:val="36"/>
+          <w:numId w:val="37"/>
         </w:numPr>
       </w:pPr>
       <w:r>
@@ -9582,7 +9735,7 @@
         <w:pStyle w:val="ListParagraph"/>
         <w:numPr>
           <w:ilvl w:val="0"/>
-          <w:numId w:val="36"/>
+          <w:numId w:val="37"/>
         </w:numPr>
       </w:pPr>
       <w:r>
@@ -9625,7 +9778,7 @@
         <w:pStyle w:val="ListParagraph"/>
         <w:numPr>
           <w:ilvl w:val="0"/>
-          <w:numId w:val="37"/>
+          <w:numId w:val="38"/>
         </w:numPr>
       </w:pPr>
       <w:r>
@@ -9682,7 +9835,7 @@
         <w:pStyle w:val="ListParagraph"/>
         <w:numPr>
           <w:ilvl w:val="0"/>
-          <w:numId w:val="37"/>
+          <w:numId w:val="38"/>
         </w:numPr>
       </w:pPr>
       <w:r>
@@ -9694,7 +9847,7 @@
         <w:pStyle w:val="ListParagraph"/>
         <w:numPr>
           <w:ilvl w:val="0"/>
-          <w:numId w:val="37"/>
+          <w:numId w:val="38"/>
         </w:numPr>
       </w:pPr>
       <w:r>
@@ -9724,7 +9877,7 @@
         <w:pStyle w:val="ListParagraph"/>
         <w:numPr>
           <w:ilvl w:val="0"/>
-          <w:numId w:val="37"/>
+          <w:numId w:val="38"/>
         </w:numPr>
       </w:pPr>
       <w:r>
@@ -10150,7 +10303,7 @@
         <w:pStyle w:val="ListParagraph"/>
         <w:numPr>
           <w:ilvl w:val="0"/>
-          <w:numId w:val="38"/>
+          <w:numId w:val="39"/>
         </w:numPr>
       </w:pPr>
       <w:r>
@@ -10162,7 +10315,7 @@
         <w:pStyle w:val="ListParagraph"/>
         <w:numPr>
           <w:ilvl w:val="0"/>
-          <w:numId w:val="38"/>
+          <w:numId w:val="39"/>
         </w:numPr>
       </w:pPr>
       <w:r>
@@ -10174,7 +10327,7 @@
         <w:pStyle w:val="ListParagraph"/>
         <w:numPr>
           <w:ilvl w:val="0"/>
-          <w:numId w:val="38"/>
+          <w:numId w:val="39"/>
         </w:numPr>
       </w:pPr>
       <w:r>
@@ -10194,7 +10347,7 @@
         <w:pStyle w:val="ListParagraph"/>
         <w:numPr>
           <w:ilvl w:val="0"/>
-          <w:numId w:val="39"/>
+          <w:numId w:val="40"/>
         </w:numPr>
       </w:pPr>
       <w:r>
@@ -10221,7 +10374,7 @@
         <w:pStyle w:val="ListParagraph"/>
         <w:numPr>
           <w:ilvl w:val="0"/>
-          <w:numId w:val="39"/>
+          <w:numId w:val="40"/>
         </w:numPr>
       </w:pPr>
       <w:r>
@@ -10248,7 +10401,7 @@
         <w:pStyle w:val="ListParagraph"/>
         <w:numPr>
           <w:ilvl w:val="0"/>
-          <w:numId w:val="39"/>
+          <w:numId w:val="40"/>
         </w:numPr>
       </w:pPr>
       <w:r>
@@ -10315,7 +10468,7 @@
         <w:pStyle w:val="ListParagraph"/>
         <w:numPr>
           <w:ilvl w:val="0"/>
-          <w:numId w:val="40"/>
+          <w:numId w:val="41"/>
         </w:numPr>
       </w:pPr>
       <w:r>
@@ -10327,7 +10480,7 @@
         <w:pStyle w:val="ListParagraph"/>
         <w:numPr>
           <w:ilvl w:val="0"/>
-          <w:numId w:val="40"/>
+          <w:numId w:val="41"/>
         </w:numPr>
       </w:pPr>
       <w:r>
@@ -10420,7 +10573,7 @@
         <w:pStyle w:val="ListParagraph"/>
         <w:numPr>
           <w:ilvl w:val="0"/>
-          <w:numId w:val="40"/>
+          <w:numId w:val="41"/>
         </w:numPr>
       </w:pPr>
       <w:r>
@@ -10465,7 +10618,7 @@
         <w:pStyle w:val="ListParagraph"/>
         <w:numPr>
           <w:ilvl w:val="0"/>
-          <w:numId w:val="40"/>
+          <w:numId w:val="41"/>
         </w:numPr>
       </w:pPr>
       <w:r>
@@ -10492,7 +10645,7 @@
         <w:pStyle w:val="ListParagraph"/>
         <w:numPr>
           <w:ilvl w:val="0"/>
-          <w:numId w:val="40"/>
+          <w:numId w:val="41"/>
         </w:numPr>
       </w:pPr>
       <w:r>
@@ -10856,7 +11009,7 @@
         <w:pStyle w:val="ListParagraph"/>
         <w:numPr>
           <w:ilvl w:val="0"/>
-          <w:numId w:val="41"/>
+          <w:numId w:val="42"/>
         </w:numPr>
       </w:pPr>
       <w:r>
@@ -10868,7 +11021,7 @@
         <w:pStyle w:val="ListParagraph"/>
         <w:numPr>
           <w:ilvl w:val="0"/>
-          <w:numId w:val="41"/>
+          <w:numId w:val="42"/>
         </w:numPr>
       </w:pPr>
       <w:r>
@@ -10886,7 +11039,7 @@
         <w:pStyle w:val="ListParagraph"/>
         <w:numPr>
           <w:ilvl w:val="0"/>
-          <w:numId w:val="41"/>
+          <w:numId w:val="42"/>
         </w:numPr>
       </w:pPr>
       <w:r>
@@ -10907,7 +11060,7 @@
         <w:pStyle w:val="ListParagraph"/>
         <w:numPr>
           <w:ilvl w:val="0"/>
-          <w:numId w:val="41"/>
+          <w:numId w:val="42"/>
         </w:numPr>
       </w:pPr>
       <w:r>
@@ -10934,7 +11087,7 @@
         <w:pStyle w:val="ListParagraph"/>
         <w:numPr>
           <w:ilvl w:val="0"/>
-          <w:numId w:val="41"/>
+          <w:numId w:val="42"/>
         </w:numPr>
       </w:pPr>
       <w:r>
@@ -10946,7 +11099,7 @@
         <w:pStyle w:val="ListParagraph"/>
         <w:numPr>
           <w:ilvl w:val="0"/>
-          <w:numId w:val="41"/>
+          <w:numId w:val="42"/>
         </w:numPr>
       </w:pPr>
       <w:r>
@@ -11003,7 +11156,7 @@
         <w:pStyle w:val="ListParagraph"/>
         <w:numPr>
           <w:ilvl w:val="0"/>
-          <w:numId w:val="41"/>
+          <w:numId w:val="42"/>
         </w:numPr>
       </w:pPr>
       <w:r>
@@ -11021,7 +11174,7 @@
         <w:pStyle w:val="ListParagraph"/>
         <w:numPr>
           <w:ilvl w:val="0"/>
-          <w:numId w:val="41"/>
+          <w:numId w:val="42"/>
         </w:numPr>
       </w:pPr>
       <w:r>
@@ -11048,7 +11201,7 @@
         <w:pStyle w:val="ListParagraph"/>
         <w:numPr>
           <w:ilvl w:val="0"/>
-          <w:numId w:val="41"/>
+          <w:numId w:val="42"/>
         </w:numPr>
       </w:pPr>
       <w:r>
@@ -11120,7 +11273,7 @@
         <w:pStyle w:val="ListParagraph"/>
         <w:numPr>
           <w:ilvl w:val="0"/>
-          <w:numId w:val="41"/>
+          <w:numId w:val="42"/>
         </w:numPr>
       </w:pPr>
       <w:r>
@@ -11164,7 +11317,7 @@
         <w:pStyle w:val="ListParagraph"/>
         <w:numPr>
           <w:ilvl w:val="0"/>
-          <w:numId w:val="42"/>
+          <w:numId w:val="43"/>
         </w:numPr>
       </w:pPr>
       <w:r>
@@ -11218,7 +11371,7 @@
         <w:pStyle w:val="ListParagraph"/>
         <w:numPr>
           <w:ilvl w:val="0"/>
-          <w:numId w:val="42"/>
+          <w:numId w:val="43"/>
         </w:numPr>
       </w:pPr>
       <w:r>
@@ -11272,7 +11425,7 @@
         <w:pStyle w:val="ListParagraph"/>
         <w:numPr>
           <w:ilvl w:val="0"/>
-          <w:numId w:val="42"/>
+          <w:numId w:val="43"/>
         </w:numPr>
       </w:pPr>
       <w:r>
@@ -11326,7 +11479,7 @@
         <w:pStyle w:val="ListParagraph"/>
         <w:numPr>
           <w:ilvl w:val="0"/>
-          <w:numId w:val="42"/>
+          <w:numId w:val="43"/>
         </w:numPr>
       </w:pPr>
       <w:r>
@@ -11374,7 +11527,7 @@
         <w:pStyle w:val="ListParagraph"/>
         <w:numPr>
           <w:ilvl w:val="0"/>
-          <w:numId w:val="42"/>
+          <w:numId w:val="43"/>
         </w:numPr>
       </w:pPr>
       <w:r>
@@ -11410,7 +11563,7 @@
         <w:pStyle w:val="ListParagraph"/>
         <w:numPr>
           <w:ilvl w:val="0"/>
-          <w:numId w:val="42"/>
+          <w:numId w:val="43"/>
         </w:numPr>
       </w:pPr>
       <w:r>
@@ -11856,7 +12009,7 @@
         <w:pStyle w:val="ListParagraph"/>
         <w:numPr>
           <w:ilvl w:val="0"/>
-          <w:numId w:val="43"/>
+          <w:numId w:val="44"/>
         </w:numPr>
       </w:pPr>
       <w:r>
@@ -11874,7 +12027,7 @@
         <w:pStyle w:val="ListParagraph"/>
         <w:numPr>
           <w:ilvl w:val="0"/>
-          <w:numId w:val="43"/>
+          <w:numId w:val="44"/>
         </w:numPr>
       </w:pPr>
       <w:r>
@@ -11892,7 +12045,7 @@
         <w:pStyle w:val="ListParagraph"/>
         <w:numPr>
           <w:ilvl w:val="0"/>
-          <w:numId w:val="43"/>
+          <w:numId w:val="44"/>
         </w:numPr>
       </w:pPr>
       <w:r>
@@ -11910,7 +12063,7 @@
         <w:pStyle w:val="ListParagraph"/>
         <w:numPr>
           <w:ilvl w:val="0"/>
-          <w:numId w:val="43"/>
+          <w:numId w:val="44"/>
         </w:numPr>
       </w:pPr>
       <w:r>
@@ -12133,7 +12286,7 @@
         <w:pStyle w:val="ListParagraph"/>
         <w:numPr>
           <w:ilvl w:val="0"/>
-          <w:numId w:val="44"/>
+          <w:numId w:val="45"/>
         </w:numPr>
       </w:pPr>
       <w:r>
@@ -12145,7 +12298,7 @@
         <w:pStyle w:val="ListParagraph"/>
         <w:numPr>
           <w:ilvl w:val="0"/>
-          <w:numId w:val="44"/>
+          <w:numId w:val="45"/>
         </w:numPr>
       </w:pPr>
       <w:r>
@@ -12208,7 +12361,7 @@
         <w:pStyle w:val="ListParagraph"/>
         <w:numPr>
           <w:ilvl w:val="0"/>
-          <w:numId w:val="44"/>
+          <w:numId w:val="45"/>
         </w:numPr>
       </w:pPr>
       <w:r>
@@ -12229,7 +12382,7 @@
         <w:pStyle w:val="ListParagraph"/>
         <w:numPr>
           <w:ilvl w:val="0"/>
-          <w:numId w:val="44"/>
+          <w:numId w:val="45"/>
         </w:numPr>
       </w:pPr>
       <w:r>
@@ -12310,7 +12463,7 @@
         <w:pStyle w:val="ListParagraph"/>
         <w:numPr>
           <w:ilvl w:val="0"/>
-          <w:numId w:val="44"/>
+          <w:numId w:val="45"/>
         </w:numPr>
       </w:pPr>
       <w:r>
@@ -12322,7 +12475,7 @@
         <w:pStyle w:val="ListParagraph"/>
         <w:numPr>
           <w:ilvl w:val="0"/>
-          <w:numId w:val="44"/>
+          <w:numId w:val="45"/>
         </w:numPr>
       </w:pPr>
       <w:r>
@@ -12785,7 +12938,7 @@
         <w:pStyle w:val="ListParagraph"/>
         <w:numPr>
           <w:ilvl w:val="0"/>
-          <w:numId w:val="45"/>
+          <w:numId w:val="46"/>
         </w:numPr>
       </w:pPr>
       <w:r>
@@ -12806,7 +12959,7 @@
         <w:pStyle w:val="ListParagraph"/>
         <w:numPr>
           <w:ilvl w:val="0"/>
-          <w:numId w:val="45"/>
+          <w:numId w:val="46"/>
         </w:numPr>
       </w:pPr>
       <w:r>
@@ -12842,7 +12995,7 @@
         <w:pStyle w:val="ListParagraph"/>
         <w:numPr>
           <w:ilvl w:val="0"/>
-          <w:numId w:val="45"/>
+          <w:numId w:val="46"/>
         </w:numPr>
       </w:pPr>
       <w:r>
@@ -12890,7 +13043,7 @@
         <w:pStyle w:val="ListParagraph"/>
         <w:numPr>
           <w:ilvl w:val="0"/>
-          <w:numId w:val="45"/>
+          <w:numId w:val="46"/>
         </w:numPr>
       </w:pPr>
       <w:r>
@@ -12917,7 +13070,7 @@
         <w:pStyle w:val="ListParagraph"/>
         <w:numPr>
           <w:ilvl w:val="0"/>
-          <w:numId w:val="45"/>
+          <w:numId w:val="46"/>
         </w:numPr>
       </w:pPr>
       <w:r>
@@ -12935,7 +13088,7 @@
         <w:pStyle w:val="ListParagraph"/>
         <w:numPr>
           <w:ilvl w:val="0"/>
-          <w:numId w:val="45"/>
+          <w:numId w:val="46"/>
         </w:numPr>
       </w:pPr>
       <w:r>
@@ -12953,7 +13106,7 @@
         <w:pStyle w:val="ListParagraph"/>
         <w:numPr>
           <w:ilvl w:val="0"/>
-          <w:numId w:val="45"/>
+          <w:numId w:val="46"/>
         </w:numPr>
       </w:pPr>
       <w:r>
@@ -12998,7 +13151,7 @@
         <w:pStyle w:val="ListParagraph"/>
         <w:numPr>
           <w:ilvl w:val="0"/>
-          <w:numId w:val="45"/>
+          <w:numId w:val="46"/>
         </w:numPr>
       </w:pPr>
       <w:r>
@@ -13034,7 +13187,7 @@
         <w:pStyle w:val="ListParagraph"/>
         <w:numPr>
           <w:ilvl w:val="0"/>
-          <w:numId w:val="45"/>
+          <w:numId w:val="46"/>
         </w:numPr>
       </w:pPr>
       <w:r>
@@ -13283,7 +13436,7 @@
         <w:pStyle w:val="ListParagraph"/>
         <w:numPr>
           <w:ilvl w:val="0"/>
-          <w:numId w:val="46"/>
+          <w:numId w:val="47"/>
         </w:numPr>
       </w:pPr>
       <w:r>
@@ -13319,7 +13472,7 @@
         <w:pStyle w:val="ListParagraph"/>
         <w:numPr>
           <w:ilvl w:val="0"/>
-          <w:numId w:val="46"/>
+          <w:numId w:val="47"/>
         </w:numPr>
       </w:pPr>
       <w:r>
@@ -13382,7 +13535,7 @@
         <w:pStyle w:val="ListParagraph"/>
         <w:numPr>
           <w:ilvl w:val="0"/>
-          <w:numId w:val="46"/>
+          <w:numId w:val="47"/>
         </w:numPr>
       </w:pPr>
       <w:r>
@@ -13408,7 +13561,7 @@
         <w:pStyle w:val="ListParagraph"/>
         <w:numPr>
           <w:ilvl w:val="0"/>
-          <w:numId w:val="47"/>
+          <w:numId w:val="48"/>
         </w:numPr>
       </w:pPr>
       <w:r>
@@ -13435,7 +13588,7 @@
         <w:pStyle w:val="ListParagraph"/>
         <w:numPr>
           <w:ilvl w:val="0"/>
-          <w:numId w:val="47"/>
+          <w:numId w:val="48"/>
         </w:numPr>
       </w:pPr>
       <w:r>
@@ -13456,7 +13609,7 @@
         <w:pStyle w:val="ListParagraph"/>
         <w:numPr>
           <w:ilvl w:val="0"/>
-          <w:numId w:val="47"/>
+          <w:numId w:val="48"/>
         </w:numPr>
       </w:pPr>
       <w:r>
@@ -13497,7 +13650,7 @@
         <w:pStyle w:val="ListParagraph"/>
         <w:numPr>
           <w:ilvl w:val="0"/>
-          <w:numId w:val="48"/>
+          <w:numId w:val="49"/>
         </w:numPr>
       </w:pPr>
       <w:r>
@@ -13542,7 +13695,7 @@
         <w:pStyle w:val="ListParagraph"/>
         <w:numPr>
           <w:ilvl w:val="0"/>
-          <w:numId w:val="48"/>
+          <w:numId w:val="49"/>
         </w:numPr>
       </w:pPr>
       <w:r>
@@ -13578,7 +13731,7 @@
         <w:pStyle w:val="ListParagraph"/>
         <w:numPr>
           <w:ilvl w:val="0"/>
-          <w:numId w:val="48"/>
+          <w:numId w:val="49"/>
         </w:numPr>
       </w:pPr>
       <w:r>
@@ -13605,7 +13758,7 @@
         <w:pStyle w:val="ListParagraph"/>
         <w:numPr>
           <w:ilvl w:val="0"/>
-          <w:numId w:val="48"/>
+          <w:numId w:val="49"/>
         </w:numPr>
       </w:pPr>
       <w:r>
@@ -13920,7 +14073,7 @@
         <w:pStyle w:val="ListParagraph"/>
         <w:numPr>
           <w:ilvl w:val="0"/>
-          <w:numId w:val="49"/>
+          <w:numId w:val="50"/>
         </w:numPr>
       </w:pPr>
       <w:r>
@@ -13995,7 +14148,7 @@
         <w:pStyle w:val="ListParagraph"/>
         <w:numPr>
           <w:ilvl w:val="0"/>
-          <w:numId w:val="49"/>
+          <w:numId w:val="50"/>
         </w:numPr>
       </w:pPr>
       <w:r>
@@ -14025,7 +14178,7 @@
         <w:pStyle w:val="ListParagraph"/>
         <w:numPr>
           <w:ilvl w:val="0"/>
-          <w:numId w:val="49"/>
+          <w:numId w:val="50"/>
         </w:numPr>
       </w:pPr>
       <w:r>
@@ -14051,7 +14204,7 @@
         <w:pStyle w:val="ListParagraph"/>
         <w:numPr>
           <w:ilvl w:val="0"/>
-          <w:numId w:val="50"/>
+          <w:numId w:val="51"/>
         </w:numPr>
       </w:pPr>
       <w:r>
@@ -14081,7 +14234,7 @@
         <w:pStyle w:val="ListParagraph"/>
         <w:numPr>
           <w:ilvl w:val="0"/>
-          <w:numId w:val="50"/>
+          <w:numId w:val="51"/>
         </w:numPr>
       </w:pPr>
       <w:r>
@@ -14102,7 +14255,7 @@
         <w:pStyle w:val="ListParagraph"/>
         <w:numPr>
           <w:ilvl w:val="0"/>
-          <w:numId w:val="50"/>
+          <w:numId w:val="51"/>
         </w:numPr>
       </w:pPr>
       <w:r>
@@ -14132,7 +14285,7 @@
         <w:pStyle w:val="ListParagraph"/>
         <w:numPr>
           <w:ilvl w:val="0"/>
-          <w:numId w:val="51"/>
+          <w:numId w:val="52"/>
         </w:numPr>
       </w:pPr>
       <w:r>
@@ -14144,7 +14297,7 @@
         <w:pStyle w:val="ListParagraph"/>
         <w:numPr>
           <w:ilvl w:val="0"/>
-          <w:numId w:val="51"/>
+          <w:numId w:val="52"/>
         </w:numPr>
       </w:pPr>
       <w:r>
@@ -14188,7 +14341,7 @@
         <w:pStyle w:val="ListParagraph"/>
         <w:numPr>
           <w:ilvl w:val="0"/>
-          <w:numId w:val="52"/>
+          <w:numId w:val="53"/>
         </w:numPr>
       </w:pPr>
       <w:r>
@@ -14236,7 +14389,7 @@
         <w:pStyle w:val="ListParagraph"/>
         <w:numPr>
           <w:ilvl w:val="0"/>
-          <w:numId w:val="52"/>
+          <w:numId w:val="53"/>
         </w:numPr>
       </w:pPr>
       <w:r>
@@ -14248,7 +14401,7 @@
         <w:pStyle w:val="ListParagraph"/>
         <w:numPr>
           <w:ilvl w:val="0"/>
-          <w:numId w:val="52"/>
+          <w:numId w:val="53"/>
         </w:numPr>
       </w:pPr>
       <w:r>
@@ -14266,7 +14419,7 @@
         <w:pStyle w:val="ListParagraph"/>
         <w:numPr>
           <w:ilvl w:val="0"/>
-          <w:numId w:val="52"/>
+          <w:numId w:val="53"/>
         </w:numPr>
       </w:pPr>
       <w:r>
@@ -14278,7 +14431,7 @@
         <w:pStyle w:val="ListParagraph"/>
         <w:numPr>
           <w:ilvl w:val="0"/>
-          <w:numId w:val="52"/>
+          <w:numId w:val="53"/>
         </w:numPr>
       </w:pPr>
       <w:r>
@@ -14290,7 +14443,7 @@
         <w:pStyle w:val="ListParagraph"/>
         <w:numPr>
           <w:ilvl w:val="0"/>
-          <w:numId w:val="52"/>
+          <w:numId w:val="53"/>
         </w:numPr>
       </w:pPr>
       <w:r>
@@ -14302,7 +14455,7 @@
         <w:pStyle w:val="ListParagraph"/>
         <w:numPr>
           <w:ilvl w:val="0"/>
-          <w:numId w:val="52"/>
+          <w:numId w:val="53"/>
         </w:numPr>
       </w:pPr>
       <w:r>
@@ -14576,7 +14729,7 @@
         <w:pStyle w:val="ListParagraph"/>
         <w:numPr>
           <w:ilvl w:val="0"/>
-          <w:numId w:val="53"/>
+          <w:numId w:val="54"/>
         </w:numPr>
       </w:pPr>
       <w:r>
@@ -14588,7 +14741,7 @@
         <w:pStyle w:val="ListParagraph"/>
         <w:numPr>
           <w:ilvl w:val="0"/>
-          <w:numId w:val="53"/>
+          <w:numId w:val="54"/>
         </w:numPr>
       </w:pPr>
       <w:r>
@@ -14600,7 +14753,7 @@
         <w:pStyle w:val="ListParagraph"/>
         <w:numPr>
           <w:ilvl w:val="0"/>
-          <w:numId w:val="53"/>
+          <w:numId w:val="54"/>
         </w:numPr>
       </w:pPr>
       <w:r>
@@ -14874,7 +15027,7 @@
         <w:pStyle w:val="ListParagraph"/>
         <w:numPr>
           <w:ilvl w:val="0"/>
-          <w:numId w:val="54"/>
+          <w:numId w:val="55"/>
         </w:numPr>
       </w:pPr>
       <w:r>
@@ -14886,7 +15039,7 @@
         <w:pStyle w:val="ListParagraph"/>
         <w:numPr>
           <w:ilvl w:val="0"/>
-          <w:numId w:val="54"/>
+          <w:numId w:val="55"/>
         </w:numPr>
       </w:pPr>
       <w:r>
@@ -14898,7 +15051,7 @@
         <w:pStyle w:val="ListParagraph"/>
         <w:numPr>
           <w:ilvl w:val="0"/>
-          <w:numId w:val="54"/>
+          <w:numId w:val="55"/>
         </w:numPr>
       </w:pPr>
       <w:r>
@@ -14941,7 +15094,7 @@
         <w:pStyle w:val="ListParagraph"/>
         <w:numPr>
           <w:ilvl w:val="0"/>
-          <w:numId w:val="55"/>
+          <w:numId w:val="56"/>
         </w:numPr>
       </w:pPr>
       <w:r>
@@ -14998,7 +15151,7 @@
         <w:pStyle w:val="ListParagraph"/>
         <w:numPr>
           <w:ilvl w:val="0"/>
-          <w:numId w:val="55"/>
+          <w:numId w:val="56"/>
         </w:numPr>
       </w:pPr>
       <w:r>
@@ -15028,7 +15181,7 @@
         <w:pStyle w:val="ListParagraph"/>
         <w:numPr>
           <w:ilvl w:val="0"/>
-          <w:numId w:val="55"/>
+          <w:numId w:val="56"/>
         </w:numPr>
       </w:pPr>
       <w:r>
@@ -15066,7 +15219,7 @@
         <w:pStyle w:val="ListParagraph"/>
         <w:numPr>
           <w:ilvl w:val="0"/>
-          <w:numId w:val="56"/>
+          <w:numId w:val="57"/>
         </w:numPr>
       </w:pPr>
       <w:r>
@@ -15087,7 +15240,7 @@
         <w:pStyle w:val="ListParagraph"/>
         <w:numPr>
           <w:ilvl w:val="0"/>
-          <w:numId w:val="56"/>
+          <w:numId w:val="57"/>
         </w:numPr>
       </w:pPr>
       <w:r>
@@ -15132,7 +15285,7 @@
         <w:pStyle w:val="ListParagraph"/>
         <w:numPr>
           <w:ilvl w:val="0"/>
-          <w:numId w:val="56"/>
+          <w:numId w:val="57"/>
         </w:numPr>
       </w:pPr>
       <w:r>
@@ -15231,7 +15384,7 @@
         <w:pStyle w:val="ListParagraph"/>
         <w:numPr>
           <w:ilvl w:val="0"/>
-          <w:numId w:val="56"/>
+          <w:numId w:val="57"/>
         </w:numPr>
       </w:pPr>
       <w:r>
@@ -15276,7 +15429,7 @@
         <w:pStyle w:val="ListParagraph"/>
         <w:numPr>
           <w:ilvl w:val="0"/>
-          <w:numId w:val="56"/>
+          <w:numId w:val="57"/>
         </w:numPr>
       </w:pPr>
       <w:r>
@@ -15625,7 +15778,7 @@
         <w:pStyle w:val="ListParagraph"/>
         <w:numPr>
           <w:ilvl w:val="0"/>
-          <w:numId w:val="57"/>
+          <w:numId w:val="58"/>
         </w:numPr>
       </w:pPr>
       <w:r>
@@ -15655,7 +15808,7 @@
         <w:pStyle w:val="ListParagraph"/>
         <w:numPr>
           <w:ilvl w:val="0"/>
-          <w:numId w:val="57"/>
+          <w:numId w:val="58"/>
         </w:numPr>
       </w:pPr>
       <w:r>
@@ -15703,7 +15856,7 @@
         <w:pStyle w:val="ListParagraph"/>
         <w:numPr>
           <w:ilvl w:val="0"/>
-          <w:numId w:val="57"/>
+          <w:numId w:val="58"/>
         </w:numPr>
       </w:pPr>
       <w:r>
@@ -15730,7 +15883,7 @@
         <w:pStyle w:val="ListParagraph"/>
         <w:numPr>
           <w:ilvl w:val="0"/>
-          <w:numId w:val="57"/>
+          <w:numId w:val="58"/>
         </w:numPr>
       </w:pPr>
       <w:r>
@@ -15756,7 +15909,7 @@
         <w:pStyle w:val="ListParagraph"/>
         <w:numPr>
           <w:ilvl w:val="0"/>
-          <w:numId w:val="58"/>
+          <w:numId w:val="59"/>
         </w:numPr>
       </w:pPr>
       <w:r>
@@ -15777,7 +15930,7 @@
         <w:pStyle w:val="ListParagraph"/>
         <w:numPr>
           <w:ilvl w:val="0"/>
-          <w:numId w:val="58"/>
+          <w:numId w:val="59"/>
         </w:numPr>
       </w:pPr>
       <w:r>
@@ -15813,7 +15966,7 @@
         <w:pStyle w:val="ListParagraph"/>
         <w:numPr>
           <w:ilvl w:val="0"/>
-          <w:numId w:val="58"/>
+          <w:numId w:val="59"/>
         </w:numPr>
       </w:pPr>
       <w:r>
@@ -15849,7 +16002,7 @@
         <w:pStyle w:val="ListParagraph"/>
         <w:numPr>
           <w:ilvl w:val="0"/>
-          <w:numId w:val="58"/>
+          <w:numId w:val="59"/>
         </w:numPr>
       </w:pPr>
       <w:r>
@@ -15878,7 +16031,7 @@
         <w:pStyle w:val="ListParagraph"/>
         <w:numPr>
           <w:ilvl w:val="0"/>
-          <w:numId w:val="59"/>
+          <w:numId w:val="60"/>
         </w:numPr>
       </w:pPr>
       <w:r>
@@ -15899,7 +16052,7 @@
         <w:pStyle w:val="ListParagraph"/>
         <w:numPr>
           <w:ilvl w:val="0"/>
-          <w:numId w:val="59"/>
+          <w:numId w:val="60"/>
         </w:numPr>
       </w:pPr>
       <w:r>
@@ -16120,7 +16273,7 @@
         <w:pStyle w:val="ListParagraph"/>
         <w:numPr>
           <w:ilvl w:val="0"/>
-          <w:numId w:val="60"/>
+          <w:numId w:val="61"/>
         </w:numPr>
       </w:pPr>
       <w:r>
@@ -16210,7 +16363,7 @@
         <w:pStyle w:val="ListParagraph"/>
         <w:numPr>
           <w:ilvl w:val="0"/>
-          <w:numId w:val="60"/>
+          <w:numId w:val="61"/>
         </w:numPr>
       </w:pPr>
       <w:r>
@@ -16240,7 +16393,7 @@
         <w:pStyle w:val="ListParagraph"/>
         <w:numPr>
           <w:ilvl w:val="0"/>
-          <w:numId w:val="60"/>
+          <w:numId w:val="61"/>
         </w:numPr>
       </w:pPr>
       <w:r>
@@ -16261,7 +16414,7 @@
         <w:pStyle w:val="ListParagraph"/>
         <w:numPr>
           <w:ilvl w:val="0"/>
-          <w:numId w:val="60"/>
+          <w:numId w:val="61"/>
         </w:numPr>
       </w:pPr>
       <w:r>
@@ -16297,7 +16450,7 @@
         <w:pStyle w:val="ListParagraph"/>
         <w:numPr>
           <w:ilvl w:val="0"/>
-          <w:numId w:val="60"/>
+          <w:numId w:val="61"/>
         </w:numPr>
       </w:pPr>
       <w:r>
@@ -16315,7 +16468,7 @@
         <w:pStyle w:val="ListParagraph"/>
         <w:numPr>
           <w:ilvl w:val="0"/>
-          <w:numId w:val="60"/>
+          <w:numId w:val="61"/>
         </w:numPr>
       </w:pPr>
       <w:r>
@@ -16359,7 +16512,7 @@
         <w:pStyle w:val="ListParagraph"/>
         <w:numPr>
           <w:ilvl w:val="0"/>
-          <w:numId w:val="61"/>
+          <w:numId w:val="62"/>
         </w:numPr>
       </w:pPr>
       <w:r>
@@ -16440,7 +16593,7 @@
         <w:pStyle w:val="ListParagraph"/>
         <w:numPr>
           <w:ilvl w:val="0"/>
-          <w:numId w:val="61"/>
+          <w:numId w:val="62"/>
         </w:numPr>
       </w:pPr>
       <w:r>
@@ -16458,7 +16611,7 @@
         <w:pStyle w:val="ListParagraph"/>
         <w:numPr>
           <w:ilvl w:val="0"/>
-          <w:numId w:val="61"/>
+          <w:numId w:val="62"/>
         </w:numPr>
       </w:pPr>
       <w:r>
@@ -16479,7 +16632,7 @@
         <w:pStyle w:val="ListParagraph"/>
         <w:numPr>
           <w:ilvl w:val="0"/>
-          <w:numId w:val="61"/>
+          <w:numId w:val="62"/>
         </w:numPr>
       </w:pPr>
       <w:r>
@@ -16505,7 +16658,7 @@
         <w:pStyle w:val="ListParagraph"/>
         <w:numPr>
           <w:ilvl w:val="0"/>
-          <w:numId w:val="62"/>
+          <w:numId w:val="63"/>
         </w:numPr>
       </w:pPr>
       <w:r>
@@ -16568,7 +16721,7 @@
         <w:pStyle w:val="ListParagraph"/>
         <w:numPr>
           <w:ilvl w:val="0"/>
-          <w:numId w:val="62"/>
+          <w:numId w:val="63"/>
         </w:numPr>
       </w:pPr>
       <w:r>
@@ -16595,7 +16748,7 @@
         <w:pStyle w:val="ListParagraph"/>
         <w:numPr>
           <w:ilvl w:val="0"/>
-          <w:numId w:val="62"/>
+          <w:numId w:val="63"/>
         </w:numPr>
       </w:pPr>
       <w:r>
@@ -16613,7 +16766,7 @@
         <w:pStyle w:val="ListParagraph"/>
         <w:numPr>
           <w:ilvl w:val="0"/>
-          <w:numId w:val="62"/>
+          <w:numId w:val="63"/>
         </w:numPr>
       </w:pPr>
       <w:r>
@@ -17244,7 +17397,7 @@
         <w:pStyle w:val="ListParagraph"/>
         <w:numPr>
           <w:ilvl w:val="0"/>
-          <w:numId w:val="63"/>
+          <w:numId w:val="64"/>
         </w:numPr>
       </w:pPr>
       <w:r>
@@ -17262,7 +17415,7 @@
         <w:pStyle w:val="ListParagraph"/>
         <w:numPr>
           <w:ilvl w:val="0"/>
-          <w:numId w:val="63"/>
+          <w:numId w:val="64"/>
         </w:numPr>
       </w:pPr>
       <w:r>
@@ -17280,7 +17433,7 @@
         <w:pStyle w:val="ListParagraph"/>
         <w:numPr>
           <w:ilvl w:val="0"/>
-          <w:numId w:val="63"/>
+          <w:numId w:val="64"/>
         </w:numPr>
       </w:pPr>
       <w:r>
@@ -17298,7 +17451,7 @@
         <w:pStyle w:val="ListParagraph"/>
         <w:numPr>
           <w:ilvl w:val="0"/>
-          <w:numId w:val="63"/>
+          <w:numId w:val="64"/>
         </w:numPr>
       </w:pPr>
       <w:r>
@@ -17316,7 +17469,7 @@
         <w:pStyle w:val="ListParagraph"/>
         <w:numPr>
           <w:ilvl w:val="0"/>
-          <w:numId w:val="63"/>
+          <w:numId w:val="64"/>
         </w:numPr>
       </w:pPr>
       <w:r>
@@ -17334,7 +17487,7 @@
         <w:pStyle w:val="ListParagraph"/>
         <w:numPr>
           <w:ilvl w:val="0"/>
-          <w:numId w:val="63"/>
+          <w:numId w:val="64"/>
         </w:numPr>
       </w:pPr>
       <w:r>
@@ -18432,7 +18585,7 @@
         <w:pStyle w:val="ListParagraph"/>
         <w:numPr>
           <w:ilvl w:val="0"/>
-          <w:numId w:val="64"/>
+          <w:numId w:val="65"/>
         </w:numPr>
       </w:pPr>
       <w:r>
@@ -18444,7 +18597,7 @@
         <w:pStyle w:val="ListParagraph"/>
         <w:numPr>
           <w:ilvl w:val="0"/>
-          <w:numId w:val="64"/>
+          <w:numId w:val="65"/>
         </w:numPr>
       </w:pPr>
       <w:r>
@@ -18456,7 +18609,7 @@
         <w:pStyle w:val="ListParagraph"/>
         <w:numPr>
           <w:ilvl w:val="0"/>
-          <w:numId w:val="64"/>
+          <w:numId w:val="65"/>
         </w:numPr>
       </w:pPr>
       <w:r>
@@ -18468,7 +18621,7 @@
         <w:pStyle w:val="ListParagraph"/>
         <w:numPr>
           <w:ilvl w:val="0"/>
-          <w:numId w:val="64"/>
+          <w:numId w:val="65"/>
         </w:numPr>
       </w:pPr>
       <w:r>
@@ -18480,7 +18633,7 @@
         <w:pStyle w:val="ListParagraph"/>
         <w:numPr>
           <w:ilvl w:val="0"/>
-          <w:numId w:val="64"/>
+          <w:numId w:val="65"/>
         </w:numPr>
       </w:pPr>
       <w:r>
@@ -18501,7 +18654,7 @@
         <w:pStyle w:val="ListParagraph"/>
         <w:numPr>
           <w:ilvl w:val="0"/>
-          <w:numId w:val="64"/>
+          <w:numId w:val="65"/>
         </w:numPr>
       </w:pPr>
       <w:r>
@@ -18513,7 +18666,7 @@
         <w:pStyle w:val="ListParagraph"/>
         <w:numPr>
           <w:ilvl w:val="0"/>
-          <w:numId w:val="64"/>
+          <w:numId w:val="65"/>
         </w:numPr>
       </w:pPr>
       <w:r>
@@ -18534,7 +18687,7 @@
         <w:pStyle w:val="ListParagraph"/>
         <w:numPr>
           <w:ilvl w:val="0"/>
-          <w:numId w:val="64"/>
+          <w:numId w:val="65"/>
         </w:numPr>
       </w:pPr>
       <w:r>
@@ -18546,7 +18699,7 @@
         <w:pStyle w:val="ListParagraph"/>
         <w:numPr>
           <w:ilvl w:val="0"/>
-          <w:numId w:val="64"/>
+          <w:numId w:val="65"/>
         </w:numPr>
       </w:pPr>
       <w:r>
@@ -18558,7 +18711,7 @@
         <w:pStyle w:val="ListParagraph"/>
         <w:numPr>
           <w:ilvl w:val="0"/>
-          <w:numId w:val="64"/>
+          <w:numId w:val="65"/>
         </w:numPr>
       </w:pPr>
       <w:r>
@@ -18570,7 +18723,7 @@
         <w:pStyle w:val="ListParagraph"/>
         <w:numPr>
           <w:ilvl w:val="0"/>
-          <w:numId w:val="64"/>
+          <w:numId w:val="65"/>
         </w:numPr>
       </w:pPr>
       <w:r>
@@ -18582,7 +18735,7 @@
         <w:pStyle w:val="ListParagraph"/>
         <w:numPr>
           <w:ilvl w:val="0"/>
-          <w:numId w:val="64"/>
+          <w:numId w:val="65"/>
         </w:numPr>
       </w:pPr>
       <w:r>
@@ -18594,7 +18747,7 @@
         <w:pStyle w:val="ListParagraph"/>
         <w:numPr>
           <w:ilvl w:val="0"/>
-          <w:numId w:val="64"/>
+          <w:numId w:val="65"/>
         </w:numPr>
       </w:pPr>
       <w:r>
@@ -18606,7 +18759,7 @@
         <w:pStyle w:val="ListParagraph"/>
         <w:numPr>
           <w:ilvl w:val="0"/>
-          <w:numId w:val="64"/>
+          <w:numId w:val="65"/>
         </w:numPr>
       </w:pPr>
       <w:r>
@@ -18906,19 +19059,19 @@
     <w:abstractNumId w:val="0"/>
   </w:num>
   <w:num w:numId="37">
-    <w:abstractNumId w:val="1"/>
+    <w:abstractNumId w:val="0"/>
   </w:num>
   <w:num w:numId="38">
-    <w:abstractNumId w:val="0"/>
+    <w:abstractNumId w:val="1"/>
   </w:num>
   <w:num w:numId="39">
     <w:abstractNumId w:val="0"/>
   </w:num>
   <w:num w:numId="40">
-    <w:abstractNumId w:val="1"/>
+    <w:abstractNumId w:val="0"/>
   </w:num>
   <w:num w:numId="41">
-    <w:abstractNumId w:val="0"/>
+    <w:abstractNumId w:val="1"/>
   </w:num>
   <w:num w:numId="42">
     <w:abstractNumId w:val="0"/>
@@ -18945,10 +19098,10 @@
     <w:abstractNumId w:val="0"/>
   </w:num>
   <w:num w:numId="50">
-    <w:abstractNumId w:val="1"/>
+    <w:abstractNumId w:val="0"/>
   </w:num>
   <w:num w:numId="51">
-    <w:abstractNumId w:val="0"/>
+    <w:abstractNumId w:val="1"/>
   </w:num>
   <w:num w:numId="52">
     <w:abstractNumId w:val="0"/>
@@ -18963,10 +19116,10 @@
     <w:abstractNumId w:val="0"/>
   </w:num>
   <w:num w:numId="56">
-    <w:abstractNumId w:val="1"/>
+    <w:abstractNumId w:val="0"/>
   </w:num>
   <w:num w:numId="57">
-    <w:abstractNumId w:val="0"/>
+    <w:abstractNumId w:val="1"/>
   </w:num>
   <w:num w:numId="58">
     <w:abstractNumId w:val="0"/>
@@ -18987,6 +19140,9 @@
     <w:abstractNumId w:val="0"/>
   </w:num>
   <w:num w:numId="64">
+    <w:abstractNumId w:val="0"/>
+  </w:num>
+  <w:num w:numId="65">
     <w:abstractNumId w:val="0"/>
   </w:num>
 </w:numbering>

</xml_diff>

<commit_message>
Clash and headroom issues in bulk, saved results, consultant models, exports to Folders
- Raise issues for all (or Make issue): Clash issue 001 / Headroom issue 001,
  description with elements and place, due in 3 working days (Mon-Fri, HK
  holidays left out), optional assignee
- Save result: named clash and headroom results shared with the project
- Clash rules against consultant IFC models, loaded when the rule runs;
  'Our models x consultant models' preset
- Headroom 'Not an issue' kept on every scan
- Save to Folders after every export; reports saved as PDF (LibreOffice)
  in 00 BIM/Exports; weekly report kept in 00 BIM/Weekly dashboard

Co-Authored-By: Claude Opus 5.5 <noreply@anthropic.com>
Claude-Session: https://claude.ai/code/session_01HMFznQ3NqvEPBkq88avjvR
</commit_message>
<xml_diff>
--- a/docs/manual/LWK_Viewer_User_Manual_EN.docx
+++ b/docs/manual/LWK_Viewer_User_Manual_EN.docx
@@ -2085,7 +2085,25 @@
         </w:numPr>
       </w:pPr>
       <w:r>
-        <w:t xml:space="preserve">A weekly summary can be posted to the same Teams channel (Monday by default).</w:t>
+        <w:t xml:space="preserve">A weekly summary can be posted to the same Teams channel (Monday by default). The same week's report is kept as a PDF in the project's Folders, under </w:t>
+      </w:r>
+      <w:r>
+        <w:rPr>
+          <w:b/>
+        </w:rPr>
+        <w:t xml:space="preserve">00 BIM &gt; Weekly dashboard</w:t>
+      </w:r>
+      <w:r>
+        <w:t xml:space="preserve">, every week at that time (Teams or not); </w:t>
+      </w:r>
+      <w:r>
+        <w:rPr>
+          <w:b/>
+        </w:rPr>
+        <w:t xml:space="preserve">Dashboard &gt; Export &gt; Weekly report to Folders</w:t>
+      </w:r>
+      <w:r>
+        <w:t xml:space="preserve"> keeps one now.</w:t>
       </w:r>
     </w:p>
     <w:p>
@@ -6094,6 +6112,54 @@
       </w:r>
       <w:r>
         <w:t xml:space="preserve"> (opened on the 3D page; IFC files - IFC projects and consultant models - can be downloaded). Everyone in the project can open and download there; nobody can add, rename, move or delete. A project with several parts has a folder per part.</w:t>
+      </w:r>
+    </w:p>
+    <w:p>
+      <w:pPr/>
+      <w:r>
+        <w:rPr>
+          <w:b/>
+        </w:rPr>
+        <w:t xml:space="preserve">Exports kept in Folders:</w:t>
+      </w:r>
+      <w:r>
+        <w:t xml:space="preserve"> after any export downloads (a clash or headroom spreadsheet, the Dashboard spreadsheet, BCF, a marked-up PDF, a board picture or backup) a bar at the bottom offers </w:t>
+      </w:r>
+      <w:r>
+        <w:rPr>
+          <w:b/>
+        </w:rPr>
+        <w:t xml:space="preserve">Save to Folders</w:t>
+      </w:r>
+      <w:r>
+        <w:t xml:space="preserve">; reports (clash, headroom, the issue report) have </w:t>
+      </w:r>
+      <w:r>
+        <w:rPr>
+          <w:b/>
+        </w:rPr>
+        <w:t xml:space="preserve">Save to Folders (PDF)</w:t>
+      </w:r>
+      <w:r>
+        <w:t xml:space="preserve"> beside Print - the server makes the PDF. They are kept in </w:t>
+      </w:r>
+      <w:r>
+        <w:rPr>
+          <w:b/>
+        </w:rPr>
+        <w:t xml:space="preserve">00 BIM &gt; Exports &gt; Clash / Headroom / Issues / BCF / Markups / Board</w:t>
+      </w:r>
+      <w:r>
+        <w:t xml:space="preserve">, and the weekly report in </w:t>
+      </w:r>
+      <w:r>
+        <w:rPr>
+          <w:b/>
+        </w:rPr>
+        <w:t xml:space="preserve">00 BIM &gt; Weekly dashboard</w:t>
+      </w:r>
+      <w:r>
+        <w:t xml:space="preserve">, with who kept them. Like the rest of 00 BIM they cannot be renamed or deleted there (download a copy to change it). A name already there gets "(2)".</w:t>
       </w:r>
     </w:p>
     <w:p>
@@ -11166,7 +11232,25 @@
         <w:t xml:space="preserve">Make issue</w:t>
       </w:r>
       <w:r>
-        <w:t xml:space="preserve"> raises a *Clash* issue there, with a picture and both elements' ids, ready to assign and to send by BCF to Revit or Navisworks.</w:t>
+        <w:t xml:space="preserve"> opens the issue form filled in: the title </w:t>
+      </w:r>
+      <w:r>
+        <w:rPr>
+          <w:b/>
+        </w:rPr>
+        <w:t xml:space="preserve">Clash issue 007 - Ducts x Beams (L2)</w:t>
+      </w:r>
+      <w:r>
+        <w:t xml:space="preserve"> (numbered in turn for the project), a description with both elements (model, category, name, type, id), the kind and depth, the floor and where in project coordinates, and the due date </w:t>
+      </w:r>
+      <w:r>
+        <w:rPr>
+          <w:b/>
+        </w:rPr>
+        <w:t xml:space="preserve">3 working days</w:t>
+      </w:r>
+      <w:r>
+        <w:t xml:space="preserve"> ahead (Monday to Friday, Hong Kong public holidays left out). Assign it and Save; it can be sent by BCF to Revit or Navisworks.</w:t>
       </w:r>
     </w:p>
     <w:p>
@@ -11181,10 +11265,46 @@
         <w:rPr>
           <w:b/>
         </w:rPr>
+        <w:t xml:space="preserve">Raise issues for all *N</w:t>
+      </w:r>
+      <w:r>
+        <w:t xml:space="preserve">* (over the list) raises one such issue for every clash listed that is open, not *Not an issue* and has no issue yet - each shown and pictured in turn (</w:t>
+      </w:r>
+      <w:r>
+        <w:rPr>
+          <w:b/>
+        </w:rPr>
+        <w:t xml:space="preserve">Stop</w:t>
+      </w:r>
+      <w:r>
+        <w:t xml:space="preserve"> ends it). Type a name in </w:t>
+      </w:r>
+      <w:r>
+        <w:rPr>
+          <w:b/>
+        </w:rPr>
+        <w:t xml:space="preserve">Assign to</w:t>
+      </w:r>
+      <w:r>
+        <w:t xml:space="preserve"> first to give them all to one person.</w:t>
+      </w:r>
+    </w:p>
+    <w:p>
+      <w:pPr>
+        <w:pStyle w:val="ListParagraph"/>
+        <w:numPr>
+          <w:ilvl w:val="0"/>
+          <w:numId w:val="42"/>
+        </w:numPr>
+      </w:pPr>
+      <w:r>
+        <w:rPr>
+          <w:b/>
+        </w:rPr>
         <w:t xml:space="preserve">Not an issue</w:t>
       </w:r>
       <w:r>
-        <w:t xml:space="preserve"> keeps that pair off the list in later runs too (find them under </w:t>
+        <w:t xml:space="preserve"> keeps that pair off the list in every later run and in the saved results too (find them under </w:t>
       </w:r>
       <w:r>
         <w:rPr>
@@ -11193,7 +11313,16 @@
         <w:t xml:space="preserve">Not an issue</w:t>
       </w:r>
       <w:r>
-        <w:t xml:space="preserve">).</w:t>
+        <w:t xml:space="preserve">; </w:t>
+      </w:r>
+      <w:r>
+        <w:rPr>
+          <w:b/>
+        </w:rPr>
+        <w:t xml:space="preserve">Count again</w:t>
+      </w:r>
+      <w:r>
+        <w:t xml:space="preserve"> undoes it).</w:t>
       </w:r>
     </w:p>
     <w:p>
@@ -11208,6 +11337,78 @@
         <w:rPr>
           <w:b/>
         </w:rPr>
+        <w:t xml:space="preserve">Save result</w:t>
+      </w:r>
+      <w:r>
+        <w:t xml:space="preserve"> (beside the result list) keeps the result shown under a name, for everyone on the project - as many as needed (before and after a design freeze, each consultant issue). Pick one in the list above the clashes to look at it again; </w:t>
+      </w:r>
+      <w:r>
+        <w:rPr>
+          <w:b/>
+        </w:rPr>
+        <w:t xml:space="preserve">Latest run</w:t>
+      </w:r>
+      <w:r>
+        <w:t xml:space="preserve"> goes back. Its author or a project admin can </w:t>
+      </w:r>
+      <w:r>
+        <w:rPr>
+          <w:b/>
+        </w:rPr>
+        <w:t xml:space="preserve">Delete</w:t>
+      </w:r>
+      <w:r>
+        <w:t xml:space="preserve"> it.</w:t>
+      </w:r>
+    </w:p>
+    <w:p>
+      <w:pPr>
+        <w:pStyle w:val="ListParagraph"/>
+        <w:numPr>
+          <w:ilvl w:val="0"/>
+          <w:numId w:val="42"/>
+        </w:numPr>
+      </w:pPr>
+      <w:r>
+        <w:rPr>
+          <w:b/>
+        </w:rPr>
+        <w:t xml:space="preserve">Consultant IFC models:</w:t>
+      </w:r>
+      <w:r>
+        <w:t xml:space="preserve"> the rule form lists the project's consultant models even when they are not loaded on the page (*consultant IFC - not loaded*): ticking one loads it. </w:t>
+      </w:r>
+      <w:r>
+        <w:rPr>
+          <w:b/>
+        </w:rPr>
+        <w:t xml:space="preserve">All consultant models</w:t>
+      </w:r>
+      <w:r>
+        <w:t xml:space="preserve"> takes every one; </w:t>
+      </w:r>
+      <w:r>
+        <w:rPr>
+          <w:b/>
+        </w:rPr>
+        <w:t xml:space="preserve">Our models x consultant models</w:t>
+      </w:r>
+      <w:r>
+        <w:t xml:space="preserve"> fills in a rule of our models against all the consultants' models, every category. When the rule runs, the consultant models it names are loaded first.</w:t>
+      </w:r>
+    </w:p>
+    <w:p>
+      <w:pPr>
+        <w:pStyle w:val="ListParagraph"/>
+        <w:numPr>
+          <w:ilvl w:val="0"/>
+          <w:numId w:val="42"/>
+        </w:numPr>
+      </w:pPr>
+      <w:r>
+        <w:rPr>
+          <w:b/>
+        </w:rPr>
         <w:t xml:space="preserve">Export the list</w:t>
       </w:r>
       <w:r>
@@ -11265,7 +11466,16 @@
         <w:t xml:space="preserve">Print / Save as PDF</w:t>
       </w:r>
       <w:r>
-        <w:t xml:space="preserve">. Allow pop-ups for the site if the browser blocks the tab.</w:t>
+        <w:t xml:space="preserve">, or </w:t>
+      </w:r>
+      <w:r>
+        <w:rPr>
+          <w:b/>
+        </w:rPr>
+        <w:t xml:space="preserve">Save to Folders (PDF)</w:t>
+      </w:r>
+      <w:r>
+        <w:t xml:space="preserve"> to keep it in the project's Folders. Allow pop-ups for the site if the browser blocks the tab.</w:t>
       </w:r>
     </w:p>
     <w:p>
@@ -11555,7 +11765,70 @@
         <w:t xml:space="preserve">Report</w:t>
       </w:r>
       <w:r>
-        <w:t xml:space="preserve">, with or without a picture of each place, to print or save as PDF.</w:t>
+        <w:t xml:space="preserve">, with or without a picture of each place, to print or save as PDF, or </w:t>
+      </w:r>
+      <w:r>
+        <w:rPr>
+          <w:b/>
+        </w:rPr>
+        <w:t xml:space="preserve">Save to Folders (PDF)</w:t>
+      </w:r>
+      <w:r>
+        <w:t xml:space="preserve">.</w:t>
+      </w:r>
+    </w:p>
+    <w:p>
+      <w:pPr>
+        <w:pStyle w:val="ListParagraph"/>
+        <w:numPr>
+          <w:ilvl w:val="0"/>
+          <w:numId w:val="43"/>
+        </w:numPr>
+      </w:pPr>
+      <w:r>
+        <w:rPr>
+          <w:b/>
+        </w:rPr>
+        <w:t xml:space="preserve">Make issue</w:t>
+      </w:r>
+      <w:r>
+        <w:t xml:space="preserve">, </w:t>
+      </w:r>
+      <w:r>
+        <w:rPr>
+          <w:b/>
+        </w:rPr>
+        <w:t xml:space="preserve">Raise issues for all</w:t>
+      </w:r>
+      <w:r>
+        <w:t xml:space="preserve">, </w:t>
+      </w:r>
+      <w:r>
+        <w:rPr>
+          <w:b/>
+        </w:rPr>
+        <w:t xml:space="preserve">Not an issue</w:t>
+      </w:r>
+      <w:r>
+        <w:t xml:space="preserve"> and </w:t>
+      </w:r>
+      <w:r>
+        <w:rPr>
+          <w:b/>
+        </w:rPr>
+        <w:t xml:space="preserve">Save result</w:t>
+      </w:r>
+      <w:r>
+        <w:t xml:space="preserve"> work as for clashes: issues are titled </w:t>
+      </w:r>
+      <w:r>
+        <w:rPr>
+          <w:b/>
+        </w:rPr>
+        <w:t xml:space="preserve">Headroom issue 001 - 2.05 m under Ducts (L1)</w:t>
+      </w:r>
+      <w:r>
+        <w:t xml:space="preserve">, due in 3 working days; a place marked *Not an issue* stays so on every scan (it is known by the two elements and where it is, to half a metre); saved results are listed above the places for everyone.</w:t>
       </w:r>
     </w:p>
     <w:p>

</xml_diff>

<commit_message>
Saved views for clashes and headroom places, issue dimensions, consultant and LWK model boxes, 3D header rows
- Save view / Clear view per clash and headroom place: kept for the project,
  used by Make issue, Raise all and report pictures, kept in saved results
- Headroom issues keep the height dimension, drawn when the issue is opened
- Clash sides: All LWK BIM models; headroom: Include consultant models,
  loaded when scanning
- 3D header: Floor plan with Plan overlay, link and BCF on the second row;
  Search, bell and + Task top right

Co-Authored-By: Claude Opus 5.5 <noreply@anthropic.com>
Claude-Session: https://claude.ai/code/session_01HMFznQ3NqvEPBkq88avjvR
</commit_message>
<xml_diff>
--- a/docs/manual/LWK_Viewer_User_Manual_EN.docx
+++ b/docs/manual/LWK_Viewer_User_Manual_EN.docx
@@ -8372,7 +8372,25 @@
         <w:t xml:space="preserve">Floor plan</w:t>
       </w:r>
       <w:r>
-        <w:t xml:space="preserve"> drop-down lists </w:t>
+        <w:t xml:space="preserve"> drop-down (second row of the 3D header, with </w:t>
+      </w:r>
+      <w:r>
+        <w:rPr>
+          <w:b/>
+        </w:rPr>
+        <w:t xml:space="preserve">Plan overlay</w:t>
+      </w:r>
+      <w:r>
+        <w:t xml:space="preserve">, the view link and </w:t>
+      </w:r>
+      <w:r>
+        <w:rPr>
+          <w:b/>
+        </w:rPr>
+        <w:t xml:space="preserve">BCF</w:t>
+      </w:r>
+      <w:r>
+        <w:t xml:space="preserve">) lists </w:t>
       </w:r>
       <w:r>
         <w:rPr>
@@ -8381,7 +8399,25 @@
         <w:t xml:space="preserve">Whole building</w:t>
       </w:r>
       <w:r>
-        <w:t xml:space="preserve"> and every level from the top down.</w:t>
+        <w:t xml:space="preserve"> and every level from the top down. </w:t>
+      </w:r>
+      <w:r>
+        <w:rPr>
+          <w:b/>
+        </w:rPr>
+        <w:t xml:space="preserve">Search</w:t>
+      </w:r>
+      <w:r>
+        <w:t xml:space="preserve">, the bell and </w:t>
+      </w:r>
+      <w:r>
+        <w:rPr>
+          <w:b/>
+        </w:rPr>
+        <w:t xml:space="preserve">+ Task</w:t>
+      </w:r>
+      <w:r>
+        <w:t xml:space="preserve"> are at the top right, as on every page.</w:t>
       </w:r>
     </w:p>
     <w:p>
@@ -11301,6 +11337,42 @@
         <w:rPr>
           <w:b/>
         </w:rPr>
+        <w:t xml:space="preserve">Save view:</w:t>
+      </w:r>
+      <w:r>
+        <w:t xml:space="preserve"> turn the view, move the section box or hide elements until the clash is clear, then </w:t>
+      </w:r>
+      <w:r>
+        <w:rPr>
+          <w:b/>
+        </w:rPr>
+        <w:t xml:space="preserve">Save view</w:t>
+      </w:r>
+      <w:r>
+        <w:t xml:space="preserve"> on it. The clash opens at that view for everyone (📷 *view* beside it), its issue - one at a time or Raise issues for all - is raised from it, and a saved result keeps it. </w:t>
+      </w:r>
+      <w:r>
+        <w:rPr>
+          <w:b/>
+        </w:rPr>
+        <w:t xml:space="preserve">Clear view</w:t>
+      </w:r>
+      <w:r>
+        <w:t xml:space="preserve"> forgets it.</w:t>
+      </w:r>
+    </w:p>
+    <w:p>
+      <w:pPr>
+        <w:pStyle w:val="ListParagraph"/>
+        <w:numPr>
+          <w:ilvl w:val="0"/>
+          <w:numId w:val="42"/>
+        </w:numPr>
+      </w:pPr>
+      <w:r>
+        <w:rPr>
+          <w:b/>
+        </w:rPr>
         <w:t xml:space="preserve">Not an issue</w:t>
       </w:r>
       <w:r>
@@ -11385,7 +11457,16 @@
         <w:t xml:space="preserve">All consultant models</w:t>
       </w:r>
       <w:r>
-        <w:t xml:space="preserve"> takes every one; </w:t>
+        <w:t xml:space="preserve"> takes every one, </w:t>
+      </w:r>
+      <w:r>
+        <w:rPr>
+          <w:b/>
+        </w:rPr>
+        <w:t xml:space="preserve">All LWK BIM models</w:t>
+      </w:r>
+      <w:r>
+        <w:t xml:space="preserve"> every model of our own; </w:t>
       </w:r>
       <w:r>
         <w:rPr>
@@ -11828,7 +11909,34 @@
         <w:t xml:space="preserve">Headroom issue 001 - 2.05 m under Ducts (L1)</w:t>
       </w:r>
       <w:r>
-        <w:t xml:space="preserve">, due in 3 working days; a place marked *Not an issue* stays so on every scan (it is known by the two elements and where it is, to half a metre); saved results are listed above the places for everyone.</w:t>
+        <w:t xml:space="preserve">, due in 3 working days; a place marked *Not an issue* stays so on every scan (it is known by the two elements and where it is, to half a metre); saved results are listed above the places for everyone. </w:t>
+      </w:r>
+      <w:r>
+        <w:rPr>
+          <w:b/>
+        </w:rPr>
+        <w:t xml:space="preserve">Save view</w:t>
+      </w:r>
+      <w:r>
+        <w:t xml:space="preserve"> keeps a view for a place, as for clashes. A headroom issue also keeps the height line: it is drawn again whenever the issue's view is opened.</w:t>
+      </w:r>
+    </w:p>
+    <w:p>
+      <w:pPr>
+        <w:pStyle w:val="ListParagraph"/>
+        <w:numPr>
+          <w:ilvl w:val="0"/>
+          <w:numId w:val="43"/>
+        </w:numPr>
+      </w:pPr>
+      <w:r>
+        <w:rPr>
+          <w:b/>
+        </w:rPr>
+        <w:t xml:space="preserve">Include consultant models</w:t>
+      </w:r>
+      <w:r>
+        <w:t xml:space="preserve"> (under Models counted, on by default): the consultants' IFC models count too - those not loaded on the page are loaded when you scan.</w:t>
       </w:r>
     </w:p>
     <w:p>

</xml_diff>

<commit_message>
3D header: one line on a wide window, two at most otherwise
Navigate / Add issue / Measure join the floor plan tools; wide: everything
on one line with Search, bell, + Task and the profile at the right;
medium: the tools on a second line; small: the project drop-downs too.

Co-Authored-By: Claude Opus 5.5 <noreply@anthropic.com>
Claude-Session: https://claude.ai/code/session_01HMFznQ3NqvEPBkq88avjvR
</commit_message>
<xml_diff>
--- a/docs/manual/LWK_Viewer_User_Manual_EN.docx
+++ b/docs/manual/LWK_Viewer_User_Manual_EN.docx
@@ -8372,7 +8372,16 @@
         <w:t xml:space="preserve">Floor plan</w:t>
       </w:r>
       <w:r>
-        <w:t xml:space="preserve"> drop-down (second row of the 3D header, with </w:t>
+        <w:t xml:space="preserve"> drop-down (in the 3D header with </w:t>
+      </w:r>
+      <w:r>
+        <w:rPr>
+          <w:b/>
+        </w:rPr>
+        <w:t xml:space="preserve">Navigate / Add issue / Measure</w:t>
+      </w:r>
+      <w:r>
+        <w:t xml:space="preserve">, </w:t>
       </w:r>
       <w:r>
         <w:rPr>
@@ -8390,7 +8399,7 @@
         <w:t xml:space="preserve">BCF</w:t>
       </w:r>
       <w:r>
-        <w:t xml:space="preserve">) lists </w:t>
+        <w:t xml:space="preserve"> - all on one line on a wide window, on the second line on a smaller one) lists </w:t>
       </w:r>
       <w:r>
         <w:rPr>

</xml_diff>

<commit_message>
Photos in an issue's discussion (Sheets and 3D)
Photo button (camera on phones), paste and drop add pictures to a message;
made smaller before upload, shown as thumbnails with a large viewer, and in
the issue report. The server keeps only uploaded snapshot paths (10 at most)
and says '(2 photos)' in the notices.

Co-Authored-By: Claude Opus 5.5 <noreply@anthropic.com>
Claude-Session: https://claude.ai/code/session_01HMFznQ3NqvEPBkq88avjvR
</commit_message>
<xml_diff>
--- a/docs/manual/LWK_Viewer_User_Manual_EN.docx
+++ b/docs/manual/LWK_Viewer_User_Manual_EN.docx
@@ -13404,7 +13404,7 @@
         <w:rPr>
           <w:b/>
         </w:rPr>
-        <w:t xml:space="preserve">Add a comment</w:t>
+        <w:t xml:space="preserve">Discussion</w:t>
       </w:r>
       <w:r>
         <w:t xml:space="preserve"> then press </w:t>
@@ -13413,7 +13413,7 @@
         <w:rPr>
           <w:b/>
         </w:rPr>
-        <w:t xml:space="preserve">Comment</w:t>
+        <w:t xml:space="preserve">Post</w:t>
       </w:r>
       <w:r>
         <w:t xml:space="preserve">. Type </w:t>
@@ -13426,6 +13426,60 @@
       </w:r>
       <w:r>
         <w:t xml:space="preserve"> to mention a project member.</w:t>
+      </w:r>
+    </w:p>
+    <w:p>
+      <w:pPr>
+        <w:pStyle w:val="ListParagraph"/>
+        <w:numPr>
+          <w:ilvl w:val="0"/>
+          <w:numId w:val="46"/>
+        </w:numPr>
+      </w:pPr>
+      <w:r>
+        <w:rPr>
+          <w:b/>
+        </w:rPr>
+        <w:t xml:space="preserve">Photos in the discussion</w:t>
+      </w:r>
+      <w:r>
+        <w:t xml:space="preserve"> (Sheets and 3D alike): </w:t>
+      </w:r>
+      <w:r>
+        <w:rPr>
+          <w:b/>
+        </w:rPr>
+        <w:t xml:space="preserve">📷 Photo</w:t>
+      </w:r>
+      <w:r>
+        <w:t xml:space="preserve"> beside Post picks pictures - on a phone or iPad it can take one with the camera - or paste a screenshot (</w:t>
+      </w:r>
+      <w:r>
+        <w:rPr>
+          <w:b/>
+        </w:rPr>
+        <w:t xml:space="preserve">Ctrl+V</w:t>
+      </w:r>
+      <w:r>
+        <w:t xml:space="preserve">) into the message box, or drop picture files on it. They wait under the box (✕ leaves one out) and go with the message when you </w:t>
+      </w:r>
+      <w:r>
+        <w:rPr>
+          <w:b/>
+        </w:rPr>
+        <w:t xml:space="preserve">Post</w:t>
+      </w:r>
+      <w:r>
+        <w:t xml:space="preserve">; a message can be photos alone. Large photos are made smaller (1920 px) first. Click a photo in the discussion to see it large (← → for the next, </w:t>
+      </w:r>
+      <w:r>
+        <w:rPr>
+          <w:b/>
+        </w:rPr>
+        <w:t xml:space="preserve">Esc</w:t>
+      </w:r>
+      <w:r>
+        <w:t xml:space="preserve"> to close). The issue report shows them under the message.</w:t>
       </w:r>
     </w:p>
     <w:p>

</xml_diff>

<commit_message>
Release 2026-10-29: What's new, manuals (EN / Cantonese)
The calendar's holidays and groups now load beside the calendar, not
before it, so its loading placeholder shows at once.

Co-Authored-By: Claude Opus 5.5 <noreply@anthropic.com>
Claude-Session: https://claude.ai/code/session_01HMFznQ3NqvEPBkq88avjvR
</commit_message>
<xml_diff>
--- a/docs/manual/LWK_Viewer_User_Manual_EN.docx
+++ b/docs/manual/LWK_Viewer_User_Manual_EN.docx
@@ -5190,6 +5190,202 @@
     </w:p>
     <w:p>
       <w:pPr>
+        <w:pStyle w:val="Heading3"/>
+      </w:pPr>
+      <w:r>
+        <w:t xml:space="preserve">Public holidays</w:t>
+      </w:r>
+    </w:p>
+    <w:p>
+      <w:pPr>
+        <w:pStyle w:val="ListParagraph"/>
+        <w:numPr>
+          <w:ilvl w:val="0"/>
+          <w:numId w:val="21"/>
+        </w:numPr>
+      </w:pPr>
+      <w:r>
+        <w:rPr>
+          <w:b/>
+        </w:rPr>
+        <w:t xml:space="preserve">Holidays ▾</w:t>
+      </w:r>
+      <w:r>
+        <w:t xml:space="preserve"> shows the public holidays of </w:t>
+      </w:r>
+      <w:r>
+        <w:rPr>
+          <w:b/>
+        </w:rPr>
+        <w:t xml:space="preserve">Hong Kong</w:t>
+      </w:r>
+      <w:r>
+        <w:t xml:space="preserve"> and / or </w:t>
+      </w:r>
+      <w:r>
+        <w:rPr>
+          <w:b/>
+        </w:rPr>
+        <w:t xml:space="preserve">the Philippines</w:t>
+      </w:r>
+      <w:r>
+        <w:t xml:space="preserve"> on the calendar (tick either or both; remembered for you). The 2026 and 2027 lists are built in (Hong Kong: Government Gazette; Philippines: Proclamations No. 1006 and 1427, regular holidays and special non-working days).</w:t>
+      </w:r>
+    </w:p>
+    <w:p>
+      <w:pPr>
+        <w:pStyle w:val="ListParagraph"/>
+        <w:numPr>
+          <w:ilvl w:val="0"/>
+          <w:numId w:val="21"/>
+        </w:numPr>
+      </w:pPr>
+      <w:r>
+        <w:t xml:space="preserve">A site admin adds later years and dates proclaimed late (the Philippine Eid'l Fitr and Eid'l Adha): </w:t>
+      </w:r>
+      <w:r>
+        <w:rPr>
+          <w:b/>
+        </w:rPr>
+        <w:t xml:space="preserve">Holidays ▾ &gt; Edit the list</w:t>
+      </w:r>
+      <w:r>
+        <w:t xml:space="preserve">, one a line, e.g. *2028-01-01 New Year's Day*.</w:t>
+      </w:r>
+    </w:p>
+    <w:p>
+      <w:pPr>
+        <w:pStyle w:val="Heading3"/>
+      </w:pPr>
+      <w:r>
+        <w:t xml:space="preserve">Annual leave and calendar groups</w:t>
+      </w:r>
+    </w:p>
+    <w:p>
+      <w:pPr>
+        <w:pStyle w:val="ListParagraph"/>
+        <w:numPr>
+          <w:ilvl w:val="0"/>
+          <w:numId w:val="22"/>
+        </w:numPr>
+      </w:pPr>
+      <w:r>
+        <w:rPr>
+          <w:b/>
+        </w:rPr>
+        <w:t xml:space="preserve">+ Leave</w:t>
+      </w:r>
+      <w:r>
+        <w:t xml:space="preserve">, </w:t>
+      </w:r>
+      <w:r>
+        <w:rPr>
+          <w:b/>
+        </w:rPr>
+        <w:t xml:space="preserve">right-click a day &gt; Add leave</w:t>
+      </w:r>
+      <w:r>
+        <w:t xml:space="preserve">, or </w:t>
+      </w:r>
+      <w:r>
+        <w:rPr>
+          <w:b/>
+        </w:rPr>
+        <w:t xml:space="preserve">drag across days</w:t>
+      </w:r>
+      <w:r>
+        <w:t xml:space="preserve"> in the month: from and to, the type (annual, sick, other), a half day (AM / PM, for one day) and a note. The form counts the working days (weekends and the ticked holidays left out; Hong Kong when none is ticked).</w:t>
+      </w:r>
+    </w:p>
+    <w:p>
+      <w:pPr>
+        <w:pStyle w:val="ListParagraph"/>
+        <w:numPr>
+          <w:ilvl w:val="0"/>
+          <w:numId w:val="22"/>
+        </w:numPr>
+      </w:pPr>
+      <w:r>
+        <w:t xml:space="preserve">Your leave shows on your calendar and on the calendars of the people who share a </w:t>
+      </w:r>
+      <w:r>
+        <w:rPr>
+          <w:b/>
+        </w:rPr>
+        <w:t xml:space="preserve">calendar group</w:t>
+      </w:r>
+      <w:r>
+        <w:t xml:space="preserve"> with you; theirs shows on yours. Click a leave for its details; </w:t>
+      </w:r>
+      <w:r>
+        <w:rPr>
+          <w:b/>
+        </w:rPr>
+        <w:t xml:space="preserve">Remove this leave</w:t>
+      </w:r>
+      <w:r>
+        <w:t xml:space="preserve"> takes your own away.</w:t>
+      </w:r>
+    </w:p>
+    <w:p>
+      <w:pPr>
+        <w:pStyle w:val="ListParagraph"/>
+        <w:numPr>
+          <w:ilvl w:val="0"/>
+          <w:numId w:val="22"/>
+        </w:numPr>
+      </w:pPr>
+      <w:r>
+        <w:rPr>
+          <w:b/>
+        </w:rPr>
+        <w:t xml:space="preserve">Groups:</w:t>
+      </w:r>
+      <w:r>
+        <w:t xml:space="preserve"> </w:t>
+      </w:r>
+      <w:r>
+        <w:rPr>
+          <w:b/>
+        </w:rPr>
+        <w:t xml:space="preserve">+ New group</w:t>
+      </w:r>
+      <w:r>
+        <w:t xml:space="preserve">, a name and its people (anyone can make one; you are in it). The person who made a group (or a site admin) edits or deletes it; the others can </w:t>
+      </w:r>
+      <w:r>
+        <w:rPr>
+          <w:b/>
+        </w:rPr>
+        <w:t xml:space="preserve">Leave group</w:t>
+      </w:r>
+      <w:r>
+        <w:t xml:space="preserve">. </w:t>
+      </w:r>
+      <w:r>
+        <w:rPr>
+          <w:b/>
+        </w:rPr>
+        <w:t xml:space="preserve">Filter ▾ &gt; Leave of</w:t>
+      </w:r>
+      <w:r>
+        <w:t xml:space="preserve"> shows the leave of one group only.</w:t>
+      </w:r>
+    </w:p>
+    <w:p>
+      <w:pPr>
+        <w:pStyle w:val="ListParagraph"/>
+        <w:numPr>
+          <w:ilvl w:val="0"/>
+          <w:numId w:val="22"/>
+        </w:numPr>
+      </w:pPr>
+      <w:r>
+        <w:t xml:space="preserve">Outlook (Add to Outlook) gets your own leave, not your colleagues'.</w:t>
+      </w:r>
+    </w:p>
+    <w:p>
+      <w:pPr>
         <w:pStyle w:val="Heading2"/>
       </w:pPr>
       <w:r>
@@ -5207,7 +5403,7 @@
         <w:pStyle w:val="ListParagraph"/>
         <w:numPr>
           <w:ilvl w:val="0"/>
-          <w:numId w:val="21"/>
+          <w:numId w:val="23"/>
         </w:numPr>
       </w:pPr>
       <w:r>
@@ -5234,7 +5430,7 @@
         <w:pStyle w:val="ListParagraph"/>
         <w:numPr>
           <w:ilvl w:val="0"/>
-          <w:numId w:val="21"/>
+          <w:numId w:val="23"/>
         </w:numPr>
       </w:pPr>
       <w:r>
@@ -5288,7 +5484,7 @@
         <w:pStyle w:val="ListParagraph"/>
         <w:numPr>
           <w:ilvl w:val="0"/>
-          <w:numId w:val="21"/>
+          <w:numId w:val="23"/>
         </w:numPr>
       </w:pPr>
       <w:r>
@@ -5315,7 +5511,7 @@
         <w:pStyle w:val="ListParagraph"/>
         <w:numPr>
           <w:ilvl w:val="0"/>
-          <w:numId w:val="21"/>
+          <w:numId w:val="23"/>
         </w:numPr>
       </w:pPr>
       <w:r>
@@ -5351,7 +5547,7 @@
         <w:pStyle w:val="ListParagraph"/>
         <w:numPr>
           <w:ilvl w:val="0"/>
-          <w:numId w:val="21"/>
+          <w:numId w:val="23"/>
         </w:numPr>
       </w:pPr>
       <w:r>
@@ -5396,7 +5592,7 @@
         <w:pStyle w:val="ListParagraph"/>
         <w:numPr>
           <w:ilvl w:val="0"/>
-          <w:numId w:val="21"/>
+          <w:numId w:val="23"/>
         </w:numPr>
       </w:pPr>
       <w:r>
@@ -5432,7 +5628,7 @@
         <w:pStyle w:val="ListParagraph"/>
         <w:numPr>
           <w:ilvl w:val="0"/>
-          <w:numId w:val="21"/>
+          <w:numId w:val="23"/>
         </w:numPr>
       </w:pPr>
       <w:r>
@@ -5491,7 +5687,7 @@
         <w:pStyle w:val="ListParagraph"/>
         <w:numPr>
           <w:ilvl w:val="0"/>
-          <w:numId w:val="22"/>
+          <w:numId w:val="24"/>
         </w:numPr>
       </w:pPr>
       <w:r>
@@ -5545,7 +5741,7 @@
         <w:pStyle w:val="ListParagraph"/>
         <w:numPr>
           <w:ilvl w:val="0"/>
-          <w:numId w:val="22"/>
+          <w:numId w:val="24"/>
         </w:numPr>
       </w:pPr>
       <w:r>
@@ -5581,7 +5777,7 @@
         <w:pStyle w:val="ListParagraph"/>
         <w:numPr>
           <w:ilvl w:val="0"/>
-          <w:numId w:val="22"/>
+          <w:numId w:val="24"/>
         </w:numPr>
       </w:pPr>
       <w:r>
@@ -5599,7 +5795,7 @@
         <w:pStyle w:val="ListParagraph"/>
         <w:numPr>
           <w:ilvl w:val="0"/>
-          <w:numId w:val="22"/>
+          <w:numId w:val="24"/>
         </w:numPr>
       </w:pPr>
       <w:r>
@@ -5653,7 +5849,7 @@
         <w:pStyle w:val="ListParagraph"/>
         <w:numPr>
           <w:ilvl w:val="0"/>
-          <w:numId w:val="22"/>
+          <w:numId w:val="24"/>
         </w:numPr>
       </w:pPr>
       <w:r>
@@ -5671,7 +5867,7 @@
         <w:pStyle w:val="ListParagraph"/>
         <w:numPr>
           <w:ilvl w:val="0"/>
-          <w:numId w:val="22"/>
+          <w:numId w:val="24"/>
         </w:numPr>
       </w:pPr>
       <w:r>
@@ -5689,7 +5885,7 @@
         <w:pStyle w:val="ListParagraph"/>
         <w:numPr>
           <w:ilvl w:val="0"/>
-          <w:numId w:val="22"/>
+          <w:numId w:val="24"/>
         </w:numPr>
       </w:pPr>
       <w:r>
@@ -5715,7 +5911,7 @@
         <w:pStyle w:val="ListParagraph"/>
         <w:numPr>
           <w:ilvl w:val="0"/>
-          <w:numId w:val="23"/>
+          <w:numId w:val="25"/>
         </w:numPr>
       </w:pPr>
       <w:r>
@@ -5751,7 +5947,7 @@
         <w:pStyle w:val="ListParagraph"/>
         <w:numPr>
           <w:ilvl w:val="0"/>
-          <w:numId w:val="23"/>
+          <w:numId w:val="25"/>
         </w:numPr>
       </w:pPr>
       <w:r>
@@ -5769,7 +5965,7 @@
         <w:pStyle w:val="ListParagraph"/>
         <w:numPr>
           <w:ilvl w:val="0"/>
-          <w:numId w:val="23"/>
+          <w:numId w:val="25"/>
         </w:numPr>
       </w:pPr>
       <w:r>
@@ -5787,7 +5983,7 @@
         <w:pStyle w:val="ListParagraph"/>
         <w:numPr>
           <w:ilvl w:val="0"/>
-          <w:numId w:val="23"/>
+          <w:numId w:val="25"/>
         </w:numPr>
       </w:pPr>
       <w:r>
@@ -5805,7 +6001,7 @@
         <w:pStyle w:val="ListParagraph"/>
         <w:numPr>
           <w:ilvl w:val="0"/>
-          <w:numId w:val="23"/>
+          <w:numId w:val="25"/>
         </w:numPr>
       </w:pPr>
       <w:r>
@@ -5915,7 +6111,7 @@
         <w:pStyle w:val="ListParagraph"/>
         <w:numPr>
           <w:ilvl w:val="0"/>
-          <w:numId w:val="24"/>
+          <w:numId w:val="26"/>
         </w:numPr>
       </w:pPr>
       <w:r>
@@ -5960,7 +6156,7 @@
         <w:pStyle w:val="ListParagraph"/>
         <w:numPr>
           <w:ilvl w:val="0"/>
-          <w:numId w:val="24"/>
+          <w:numId w:val="26"/>
         </w:numPr>
       </w:pPr>
       <w:r>
@@ -6014,7 +6210,7 @@
         <w:pStyle w:val="ListParagraph"/>
         <w:numPr>
           <w:ilvl w:val="0"/>
-          <w:numId w:val="24"/>
+          <w:numId w:val="26"/>
         </w:numPr>
       </w:pPr>
       <w:r>
@@ -6059,7 +6255,7 @@
         <w:pStyle w:val="ListParagraph"/>
         <w:numPr>
           <w:ilvl w:val="0"/>
-          <w:numId w:val="24"/>
+          <w:numId w:val="26"/>
         </w:numPr>
       </w:pPr>
       <w:r>
@@ -6167,7 +6363,7 @@
         <w:pStyle w:val="ListParagraph"/>
         <w:numPr>
           <w:ilvl w:val="0"/>
-          <w:numId w:val="25"/>
+          <w:numId w:val="27"/>
         </w:numPr>
       </w:pPr>
       <w:r>
@@ -6194,7 +6390,7 @@
         <w:pStyle w:val="ListParagraph"/>
         <w:numPr>
           <w:ilvl w:val="0"/>
-          <w:numId w:val="25"/>
+          <w:numId w:val="27"/>
         </w:numPr>
       </w:pPr>
       <w:r>
@@ -6230,7 +6426,7 @@
         <w:pStyle w:val="ListParagraph"/>
         <w:numPr>
           <w:ilvl w:val="0"/>
-          <w:numId w:val="25"/>
+          <w:numId w:val="27"/>
         </w:numPr>
       </w:pPr>
       <w:r>
@@ -6302,7 +6498,7 @@
         <w:pStyle w:val="ListParagraph"/>
         <w:numPr>
           <w:ilvl w:val="0"/>
-          <w:numId w:val="25"/>
+          <w:numId w:val="27"/>
         </w:numPr>
       </w:pPr>
       <w:r>
@@ -6347,7 +6543,7 @@
         <w:pStyle w:val="ListParagraph"/>
         <w:numPr>
           <w:ilvl w:val="0"/>
-          <w:numId w:val="25"/>
+          <w:numId w:val="27"/>
         </w:numPr>
       </w:pPr>
       <w:r>
@@ -6455,7 +6651,7 @@
         <w:pStyle w:val="ListParagraph"/>
         <w:numPr>
           <w:ilvl w:val="0"/>
-          <w:numId w:val="25"/>
+          <w:numId w:val="27"/>
         </w:numPr>
       </w:pPr>
       <w:r>
@@ -6491,7 +6687,7 @@
         <w:pStyle w:val="ListParagraph"/>
         <w:numPr>
           <w:ilvl w:val="0"/>
-          <w:numId w:val="25"/>
+          <w:numId w:val="27"/>
         </w:numPr>
       </w:pPr>
       <w:r>
@@ -6527,7 +6723,7 @@
         <w:pStyle w:val="ListParagraph"/>
         <w:numPr>
           <w:ilvl w:val="0"/>
-          <w:numId w:val="25"/>
+          <w:numId w:val="27"/>
         </w:numPr>
       </w:pPr>
       <w:r>
@@ -6563,7 +6759,7 @@
         <w:pStyle w:val="ListParagraph"/>
         <w:numPr>
           <w:ilvl w:val="0"/>
-          <w:numId w:val="25"/>
+          <w:numId w:val="27"/>
         </w:numPr>
       </w:pPr>
       <w:r>
@@ -6590,7 +6786,7 @@
         <w:pStyle w:val="ListParagraph"/>
         <w:numPr>
           <w:ilvl w:val="0"/>
-          <w:numId w:val="25"/>
+          <w:numId w:val="27"/>
         </w:numPr>
       </w:pPr>
       <w:r>
@@ -6624,7 +6820,7 @@
         <w:pStyle w:val="ListParagraph"/>
         <w:numPr>
           <w:ilvl w:val="0"/>
-          <w:numId w:val="26"/>
+          <w:numId w:val="28"/>
         </w:numPr>
       </w:pPr>
       <w:r>
@@ -6645,7 +6841,7 @@
         <w:pStyle w:val="ListParagraph"/>
         <w:numPr>
           <w:ilvl w:val="0"/>
-          <w:numId w:val="26"/>
+          <w:numId w:val="28"/>
         </w:numPr>
       </w:pPr>
       <w:r>
@@ -6657,7 +6853,7 @@
         <w:pStyle w:val="ListParagraph"/>
         <w:numPr>
           <w:ilvl w:val="0"/>
-          <w:numId w:val="26"/>
+          <w:numId w:val="28"/>
         </w:numPr>
       </w:pPr>
       <w:r>
@@ -6675,7 +6871,7 @@
         <w:pStyle w:val="ListParagraph"/>
         <w:numPr>
           <w:ilvl w:val="0"/>
-          <w:numId w:val="26"/>
+          <w:numId w:val="28"/>
         </w:numPr>
       </w:pPr>
       <w:r>
@@ -6693,7 +6889,7 @@
         <w:pStyle w:val="ListParagraph"/>
         <w:numPr>
           <w:ilvl w:val="0"/>
-          <w:numId w:val="26"/>
+          <w:numId w:val="28"/>
         </w:numPr>
       </w:pPr>
       <w:r>
@@ -6725,6 +6921,120 @@
       </w:r>
       <w:r>
         <w:t xml:space="preserve">.</w:t>
+      </w:r>
+    </w:p>
+    <w:p>
+      <w:pPr>
+        <w:pStyle w:val="ListParagraph"/>
+        <w:numPr>
+          <w:ilvl w:val="0"/>
+          <w:numId w:val="28"/>
+        </w:numPr>
+      </w:pPr>
+      <w:r>
+        <w:t xml:space="preserve">After a PDF is imported, </w:t>
+      </w:r>
+      <w:r>
+        <w:rPr>
+          <w:b/>
+        </w:rPr>
+        <w:t xml:space="preserve">Keep a copy in Folders ...</w:t>
+      </w:r>
+      <w:r>
+        <w:t xml:space="preserve"> puts the file in the project's Folders too: choose the project and the folder (or </w:t>
+      </w:r>
+      <w:r>
+        <w:rPr>
+          <w:b/>
+        </w:rPr>
+        <w:t xml:space="preserve">+ New folder</w:t>
+      </w:r>
+      <w:r>
+        <w:t xml:space="preserve">). The folder is remembered for next time.</w:t>
+      </w:r>
+    </w:p>
+    <w:p>
+      <w:pPr>
+        <w:pStyle w:val="ListParagraph"/>
+        <w:numPr>
+          <w:ilvl w:val="0"/>
+          <w:numId w:val="28"/>
+        </w:numPr>
+      </w:pPr>
+      <w:r>
+        <w:rPr>
+          <w:b/>
+        </w:rPr>
+        <w:t xml:space="preserve">Set ▾</w:t>
+      </w:r>
+      <w:r>
+        <w:t xml:space="preserve"> (beside the sheet list, on a set of imported PDFs): </w:t>
+      </w:r>
+      <w:r>
+        <w:rPr>
+          <w:b/>
+        </w:rPr>
+        <w:t xml:space="preserve">Select sheets</w:t>
+      </w:r>
+      <w:r>
+        <w:t xml:space="preserve"> - tick several (shift-click for a run) and </w:t>
+      </w:r>
+      <w:r>
+        <w:rPr>
+          <w:b/>
+        </w:rPr>
+        <w:t xml:space="preserve">Delete</w:t>
+      </w:r>
+      <w:r>
+        <w:t xml:space="preserve"> them together; </w:t>
+      </w:r>
+      <w:r>
+        <w:rPr>
+          <w:b/>
+        </w:rPr>
+        <w:t xml:space="preserve">Rename set</w:t>
+      </w:r>
+      <w:r>
+        <w:t xml:space="preserve">; </w:t>
+      </w:r>
+      <w:r>
+        <w:rPr>
+          <w:b/>
+        </w:rPr>
+        <w:t xml:space="preserve">Archive set</w:t>
+      </w:r>
+      <w:r>
+        <w:t xml:space="preserve"> - it leaves the Sheets page and Folders, nothing is deleted, and </w:t>
+      </w:r>
+      <w:r>
+        <w:rPr>
+          <w:b/>
+        </w:rPr>
+        <w:t xml:space="preserve">Set ▾ &gt; Archived sets &gt; Bring back</w:t>
+      </w:r>
+      <w:r>
+        <w:t xml:space="preserve"> restores it; </w:t>
+      </w:r>
+      <w:r>
+        <w:rPr>
+          <w:b/>
+        </w:rPr>
+        <w:t xml:space="preserve">Delete set</w:t>
+      </w:r>
+      <w:r>
+        <w:t xml:space="preserve"> - its sheets and their PDFs. Markups and issues on deleted sheets stay in the project.</w:t>
+      </w:r>
+    </w:p>
+    <w:p>
+      <w:pPr>
+        <w:pStyle w:val="ListParagraph"/>
+        <w:numPr>
+          <w:ilvl w:val="0"/>
+          <w:numId w:val="28"/>
+        </w:numPr>
+      </w:pPr>
+      <w:r>
+        <w:t xml:space="preserve">Each browser tab keeps its own project (it shows in the address), so two projects can be open side by side and each issue is saved in its own.</w:t>
       </w:r>
     </w:p>
     <w:p>
@@ -7102,7 +7412,7 @@
         <w:pStyle w:val="ListParagraph"/>
         <w:numPr>
           <w:ilvl w:val="0"/>
-          <w:numId w:val="27"/>
+          <w:numId w:val="29"/>
         </w:numPr>
       </w:pPr>
       <w:r>
@@ -7120,7 +7430,7 @@
         <w:pStyle w:val="ListParagraph"/>
         <w:numPr>
           <w:ilvl w:val="0"/>
-          <w:numId w:val="27"/>
+          <w:numId w:val="29"/>
         </w:numPr>
       </w:pPr>
       <w:r>
@@ -7147,7 +7457,7 @@
         <w:pStyle w:val="ListParagraph"/>
         <w:numPr>
           <w:ilvl w:val="0"/>
-          <w:numId w:val="27"/>
+          <w:numId w:val="29"/>
         </w:numPr>
       </w:pPr>
       <w:r>
@@ -7174,7 +7484,7 @@
         <w:pStyle w:val="ListParagraph"/>
         <w:numPr>
           <w:ilvl w:val="0"/>
-          <w:numId w:val="27"/>
+          <w:numId w:val="29"/>
         </w:numPr>
       </w:pPr>
       <w:r>
@@ -7421,7 +7731,7 @@
         <w:pStyle w:val="ListParagraph"/>
         <w:numPr>
           <w:ilvl w:val="0"/>
-          <w:numId w:val="28"/>
+          <w:numId w:val="30"/>
         </w:numPr>
       </w:pPr>
       <w:r>
@@ -7448,7 +7758,7 @@
         <w:pStyle w:val="ListParagraph"/>
         <w:numPr>
           <w:ilvl w:val="0"/>
-          <w:numId w:val="28"/>
+          <w:numId w:val="30"/>
         </w:numPr>
       </w:pPr>
       <w:r>
@@ -7466,7 +7776,7 @@
         <w:pStyle w:val="ListParagraph"/>
         <w:numPr>
           <w:ilvl w:val="0"/>
-          <w:numId w:val="28"/>
+          <w:numId w:val="30"/>
         </w:numPr>
       </w:pPr>
       <w:r>
@@ -7484,7 +7794,7 @@
         <w:pStyle w:val="ListParagraph"/>
         <w:numPr>
           <w:ilvl w:val="0"/>
-          <w:numId w:val="28"/>
+          <w:numId w:val="30"/>
         </w:numPr>
       </w:pPr>
       <w:r>
@@ -7547,7 +7857,7 @@
         <w:pStyle w:val="ListParagraph"/>
         <w:numPr>
           <w:ilvl w:val="0"/>
-          <w:numId w:val="28"/>
+          <w:numId w:val="30"/>
         </w:numPr>
       </w:pPr>
       <w:r>
@@ -7582,7 +7892,7 @@
         <w:pStyle w:val="ListParagraph"/>
         <w:numPr>
           <w:ilvl w:val="0"/>
-          <w:numId w:val="29"/>
+          <w:numId w:val="31"/>
         </w:numPr>
       </w:pPr>
       <w:r>
@@ -7618,7 +7928,7 @@
         <w:pStyle w:val="ListParagraph"/>
         <w:numPr>
           <w:ilvl w:val="0"/>
-          <w:numId w:val="29"/>
+          <w:numId w:val="31"/>
         </w:numPr>
       </w:pPr>
       <w:r>
@@ -7636,7 +7946,7 @@
         <w:pStyle w:val="ListParagraph"/>
         <w:numPr>
           <w:ilvl w:val="0"/>
-          <w:numId w:val="29"/>
+          <w:numId w:val="31"/>
         </w:numPr>
       </w:pPr>
       <w:r>
@@ -8237,7 +8547,7 @@
         <w:pStyle w:val="ListParagraph"/>
         <w:numPr>
           <w:ilvl w:val="0"/>
-          <w:numId w:val="30"/>
+          <w:numId w:val="32"/>
         </w:numPr>
       </w:pPr>
       <w:r>
@@ -8276,7 +8586,7 @@
         <w:pStyle w:val="ListParagraph"/>
         <w:numPr>
           <w:ilvl w:val="0"/>
-          <w:numId w:val="30"/>
+          <w:numId w:val="32"/>
         </w:numPr>
       </w:pPr>
       <w:r>
@@ -8306,7 +8616,7 @@
         <w:pStyle w:val="ListParagraph"/>
         <w:numPr>
           <w:ilvl w:val="0"/>
-          <w:numId w:val="30"/>
+          <w:numId w:val="32"/>
         </w:numPr>
       </w:pPr>
       <w:r>
@@ -8324,7 +8634,7 @@
         <w:pStyle w:val="ListParagraph"/>
         <w:numPr>
           <w:ilvl w:val="0"/>
-          <w:numId w:val="30"/>
+          <w:numId w:val="32"/>
         </w:numPr>
       </w:pPr>
       <w:r>
@@ -8359,7 +8669,7 @@
         <w:pStyle w:val="ListParagraph"/>
         <w:numPr>
           <w:ilvl w:val="0"/>
-          <w:numId w:val="31"/>
+          <w:numId w:val="33"/>
         </w:numPr>
       </w:pPr>
       <w:r>
@@ -8434,7 +8744,7 @@
         <w:pStyle w:val="ListParagraph"/>
         <w:numPr>
           <w:ilvl w:val="0"/>
-          <w:numId w:val="31"/>
+          <w:numId w:val="33"/>
         </w:numPr>
       </w:pPr>
       <w:r>
@@ -8446,7 +8756,7 @@
         <w:pStyle w:val="ListParagraph"/>
         <w:numPr>
           <w:ilvl w:val="0"/>
-          <w:numId w:val="31"/>
+          <w:numId w:val="33"/>
         </w:numPr>
       </w:pPr>
       <w:r>
@@ -8473,7 +8783,7 @@
         <w:pStyle w:val="ListParagraph"/>
         <w:numPr>
           <w:ilvl w:val="0"/>
-          <w:numId w:val="31"/>
+          <w:numId w:val="33"/>
         </w:numPr>
       </w:pPr>
       <w:r>
@@ -8499,7 +8809,7 @@
         <w:pStyle w:val="ListParagraph"/>
         <w:numPr>
           <w:ilvl w:val="0"/>
-          <w:numId w:val="32"/>
+          <w:numId w:val="34"/>
         </w:numPr>
       </w:pPr>
       <w:r>
@@ -8520,7 +8830,7 @@
         <w:pStyle w:val="ListParagraph"/>
         <w:numPr>
           <w:ilvl w:val="0"/>
-          <w:numId w:val="32"/>
+          <w:numId w:val="34"/>
         </w:numPr>
       </w:pPr>
       <w:r>
@@ -8547,7 +8857,7 @@
         <w:pStyle w:val="ListParagraph"/>
         <w:numPr>
           <w:ilvl w:val="0"/>
-          <w:numId w:val="32"/>
+          <w:numId w:val="34"/>
         </w:numPr>
       </w:pPr>
       <w:r>
@@ -8565,7 +8875,7 @@
         <w:pStyle w:val="ListParagraph"/>
         <w:numPr>
           <w:ilvl w:val="0"/>
-          <w:numId w:val="32"/>
+          <w:numId w:val="34"/>
         </w:numPr>
       </w:pPr>
       <w:r>
@@ -8583,7 +8893,7 @@
         <w:pStyle w:val="ListParagraph"/>
         <w:numPr>
           <w:ilvl w:val="0"/>
-          <w:numId w:val="32"/>
+          <w:numId w:val="34"/>
         </w:numPr>
       </w:pPr>
       <w:r>
@@ -9001,7 +9311,7 @@
         <w:pStyle w:val="ListParagraph"/>
         <w:numPr>
           <w:ilvl w:val="0"/>
-          <w:numId w:val="33"/>
+          <w:numId w:val="35"/>
         </w:numPr>
       </w:pPr>
       <w:r>
@@ -9046,7 +9356,7 @@
         <w:pStyle w:val="ListParagraph"/>
         <w:numPr>
           <w:ilvl w:val="0"/>
-          <w:numId w:val="33"/>
+          <w:numId w:val="35"/>
         </w:numPr>
       </w:pPr>
       <w:r>
@@ -9082,7 +9392,7 @@
         <w:pStyle w:val="ListParagraph"/>
         <w:numPr>
           <w:ilvl w:val="0"/>
-          <w:numId w:val="33"/>
+          <w:numId w:val="35"/>
         </w:numPr>
       </w:pPr>
       <w:r>
@@ -9125,7 +9435,7 @@
         <w:pStyle w:val="ListParagraph"/>
         <w:numPr>
           <w:ilvl w:val="0"/>
-          <w:numId w:val="34"/>
+          <w:numId w:val="36"/>
         </w:numPr>
       </w:pPr>
       <w:r>
@@ -9146,7 +9456,7 @@
         <w:pStyle w:val="ListParagraph"/>
         <w:numPr>
           <w:ilvl w:val="0"/>
-          <w:numId w:val="34"/>
+          <w:numId w:val="36"/>
         </w:numPr>
       </w:pPr>
       <w:r>
@@ -9173,7 +9483,7 @@
         <w:pStyle w:val="ListParagraph"/>
         <w:numPr>
           <w:ilvl w:val="0"/>
-          <w:numId w:val="34"/>
+          <w:numId w:val="36"/>
         </w:numPr>
       </w:pPr>
       <w:r>
@@ -9236,7 +9546,7 @@
         <w:pStyle w:val="ListParagraph"/>
         <w:numPr>
           <w:ilvl w:val="0"/>
-          <w:numId w:val="34"/>
+          <w:numId w:val="36"/>
         </w:numPr>
       </w:pPr>
       <w:r>
@@ -9410,7 +9720,7 @@
         <w:pStyle w:val="ListParagraph"/>
         <w:numPr>
           <w:ilvl w:val="0"/>
-          <w:numId w:val="35"/>
+          <w:numId w:val="37"/>
         </w:numPr>
       </w:pPr>
       <w:r>
@@ -9437,7 +9747,7 @@
         <w:pStyle w:val="ListParagraph"/>
         <w:numPr>
           <w:ilvl w:val="0"/>
-          <w:numId w:val="35"/>
+          <w:numId w:val="37"/>
         </w:numPr>
       </w:pPr>
       <w:r>
@@ -9458,7 +9768,7 @@
         <w:pStyle w:val="ListParagraph"/>
         <w:numPr>
           <w:ilvl w:val="0"/>
-          <w:numId w:val="35"/>
+          <w:numId w:val="37"/>
         </w:numPr>
       </w:pPr>
       <w:r>
@@ -9739,7 +10049,7 @@
         <w:pStyle w:val="ListParagraph"/>
         <w:numPr>
           <w:ilvl w:val="0"/>
-          <w:numId w:val="36"/>
+          <w:numId w:val="38"/>
         </w:numPr>
       </w:pPr>
       <w:r>
@@ -9760,7 +10070,7 @@
         <w:pStyle w:val="ListParagraph"/>
         <w:numPr>
           <w:ilvl w:val="0"/>
-          <w:numId w:val="36"/>
+          <w:numId w:val="38"/>
         </w:numPr>
       </w:pPr>
       <w:r>
@@ -9778,7 +10088,7 @@
         <w:pStyle w:val="ListParagraph"/>
         <w:numPr>
           <w:ilvl w:val="0"/>
-          <w:numId w:val="36"/>
+          <w:numId w:val="38"/>
         </w:numPr>
       </w:pPr>
       <w:r>
@@ -9796,7 +10106,7 @@
         <w:pStyle w:val="ListParagraph"/>
         <w:numPr>
           <w:ilvl w:val="0"/>
-          <w:numId w:val="36"/>
+          <w:numId w:val="38"/>
         </w:numPr>
       </w:pPr>
       <w:r>
@@ -9816,7 +10126,7 @@
         <w:pStyle w:val="ListParagraph"/>
         <w:numPr>
           <w:ilvl w:val="0"/>
-          <w:numId w:val="37"/>
+          <w:numId w:val="39"/>
         </w:numPr>
       </w:pPr>
       <w:r>
@@ -9846,7 +10156,7 @@
         <w:pStyle w:val="ListParagraph"/>
         <w:numPr>
           <w:ilvl w:val="0"/>
-          <w:numId w:val="37"/>
+          <w:numId w:val="39"/>
         </w:numPr>
       </w:pPr>
       <w:r>
@@ -9889,7 +10199,7 @@
         <w:pStyle w:val="ListParagraph"/>
         <w:numPr>
           <w:ilvl w:val="0"/>
-          <w:numId w:val="38"/>
+          <w:numId w:val="40"/>
         </w:numPr>
       </w:pPr>
       <w:r>
@@ -9946,7 +10256,7 @@
         <w:pStyle w:val="ListParagraph"/>
         <w:numPr>
           <w:ilvl w:val="0"/>
-          <w:numId w:val="38"/>
+          <w:numId w:val="40"/>
         </w:numPr>
       </w:pPr>
       <w:r>
@@ -9958,7 +10268,7 @@
         <w:pStyle w:val="ListParagraph"/>
         <w:numPr>
           <w:ilvl w:val="0"/>
-          <w:numId w:val="38"/>
+          <w:numId w:val="40"/>
         </w:numPr>
       </w:pPr>
       <w:r>
@@ -9988,7 +10298,7 @@
         <w:pStyle w:val="ListParagraph"/>
         <w:numPr>
           <w:ilvl w:val="0"/>
-          <w:numId w:val="38"/>
+          <w:numId w:val="40"/>
         </w:numPr>
       </w:pPr>
       <w:r>
@@ -10414,7 +10724,7 @@
         <w:pStyle w:val="ListParagraph"/>
         <w:numPr>
           <w:ilvl w:val="0"/>
-          <w:numId w:val="39"/>
+          <w:numId w:val="41"/>
         </w:numPr>
       </w:pPr>
       <w:r>
@@ -10426,7 +10736,7 @@
         <w:pStyle w:val="ListParagraph"/>
         <w:numPr>
           <w:ilvl w:val="0"/>
-          <w:numId w:val="39"/>
+          <w:numId w:val="41"/>
         </w:numPr>
       </w:pPr>
       <w:r>
@@ -10438,7 +10748,7 @@
         <w:pStyle w:val="ListParagraph"/>
         <w:numPr>
           <w:ilvl w:val="0"/>
-          <w:numId w:val="39"/>
+          <w:numId w:val="41"/>
         </w:numPr>
       </w:pPr>
       <w:r>
@@ -10458,7 +10768,7 @@
         <w:pStyle w:val="ListParagraph"/>
         <w:numPr>
           <w:ilvl w:val="0"/>
-          <w:numId w:val="40"/>
+          <w:numId w:val="42"/>
         </w:numPr>
       </w:pPr>
       <w:r>
@@ -10485,7 +10795,7 @@
         <w:pStyle w:val="ListParagraph"/>
         <w:numPr>
           <w:ilvl w:val="0"/>
-          <w:numId w:val="40"/>
+          <w:numId w:val="42"/>
         </w:numPr>
       </w:pPr>
       <w:r>
@@ -10512,7 +10822,7 @@
         <w:pStyle w:val="ListParagraph"/>
         <w:numPr>
           <w:ilvl w:val="0"/>
-          <w:numId w:val="40"/>
+          <w:numId w:val="42"/>
         </w:numPr>
       </w:pPr>
       <w:r>
@@ -10579,7 +10889,7 @@
         <w:pStyle w:val="ListParagraph"/>
         <w:numPr>
           <w:ilvl w:val="0"/>
-          <w:numId w:val="41"/>
+          <w:numId w:val="43"/>
         </w:numPr>
       </w:pPr>
       <w:r>
@@ -10591,7 +10901,7 @@
         <w:pStyle w:val="ListParagraph"/>
         <w:numPr>
           <w:ilvl w:val="0"/>
-          <w:numId w:val="41"/>
+          <w:numId w:val="43"/>
         </w:numPr>
       </w:pPr>
       <w:r>
@@ -10684,7 +10994,7 @@
         <w:pStyle w:val="ListParagraph"/>
         <w:numPr>
           <w:ilvl w:val="0"/>
-          <w:numId w:val="41"/>
+          <w:numId w:val="43"/>
         </w:numPr>
       </w:pPr>
       <w:r>
@@ -10729,7 +11039,7 @@
         <w:pStyle w:val="ListParagraph"/>
         <w:numPr>
           <w:ilvl w:val="0"/>
-          <w:numId w:val="41"/>
+          <w:numId w:val="43"/>
         </w:numPr>
       </w:pPr>
       <w:r>
@@ -10756,7 +11066,7 @@
         <w:pStyle w:val="ListParagraph"/>
         <w:numPr>
           <w:ilvl w:val="0"/>
-          <w:numId w:val="41"/>
+          <w:numId w:val="43"/>
         </w:numPr>
       </w:pPr>
       <w:r>
@@ -11120,7 +11430,7 @@
         <w:pStyle w:val="ListParagraph"/>
         <w:numPr>
           <w:ilvl w:val="0"/>
-          <w:numId w:val="42"/>
+          <w:numId w:val="44"/>
         </w:numPr>
       </w:pPr>
       <w:r>
@@ -11132,7 +11442,7 @@
         <w:pStyle w:val="ListParagraph"/>
         <w:numPr>
           <w:ilvl w:val="0"/>
-          <w:numId w:val="42"/>
+          <w:numId w:val="44"/>
         </w:numPr>
       </w:pPr>
       <w:r>
@@ -11150,7 +11460,7 @@
         <w:pStyle w:val="ListParagraph"/>
         <w:numPr>
           <w:ilvl w:val="0"/>
-          <w:numId w:val="42"/>
+          <w:numId w:val="44"/>
         </w:numPr>
       </w:pPr>
       <w:r>
@@ -11171,7 +11481,7 @@
         <w:pStyle w:val="ListParagraph"/>
         <w:numPr>
           <w:ilvl w:val="0"/>
-          <w:numId w:val="42"/>
+          <w:numId w:val="44"/>
         </w:numPr>
       </w:pPr>
       <w:r>
@@ -11198,7 +11508,7 @@
         <w:pStyle w:val="ListParagraph"/>
         <w:numPr>
           <w:ilvl w:val="0"/>
-          <w:numId w:val="42"/>
+          <w:numId w:val="44"/>
         </w:numPr>
       </w:pPr>
       <w:r>
@@ -11210,7 +11520,7 @@
         <w:pStyle w:val="ListParagraph"/>
         <w:numPr>
           <w:ilvl w:val="0"/>
-          <w:numId w:val="42"/>
+          <w:numId w:val="44"/>
         </w:numPr>
       </w:pPr>
       <w:r>
@@ -11267,7 +11577,7 @@
         <w:pStyle w:val="ListParagraph"/>
         <w:numPr>
           <w:ilvl w:val="0"/>
-          <w:numId w:val="42"/>
+          <w:numId w:val="44"/>
         </w:numPr>
       </w:pPr>
       <w:r>
@@ -11303,7 +11613,7 @@
         <w:pStyle w:val="ListParagraph"/>
         <w:numPr>
           <w:ilvl w:val="0"/>
-          <w:numId w:val="42"/>
+          <w:numId w:val="44"/>
         </w:numPr>
       </w:pPr>
       <w:r>
@@ -11339,7 +11649,7 @@
         <w:pStyle w:val="ListParagraph"/>
         <w:numPr>
           <w:ilvl w:val="0"/>
-          <w:numId w:val="42"/>
+          <w:numId w:val="44"/>
         </w:numPr>
       </w:pPr>
       <w:r>
@@ -11375,7 +11685,7 @@
         <w:pStyle w:val="ListParagraph"/>
         <w:numPr>
           <w:ilvl w:val="0"/>
-          <w:numId w:val="42"/>
+          <w:numId w:val="44"/>
         </w:numPr>
       </w:pPr>
       <w:r>
@@ -11411,7 +11721,7 @@
         <w:pStyle w:val="ListParagraph"/>
         <w:numPr>
           <w:ilvl w:val="0"/>
-          <w:numId w:val="42"/>
+          <w:numId w:val="44"/>
         </w:numPr>
       </w:pPr>
       <w:r>
@@ -11447,7 +11757,7 @@
         <w:pStyle w:val="ListParagraph"/>
         <w:numPr>
           <w:ilvl w:val="0"/>
-          <w:numId w:val="42"/>
+          <w:numId w:val="44"/>
         </w:numPr>
       </w:pPr>
       <w:r>
@@ -11492,7 +11802,7 @@
         <w:pStyle w:val="ListParagraph"/>
         <w:numPr>
           <w:ilvl w:val="0"/>
-          <w:numId w:val="42"/>
+          <w:numId w:val="44"/>
         </w:numPr>
       </w:pPr>
       <w:r>
@@ -11573,7 +11883,7 @@
         <w:pStyle w:val="ListParagraph"/>
         <w:numPr>
           <w:ilvl w:val="0"/>
-          <w:numId w:val="42"/>
+          <w:numId w:val="44"/>
         </w:numPr>
       </w:pPr>
       <w:r>
@@ -11617,7 +11927,7 @@
         <w:pStyle w:val="ListParagraph"/>
         <w:numPr>
           <w:ilvl w:val="0"/>
-          <w:numId w:val="43"/>
+          <w:numId w:val="45"/>
         </w:numPr>
       </w:pPr>
       <w:r>
@@ -11671,7 +11981,7 @@
         <w:pStyle w:val="ListParagraph"/>
         <w:numPr>
           <w:ilvl w:val="0"/>
-          <w:numId w:val="43"/>
+          <w:numId w:val="45"/>
         </w:numPr>
       </w:pPr>
       <w:r>
@@ -11725,7 +12035,7 @@
         <w:pStyle w:val="ListParagraph"/>
         <w:numPr>
           <w:ilvl w:val="0"/>
-          <w:numId w:val="43"/>
+          <w:numId w:val="45"/>
         </w:numPr>
       </w:pPr>
       <w:r>
@@ -11779,7 +12089,7 @@
         <w:pStyle w:val="ListParagraph"/>
         <w:numPr>
           <w:ilvl w:val="0"/>
-          <w:numId w:val="43"/>
+          <w:numId w:val="45"/>
         </w:numPr>
       </w:pPr>
       <w:r>
@@ -11827,7 +12137,7 @@
         <w:pStyle w:val="ListParagraph"/>
         <w:numPr>
           <w:ilvl w:val="0"/>
-          <w:numId w:val="43"/>
+          <w:numId w:val="45"/>
         </w:numPr>
       </w:pPr>
       <w:r>
@@ -11872,7 +12182,7 @@
         <w:pStyle w:val="ListParagraph"/>
         <w:numPr>
           <w:ilvl w:val="0"/>
-          <w:numId w:val="43"/>
+          <w:numId w:val="45"/>
         </w:numPr>
       </w:pPr>
       <w:r>
@@ -11935,7 +12245,7 @@
         <w:pStyle w:val="ListParagraph"/>
         <w:numPr>
           <w:ilvl w:val="0"/>
-          <w:numId w:val="43"/>
+          <w:numId w:val="45"/>
         </w:numPr>
       </w:pPr>
       <w:r>
@@ -11953,7 +12263,7 @@
         <w:pStyle w:val="ListParagraph"/>
         <w:numPr>
           <w:ilvl w:val="0"/>
-          <w:numId w:val="43"/>
+          <w:numId w:val="45"/>
         </w:numPr>
       </w:pPr>
       <w:r>
@@ -12399,7 +12709,7 @@
         <w:pStyle w:val="ListParagraph"/>
         <w:numPr>
           <w:ilvl w:val="0"/>
-          <w:numId w:val="44"/>
+          <w:numId w:val="46"/>
         </w:numPr>
       </w:pPr>
       <w:r>
@@ -12417,7 +12727,7 @@
         <w:pStyle w:val="ListParagraph"/>
         <w:numPr>
           <w:ilvl w:val="0"/>
-          <w:numId w:val="44"/>
+          <w:numId w:val="46"/>
         </w:numPr>
       </w:pPr>
       <w:r>
@@ -12435,7 +12745,7 @@
         <w:pStyle w:val="ListParagraph"/>
         <w:numPr>
           <w:ilvl w:val="0"/>
-          <w:numId w:val="44"/>
+          <w:numId w:val="46"/>
         </w:numPr>
       </w:pPr>
       <w:r>
@@ -12453,7 +12763,7 @@
         <w:pStyle w:val="ListParagraph"/>
         <w:numPr>
           <w:ilvl w:val="0"/>
-          <w:numId w:val="44"/>
+          <w:numId w:val="46"/>
         </w:numPr>
       </w:pPr>
       <w:r>
@@ -12676,7 +12986,7 @@
         <w:pStyle w:val="ListParagraph"/>
         <w:numPr>
           <w:ilvl w:val="0"/>
-          <w:numId w:val="45"/>
+          <w:numId w:val="47"/>
         </w:numPr>
       </w:pPr>
       <w:r>
@@ -12688,7 +12998,7 @@
         <w:pStyle w:val="ListParagraph"/>
         <w:numPr>
           <w:ilvl w:val="0"/>
-          <w:numId w:val="45"/>
+          <w:numId w:val="47"/>
         </w:numPr>
       </w:pPr>
       <w:r>
@@ -12751,7 +13061,7 @@
         <w:pStyle w:val="ListParagraph"/>
         <w:numPr>
           <w:ilvl w:val="0"/>
-          <w:numId w:val="45"/>
+          <w:numId w:val="47"/>
         </w:numPr>
       </w:pPr>
       <w:r>
@@ -12772,7 +13082,7 @@
         <w:pStyle w:val="ListParagraph"/>
         <w:numPr>
           <w:ilvl w:val="0"/>
-          <w:numId w:val="45"/>
+          <w:numId w:val="47"/>
         </w:numPr>
       </w:pPr>
       <w:r>
@@ -12853,7 +13163,7 @@
         <w:pStyle w:val="ListParagraph"/>
         <w:numPr>
           <w:ilvl w:val="0"/>
-          <w:numId w:val="45"/>
+          <w:numId w:val="47"/>
         </w:numPr>
       </w:pPr>
       <w:r>
@@ -12865,7 +13175,7 @@
         <w:pStyle w:val="ListParagraph"/>
         <w:numPr>
           <w:ilvl w:val="0"/>
-          <w:numId w:val="45"/>
+          <w:numId w:val="47"/>
         </w:numPr>
       </w:pPr>
       <w:r>
@@ -13328,7 +13638,7 @@
         <w:pStyle w:val="ListParagraph"/>
         <w:numPr>
           <w:ilvl w:val="0"/>
-          <w:numId w:val="46"/>
+          <w:numId w:val="48"/>
         </w:numPr>
       </w:pPr>
       <w:r>
@@ -13349,7 +13659,7 @@
         <w:pStyle w:val="ListParagraph"/>
         <w:numPr>
           <w:ilvl w:val="0"/>
-          <w:numId w:val="46"/>
+          <w:numId w:val="48"/>
         </w:numPr>
       </w:pPr>
       <w:r>
@@ -13385,7 +13695,7 @@
         <w:pStyle w:val="ListParagraph"/>
         <w:numPr>
           <w:ilvl w:val="0"/>
-          <w:numId w:val="46"/>
+          <w:numId w:val="48"/>
         </w:numPr>
       </w:pPr>
       <w:r>
@@ -13433,7 +13743,7 @@
         <w:pStyle w:val="ListParagraph"/>
         <w:numPr>
           <w:ilvl w:val="0"/>
-          <w:numId w:val="46"/>
+          <w:numId w:val="48"/>
         </w:numPr>
       </w:pPr>
       <w:r>
@@ -13487,7 +13797,7 @@
         <w:pStyle w:val="ListParagraph"/>
         <w:numPr>
           <w:ilvl w:val="0"/>
-          <w:numId w:val="46"/>
+          <w:numId w:val="48"/>
         </w:numPr>
       </w:pPr>
       <w:r>
@@ -13514,7 +13824,7 @@
         <w:pStyle w:val="ListParagraph"/>
         <w:numPr>
           <w:ilvl w:val="0"/>
-          <w:numId w:val="46"/>
+          <w:numId w:val="48"/>
         </w:numPr>
       </w:pPr>
       <w:r>
@@ -13532,7 +13842,7 @@
         <w:pStyle w:val="ListParagraph"/>
         <w:numPr>
           <w:ilvl w:val="0"/>
-          <w:numId w:val="46"/>
+          <w:numId w:val="48"/>
         </w:numPr>
       </w:pPr>
       <w:r>
@@ -13550,7 +13860,7 @@
         <w:pStyle w:val="ListParagraph"/>
         <w:numPr>
           <w:ilvl w:val="0"/>
-          <w:numId w:val="46"/>
+          <w:numId w:val="48"/>
         </w:numPr>
       </w:pPr>
       <w:r>
@@ -13595,7 +13905,7 @@
         <w:pStyle w:val="ListParagraph"/>
         <w:numPr>
           <w:ilvl w:val="0"/>
-          <w:numId w:val="46"/>
+          <w:numId w:val="48"/>
         </w:numPr>
       </w:pPr>
       <w:r>
@@ -13631,7 +13941,7 @@
         <w:pStyle w:val="ListParagraph"/>
         <w:numPr>
           <w:ilvl w:val="0"/>
-          <w:numId w:val="46"/>
+          <w:numId w:val="48"/>
         </w:numPr>
       </w:pPr>
       <w:r>
@@ -13880,7 +14190,7 @@
         <w:pStyle w:val="ListParagraph"/>
         <w:numPr>
           <w:ilvl w:val="0"/>
-          <w:numId w:val="47"/>
+          <w:numId w:val="49"/>
         </w:numPr>
       </w:pPr>
       <w:r>
@@ -13916,7 +14226,7 @@
         <w:pStyle w:val="ListParagraph"/>
         <w:numPr>
           <w:ilvl w:val="0"/>
-          <w:numId w:val="47"/>
+          <w:numId w:val="49"/>
         </w:numPr>
       </w:pPr>
       <w:r>
@@ -13979,7 +14289,7 @@
         <w:pStyle w:val="ListParagraph"/>
         <w:numPr>
           <w:ilvl w:val="0"/>
-          <w:numId w:val="47"/>
+          <w:numId w:val="49"/>
         </w:numPr>
       </w:pPr>
       <w:r>
@@ -14005,7 +14315,7 @@
         <w:pStyle w:val="ListParagraph"/>
         <w:numPr>
           <w:ilvl w:val="0"/>
-          <w:numId w:val="48"/>
+          <w:numId w:val="50"/>
         </w:numPr>
       </w:pPr>
       <w:r>
@@ -14032,7 +14342,7 @@
         <w:pStyle w:val="ListParagraph"/>
         <w:numPr>
           <w:ilvl w:val="0"/>
-          <w:numId w:val="48"/>
+          <w:numId w:val="50"/>
         </w:numPr>
       </w:pPr>
       <w:r>
@@ -14053,7 +14363,7 @@
         <w:pStyle w:val="ListParagraph"/>
         <w:numPr>
           <w:ilvl w:val="0"/>
-          <w:numId w:val="48"/>
+          <w:numId w:val="50"/>
         </w:numPr>
       </w:pPr>
       <w:r>
@@ -14094,7 +14404,7 @@
         <w:pStyle w:val="ListParagraph"/>
         <w:numPr>
           <w:ilvl w:val="0"/>
-          <w:numId w:val="49"/>
+          <w:numId w:val="51"/>
         </w:numPr>
       </w:pPr>
       <w:r>
@@ -14139,7 +14449,7 @@
         <w:pStyle w:val="ListParagraph"/>
         <w:numPr>
           <w:ilvl w:val="0"/>
-          <w:numId w:val="49"/>
+          <w:numId w:val="51"/>
         </w:numPr>
       </w:pPr>
       <w:r>
@@ -14175,7 +14485,7 @@
         <w:pStyle w:val="ListParagraph"/>
         <w:numPr>
           <w:ilvl w:val="0"/>
-          <w:numId w:val="49"/>
+          <w:numId w:val="51"/>
         </w:numPr>
       </w:pPr>
       <w:r>
@@ -14202,7 +14512,7 @@
         <w:pStyle w:val="ListParagraph"/>
         <w:numPr>
           <w:ilvl w:val="0"/>
-          <w:numId w:val="49"/>
+          <w:numId w:val="51"/>
         </w:numPr>
       </w:pPr>
       <w:r>
@@ -14517,7 +14827,7 @@
         <w:pStyle w:val="ListParagraph"/>
         <w:numPr>
           <w:ilvl w:val="0"/>
-          <w:numId w:val="50"/>
+          <w:numId w:val="52"/>
         </w:numPr>
       </w:pPr>
       <w:r>
@@ -14592,7 +14902,7 @@
         <w:pStyle w:val="ListParagraph"/>
         <w:numPr>
           <w:ilvl w:val="0"/>
-          <w:numId w:val="50"/>
+          <w:numId w:val="52"/>
         </w:numPr>
       </w:pPr>
       <w:r>
@@ -14622,7 +14932,7 @@
         <w:pStyle w:val="ListParagraph"/>
         <w:numPr>
           <w:ilvl w:val="0"/>
-          <w:numId w:val="50"/>
+          <w:numId w:val="52"/>
         </w:numPr>
       </w:pPr>
       <w:r>
@@ -14648,7 +14958,7 @@
         <w:pStyle w:val="ListParagraph"/>
         <w:numPr>
           <w:ilvl w:val="0"/>
-          <w:numId w:val="51"/>
+          <w:numId w:val="53"/>
         </w:numPr>
       </w:pPr>
       <w:r>
@@ -14678,7 +14988,7 @@
         <w:pStyle w:val="ListParagraph"/>
         <w:numPr>
           <w:ilvl w:val="0"/>
-          <w:numId w:val="51"/>
+          <w:numId w:val="53"/>
         </w:numPr>
       </w:pPr>
       <w:r>
@@ -14699,7 +15009,7 @@
         <w:pStyle w:val="ListParagraph"/>
         <w:numPr>
           <w:ilvl w:val="0"/>
-          <w:numId w:val="51"/>
+          <w:numId w:val="53"/>
         </w:numPr>
       </w:pPr>
       <w:r>
@@ -14729,7 +15039,7 @@
         <w:pStyle w:val="ListParagraph"/>
         <w:numPr>
           <w:ilvl w:val="0"/>
-          <w:numId w:val="52"/>
+          <w:numId w:val="54"/>
         </w:numPr>
       </w:pPr>
       <w:r>
@@ -14741,7 +15051,7 @@
         <w:pStyle w:val="ListParagraph"/>
         <w:numPr>
           <w:ilvl w:val="0"/>
-          <w:numId w:val="52"/>
+          <w:numId w:val="54"/>
         </w:numPr>
       </w:pPr>
       <w:r>
@@ -14785,7 +15095,7 @@
         <w:pStyle w:val="ListParagraph"/>
         <w:numPr>
           <w:ilvl w:val="0"/>
-          <w:numId w:val="53"/>
+          <w:numId w:val="55"/>
         </w:numPr>
       </w:pPr>
       <w:r>
@@ -14833,7 +15143,7 @@
         <w:pStyle w:val="ListParagraph"/>
         <w:numPr>
           <w:ilvl w:val="0"/>
-          <w:numId w:val="53"/>
+          <w:numId w:val="55"/>
         </w:numPr>
       </w:pPr>
       <w:r>
@@ -14845,7 +15155,7 @@
         <w:pStyle w:val="ListParagraph"/>
         <w:numPr>
           <w:ilvl w:val="0"/>
-          <w:numId w:val="53"/>
+          <w:numId w:val="55"/>
         </w:numPr>
       </w:pPr>
       <w:r>
@@ -14863,7 +15173,7 @@
         <w:pStyle w:val="ListParagraph"/>
         <w:numPr>
           <w:ilvl w:val="0"/>
-          <w:numId w:val="53"/>
+          <w:numId w:val="55"/>
         </w:numPr>
       </w:pPr>
       <w:r>
@@ -14875,7 +15185,7 @@
         <w:pStyle w:val="ListParagraph"/>
         <w:numPr>
           <w:ilvl w:val="0"/>
-          <w:numId w:val="53"/>
+          <w:numId w:val="55"/>
         </w:numPr>
       </w:pPr>
       <w:r>
@@ -14887,7 +15197,7 @@
         <w:pStyle w:val="ListParagraph"/>
         <w:numPr>
           <w:ilvl w:val="0"/>
-          <w:numId w:val="53"/>
+          <w:numId w:val="55"/>
         </w:numPr>
       </w:pPr>
       <w:r>
@@ -14899,7 +15209,7 @@
         <w:pStyle w:val="ListParagraph"/>
         <w:numPr>
           <w:ilvl w:val="0"/>
-          <w:numId w:val="53"/>
+          <w:numId w:val="55"/>
         </w:numPr>
       </w:pPr>
       <w:r>
@@ -15173,7 +15483,7 @@
         <w:pStyle w:val="ListParagraph"/>
         <w:numPr>
           <w:ilvl w:val="0"/>
-          <w:numId w:val="54"/>
+          <w:numId w:val="56"/>
         </w:numPr>
       </w:pPr>
       <w:r>
@@ -15185,7 +15495,7 @@
         <w:pStyle w:val="ListParagraph"/>
         <w:numPr>
           <w:ilvl w:val="0"/>
-          <w:numId w:val="54"/>
+          <w:numId w:val="56"/>
         </w:numPr>
       </w:pPr>
       <w:r>
@@ -15197,7 +15507,7 @@
         <w:pStyle w:val="ListParagraph"/>
         <w:numPr>
           <w:ilvl w:val="0"/>
-          <w:numId w:val="54"/>
+          <w:numId w:val="56"/>
         </w:numPr>
       </w:pPr>
       <w:r>
@@ -15471,7 +15781,7 @@
         <w:pStyle w:val="ListParagraph"/>
         <w:numPr>
           <w:ilvl w:val="0"/>
-          <w:numId w:val="55"/>
+          <w:numId w:val="57"/>
         </w:numPr>
       </w:pPr>
       <w:r>
@@ -15483,7 +15793,7 @@
         <w:pStyle w:val="ListParagraph"/>
         <w:numPr>
           <w:ilvl w:val="0"/>
-          <w:numId w:val="55"/>
+          <w:numId w:val="57"/>
         </w:numPr>
       </w:pPr>
       <w:r>
@@ -15495,7 +15805,7 @@
         <w:pStyle w:val="ListParagraph"/>
         <w:numPr>
           <w:ilvl w:val="0"/>
-          <w:numId w:val="55"/>
+          <w:numId w:val="57"/>
         </w:numPr>
       </w:pPr>
       <w:r>
@@ -15538,7 +15848,7 @@
         <w:pStyle w:val="ListParagraph"/>
         <w:numPr>
           <w:ilvl w:val="0"/>
-          <w:numId w:val="56"/>
+          <w:numId w:val="58"/>
         </w:numPr>
       </w:pPr>
       <w:r>
@@ -15595,7 +15905,7 @@
         <w:pStyle w:val="ListParagraph"/>
         <w:numPr>
           <w:ilvl w:val="0"/>
-          <w:numId w:val="56"/>
+          <w:numId w:val="58"/>
         </w:numPr>
       </w:pPr>
       <w:r>
@@ -15625,7 +15935,7 @@
         <w:pStyle w:val="ListParagraph"/>
         <w:numPr>
           <w:ilvl w:val="0"/>
-          <w:numId w:val="56"/>
+          <w:numId w:val="58"/>
         </w:numPr>
       </w:pPr>
       <w:r>
@@ -15663,7 +15973,7 @@
         <w:pStyle w:val="ListParagraph"/>
         <w:numPr>
           <w:ilvl w:val="0"/>
-          <w:numId w:val="57"/>
+          <w:numId w:val="59"/>
         </w:numPr>
       </w:pPr>
       <w:r>
@@ -15684,7 +15994,7 @@
         <w:pStyle w:val="ListParagraph"/>
         <w:numPr>
           <w:ilvl w:val="0"/>
-          <w:numId w:val="57"/>
+          <w:numId w:val="59"/>
         </w:numPr>
       </w:pPr>
       <w:r>
@@ -15729,7 +16039,7 @@
         <w:pStyle w:val="ListParagraph"/>
         <w:numPr>
           <w:ilvl w:val="0"/>
-          <w:numId w:val="57"/>
+          <w:numId w:val="59"/>
         </w:numPr>
       </w:pPr>
       <w:r>
@@ -15828,7 +16138,7 @@
         <w:pStyle w:val="ListParagraph"/>
         <w:numPr>
           <w:ilvl w:val="0"/>
-          <w:numId w:val="57"/>
+          <w:numId w:val="59"/>
         </w:numPr>
       </w:pPr>
       <w:r>
@@ -15873,7 +16183,7 @@
         <w:pStyle w:val="ListParagraph"/>
         <w:numPr>
           <w:ilvl w:val="0"/>
-          <w:numId w:val="57"/>
+          <w:numId w:val="59"/>
         </w:numPr>
       </w:pPr>
       <w:r>
@@ -16222,7 +16532,7 @@
         <w:pStyle w:val="ListParagraph"/>
         <w:numPr>
           <w:ilvl w:val="0"/>
-          <w:numId w:val="58"/>
+          <w:numId w:val="60"/>
         </w:numPr>
       </w:pPr>
       <w:r>
@@ -16252,7 +16562,7 @@
         <w:pStyle w:val="ListParagraph"/>
         <w:numPr>
           <w:ilvl w:val="0"/>
-          <w:numId w:val="58"/>
+          <w:numId w:val="60"/>
         </w:numPr>
       </w:pPr>
       <w:r>
@@ -16300,7 +16610,7 @@
         <w:pStyle w:val="ListParagraph"/>
         <w:numPr>
           <w:ilvl w:val="0"/>
-          <w:numId w:val="58"/>
+          <w:numId w:val="60"/>
         </w:numPr>
       </w:pPr>
       <w:r>
@@ -16327,7 +16637,7 @@
         <w:pStyle w:val="ListParagraph"/>
         <w:numPr>
           <w:ilvl w:val="0"/>
-          <w:numId w:val="58"/>
+          <w:numId w:val="60"/>
         </w:numPr>
       </w:pPr>
       <w:r>
@@ -16353,7 +16663,7 @@
         <w:pStyle w:val="ListParagraph"/>
         <w:numPr>
           <w:ilvl w:val="0"/>
-          <w:numId w:val="59"/>
+          <w:numId w:val="61"/>
         </w:numPr>
       </w:pPr>
       <w:r>
@@ -16374,7 +16684,7 @@
         <w:pStyle w:val="ListParagraph"/>
         <w:numPr>
           <w:ilvl w:val="0"/>
-          <w:numId w:val="59"/>
+          <w:numId w:val="61"/>
         </w:numPr>
       </w:pPr>
       <w:r>
@@ -16410,7 +16720,7 @@
         <w:pStyle w:val="ListParagraph"/>
         <w:numPr>
           <w:ilvl w:val="0"/>
-          <w:numId w:val="59"/>
+          <w:numId w:val="61"/>
         </w:numPr>
       </w:pPr>
       <w:r>
@@ -16446,7 +16756,7 @@
         <w:pStyle w:val="ListParagraph"/>
         <w:numPr>
           <w:ilvl w:val="0"/>
-          <w:numId w:val="59"/>
+          <w:numId w:val="61"/>
         </w:numPr>
       </w:pPr>
       <w:r>
@@ -16475,7 +16785,7 @@
         <w:pStyle w:val="ListParagraph"/>
         <w:numPr>
           <w:ilvl w:val="0"/>
-          <w:numId w:val="60"/>
+          <w:numId w:val="62"/>
         </w:numPr>
       </w:pPr>
       <w:r>
@@ -16496,7 +16806,7 @@
         <w:pStyle w:val="ListParagraph"/>
         <w:numPr>
           <w:ilvl w:val="0"/>
-          <w:numId w:val="60"/>
+          <w:numId w:val="62"/>
         </w:numPr>
       </w:pPr>
       <w:r>
@@ -16717,7 +17027,7 @@
         <w:pStyle w:val="ListParagraph"/>
         <w:numPr>
           <w:ilvl w:val="0"/>
-          <w:numId w:val="61"/>
+          <w:numId w:val="63"/>
         </w:numPr>
       </w:pPr>
       <w:r>
@@ -16807,7 +17117,7 @@
         <w:pStyle w:val="ListParagraph"/>
         <w:numPr>
           <w:ilvl w:val="0"/>
-          <w:numId w:val="61"/>
+          <w:numId w:val="63"/>
         </w:numPr>
       </w:pPr>
       <w:r>
@@ -16837,7 +17147,7 @@
         <w:pStyle w:val="ListParagraph"/>
         <w:numPr>
           <w:ilvl w:val="0"/>
-          <w:numId w:val="61"/>
+          <w:numId w:val="63"/>
         </w:numPr>
       </w:pPr>
       <w:r>
@@ -16858,7 +17168,7 @@
         <w:pStyle w:val="ListParagraph"/>
         <w:numPr>
           <w:ilvl w:val="0"/>
-          <w:numId w:val="61"/>
+          <w:numId w:val="63"/>
         </w:numPr>
       </w:pPr>
       <w:r>
@@ -16894,7 +17204,7 @@
         <w:pStyle w:val="ListParagraph"/>
         <w:numPr>
           <w:ilvl w:val="0"/>
-          <w:numId w:val="61"/>
+          <w:numId w:val="63"/>
         </w:numPr>
       </w:pPr>
       <w:r>
@@ -16912,7 +17222,7 @@
         <w:pStyle w:val="ListParagraph"/>
         <w:numPr>
           <w:ilvl w:val="0"/>
-          <w:numId w:val="61"/>
+          <w:numId w:val="63"/>
         </w:numPr>
       </w:pPr>
       <w:r>
@@ -16956,7 +17266,7 @@
         <w:pStyle w:val="ListParagraph"/>
         <w:numPr>
           <w:ilvl w:val="0"/>
-          <w:numId w:val="62"/>
+          <w:numId w:val="64"/>
         </w:numPr>
       </w:pPr>
       <w:r>
@@ -17037,7 +17347,7 @@
         <w:pStyle w:val="ListParagraph"/>
         <w:numPr>
           <w:ilvl w:val="0"/>
-          <w:numId w:val="62"/>
+          <w:numId w:val="64"/>
         </w:numPr>
       </w:pPr>
       <w:r>
@@ -17055,7 +17365,7 @@
         <w:pStyle w:val="ListParagraph"/>
         <w:numPr>
           <w:ilvl w:val="0"/>
-          <w:numId w:val="62"/>
+          <w:numId w:val="64"/>
         </w:numPr>
       </w:pPr>
       <w:r>
@@ -17076,7 +17386,7 @@
         <w:pStyle w:val="ListParagraph"/>
         <w:numPr>
           <w:ilvl w:val="0"/>
-          <w:numId w:val="62"/>
+          <w:numId w:val="64"/>
         </w:numPr>
       </w:pPr>
       <w:r>
@@ -17102,7 +17412,7 @@
         <w:pStyle w:val="ListParagraph"/>
         <w:numPr>
           <w:ilvl w:val="0"/>
-          <w:numId w:val="63"/>
+          <w:numId w:val="65"/>
         </w:numPr>
       </w:pPr>
       <w:r>
@@ -17165,7 +17475,7 @@
         <w:pStyle w:val="ListParagraph"/>
         <w:numPr>
           <w:ilvl w:val="0"/>
-          <w:numId w:val="63"/>
+          <w:numId w:val="65"/>
         </w:numPr>
       </w:pPr>
       <w:r>
@@ -17192,7 +17502,7 @@
         <w:pStyle w:val="ListParagraph"/>
         <w:numPr>
           <w:ilvl w:val="0"/>
-          <w:numId w:val="63"/>
+          <w:numId w:val="65"/>
         </w:numPr>
       </w:pPr>
       <w:r>
@@ -17210,7 +17520,7 @@
         <w:pStyle w:val="ListParagraph"/>
         <w:numPr>
           <w:ilvl w:val="0"/>
-          <w:numId w:val="63"/>
+          <w:numId w:val="65"/>
         </w:numPr>
       </w:pPr>
       <w:r>
@@ -17841,7 +18151,7 @@
         <w:pStyle w:val="ListParagraph"/>
         <w:numPr>
           <w:ilvl w:val="0"/>
-          <w:numId w:val="64"/>
+          <w:numId w:val="66"/>
         </w:numPr>
       </w:pPr>
       <w:r>
@@ -17859,7 +18169,7 @@
         <w:pStyle w:val="ListParagraph"/>
         <w:numPr>
           <w:ilvl w:val="0"/>
-          <w:numId w:val="64"/>
+          <w:numId w:val="66"/>
         </w:numPr>
       </w:pPr>
       <w:r>
@@ -17877,7 +18187,7 @@
         <w:pStyle w:val="ListParagraph"/>
         <w:numPr>
           <w:ilvl w:val="0"/>
-          <w:numId w:val="64"/>
+          <w:numId w:val="66"/>
         </w:numPr>
       </w:pPr>
       <w:r>
@@ -17895,7 +18205,7 @@
         <w:pStyle w:val="ListParagraph"/>
         <w:numPr>
           <w:ilvl w:val="0"/>
-          <w:numId w:val="64"/>
+          <w:numId w:val="66"/>
         </w:numPr>
       </w:pPr>
       <w:r>
@@ -17913,7 +18223,7 @@
         <w:pStyle w:val="ListParagraph"/>
         <w:numPr>
           <w:ilvl w:val="0"/>
-          <w:numId w:val="64"/>
+          <w:numId w:val="66"/>
         </w:numPr>
       </w:pPr>
       <w:r>
@@ -17931,7 +18241,7 @@
         <w:pStyle w:val="ListParagraph"/>
         <w:numPr>
           <w:ilvl w:val="0"/>
-          <w:numId w:val="64"/>
+          <w:numId w:val="66"/>
         </w:numPr>
       </w:pPr>
       <w:r>
@@ -19029,7 +19339,7 @@
         <w:pStyle w:val="ListParagraph"/>
         <w:numPr>
           <w:ilvl w:val="0"/>
-          <w:numId w:val="65"/>
+          <w:numId w:val="67"/>
         </w:numPr>
       </w:pPr>
       <w:r>
@@ -19041,7 +19351,7 @@
         <w:pStyle w:val="ListParagraph"/>
         <w:numPr>
           <w:ilvl w:val="0"/>
-          <w:numId w:val="65"/>
+          <w:numId w:val="67"/>
         </w:numPr>
       </w:pPr>
       <w:r>
@@ -19053,7 +19363,7 @@
         <w:pStyle w:val="ListParagraph"/>
         <w:numPr>
           <w:ilvl w:val="0"/>
-          <w:numId w:val="65"/>
+          <w:numId w:val="67"/>
         </w:numPr>
       </w:pPr>
       <w:r>
@@ -19065,7 +19375,7 @@
         <w:pStyle w:val="ListParagraph"/>
         <w:numPr>
           <w:ilvl w:val="0"/>
-          <w:numId w:val="65"/>
+          <w:numId w:val="67"/>
         </w:numPr>
       </w:pPr>
       <w:r>
@@ -19077,7 +19387,7 @@
         <w:pStyle w:val="ListParagraph"/>
         <w:numPr>
           <w:ilvl w:val="0"/>
-          <w:numId w:val="65"/>
+          <w:numId w:val="67"/>
         </w:numPr>
       </w:pPr>
       <w:r>
@@ -19098,7 +19408,7 @@
         <w:pStyle w:val="ListParagraph"/>
         <w:numPr>
           <w:ilvl w:val="0"/>
-          <w:numId w:val="65"/>
+          <w:numId w:val="67"/>
         </w:numPr>
       </w:pPr>
       <w:r>
@@ -19110,7 +19420,7 @@
         <w:pStyle w:val="ListParagraph"/>
         <w:numPr>
           <w:ilvl w:val="0"/>
-          <w:numId w:val="65"/>
+          <w:numId w:val="67"/>
         </w:numPr>
       </w:pPr>
       <w:r>
@@ -19131,7 +19441,7 @@
         <w:pStyle w:val="ListParagraph"/>
         <w:numPr>
           <w:ilvl w:val="0"/>
-          <w:numId w:val="65"/>
+          <w:numId w:val="67"/>
         </w:numPr>
       </w:pPr>
       <w:r>
@@ -19143,7 +19453,7 @@
         <w:pStyle w:val="ListParagraph"/>
         <w:numPr>
           <w:ilvl w:val="0"/>
-          <w:numId w:val="65"/>
+          <w:numId w:val="67"/>
         </w:numPr>
       </w:pPr>
       <w:r>
@@ -19155,7 +19465,7 @@
         <w:pStyle w:val="ListParagraph"/>
         <w:numPr>
           <w:ilvl w:val="0"/>
-          <w:numId w:val="65"/>
+          <w:numId w:val="67"/>
         </w:numPr>
       </w:pPr>
       <w:r>
@@ -19167,7 +19477,7 @@
         <w:pStyle w:val="ListParagraph"/>
         <w:numPr>
           <w:ilvl w:val="0"/>
-          <w:numId w:val="65"/>
+          <w:numId w:val="67"/>
         </w:numPr>
       </w:pPr>
       <w:r>
@@ -19179,7 +19489,7 @@
         <w:pStyle w:val="ListParagraph"/>
         <w:numPr>
           <w:ilvl w:val="0"/>
-          <w:numId w:val="65"/>
+          <w:numId w:val="67"/>
         </w:numPr>
       </w:pPr>
       <w:r>
@@ -19191,7 +19501,7 @@
         <w:pStyle w:val="ListParagraph"/>
         <w:numPr>
           <w:ilvl w:val="0"/>
-          <w:numId w:val="65"/>
+          <w:numId w:val="67"/>
         </w:numPr>
       </w:pPr>
       <w:r>
@@ -19203,7 +19513,7 @@
         <w:pStyle w:val="ListParagraph"/>
         <w:numPr>
           <w:ilvl w:val="0"/>
-          <w:numId w:val="65"/>
+          <w:numId w:val="67"/>
         </w:numPr>
       </w:pPr>
       <w:r>
@@ -19506,22 +19816,22 @@
     <w:abstractNumId w:val="0"/>
   </w:num>
   <w:num w:numId="38">
-    <w:abstractNumId w:val="1"/>
+    <w:abstractNumId w:val="0"/>
   </w:num>
   <w:num w:numId="39">
     <w:abstractNumId w:val="0"/>
   </w:num>
   <w:num w:numId="40">
-    <w:abstractNumId w:val="0"/>
+    <w:abstractNumId w:val="1"/>
   </w:num>
   <w:num w:numId="41">
-    <w:abstractNumId w:val="1"/>
+    <w:abstractNumId w:val="0"/>
   </w:num>
   <w:num w:numId="42">
     <w:abstractNumId w:val="0"/>
   </w:num>
   <w:num w:numId="43">
-    <w:abstractNumId w:val="0"/>
+    <w:abstractNumId w:val="1"/>
   </w:num>
   <w:num w:numId="44">
     <w:abstractNumId w:val="0"/>
@@ -19545,13 +19855,13 @@
     <w:abstractNumId w:val="0"/>
   </w:num>
   <w:num w:numId="51">
-    <w:abstractNumId w:val="1"/>
+    <w:abstractNumId w:val="0"/>
   </w:num>
   <w:num w:numId="52">
     <w:abstractNumId w:val="0"/>
   </w:num>
   <w:num w:numId="53">
-    <w:abstractNumId w:val="0"/>
+    <w:abstractNumId w:val="1"/>
   </w:num>
   <w:num w:numId="54">
     <w:abstractNumId w:val="0"/>
@@ -19563,13 +19873,13 @@
     <w:abstractNumId w:val="0"/>
   </w:num>
   <w:num w:numId="57">
-    <w:abstractNumId w:val="1"/>
+    <w:abstractNumId w:val="0"/>
   </w:num>
   <w:num w:numId="58">
     <w:abstractNumId w:val="0"/>
   </w:num>
   <w:num w:numId="59">
-    <w:abstractNumId w:val="0"/>
+    <w:abstractNumId w:val="1"/>
   </w:num>
   <w:num w:numId="60">
     <w:abstractNumId w:val="0"/>
@@ -19587,6 +19897,12 @@
     <w:abstractNumId w:val="0"/>
   </w:num>
   <w:num w:numId="65">
+    <w:abstractNumId w:val="0"/>
+  </w:num>
+  <w:num w:numId="66">
+    <w:abstractNumId w:val="0"/>
+  </w:num>
+  <w:num w:numId="67">
     <w:abstractNumId w:val="0"/>
   </w:num>
 </w:numbering>

</xml_diff>

<commit_message>
Sheets: CAD drawings (DWG / DXF) made into sheets
Files > A CAD drawing sends a drawing with its xrefs (or a .zip). The
server turns DWG into DXF with the ODA File Converter (DXF is read as it
is) and draws every layout as a page: paper space, and each viewport's
model at its scale, clipped, with its frozen layers left out; blocks,
xrefs, dimensions, solid and pattern hatches, text, MTEXT, leaders and
multileaders, line weights and line types, in black or the drawing's
colours. Chinese text is drawn from the server's TrueType font, with an
invisible copy for search. The pages are added as a set of imported
sheets. Standard library only; the converter and the font are found on
the server (README).

Co-Authored-By: Claude Opus 5.5 <noreply@anthropic.com>
Claude-Session: https://claude.ai/code/session_01HMFznQ3NqvEPBkq88avjvR
</commit_message>
<xml_diff>
--- a/docs/manual/LWK_Viewer_User_Manual_EN.docx
+++ b/docs/manual/LWK_Viewer_User_Manual_EN.docx
@@ -7035,6 +7035,60 @@
       </w:pPr>
       <w:r>
         <w:t xml:space="preserve">Each browser tab keeps its own project (it shows in the address), so two projects can be open side by side and each issue is saved in its own.</w:t>
+      </w:r>
+    </w:p>
+    <w:p>
+      <w:pPr>
+        <w:pStyle w:val="ListParagraph"/>
+        <w:numPr>
+          <w:ilvl w:val="0"/>
+          <w:numId w:val="28"/>
+        </w:numPr>
+      </w:pPr>
+      <w:r>
+        <w:rPr>
+          <w:b/>
+        </w:rPr>
+        <w:t xml:space="preserve">CAD drawings:</w:t>
+      </w:r>
+      <w:r>
+        <w:t xml:space="preserve"> </w:t>
+      </w:r>
+      <w:r>
+        <w:rPr>
+          <w:b/>
+        </w:rPr>
+        <w:t xml:space="preserve">Files &gt; A CAD drawing (DWG / DXF)</w:t>
+      </w:r>
+      <w:r>
+        <w:t xml:space="preserve"> - choose the drawing and its </w:t>
+      </w:r>
+      <w:r>
+        <w:rPr>
+          <w:b/>
+        </w:rPr>
+        <w:t xml:space="preserve">xrefs</w:t>
+      </w:r>
+      <w:r>
+        <w:t xml:space="preserve"> together (or one .zip). Tick the drawings to make into sheets and leave the xrefs unticked; name the set; choose black lines (as plotted) or the drawing's colours. </w:t>
+      </w:r>
+      <w:r>
+        <w:rPr>
+          <w:b/>
+        </w:rPr>
+        <w:t xml:space="preserve">Each layout becomes a sheet</w:t>
+      </w:r>
+      <w:r>
+        <w:t xml:space="preserve">: its border and title block, and each viewport's view of the model at its scale, with the xrefs and the layers frozen in that viewport left out. Sheet numbers come from the layout names (A-101 ...). An xref that was not sent is listed (the drawing is made without it). Fonts are drawn with a standard font and complex line types as plain dashes; 3D views, images and OLE objects are not drawn - for the exact look, publish a PDF from AutoCAD and import that. DWG needs the </w:t>
+      </w:r>
+      <w:r>
+        <w:rPr>
+          <w:b/>
+        </w:rPr>
+        <w:t xml:space="preserve">ODA File Converter</w:t>
+      </w:r>
+      <w:r>
+        <w:t xml:space="preserve"> on the server (the server's admin installs it once); DXF works without it.</w:t>
       </w:r>
     </w:p>
     <w:p>

</xml_diff>

<commit_message>
Imports kept in Folders: 00 BIM/Import/PDF and CAD, chosen in the import window
Importing a PDF now opens one window (sheet number, set, and where the
PDF is kept in Folders) instead of two prompts and a bar afterwards. By
default the PDF goes to 00 BIM/Import/PDF/<set> and CAD drawings with
their xrefs to 00 BIM/Import/CAD/<set>; Change folder picks any other
project folder, or nothing is kept. Only the viewer writes in 00 BIM
(a new for-viewer/import route, as for Exports). The window says when
the model is not in a Folders project yet.

Co-Authored-By: Claude Opus 5.5 <noreply@anthropic.com>
Claude-Session: https://claude.ai/code/session_01HMFznQ3NqvEPBkq88avjvR
</commit_message>
<xml_diff>
--- a/docs/manual/LWK_Viewer_User_Manual_EN.docx
+++ b/docs/manual/LWK_Viewer_User_Manual_EN.docx
@@ -6932,16 +6932,52 @@
         </w:numPr>
       </w:pPr>
       <w:r>
-        <w:t xml:space="preserve">After a PDF is imported, </w:t>
-      </w:r>
-      <w:r>
-        <w:rPr>
-          <w:b/>
-        </w:rPr>
-        <w:t xml:space="preserve">Keep a copy in Folders ...</w:t>
-      </w:r>
-      <w:r>
-        <w:t xml:space="preserve"> puts the file in the project's Folders too: choose the project and the folder (or </w:t>
+        <w:t xml:space="preserve">Importing a PDF opens one window: the </w:t>
+      </w:r>
+      <w:r>
+        <w:rPr>
+          <w:b/>
+        </w:rPr>
+        <w:t xml:space="preserve">sheet number</w:t>
+      </w:r>
+      <w:r>
+        <w:t xml:space="preserve"> (a prefix for a PDF of several pages), the </w:t>
+      </w:r>
+      <w:r>
+        <w:rPr>
+          <w:b/>
+        </w:rPr>
+        <w:t xml:space="preserve">set</w:t>
+      </w:r>
+      <w:r>
+        <w:t xml:space="preserve">, and </w:t>
+      </w:r>
+      <w:r>
+        <w:rPr>
+          <w:b/>
+        </w:rPr>
+        <w:t xml:space="preserve">Keep the PDF in Folders</w:t>
+      </w:r>
+      <w:r>
+        <w:t xml:space="preserve"> - by default in </w:t>
+      </w:r>
+      <w:r>
+        <w:rPr>
+          <w:b/>
+        </w:rPr>
+        <w:t xml:space="preserve">00 BIM &gt; Import &gt; PDF &gt; (the set)</w:t>
+      </w:r>
+      <w:r>
+        <w:t xml:space="preserve">; </w:t>
+      </w:r>
+      <w:r>
+        <w:rPr>
+          <w:b/>
+        </w:rPr>
+        <w:t xml:space="preserve">Change folder ...</w:t>
+      </w:r>
+      <w:r>
+        <w:t xml:space="preserve"> picks another project or folder (or </w:t>
       </w:r>
       <w:r>
         <w:rPr>
@@ -6950,7 +6986,16 @@
         <w:t xml:space="preserve">+ New folder</w:t>
       </w:r>
       <w:r>
-        <w:t xml:space="preserve">). The folder is remembered for next time.</w:t>
+        <w:t xml:space="preserve">); </w:t>
+      </w:r>
+      <w:r>
+        <w:rPr>
+          <w:b/>
+        </w:rPr>
+        <w:t xml:space="preserve">Don't keep a copy</w:t>
+      </w:r>
+      <w:r>
+        <w:t xml:space="preserve">. The choice is remembered for the project. The model has to be in a Folders project (Projects page) for this.</w:t>
       </w:r>
     </w:p>
     <w:p>
@@ -7070,7 +7115,34 @@
         <w:t xml:space="preserve">xrefs</w:t>
       </w:r>
       <w:r>
-        <w:t xml:space="preserve"> together (or one .zip). Tick the drawings to make into sheets and leave the xrefs unticked; name the set; choose black lines (as plotted) or the drawing's colours. </w:t>
+        <w:t xml:space="preserve"> together (or one .zip). Tick the drawings to make into sheets and leave the xrefs unticked; name the set; choose black lines (as plotted) or the drawing's colours; and where the CAD files are kept in Folders (by default </w:t>
+      </w:r>
+      <w:r>
+        <w:rPr>
+          <w:b/>
+        </w:rPr>
+        <w:t xml:space="preserve">00 BIM &gt; Import &gt; CAD &gt; (the set)</w:t>
+      </w:r>
+      <w:r>
+        <w:t xml:space="preserve">, or </w:t>
+      </w:r>
+      <w:r>
+        <w:rPr>
+          <w:b/>
+        </w:rPr>
+        <w:t xml:space="preserve">Change folder ...</w:t>
+      </w:r>
+      <w:r>
+        <w:t xml:space="preserve">, or </w:t>
+      </w:r>
+      <w:r>
+        <w:rPr>
+          <w:b/>
+        </w:rPr>
+        <w:t xml:space="preserve">Don't keep a copy</w:t>
+      </w:r>
+      <w:r>
+        <w:t xml:space="preserve">). </w:t>
       </w:r>
       <w:r>
         <w:rPr>

</xml_diff>

<commit_message>
Release 2026-11-01: CAD xrefs found by themselves, import from Folders, task owners, calendar sub-tasks
- CAD import: long file names (and & or brackets) accepted; the drawings
  are read first and their xrefs are taken from the files or folder chosen
  on the PC (only those needed are sent), then from the project's Folders,
  and only what is still missing is asked for (choose files / a folder /
  make the sheets without them)
- Files > A PDF / CAD drawing: from this PC, a folder on this PC (CAD), or
  From Folders
- Tasks: the owner and person drop-downs list the task list's members,
  with Show everyone
- Calendar: sub-tasks' due dates show for the owners of the tasks above
  them ("Sub-task of ..."); week starts on Monday or Sunday
- What's new, manuals EN / YUE

Co-Authored-By: Claude Opus 5.5 <noreply@anthropic.com>
Claude-Session: https://claude.ai/code/session_01HMFznQ3NqvEPBkq88avjvR
</commit_message>
<xml_diff>
--- a/docs/manual/LWK_Viewer_User_Manual_EN.docx
+++ b/docs/manual/LWK_Viewer_User_Manual_EN.docx
@@ -2962,6 +2962,51 @@
         </w:numPr>
       </w:pPr>
       <w:r>
+        <w:rPr>
+          <w:b/>
+        </w:rPr>
+        <w:t xml:space="preserve">Owners</w:t>
+      </w:r>
+      <w:r>
+        <w:t xml:space="preserve"> (and the list's person columns) list the </w:t>
+      </w:r>
+      <w:r>
+        <w:rPr>
+          <w:b/>
+        </w:rPr>
+        <w:t xml:space="preserve">task list's members</w:t>
+      </w:r>
+      <w:r>
+        <w:t xml:space="preserve">; </w:t>
+      </w:r>
+      <w:r>
+        <w:rPr>
+          <w:b/>
+        </w:rPr>
+        <w:t xml:space="preserve">Show everyone</w:t>
+      </w:r>
+      <w:r>
+        <w:t xml:space="preserve"> at the bottom of the list adds anyone else. Add people to the list with </w:t>
+      </w:r>
+      <w:r>
+        <w:rPr>
+          <w:b/>
+        </w:rPr>
+        <w:t xml:space="preserve">Members</w:t>
+      </w:r>
+      <w:r>
+        <w:t xml:space="preserve"> (top right).</w:t>
+      </w:r>
+    </w:p>
+    <w:p>
+      <w:pPr>
+        <w:pStyle w:val="ListParagraph"/>
+        <w:numPr>
+          <w:ilvl w:val="0"/>
+          <w:numId w:val="11"/>
+        </w:numPr>
+      </w:pPr>
+      <w:r>
         <w:t xml:space="preserve">Click a task to open its window: title, </w:t>
       </w:r>
       <w:r>
@@ -4541,7 +4586,16 @@
         <w:t xml:space="preserve">Task:</w:t>
       </w:r>
       <w:r>
-        <w:t xml:space="preserve"> choose the task list and group (this project's first), owners (this chat's people first), due date and priority. The task goes into the list and its card into the chat. ⋯ More &gt; </w:t>
+        <w:t xml:space="preserve"> choose the task list and group (this project's first), owners (the chosen list's members; </w:t>
+      </w:r>
+      <w:r>
+        <w:rPr>
+          <w:b/>
+        </w:rPr>
+        <w:t xml:space="preserve">Show everyone</w:t>
+      </w:r>
+      <w:r>
+        <w:t xml:space="preserve"> for the rest), due date and priority. The task goes into the list and its card into the chat. ⋯ More &gt; </w:t>
       </w:r>
       <w:r>
         <w:rPr>
@@ -5023,7 +5077,25 @@
         <w:t xml:space="preserve">your tasks</w:t>
       </w:r>
       <w:r>
-        <w:t xml:space="preserve"> on their due dates and </w:t>
+        <w:t xml:space="preserve"> on their due dates - with the </w:t>
+      </w:r>
+      <w:r>
+        <w:rPr>
+          <w:b/>
+        </w:rPr>
+        <w:t xml:space="preserve">sub-tasks</w:t>
+      </w:r>
+      <w:r>
+        <w:t xml:space="preserve"> (at any level) of the tasks you own, which say </w:t>
+      </w:r>
+      <w:r>
+        <w:rPr>
+          <w:b/>
+        </w:rPr>
+        <w:t xml:space="preserve">Sub-task of ...</w:t>
+      </w:r>
+      <w:r>
+        <w:t xml:space="preserve"> - and </w:t>
       </w:r>
       <w:r>
         <w:rPr>
@@ -5071,7 +5143,16 @@
         <w:t xml:space="preserve">Filter ▾</w:t>
       </w:r>
       <w:r>
-        <w:t xml:space="preserve"> shows or hides meetings, tasks and issues (it says how many are left out). </w:t>
+        <w:t xml:space="preserve"> shows or hides meetings, tasks and issues (it says how many are left out), and </w:t>
+      </w:r>
+      <w:r>
+        <w:rPr>
+          <w:b/>
+        </w:rPr>
+        <w:t xml:space="preserve">Week starts on: Monday / Sunday</w:t>
+      </w:r>
+      <w:r>
+        <w:t xml:space="preserve"> sets the leftmost column (remembered for you). </w:t>
       </w:r>
       <w:r>
         <w:rPr>
@@ -7094,6 +7175,69 @@
         <w:rPr>
           <w:b/>
         </w:rPr>
+        <w:t xml:space="preserve">Where the file comes from:</w:t>
+      </w:r>
+      <w:r>
+        <w:t xml:space="preserve"> </w:t>
+      </w:r>
+      <w:r>
+        <w:rPr>
+          <w:b/>
+        </w:rPr>
+        <w:t xml:space="preserve">Files &gt; A PDF drawing</w:t>
+      </w:r>
+      <w:r>
+        <w:t xml:space="preserve"> or </w:t>
+      </w:r>
+      <w:r>
+        <w:rPr>
+          <w:b/>
+        </w:rPr>
+        <w:t xml:space="preserve">A CAD drawing</w:t>
+      </w:r>
+      <w:r>
+        <w:t xml:space="preserve"> first asks: </w:t>
+      </w:r>
+      <w:r>
+        <w:rPr>
+          <w:b/>
+        </w:rPr>
+        <w:t xml:space="preserve">Files on this PC ...</w:t>
+      </w:r>
+      <w:r>
+        <w:t xml:space="preserve"> (the usual file picker), for CAD also </w:t>
+      </w:r>
+      <w:r>
+        <w:rPr>
+          <w:b/>
+        </w:rPr>
+        <w:t xml:space="preserve">A folder on this PC ...</w:t>
+      </w:r>
+      <w:r>
+        <w:t xml:space="preserve">, or </w:t>
+      </w:r>
+      <w:r>
+        <w:rPr>
+          <w:b/>
+        </w:rPr>
+        <w:t xml:space="preserve">From Folders ...</w:t>
+      </w:r>
+      <w:r>
+        <w:t xml:space="preserve"> - a file already in the project's Folders (e.g. 01 Incoming): browse to it and tick one or more. A file taken from Folders stays where it is there (nothing more is kept).</w:t>
+      </w:r>
+    </w:p>
+    <w:p>
+      <w:pPr>
+        <w:pStyle w:val="ListParagraph"/>
+        <w:numPr>
+          <w:ilvl w:val="0"/>
+          <w:numId w:val="28"/>
+        </w:numPr>
+      </w:pPr>
+      <w:r>
+        <w:rPr>
+          <w:b/>
+        </w:rPr>
         <w:t xml:space="preserve">CAD drawings:</w:t>
       </w:r>
       <w:r>
@@ -7106,16 +7250,7 @@
         <w:t xml:space="preserve">Files &gt; A CAD drawing (DWG / DXF)</w:t>
       </w:r>
       <w:r>
-        <w:t xml:space="preserve"> - choose the drawing and its </w:t>
-      </w:r>
-      <w:r>
-        <w:rPr>
-          <w:b/>
-        </w:rPr>
-        <w:t xml:space="preserve">xrefs</w:t>
-      </w:r>
-      <w:r>
-        <w:t xml:space="preserve"> together (or one .zip). Tick the drawings to make into sheets and leave the xrefs unticked; name the set; choose black lines (as plotted) or the drawing's colours; and where the CAD files are kept in Folders (by default </w:t>
+        <w:t xml:space="preserve"> - choose the drawing(s), or a whole folder (or one .zip). Tick the drawings to make into sheets (files in a folder named like Xref are left unticked); name the set; choose black lines (as plotted) or the drawing's colours; and where the CAD files are kept in Folders (by default </w:t>
       </w:r>
       <w:r>
         <w:rPr>
@@ -7151,7 +7286,52 @@
         <w:t xml:space="preserve">Each layout becomes a sheet</w:t>
       </w:r>
       <w:r>
-        <w:t xml:space="preserve">: its border and title block, and each viewport's view of the model at its scale, with the xrefs and the layers frozen in that viewport left out. Sheet numbers come from the layout names (A-101 ...). An xref that was not sent is listed (the drawing is made without it). Fonts are drawn with a standard font and complex line types as plain dashes; 3D views, images and OLE objects are not drawn - for the exact look, publish a PDF from AutoCAD and import that. DWG needs the </w:t>
+        <w:t xml:space="preserve">: its border and title block, and each viewport's view of the model at its scale, with the xrefs and the layers frozen in that viewport left out. Sheet numbers come from the layout names (A-101 ...). </w:t>
+      </w:r>
+      <w:r>
+        <w:rPr>
+          <w:b/>
+        </w:rPr>
+        <w:t xml:space="preserve">The xrefs are found by themselves:</w:t>
+      </w:r>
+      <w:r>
+        <w:t xml:space="preserve"> the drawings are read first, and each xref they use (and the xrefs' own xrefs) is taken from the files or folder chosen on this PC - only the ones needed are sent - then from anywhere in the project's </w:t>
+      </w:r>
+      <w:r>
+        <w:rPr>
+          <w:b/>
+        </w:rPr>
+        <w:t xml:space="preserve">Folders</w:t>
+      </w:r>
+      <w:r>
+        <w:t xml:space="preserve"> (the newest copy). Only what is still missing is asked for: </w:t>
+      </w:r>
+      <w:r>
+        <w:rPr>
+          <w:b/>
+        </w:rPr>
+        <w:t xml:space="preserve">Choose files ...</w:t>
+      </w:r>
+      <w:r>
+        <w:t xml:space="preserve">, </w:t>
+      </w:r>
+      <w:r>
+        <w:rPr>
+          <w:b/>
+        </w:rPr>
+        <w:t xml:space="preserve">Choose a folder ...</w:t>
+      </w:r>
+      <w:r>
+        <w:t xml:space="preserve"> or </w:t>
+      </w:r>
+      <w:r>
+        <w:rPr>
+          <w:b/>
+        </w:rPr>
+        <w:t xml:space="preserve">Make the sheets without them</w:t>
+      </w:r>
+      <w:r>
+        <w:t xml:space="preserve"> (they are then listed as not found). No need to bind the xrefs. Long file names, and names with &amp; or brackets, are fine. Fonts are drawn with a standard font and complex line types as plain dashes; 3D views, images and OLE objects are not drawn - for the exact look, publish a PDF from AutoCAD and import that. DWG needs the </w:t>
       </w:r>
       <w:r>
         <w:rPr>

</xml_diff>

<commit_message>
Release 2026-11-02: Set menu buttons, Delete set asks about Folders files, one-row header
- Sheets > Set menu: the actions are bordered buttons with icons; Delete
  set in red; archived sets have a Bring back button
- Delete set opens a window listing the set's files kept in Folders:
  delete the set and keep them, or delete them too (to the Folders bin,
  restorable). Imports now record the files they keep per set
  (imported_kept.json); older ones are found in 00 BIM/Import/PDF|CAD/<set>
- Header fits one row on full-screen windows: shorter project and model /
  sheet-set drop-downs (full names in tooltips), no repeated project name,
  Search as an icon on smaller screens; 3D keeps its tools on one row from
  1720 px
- What's new, manuals EN / YUE

Co-Authored-By: Claude Opus 5.5 <noreply@anthropic.com>
Claude-Session: https://claude.ai/code/session_01HMFznQ3NqvEPBkq88avjvR
</commit_message>
<xml_diff>
--- a/docs/manual/LWK_Viewer_User_Manual_EN.docx
+++ b/docs/manual/LWK_Viewer_User_Manual_EN.docx
@@ -7148,7 +7148,43 @@
         <w:t xml:space="preserve">Delete set</w:t>
       </w:r>
       <w:r>
-        <w:t xml:space="preserve"> - its sheets and their PDFs. Markups and issues on deleted sheets stay in the project.</w:t>
+        <w:t xml:space="preserve"> - its sheets and their PDFs; a window lists the set's </w:t>
+      </w:r>
+      <w:r>
+        <w:rPr>
+          <w:b/>
+        </w:rPr>
+        <w:t xml:space="preserve">files kept in Folders</w:t>
+      </w:r>
+      <w:r>
+        <w:t xml:space="preserve"> and asks: </w:t>
+      </w:r>
+      <w:r>
+        <w:rPr>
+          <w:b/>
+        </w:rPr>
+        <w:t xml:space="preserve">Delete the set, keep the files</w:t>
+      </w:r>
+      <w:r>
+        <w:t xml:space="preserve"> or </w:t>
+      </w:r>
+      <w:r>
+        <w:rPr>
+          <w:b/>
+        </w:rPr>
+        <w:t xml:space="preserve">Delete the set and its files</w:t>
+      </w:r>
+      <w:r>
+        <w:t xml:space="preserve"> (they go to the Folders bin, where they can be restored). Markups and issues on deleted sheets stay in the project. The menu's actions are buttons; </w:t>
+      </w:r>
+      <w:r>
+        <w:rPr>
+          <w:b/>
+        </w:rPr>
+        <w:t xml:space="preserve">Delete set</w:t>
+      </w:r>
+      <w:r>
+        <w:t xml:space="preserve"> is the red one.</w:t>
       </w:r>
     </w:p>
     <w:p>
@@ -7161,6 +7197,18 @@
       </w:pPr>
       <w:r>
         <w:t xml:space="preserve">Each browser tab keeps its own project (it shows in the address), so two projects can be open side by side and each issue is saved in its own.</w:t>
+      </w:r>
+    </w:p>
+    <w:p>
+      <w:pPr>
+        <w:pStyle w:val="ListParagraph"/>
+        <w:numPr>
+          <w:ilvl w:val="0"/>
+          <w:numId w:val="28"/>
+        </w:numPr>
+      </w:pPr>
+      <w:r>
+        <w:t xml:space="preserve">The header is one row on a full-screen window: the project and model / sheet-set drop-downs are kept short - point at one for its full name.</w:t>
       </w:r>
     </w:p>
     <w:p>

</xml_diff>

<commit_message>
SBD Export: streets from Floor slabs; ground level from them
- A street is a Floor whose type name has "Street" in it, kerb to kerb:
  its centreline (half-way between the long sides, round bends), its far
  side (the opposite boundary for Case 1 U) and its level are read from it.
  Axis 1 runs along the longest street frontage; the zones are measured
  from the street level (the slabs' mean top level near the site, by area)
  unless a Level is chosen. Line picking stays as the fallback.
- Server keeps the street outlines and the ground's source; the SBD plan
  draws the streets.
- Tests for the strip centreline (straight, bent), far side, mean level and
  the same Case 1 U from a slab; What's new 2026-11-04, manuals EN / YUE

Co-Authored-By: Claude Opus 5.5 <noreply@anthropic.com>
Claude-Session: https://claude.ai/code/session_01HMFznQ3NqvEPBkq88avjvR
</commit_message>
<xml_diff>
--- a/docs/manual/LWK_Viewer_User_Manual_EN.docx
+++ b/docs/manual/LWK_Viewer_User_Manual_EN.docx
@@ -12695,10 +12695,10 @@
         <w:rPr>
           <w:b/>
         </w:rPr>
-        <w:t xml:space="preserve">In Revit:</w:t>
-      </w:r>
-      <w:r>
-        <w:t xml:space="preserve"> model each building (podium, towers) as a </w:t>
+        <w:t xml:space="preserve">In Revit - what to model:</w:t>
+      </w:r>
+      <w:r>
+        <w:t xml:space="preserve"> each building (podium, towers) as a </w:t>
       </w:r>
       <w:r>
         <w:rPr>
@@ -12707,16 +12707,61 @@
         <w:t xml:space="preserve">Mass</w:t>
       </w:r>
       <w:r>
-        <w:t xml:space="preserve"> (Massing &amp; Site &gt; In-Place Mass, or a Mass family). Then </w:t>
-      </w:r>
-      <w:r>
-        <w:rPr>
-          <w:b/>
-        </w:rPr>
-        <w:t xml:space="preserve">LWK &gt; Viewer tools &gt; SBD Export</w:t>
-      </w:r>
-      <w:r>
-        <w:t xml:space="preserve">: choose the site boundary (a Property Line, or pick its lines - it must close within 10 mm), the level the zones are measured from (the site's ground, e.g. mean street level), and optionally each street: its </w:t>
+        <w:t xml:space="preserve"> (Massing &amp; Site &gt; In-Place Mass, or a Mass family); the </w:t>
+      </w:r>
+      <w:r>
+        <w:rPr>
+          <w:b/>
+        </w:rPr>
+        <w:t xml:space="preserve">site boundary</w:t>
+      </w:r>
+      <w:r>
+        <w:t xml:space="preserve"> as a Property Line (or lines that close within 10 mm); and each </w:t>
+      </w:r>
+      <w:r>
+        <w:rPr>
+          <w:b/>
+        </w:rPr>
+        <w:t xml:space="preserve">street as a Floor</w:t>
+      </w:r>
+      <w:r>
+        <w:t xml:space="preserve"> whose type name has </w:t>
+      </w:r>
+      <w:r>
+        <w:rPr>
+          <w:b/>
+        </w:rPr>
+        <w:t xml:space="preserve">Street</w:t>
+      </w:r>
+      <w:r>
+        <w:t xml:space="preserve"> in it (e.g. *SBD Street*), drawn from street boundary to street boundary, at the street's level (its </w:t>
+      </w:r>
+      <w:r>
+        <w:rPr>
+          <w:b/>
+        </w:rPr>
+        <w:t xml:space="preserve">Mark</w:t>
+      </w:r>
+      <w:r>
+        <w:t xml:space="preserve"> is used as the street's name). No floor levels are needed - the heights come from the masses.</w:t>
+      </w:r>
+    </w:p>
+    <w:p>
+      <w:pPr>
+        <w:pStyle w:val="ListParagraph"/>
+        <w:numPr>
+          <w:ilvl w:val="0"/>
+          <w:numId w:val="46"/>
+        </w:numPr>
+      </w:pPr>
+      <w:r>
+        <w:rPr>
+          <w:b/>
+        </w:rPr>
+        <w:t xml:space="preserve">What is read from a street slab:</w:t>
+      </w:r>
+      <w:r>
+        <w:t xml:space="preserve"> its </w:t>
       </w:r>
       <w:r>
         <w:rPr>
@@ -12725,16 +12770,52 @@
         <w:t xml:space="preserve">centreline</w:t>
       </w:r>
       <w:r>
-        <w:t xml:space="preserve"> and the </w:t>
-      </w:r>
-      <w:r>
-        <w:rPr>
-          <w:b/>
-        </w:rPr>
-        <w:t xml:space="preserve">opposite site's boundary</w:t>
-      </w:r>
-      <w:r>
-        <w:t xml:space="preserve"> (the first street's centreline is Axis 1, Projection Plane X). The masses go to the viewer, which assesses them straight away; the result shows in the Revit window too.</w:t>
+        <w:t xml:space="preserve"> (half-way between its two long sides, round any bend), its </w:t>
+      </w:r>
+      <w:r>
+        <w:rPr>
+          <w:b/>
+        </w:rPr>
+        <w:t xml:space="preserve">far side</w:t>
+      </w:r>
+      <w:r>
+        <w:t xml:space="preserve"> = the opposite site's boundary (for Case 1 U), and its </w:t>
+      </w:r>
+      <w:r>
+        <w:rPr>
+          <w:b/>
+        </w:rPr>
+        <w:t xml:space="preserve">level</w:t>
+      </w:r>
+      <w:r>
+        <w:t xml:space="preserve">. Axis 1 (Projection Plane X) runs along the street fronting the site the longest. The zones are measured from the </w:t>
+      </w:r>
+      <w:r>
+        <w:rPr>
+          <w:b/>
+        </w:rPr>
+        <w:t xml:space="preserve">street level</w:t>
+      </w:r>
+      <w:r>
+        <w:t xml:space="preserve"> = the mean top level of the street slabs near the site (by area); you can choose a Level instead. A slab that is not a strip (a junction) is left out - pick its centreline and the opposite boundary as lines instead.</w:t>
+      </w:r>
+    </w:p>
+    <w:p>
+      <w:pPr>
+        <w:pStyle w:val="ListParagraph"/>
+        <w:numPr>
+          <w:ilvl w:val="0"/>
+          <w:numId w:val="46"/>
+        </w:numPr>
+      </w:pPr>
+      <w:r>
+        <w:rPr>
+          <w:b/>
+        </w:rPr>
+        <w:t xml:space="preserve">LWK &gt; Viewer tools &gt; SBD Export:</w:t>
+      </w:r>
+      <w:r>
+        <w:t xml:space="preserve"> choose the site boundary, untick any street not fronting the site, accept the street level (or choose a Level), and the masses go to the viewer, which assesses them straight away; the result shows in the Revit window too, with each street's length, width and level.</w:t>
       </w:r>
     </w:p>
     <w:p>

</xml_diff>

<commit_message>
SBD: zone elevations with IS/PE by area, Low zone 1/3 H exemption, Case 1 U/Lp per zone
- server/sbd/elevation.py: each zone's elevational projection on its own
  Plane X and Plane Y from the masses (IS in the gaps that count and open
  to above, PE voids >= 3 m x 3 m, PE capped at 1/3 of the required P);
  P = (IS + PE) / (W x H), as the BD sample case
- Low zone: the portion <= 1/3 H disregarded in the footprints, Lp and
  the elevation; Table 1 Lp still takes all the Low zone's buildings
- Case 1 per zone: U = canyon area / length, Lp = facade projected on the
  street, against 5U; site under 2 ha checked on Plane X only
- S1 / S3 passed 1 mm short of 7.5 m (area / depth arithmetic)
- viewer: Plan ... > Elevation with the working, report and issue text
- tests: the BD sample case; What's new 2026-11-06; manuals EN/YUE

Co-Authored-By: Claude Opus 5.5 <noreply@anthropic.com>
Claude-Session: https://claude.ai/code/session_01HMFznQ3NqvEPBkq88avjvR
</commit_message>
<xml_diff>
--- a/docs/manual/LWK_Viewer_User_Manual_EN.docx
+++ b/docs/manual/LWK_Viewer_User_Manual_EN.docx
@@ -13152,6 +13152,87 @@
       </w:r>
       <w:r>
         <w:t xml:space="preserve"> the zones are measured from the ground chosen in SBD Export. If the lowest mass does not start there, Checks &gt; SBD says so (a 10 m podium would otherwise count in the Middle zone); SBD Export compares the street slabs' level with where the masses start and offers either, or a Level.</w:t>
+      </w:r>
+    </w:p>
+    <w:p>
+      <w:pPr>
+        <w:pStyle w:val="ListParagraph"/>
+        <w:numPr>
+          <w:ilvl w:val="0"/>
+          <w:numId w:val="46"/>
+        </w:numPr>
+      </w:pPr>
+      <w:r>
+        <w:rPr>
+          <w:b/>
+        </w:rPr>
+        <w:t xml:space="preserve">Elevations (Plan ... &gt; Elevation):</w:t>
+      </w:r>
+      <w:r>
+        <w:t xml:space="preserve"> each zone's elevational projection on its own Plane X and Plane Y (Fig B10 / B11), drawn from the masses: the buildings, the </w:t>
+      </w:r>
+      <w:r>
+        <w:rPr>
+          <w:b/>
+        </w:rPr>
+        <w:t xml:space="preserve">IS</w:t>
+      </w:r>
+      <w:r>
+        <w:t xml:space="preserve"> (dotted green: the gaps that count on plan, at least 2/3 of the zone's height, and open to above over a lower building - a podium roof - where the open run with the IS beside it is 7.5 m or more), the </w:t>
+      </w:r>
+      <w:r>
+        <w:rPr>
+          <w:b/>
+        </w:rPr>
+        <w:t xml:space="preserve">PE</w:t>
+      </w:r>
+      <w:r>
+        <w:t xml:space="preserve"> (blue grid: a void through the building at least 3 m wide and 3 m high) and the zone frame (dashed red). The working is listed as in the BD sample case: zone area W x H, IS area, P by the IS, PE area, P by the PE and P = IS + PE. PE counts up to 1/3 of the required P, and IS alone must reach 2/3 of it. The table's P is this P (the plan's IS / W is given under the working).</w:t>
+      </w:r>
+    </w:p>
+    <w:p>
+      <w:pPr>
+        <w:pStyle w:val="ListParagraph"/>
+        <w:numPr>
+          <w:ilvl w:val="0"/>
+          <w:numId w:val="46"/>
+        </w:numPr>
+      </w:pPr>
+      <w:r>
+        <w:rPr>
+          <w:b/>
+        </w:rPr>
+        <w:t xml:space="preserve">Low zone exemption:</w:t>
+      </w:r>
+      <w:r>
+        <w:t xml:space="preserve"> the portion of the Low zone up to 1/3 H (6.67 m) is disregarded - hatched on the elevation, not counted as IS, and left out of the zone's footprints and of Lp (a 6 m podium edge does not close a setback). Table 1's Lp (whether P is required) still takes all the Low zone's buildings.</w:t>
+      </w:r>
+    </w:p>
+    <w:p>
+      <w:pPr>
+        <w:pStyle w:val="ListParagraph"/>
+        <w:numPr>
+          <w:ilvl w:val="0"/>
+          <w:numId w:val="46"/>
+        </w:numPr>
+      </w:pPr>
+      <w:r>
+        <w:rPr>
+          <w:b/>
+        </w:rPr>
+        <w:t xml:space="preserve">Case 1 per zone:</w:t>
+      </w:r>
+      <w:r>
+        <w:t xml:space="preserve"> U = canyon area / its length along the centreline, and Lp = the facade projected on the street, for the podium in the Low zone (above 1/3 H) and the towers in the Middle and High zones; Lp must not exceed 5U (the BD sample: U = 15 m, 5U = 75 m, Lp = 80 - 7.5 x 2 = 65 m; tower U = 15 + 4 = 19 m, 5U = 95 m, Lp = 32 m). </w:t>
+      </w:r>
+      <w:r>
+        <w:rPr>
+          <w:b/>
+        </w:rPr>
+        <w:t xml:space="preserve">Plane Y:</w:t>
+      </w:r>
+      <w:r>
+        <w:t xml:space="preserve"> a site under 2 ha is checked on Plane X; Plane Y is shown for information (greyed). From 2 ha, Plane X needs 20 % and Plane Y 25 % (33.3 % with a building over 60 m).</w:t>
       </w:r>
     </w:p>
     <w:p>

</xml_diff>

<commit_message>
SBD: street canyon check (Design Requirement 1) and zoom on the drawings
- engine case1: the canyon drawn (facade to opposite boundary, per run of
  stations), the facade and an Lp dimension line; case1_pass overall
- viewer: Plan ... > Street canyon per zone with U / Lp / 5U working, its
  own verdict in the summary, in the report and issues; wheel / pinch
  zoom, drag pan, + / - / Fit on plan, elevation and canyon views
- tests: canyon area = U x L, Lp line; manuals EN/YUE, Help, 2026-11-08

Co-Authored-By: Claude Opus 5.5 <noreply@anthropic.com>
Claude-Session: https://claude.ai/code/session_01HMFznQ3NqvEPBkq88avjvR
</commit_message>
<xml_diff>
--- a/docs/manual/LWK_Viewer_User_Manual_EN.docx
+++ b/docs/manual/LWK_Viewer_User_Manual_EN.docx
@@ -13673,6 +13673,69 @@
       </w:r>
       <w:r>
         <w:t xml:space="preserve"> each corridor and side region is drawn to the site boundary (its band, clipped to the site); its label gives the turn (any angle from 0 to 15°, e.g. *S2 16.9 m · 7.6°*); the buildings are named B1, B2 ... as on the elevation.</w:t>
+      </w:r>
+    </w:p>
+    <w:p>
+      <w:pPr>
+        <w:pStyle w:val="ListParagraph"/>
+        <w:numPr>
+          <w:ilvl w:val="0"/>
+          <w:numId w:val="49"/>
+        </w:numPr>
+      </w:pPr>
+      <w:r>
+        <w:rPr>
+          <w:b/>
+        </w:rPr>
+        <w:t xml:space="preserve">Street canyon (Plan ... &gt; Street canyon):</w:t>
+      </w:r>
+      <w:r>
+        <w:t xml:space="preserve"> Design Requirement (1) as its own check, zone by zone: each building facing a street, its canyon (from the facade within 30 m of the centreline to the opposite site boundary) hatched, U written in it, and Lp drawn along the street; beside it the working - U = canyon area / length, Lp, 5U and the result. The summary shows its own verdict (Street canyon: Lp ≤ 5U · PASS / FAIL, with the buildings that fail), and the Report and Make issue include it.</w:t>
+      </w:r>
+    </w:p>
+    <w:p>
+      <w:pPr>
+        <w:pStyle w:val="ListParagraph"/>
+        <w:numPr>
+          <w:ilvl w:val="0"/>
+          <w:numId w:val="49"/>
+        </w:numPr>
+      </w:pPr>
+      <w:r>
+        <w:rPr>
+          <w:b/>
+        </w:rPr>
+        <w:t xml:space="preserve">Zoom:</w:t>
+      </w:r>
+      <w:r>
+        <w:t xml:space="preserve"> in the Plan, Elevation and Street canyon views, the mouse wheel (or a pinch) zooms at the pointer, a drag pans, and </w:t>
+      </w:r>
+      <w:r>
+        <w:rPr>
+          <w:b/>
+        </w:rPr>
+        <w:t xml:space="preserve">+</w:t>
+      </w:r>
+      <w:r>
+        <w:t xml:space="preserve">, </w:t>
+      </w:r>
+      <w:r>
+        <w:rPr>
+          <w:b/>
+        </w:rPr>
+        <w:t xml:space="preserve">-</w:t>
+      </w:r>
+      <w:r>
+        <w:t xml:space="preserve"> and </w:t>
+      </w:r>
+      <w:r>
+        <w:rPr>
+          <w:b/>
+        </w:rPr>
+        <w:t xml:space="preserve">Fit</w:t>
+      </w:r>
+      <w:r>
+        <w:t xml:space="preserve"> (or a double-click) are at the bottom right.</w:t>
       </w:r>
     </w:p>
     <w:p>

</xml_diff>

<commit_message>
SBD report 6: square-start side edges, street found by slab, DR(1) recess parts to real facade, straight corridor (2026-11-14)
Co-Authored-By: Claude Opus 5.5 <noreply@anthropic.com>
Claude-Session: https://claude.ai/code/session_01HMFznQ3NqvEPBkq88avjvR
</commit_message>
<xml_diff>
--- a/docs/manual/LWK_Viewer_User_Manual_EN.docx
+++ b/docs/manual/LWK_Viewer_User_Manual_EN.docx
@@ -14317,6 +14317,69 @@
       </w:r>
       <w:r>
         <w:t xml:space="preserve">, dimensioned on the drawing. The 30 m offset from each centreline is a dashed line; each street's name, level and width are placed clear of the canyons.</w:t>
+      </w:r>
+    </w:p>
+    <w:p>
+      <w:pPr>
+        <w:pStyle w:val="ListParagraph"/>
+        <w:numPr>
+          <w:ilvl w:val="0"/>
+          <w:numId w:val="51"/>
+        </w:numPr>
+      </w:pPr>
+      <w:r>
+        <w:rPr>
+          <w:b/>
+        </w:rPr>
+        <w:t xml:space="preserve">Report 6 rules:</w:t>
+      </w:r>
+      <w:r>
+        <w:t xml:space="preserve"> a side region's inner edge always starts </w:t>
+      </w:r>
+      <w:r>
+        <w:rPr>
+          <w:b/>
+        </w:rPr>
+        <w:t xml:space="preserve">square to the plane</w:t>
+      </w:r>
+      <w:r>
+        <w:t xml:space="preserve"> and turns only at a building corner (never angled from the plane on), so its corners stay on the boundary. The street part is found from the </w:t>
+      </w:r>
+      <w:r>
+        <w:rPr>
+          <w:b/>
+        </w:rPr>
+        <w:t xml:space="preserve">street slab</w:t>
+      </w:r>
+      <w:r>
+        <w:t xml:space="preserve"> beside the boundary (not from the centreline's distance), so a street of any name, or a slab drawn a little off the boundary, still extends the region - only across the street, never along it. An </w:t>
+      </w:r>
+      <w:r>
+        <w:rPr>
+          <w:b/>
+        </w:rPr>
+        <w:t xml:space="preserve">air corridor is one straight band</w:t>
+      </w:r>
+      <w:r>
+        <w:t xml:space="preserve"> of the same width from end to end, at its angle (up to 15°). </w:t>
+      </w:r>
+      <w:r>
+        <w:rPr>
+          <w:b/>
+        </w:rPr>
+        <w:t xml:space="preserve">Design Requirement (1):</w:t>
+      </w:r>
+      <w:r>
+        <w:t xml:space="preserve"> only where the ray meets the building's real facade within 30 m does the canyon count - a facade set back beyond 30 m between two wings gives </w:t>
+      </w:r>
+      <w:r>
+        <w:rPr>
+          <w:b/>
+        </w:rPr>
+        <w:t xml:space="preserve">two canyons A(a) + A(b)</w:t>
+      </w:r>
+      <w:r>
+        <w:t xml:space="preserve">, also on a street that is not quite straight.</w:t>
       </w:r>
     </w:p>
     <w:p>

</xml_diff>

<commit_message>
SBD report 7: side regions run to the boundary corner (tapering piece kept), jog beside a street joined, exact corridor ends; CAD template with the project's site at shared coordinates (2026-11-15)
Co-Authored-By: Claude Opus 5.5 <noreply@anthropic.com>
Claude-Session: https://claude.ai/code/session_01HMFznQ3NqvEPBkq88avjvR
</commit_message>
<xml_diff>
--- a/docs/manual/LWK_Viewer_User_Manual_EN.docx
+++ b/docs/manual/LWK_Viewer_User_Manual_EN.docx
@@ -13222,7 +13222,34 @@
         <w:t xml:space="preserve">CAD template</w:t>
       </w:r>
       <w:r>
-        <w:t xml:space="preserve"> (No Revit?) and open the DXF: the layers, an example (a site, two streets, a podium and a tower) and the rules.</w:t>
+        <w:t xml:space="preserve"> (No Revit?) and open the DXF: the layers and the rules - with the project's </w:t>
+      </w:r>
+      <w:r>
+        <w:rPr>
+          <w:b/>
+        </w:rPr>
+        <w:t xml:space="preserve">own site boundary and streets</w:t>
+      </w:r>
+      <w:r>
+        <w:t xml:space="preserve"> when it has an SBD model (sent from Revit once), at </w:t>
+      </w:r>
+      <w:r>
+        <w:rPr>
+          <w:b/>
+        </w:rPr>
+        <w:t xml:space="preserve">shared (survey) coordinates and mPD levels</w:t>
+      </w:r>
+      <w:r>
+        <w:t xml:space="preserve"> when the project's 3D (its Revit export) says where they are; otherwise an example (a site, two streets, a podium and a tower). Keep the note </w:t>
+      </w:r>
+      <w:r>
+        <w:rPr>
+          <w:b/>
+        </w:rPr>
+        <w:t xml:space="preserve">LWK-SBD-FRAME: SHARED</w:t>
+      </w:r>
+      <w:r>
+        <w:t xml:space="preserve"> in the drawing: on import the drawing is brought back to the Revit model's origin, so the masses sit right in the 3D.</w:t>
       </w:r>
     </w:p>
     <w:p>
@@ -14380,6 +14407,33 @@
       </w:r>
       <w:r>
         <w:t xml:space="preserve">, also on a street that is not quite straight.</w:t>
+      </w:r>
+    </w:p>
+    <w:p>
+      <w:pPr>
+        <w:pStyle w:val="ListParagraph"/>
+        <w:numPr>
+          <w:ilvl w:val="0"/>
+          <w:numId w:val="51"/>
+        </w:numPr>
+      </w:pPr>
+      <w:r>
+        <w:rPr>
+          <w:b/>
+        </w:rPr>
+        <w:t xml:space="preserve">Report 7 rules:</w:t>
+      </w:r>
+      <w:r>
+        <w:t xml:space="preserve"> where a side region narrows to a point at the site boundary (its edge meeting the boundary), that last piece is part of it - the hatch ends </w:t>
+      </w:r>
+      <w:r>
+        <w:rPr>
+          <w:b/>
+        </w:rPr>
+        <w:t xml:space="preserve">exactly at the boundary's corner</w:t>
+      </w:r>
+      <w:r>
+        <w:t xml:space="preserve">, never cut square short of it. A short step (under 3 m) in the boundary facing a street, or a sliver between the boundary and the street slab, does not split the street part: one extension up to the centreline. The air corridor's ends also lie exactly on the boundary.</w:t>
       </w:r>
     </w:p>
     <w:p>

</xml_diff>

<commit_message>
SBD Export always asks which viewer project (last used listed first, remembered); manuals; release 2026-11-16
Co-Authored-By: Claude Opus 5.5 <noreply@anthropic.com>
Claude-Session: https://claude.ai/code/session_01HMFznQ3NqvEPBkq88avjvR
</commit_message>
<xml_diff>
--- a/docs/manual/LWK_Viewer_User_Manual_EN.docx
+++ b/docs/manual/LWK_Viewer_User_Manual_EN.docx
@@ -12854,7 +12854,16 @@
         <w:t xml:space="preserve">LWK &gt; Viewer tools &gt; SBD Export.</w:t>
       </w:r>
       <w:r>
-        <w:t xml:space="preserve"> Choose the site boundary; untick any street not fronting the site; choose the viewer project if asked. The ground is not asked: Level 0 is the mean level of the lowest street abutting the site (each street's own slab level), or the masses' base when there is no street.</w:t>
+        <w:t xml:space="preserve"> Choose the site boundary; untick any street not fronting the site; choose the </w:t>
+      </w:r>
+      <w:r>
+        <w:rPr>
+          <w:b/>
+        </w:rPr>
+        <w:t xml:space="preserve">viewer project</w:t>
+      </w:r>
+      <w:r>
+        <w:t xml:space="preserve"> - it asks every time (an export replaces that project's SBD model), with the project last used with this Revit file listed first. The ground is not asked: Level 0 is the mean level of the lowest street abutting the site (each street's own slab level), or the masses' base when there is no street.</w:t>
       </w:r>
     </w:p>
     <w:p>
@@ -13485,7 +13494,7 @@
         <w:t xml:space="preserve">LWK &gt; Viewer tools &gt; SBD Export:</w:t>
       </w:r>
       <w:r>
-        <w:t xml:space="preserve"> choose the site boundary, untick any street not fronting the site, accept the street level (or choose a Level), and the masses go to the viewer, which assesses them straight away; the result shows in the Revit window too, with each street's length, width and level.</w:t>
+        <w:t xml:space="preserve"> choose the site boundary, untick any street not fronting the site, choose the viewer project, and the masses go to the viewer, which assesses them straight away; the result shows in the Revit window too, with each street's length, width and level.</w:t>
       </w:r>
     </w:p>
     <w:p>
@@ -13812,7 +13821,7 @@
         <w:t xml:space="preserve">Heights:</w:t>
       </w:r>
       <w:r>
-        <w:t xml:space="preserve"> the zones are measured from the ground chosen in SBD Export. If the lowest mass does not start there, Checks &gt; SBD says so (a 10 m podium would otherwise count in the Middle zone); SBD Export compares the street slabs' level with where the masses start and offers either, or a Level.</w:t>
+        <w:t xml:space="preserve"> the zones are measured from Level 0 (the lowest abutting street, or the masses' base when there is no street). If the lowest mass does not start there, Checks &gt; SBD says so (a 10 m podium would otherwise count in the Middle zone).</w:t>
       </w:r>
     </w:p>
     <w:p>

</xml_diff>

<commit_message>
SBD report 8: side region on to the site's corner, U/Y-shaped towers kept in elevations, building marks, Lp = notional rectangle's longer side (Fig B3); release 2026-11-17
Co-Authored-By: Claude Opus 5.5 <noreply@anthropic.com>
Claude-Session: https://claude.ai/code/session_01HMFznQ3NqvEPBkq88avjvR
</commit_message>
<xml_diff>
--- a/docs/manual/LWK_Viewer_User_Manual_EN.docx
+++ b/docs/manual/LWK_Viewer_User_Manual_EN.docx
@@ -14443,6 +14443,60 @@
       </w:r>
       <w:r>
         <w:t xml:space="preserve">, never cut square short of it. A short step (under 3 m) in the boundary facing a street, or a sliver between the boundary and the street slab, does not split the street part: one extension up to the centreline. The air corridor's ends also lie exactly on the boundary.</w:t>
+      </w:r>
+    </w:p>
+    <w:p>
+      <w:pPr>
+        <w:pStyle w:val="ListParagraph"/>
+        <w:numPr>
+          <w:ilvl w:val="0"/>
+          <w:numId w:val="51"/>
+        </w:numPr>
+      </w:pPr>
+      <w:r>
+        <w:rPr>
+          <w:b/>
+        </w:rPr>
+        <w:t xml:space="preserve">Report 8 rules:</w:t>
+      </w:r>
+      <w:r>
+        <w:t xml:space="preserve"> where the turned edge leaves the site through its far boundary and the site carries on round a corner beyond it, the side region takes that corner too - all of the site outward of the edge's line, on to the boundary's corner. A tower whose plan bends (a Y or a U) is always drawn in the elevation (each cut is matched to its building by a point inside it), and every building block is marked </w:t>
+      </w:r>
+      <w:r>
+        <w:rPr>
+          <w:b/>
+        </w:rPr>
+        <w:t xml:space="preserve">B1, B2 ...</w:t>
+      </w:r>
+      <w:r>
+        <w:t xml:space="preserve"> on the elevations. </w:t>
+      </w:r>
+      <w:r>
+        <w:rPr>
+          <w:b/>
+        </w:rPr>
+        <w:t xml:space="preserve">Lp (Design Requirement 1)</w:t>
+      </w:r>
+      <w:r>
+        <w:t xml:space="preserve"> is the </w:t>
+      </w:r>
+      <w:r>
+        <w:rPr>
+          <w:b/>
+        </w:rPr>
+        <w:t xml:space="preserve">longer side of the notional rectangle</w:t>
+      </w:r>
+      <w:r>
+        <w:t xml:space="preserve"> round the building or group (buildings under 15 m apart are one group), the rectangle lying flush with the building and turned to the side that gives the </w:t>
+      </w:r>
+      <w:r>
+        <w:rPr>
+          <w:b/>
+        </w:rPr>
+        <w:t xml:space="preserve">smaller</w:t>
+      </w:r>
+      <w:r>
+        <w:t xml:space="preserve"> Lp (Fig B3: "as L2 &gt; L1, Lp = L1") - for every building, abutting a street or not (it replaces the shorter side of report 5 and the canyon parts' projections). The street canyon still gives U = (A(a) + A(b)) / (L(a) + L(b)) and Max Lp = 5U.</w:t>
       </w:r>
     </w:p>
     <w:p>

</xml_diff>

<commit_message>
SBD elevation: end columns over the disregarded 1/3 H join the setback's IS; narrow profile steps dimensioned; the 3D box hides the SBD masses model too; release 2026-11-18
Co-Authored-By: Claude Opus 5.5 <noreply@anthropic.com>
Claude-Session: https://claude.ai/code/session_01HMFznQ3NqvEPBkq88avjvR
</commit_message>
<xml_diff>
--- a/docs/manual/LWK_Viewer_User_Manual_EN.docx
+++ b/docs/manual/LWK_Viewer_User_Manual_EN.docx
@@ -14497,6 +14497,42 @@
       </w:r>
       <w:r>
         <w:t xml:space="preserve"> Lp (Fig B3: "as L2 &gt; L1, Lp = L1") - for every building, abutting a street or not (it replaces the shorter side of report 5 and the canyon parts' projections). The street canyon still gives U = (A(a) + A(b)) / (L(a) + L(b)) and Max Lp = 5U.</w:t>
+      </w:r>
+    </w:p>
+    <w:p>
+      <w:pPr>
+        <w:pStyle w:val="ListParagraph"/>
+        <w:numPr>
+          <w:ilvl w:val="0"/>
+          <w:numId w:val="51"/>
+        </w:numPr>
+      </w:pPr>
+      <w:r>
+        <w:rPr>
+          <w:b/>
+        </w:rPr>
+        <w:t xml:space="preserve">On the elevation</w:t>
+      </w:r>
+      <w:r>
+        <w:t xml:space="preserve">, at a building's ends, the open space above a part that is all within the disregarded 1/3 H (and over a lower step beside it) is the space beside the side setback: it joins the setback's IS horizontally (with a setback that does not count on its own, when together they reach 7.5 m). Every step of the buildings' profile has its width written, a narrow one placed clear of its neighbours. The </w:t>
+      </w:r>
+      <w:r>
+        <w:rPr>
+          <w:b/>
+        </w:rPr>
+        <w:t xml:space="preserve">3D</w:t>
+      </w:r>
+      <w:r>
+        <w:t xml:space="preserve"> box in Checks &gt; SBD shows or hides everything of the SBD in the 3D - the outline and zone limits, and the </w:t>
+      </w:r>
+      <w:r>
+        <w:rPr>
+          <w:b/>
+        </w:rPr>
+        <w:t xml:space="preserve">SBD masses</w:t>
+      </w:r>
+      <w:r>
+        <w:t xml:space="preserve"> model each export adds.</w:t>
       </w:r>
     </w:p>
     <w:p>

</xml_diff>

<commit_message>
Tasks and Folders: sortable column headings; Tasks: the task panel's buttons wrap (Delete in view); Tasks, Folders, Chat: sizeable side columns (Chat list foldable); SBD panel: pass/fail chips with a legend, actions as buttons; release 2026-11-19
Co-Authored-By: Claude Opus 5.5 <noreply@anthropic.com>
Claude-Session: https://claude.ai/code/session_01HMFznQ3NqvEPBkq88avjvR
</commit_message>
<xml_diff>
--- a/docs/manual/LWK_Viewer_User_Manual_EN.docx
+++ b/docs/manual/LWK_Viewer_User_Manual_EN.docx
@@ -2786,6 +2786,24 @@
         <w:rPr>
           <w:b/>
         </w:rPr>
+        <w:t xml:space="preserve">Sort by a heading:</w:t>
+      </w:r>
+      <w:r>
+        <w:t xml:space="preserve"> click any column heading (Task title, Priority, Owner, Start, Due ...) - ▲ ascending, again ▼ descending, again the list's own order; empty cells go last, sub-tasks are sorted too, and your choice is remembered. Drag the edge of the side bar or of the task panel to make it wider or narrower (double-click the edge: usual width); the task panel's buttons (Delete among them) always stay in view.</w:t>
+      </w:r>
+    </w:p>
+    <w:p>
+      <w:pPr>
+        <w:pStyle w:val="ListParagraph"/>
+        <w:numPr>
+          <w:ilvl w:val="0"/>
+          <w:numId w:val="10"/>
+        </w:numPr>
+      </w:pPr>
+      <w:r>
+        <w:rPr>
+          <w:b/>
+        </w:rPr>
         <w:t xml:space="preserve">Kanban:</w:t>
       </w:r>
       <w:r>
@@ -3664,6 +3682,12 @@
       </w:r>
       <w:r>
         <w:t xml:space="preserve"> opens the Messenger: the team's conversations, next to the work they are about.</w:t>
+      </w:r>
+    </w:p>
+    <w:p>
+      <w:pPr/>
+      <w:r>
+        <w:t xml:space="preserve">Drag the edge of the chat list or of the details panel to size it; the small tab on the list's edge pins it, or - unpinned - folds it away for a wider conversation (as on the Sheets and 3D pages).</w:t>
       </w:r>
     </w:p>
     <w:p>
@@ -6806,6 +6830,60 @@
       </w:r>
       <w:r>
         <w:t xml:space="preserve"> also brings them back at once.</w:t>
+      </w:r>
+    </w:p>
+    <w:p>
+      <w:pPr>
+        <w:pStyle w:val="ListParagraph"/>
+        <w:numPr>
+          <w:ilvl w:val="0"/>
+          <w:numId w:val="27"/>
+        </w:numPr>
+      </w:pPr>
+      <w:r>
+        <w:rPr>
+          <w:b/>
+        </w:rPr>
+        <w:t xml:space="preserve">Sorting and columns:</w:t>
+      </w:r>
+      <w:r>
+        <w:t xml:space="preserve"> click </w:t>
+      </w:r>
+      <w:r>
+        <w:rPr>
+          <w:b/>
+        </w:rPr>
+        <w:t xml:space="preserve">Name</w:t>
+      </w:r>
+      <w:r>
+        <w:t xml:space="preserve">, </w:t>
+      </w:r>
+      <w:r>
+        <w:rPr>
+          <w:b/>
+        </w:rPr>
+        <w:t xml:space="preserve">Modified</w:t>
+      </w:r>
+      <w:r>
+        <w:t xml:space="preserve">, </w:t>
+      </w:r>
+      <w:r>
+        <w:rPr>
+          <w:b/>
+        </w:rPr>
+        <w:t xml:space="preserve">Size</w:t>
+      </w:r>
+      <w:r>
+        <w:t xml:space="preserve"> or </w:t>
+      </w:r>
+      <w:r>
+        <w:rPr>
+          <w:b/>
+        </w:rPr>
+        <w:t xml:space="preserve">Uploaded by</w:t>
+      </w:r>
+      <w:r>
+        <w:t xml:space="preserve"> to sort (▲, ▼, then the usual order; folders stay first). Drag the edge of the folder tree or of the preview to size it.</w:t>
       </w:r>
     </w:p>
     <w:p>
@@ -14533,6 +14611,24 @@
       </w:r>
       <w:r>
         <w:t xml:space="preserve"> model each export adds.</w:t>
+      </w:r>
+    </w:p>
+    <w:p>
+      <w:pPr>
+        <w:pStyle w:val="ListParagraph"/>
+        <w:numPr>
+          <w:ilvl w:val="0"/>
+          <w:numId w:val="51"/>
+        </w:numPr>
+      </w:pPr>
+      <w:r>
+        <w:rPr>
+          <w:b/>
+        </w:rPr>
+        <w:t xml:space="preserve">In the panel:</w:t>
+      </w:r>
+      <w:r>
+        <w:t xml:space="preserve"> a P or Lp that complies sits on green, one that does not on solid red, as the legend under the table says (grey: for information only); the actions (Plan, 3D, Make issue, Report, CAD, Remove, CAD template, Import CAD model) are buttons.</w:t>
       </w:r>
     </w:p>
     <w:p>

</xml_diff>

<commit_message>
SBD: a building an opening runs through is drawn on each side; corridors clipped to the site; release 2026-12-01 (What's new, manuals EN/YUE)
Co-Authored-By: Claude Opus 5.5 <noreply@anthropic.com>
Claude-Session: https://claude.ai/code/session_01HMFznQ3NqvEPBkq88avjvR
</commit_message>
<xml_diff>
--- a/docs/manual/LWK_Viewer_User_Manual_EN.docx
+++ b/docs/manual/LWK_Viewer_User_Manual_EN.docx
@@ -19962,6 +19962,60 @@
         <w:rPr>
           <w:b/>
         </w:rPr>
+        <w:t xml:space="preserve">TMTL496, 3rd review:</w:t>
+      </w:r>
+      <w:r>
+        <w:t xml:space="preserve"> a side region's street part runs exactly between the two points where its inner edge meets the site boundary, cut </w:t>
+      </w:r>
+      <w:r>
+        <w:rPr>
+          <w:b/>
+        </w:rPr>
+        <w:t xml:space="preserve">parallel to the plane</w:t>
+      </w:r>
+      <w:r>
+        <w:t xml:space="preserve"> at both ends. Past the last building corner the edge may also turn 15° away from the plane, so the region takes in more area where no building stands in the way. Openings are found </w:t>
+      </w:r>
+      <w:r>
+        <w:rPr>
+          <w:b/>
+        </w:rPr>
+        <w:t xml:space="preserve">level by level</w:t>
+      </w:r>
+      <w:r>
+        <w:t xml:space="preserve">: one clear from some height up - over a low building between towers - is an </w:t>
+      </w:r>
+      <w:r>
+        <w:rPr>
+          <w:b/>
+        </w:rPr>
+        <w:t xml:space="preserve">air corridor (S2) from that height</w:t>
+      </w:r>
+      <w:r>
+        <w:t xml:space="preserve">, blocked below it on the elevation and IS above (slits under 3 m beside the low building are part of it; a wider gap there is kept as found, and the space over the low building is taken horizontally). An opening at a turn of 15 m or more is now counted as an air corridor too. Each corridor is measured at its </w:t>
+      </w:r>
+      <w:r>
+        <w:rPr>
+          <w:b/>
+        </w:rPr>
+        <w:t xml:space="preserve">widest</w:t>
+      </w:r>
+      <w:r>
+        <w:t xml:space="preserve"> band through the same opening, turned up to 15°; one that reaches 15 m that way counts. Hover a building's name on the plan for its top above Level 0 - a building that shows at a plan level above its top means Level 0 is lower than you expect (it is the lowest street abutting the site).</w:t>
+      </w:r>
+    </w:p>
+    <w:p>
+      <w:pPr>
+        <w:pStyle w:val="ListParagraph"/>
+        <w:numPr>
+          <w:ilvl w:val="0"/>
+          <w:numId w:val="81"/>
+        </w:numPr>
+      </w:pPr>
+      <w:r>
+        <w:rPr>
+          <w:b/>
+        </w:rPr>
         <w:t xml:space="preserve">On the elevation</w:t>
       </w:r>
       <w:r>
@@ -24904,6 +24958,96 @@
       </w:r>
       <w:r>
         <w:t xml:space="preserve"> message (Close), and any message that has only one button. Dialogs that come before the LWK tools load, or while a model opens, are answered by the launcher's watcher, which finds every window of that Revit. Every dialog is written to nightly\dialogs.log. The launcher and its watcher are renewed by themselves the next time Revit is opened by hand after an update. Best: repair or remove the broken add-in on that PC.</w:t>
+      </w:r>
+    </w:p>
+    <w:p>
+      <w:pPr>
+        <w:pStyle w:val="ListParagraph"/>
+        <w:numPr>
+          <w:ilvl w:val="0"/>
+          <w:numId w:val="99"/>
+        </w:numPr>
+      </w:pPr>
+      <w:r>
+        <w:rPr>
+          <w:b/>
+        </w:rPr>
+        <w:t xml:space="preserve">Revit 2023-2026 (watcher 2026-11-31):</w:t>
+      </w:r>
+      <w:r>
+        <w:t xml:space="preserve"> the launcher's watcher also sees the newer WPF windows, and presses by the button's label: </w:t>
+      </w:r>
+      <w:r>
+        <w:rPr>
+          <w:b/>
+        </w:rPr>
+        <w:t xml:space="preserve">Load Once</w:t>
+      </w:r>
+      <w:r>
+        <w:t xml:space="preserve"> for an unsigned add-in, </w:t>
+      </w:r>
+      <w:r>
+        <w:rPr>
+          <w:b/>
+        </w:rPr>
+        <w:t xml:space="preserve">Ignore and continue opening the project</w:t>
+      </w:r>
+      <w:r>
+        <w:t xml:space="preserve"> for missing links, </w:t>
+      </w:r>
+      <w:r>
+        <w:rPr>
+          <w:b/>
+        </w:rPr>
+        <w:t xml:space="preserve">Continue working with the file</w:t>
+      </w:r>
+      <w:r>
+        <w:t xml:space="preserve"> for missing third-party updaters, and Close on What's New and similar notices. It never presses </w:t>
+      </w:r>
+      <w:r>
+        <w:rPr>
+          <w:b/>
+        </w:rPr>
+        <w:t xml:space="preserve">Cancel</w:t>
+      </w:r>
+      <w:r>
+        <w:t xml:space="preserve">, </w:t>
+      </w:r>
+      <w:r>
+        <w:rPr>
+          <w:b/>
+        </w:rPr>
+        <w:t xml:space="preserve">Do Not Load</w:t>
+      </w:r>
+      <w:r>
+        <w:t xml:space="preserve"> or </w:t>
+      </w:r>
+      <w:r>
+        <w:rPr>
+          <w:b/>
+        </w:rPr>
+        <w:t xml:space="preserve">Always Load</w:t>
+      </w:r>
+      <w:r>
+        <w:t xml:space="preserve"> - a progress window with only Cancel is left alone, so a model still opening is not stopped. A dialog it does not know is written to nightly\dialogs.log with its picture in nightly\dialogs\ - send both, so a rule can be added. After this update, open </w:t>
+      </w:r>
+      <w:r>
+        <w:rPr>
+          <w:b/>
+        </w:rPr>
+        <w:t xml:space="preserve">Auto-export</w:t>
+      </w:r>
+      <w:r>
+        <w:t xml:space="preserve"> on each PC and </w:t>
+      </w:r>
+      <w:r>
+        <w:rPr>
+          <w:b/>
+        </w:rPr>
+        <w:t xml:space="preserve">save the schedule once</w:t>
+      </w:r>
+      <w:r>
+        <w:t xml:space="preserve">: that writes the new launcher and watcher.</w:t>
       </w:r>
     </w:p>
     <w:p>

</xml_diff>

<commit_message>
SBD checks run in their own process (server stays responsive), 20 min limit, side regions fast again; release 2026-12-02
The 2026-12-01 SBD check ran inside the server and held it for minutes,
so the viewer showed Offline and publishing from Revit timed out.

Co-Authored-By: Claude Opus 5.5 <noreply@anthropic.com>
Claude-Session: https://claude.ai/code/session_01HMFznQ3NqvEPBkq88avjvR
</commit_message>
<xml_diff>
--- a/docs/manual/LWK_Viewer_User_Manual_EN.docx
+++ b/docs/manual/LWK_Viewer_User_Manual_EN.docx
@@ -20002,6 +20002,24 @@
       </w:r>
       <w:r>
         <w:t xml:space="preserve"> band through the same opening, turned up to 15°; one that reaches 15 m that way counts. Hover a building's name on the plan for its top above Level 0 - a building that shows at a plan level above its top means Level 0 is lower than you expect (it is the lowest street abutting the site).</w:t>
+      </w:r>
+    </w:p>
+    <w:p>
+      <w:pPr>
+        <w:pStyle w:val="ListParagraph"/>
+        <w:numPr>
+          <w:ilvl w:val="0"/>
+          <w:numId w:val="81"/>
+        </w:numPr>
+      </w:pPr>
+      <w:r>
+        <w:rPr>
+          <w:b/>
+        </w:rPr>
+        <w:t xml:space="preserve">While a check runs:</w:t>
+      </w:r>
+      <w:r>
+        <w:t xml:space="preserve"> each SBD check runs in its own process on the server, at lower priority, so the viewer and publishing from Revit carry on meanwhile. A big model can take some minutes - the panel says it is running. A check that takes over 20 minutes is stopped with a message: send the model (Model (JSON)) for a look.</w:t>
       </w:r>
     </w:p>
     <w:p>

</xml_diff>

<commit_message>
Server keeps answering everyone; Admin > Speed timing log (release 2026-12-03)
- perf.py: per-route timings, slow answers, a watchdog that records what the
  main loop was busy with when it stalls, page load times from devices
  (boot.js beacon), Admin > Speed
- page data handlers run on threads; publish upload unpacked on a thread
  (one project at a time); heavy write handlers' work on threads
- sheet pictures (sheettiles.py) and CAD drawing run as separate
  lower-priority processes (procjob.py)

Co-Authored-By: Claude Opus 5.5 <noreply@anthropic.com>
Claude-Session: https://claude.ai/code/session_01HMFznQ3NqvEPBkq88avjvR
</commit_message>
<xml_diff>
--- a/docs/manual/LWK_Viewer_User_Manual_EN.docx
+++ b/docs/manual/LWK_Viewer_User_Manual_EN.docx
@@ -25976,6 +25976,69 @@
       </w:r>
       <w:r>
         <w:t xml:space="preserve"> reports sent by the 3D page from each device: what loaded, peak memory, frame rate, stalls and crashes. Filter to crashes or to phones and tablets to see where the viewer struggles.</w:t>
+      </w:r>
+    </w:p>
+    <w:p>
+      <w:pPr>
+        <w:pStyle w:val="ListParagraph"/>
+        <w:numPr>
+          <w:ilvl w:val="0"/>
+          <w:numId w:val="104"/>
+        </w:numPr>
+      </w:pPr>
+      <w:r>
+        <w:rPr>
+          <w:b/>
+        </w:rPr>
+        <w:t xml:space="preserve">Speed (site admins):</w:t>
+      </w:r>
+      <w:r>
+        <w:t xml:space="preserve"> how fast the server answers and how long people wait, measured all the time. </w:t>
+      </w:r>
+      <w:r>
+        <w:rPr>
+          <w:b/>
+        </w:rPr>
+        <w:t xml:space="preserve">Days</w:t>
+      </w:r>
+      <w:r>
+        <w:t xml:space="preserve">: answers, the typical and slowest times, and </w:t>
+      </w:r>
+      <w:r>
+        <w:rPr>
+          <w:b/>
+        </w:rPr>
+        <w:t xml:space="preserve">stalls</w:t>
+      </w:r>
+      <w:r>
+        <w:t xml:space="preserve"> - moments the server stopped answering everyone (as when the viewer showed Offline). Each stall says what the server was busy with: send it to have that part fixed. </w:t>
+      </w:r>
+      <w:r>
+        <w:rPr>
+          <w:b/>
+        </w:rPr>
+        <w:t xml:space="preserve">Pages, as people waited</w:t>
+      </w:r>
+      <w:r>
+        <w:t xml:space="preserve">: each page's time until it was ready on people's own devices (the first sheet or the models shown), with its slowest data. </w:t>
+      </w:r>
+      <w:r>
+        <w:rPr>
+          <w:b/>
+        </w:rPr>
+        <w:t xml:space="preserve">Server answers</w:t>
+      </w:r>
+      <w:r>
+        <w:t xml:space="preserve"> and </w:t>
+      </w:r>
+      <w:r>
+        <w:rPr>
+          <w:b/>
+        </w:rPr>
+        <w:t xml:space="preserve">Slow answers</w:t>
+      </w:r>
+      <w:r>
+        <w:t xml:space="preserve"> (over 2 s) show which parts take the time. The chat's waiting-for-news requests are counted but not as slow.</w:t>
       </w:r>
     </w:p>
     <w:p>

</xml_diff>

<commit_message>
SBD street canyon: measured square to the street's leg over the whole frontage (a joined street's kinked centreline no longer skews it); release 2026-12-04
Co-Authored-By: Claude Opus 5.5 <noreply@anthropic.com>
Claude-Session: https://claude.ai/code/session_01HMFznQ3NqvEPBkq88avjvR
</commit_message>
<xml_diff>
--- a/docs/manual/LWK_Viewer_User_Manual_EN.docx
+++ b/docs/manual/LWK_Viewer_User_Manual_EN.docx
@@ -20020,6 +20020,24 @@
       </w:r>
       <w:r>
         <w:t xml:space="preserve"> each SBD check runs in its own process on the server, at lower priority, so the viewer and publishing from Revit carry on meanwhile. A big model can take some minutes - the panel says it is running. A check that takes over 20 minutes is stopped with a message: send the model (Model (JSON)) for a look.</w:t>
+      </w:r>
+    </w:p>
+    <w:p>
+      <w:pPr>
+        <w:pStyle w:val="ListParagraph"/>
+        <w:numPr>
+          <w:ilvl w:val="0"/>
+          <w:numId w:val="81"/>
+        </w:numPr>
+      </w:pPr>
+      <w:r>
+        <w:rPr>
+          <w:b/>
+        </w:rPr>
+        <w:t xml:space="preserve">Street canyon widths</w:t>
+      </w:r>
+      <w:r>
+        <w:t xml:space="preserve"> are measured square to the street's leg (its overall direction), over the whole frontage of the building or group, wherever its facade is within 30 m of the centreline - a small bend in the centreline where the street's Floors were joined does not turn the canyon askew.</w:t>
       </w:r>
     </w:p>
     <w:p>

</xml_diff>

<commit_message>
Sheets: moving into groups / hiding no longer takes the server down (release 2026-12-05)
- the manifest answer is kept per project, each sheet's JSON ready; groups
  and hidden marks spliced in per change, gzip made once, ETag; get_data on
  a thread
- /api/ping and the project list no longer parse every manifest (cached by
  mtime) - the Speed watchdog showed it blocking the loop
- the page applies a move or hide to the list it has, saving behind it
  (queued, last wins); the manifest is not reloaded; a failed reload keeps
  the list (no null manifest error)
- service worker: a timeout other than the ping is not 'offline'
- big JSON answers gzipped on a thread

Co-Authored-By: Claude Opus 5.5 <noreply@anthropic.com>
Claude-Session: https://claude.ai/code/session_01HMFznQ3NqvEPBkq88avjvR
</commit_message>
<xml_diff>
--- a/docs/manual/LWK_Viewer_User_Manual_EN.docx
+++ b/docs/manual/LWK_Viewer_User_Manual_EN.docx
@@ -9891,6 +9891,18 @@
       </w:r>
       <w:r>
         <w:t xml:space="preserve"> unticked.</w:t>
+      </w:r>
+    </w:p>
+    <w:p>
+      <w:pPr>
+        <w:pStyle w:val="ListParagraph"/>
+        <w:numPr>
+          <w:ilvl w:val="0"/>
+          <w:numId w:val="43"/>
+        </w:numPr>
+      </w:pPr>
+      <w:r>
+        <w:t xml:space="preserve">A move into a group, or a hide, shows at once and is saved behind it - the sheet list is not read again, so even a big project can be sorted quickly without slowing the server for others. If a change cannot be saved, the status line says so and the list is shown again as the server has it.</w:t>
       </w:r>
     </w:p>
     <w:p>

</xml_diff>

<commit_message>
Sheets: Move / hide sheets with a bar that stays on top, Esc to finish, all ticked sheets move; drag to order; Hidden as recycle bin with delete for good (release 2026-12-06)
- removed Make groups from the sheet numbers; Select sheets renamed Move / hide sheets
- pick bar sticky; choice clears after each move; Esc / Done end it
- right-click with sheets ticked acts on all of them (the clicked one too)
- drag sheets (or the ticked ones) before/after another, or onto a group heading;
  Move up / Move down; group order = its list, Other order per set (PUT /api/sheet-meta/order)
- POST /api/sheet-meta/delete (admins, hidden sheets only): imported sheets removed
  with unused PDFs, Revit sheets struck off for good (sheet_meta deleted) and their PDF removed

Co-Authored-By: Claude Opus 5.5 <noreply@anthropic.com>
Claude-Session: https://claude.ai/code/session_01HMFznQ3NqvEPBkq88avjvR
</commit_message>
<xml_diff>
--- a/docs/manual/LWK_Viewer_User_Manual_EN.docx
+++ b/docs/manual/LWK_Viewer_User_Manual_EN.docx
@@ -9782,43 +9782,52 @@
         <w:t xml:space="preserve">New group</w:t>
       </w:r>
       <w:r>
+        <w:t xml:space="preserve">, then ☰ &gt; </w:t>
+      </w:r>
+      <w:r>
+        <w:rPr>
+          <w:b/>
+        </w:rPr>
+        <w:t xml:space="preserve">Move / hide sheets</w:t>
+      </w:r>
+      <w:r>
+        <w:t xml:space="preserve">: tick the sheets and use </w:t>
+      </w:r>
+      <w:r>
+        <w:rPr>
+          <w:b/>
+        </w:rPr>
+        <w:t xml:space="preserve">Move to ▾</w:t>
+      </w:r>
+      <w:r>
         <w:t xml:space="preserve"> or </w:t>
       </w:r>
       <w:r>
         <w:rPr>
           <w:b/>
         </w:rPr>
-        <w:t xml:space="preserve">Make groups from the sheet numbers</w:t>
-      </w:r>
-      <w:r>
-        <w:t xml:space="preserve"> (A-1xx, A-2xx ...), and right-click a sheet &gt; </w:t>
-      </w:r>
-      <w:r>
-        <w:rPr>
-          <w:b/>
-        </w:rPr>
-        <w:t xml:space="preserve">Move to ...</w:t>
-      </w:r>
-      <w:r>
-        <w:t xml:space="preserve"> (or </w:t>
-      </w:r>
-      <w:r>
-        <w:rPr>
-          <w:b/>
-        </w:rPr>
-        <w:t xml:space="preserve">Select</w:t>
-      </w:r>
-      <w:r>
-        <w:t xml:space="preserve"> several, then </w:t>
-      </w:r>
-      <w:r>
-        <w:rPr>
-          <w:b/>
-        </w:rPr>
-        <w:t xml:space="preserve">Group ▾</w:t>
-      </w:r>
-      <w:r>
-        <w:t xml:space="preserve">) - project members make the groups, for everyone. Click a group's heading to fold it; its ⋯ has </w:t>
+        <w:t xml:space="preserve">Hide</w:t>
+      </w:r>
+      <w:r>
+        <w:t xml:space="preserve"> in the bar that stays at the top of the list (or right-click any ticked sheet - all the ticked ones move). The choice clears after each move, ready for the next; </w:t>
+      </w:r>
+      <w:r>
+        <w:rPr>
+          <w:b/>
+        </w:rPr>
+        <w:t xml:space="preserve">Esc</w:t>
+      </w:r>
+      <w:r>
+        <w:t xml:space="preserve"> or </w:t>
+      </w:r>
+      <w:r>
+        <w:rPr>
+          <w:b/>
+        </w:rPr>
+        <w:t xml:space="preserve">Done</w:t>
+      </w:r>
+      <w:r>
+        <w:t xml:space="preserve"> finishes - project members make the groups, for everyone. Click a group's heading to fold it; its ⋯ has </w:t>
       </w:r>
       <w:r>
         <w:rPr>
@@ -9891,6 +9900,69 @@
       </w:r>
       <w:r>
         <w:t xml:space="preserve"> unticked.</w:t>
+      </w:r>
+    </w:p>
+    <w:p>
+      <w:pPr>
+        <w:pStyle w:val="ListParagraph"/>
+        <w:numPr>
+          <w:ilvl w:val="0"/>
+          <w:numId w:val="43"/>
+        </w:numPr>
+      </w:pPr>
+      <w:r>
+        <w:rPr>
+          <w:b/>
+        </w:rPr>
+        <w:t xml:space="preserve">Putting sheets in order:</w:t>
+      </w:r>
+      <w:r>
+        <w:t xml:space="preserve"> drag a sheet (or the ticked ones) onto another - it goes before or after it, into that sheet's group; drop on a group's heading to put it at the end of that group. Or right-click a sheet &gt; </w:t>
+      </w:r>
+      <w:r>
+        <w:rPr>
+          <w:b/>
+        </w:rPr>
+        <w:t xml:space="preserve">Move up</w:t>
+      </w:r>
+      <w:r>
+        <w:t xml:space="preserve"> / </w:t>
+      </w:r>
+      <w:r>
+        <w:rPr>
+          <w:b/>
+        </w:rPr>
+        <w:t xml:space="preserve">Move down</w:t>
+      </w:r>
+      <w:r>
+        <w:t xml:space="preserve">. Each group keeps its own order, and so do the sheets in no group, for everyone. </w:t>
+      </w:r>
+      <w:r>
+        <w:rPr>
+          <w:b/>
+        </w:rPr>
+        <w:t xml:space="preserve">Hidden is the recycle bin</w:t>
+      </w:r>
+      <w:r>
+        <w:t xml:space="preserve"> (admins): right-click a hidden sheet &gt; </w:t>
+      </w:r>
+      <w:r>
+        <w:rPr>
+          <w:b/>
+        </w:rPr>
+        <w:t xml:space="preserve">Delete from the server ...</w:t>
+      </w:r>
+      <w:r>
+        <w:t xml:space="preserve">, or ⋯ on the Hidden heading &gt; </w:t>
+      </w:r>
+      <w:r>
+        <w:rPr>
+          <w:b/>
+        </w:rPr>
+        <w:t xml:space="preserve">Delete all ...</w:t>
+      </w:r>
+      <w:r>
+        <w:t xml:space="preserve"> - the sheet and its PDF go for good and do not come back with the next publish from Revit; its markups and issues are kept.</w:t>
       </w:r>
     </w:p>
     <w:p>

</xml_diff>

<commit_message>
SBD Run in the background (status polled, no request held for minutes); goto polling every 3 s behind other tabs (release 2026-12-07)
From the Speed report of 23 Oct: POST /api/sbd/run held 171 s; /api/goto 32k answers a day.

Co-Authored-By: Claude Opus 5.5 <noreply@anthropic.com>
Claude-Session: https://claude.ai/code/session_01HMFznQ3NqvEPBkq88avjvR
</commit_message>
<xml_diff>
--- a/docs/manual/LWK_Viewer_User_Manual_EN.docx
+++ b/docs/manual/LWK_Viewer_User_Manual_EN.docx
@@ -20104,6 +20104,24 @@
       </w:r>
       <w:r>
         <w:t xml:space="preserve"> each SBD check runs in its own process on the server, at lower priority, so the viewer and publishing from Revit carry on meanwhile. A big model can take some minutes - the panel says it is running. A check that takes over 20 minutes is stopped with a message: send the model (Model (JSON)) for a look.</w:t>
+      </w:r>
+    </w:p>
+    <w:p>
+      <w:pPr>
+        <w:pStyle w:val="ListParagraph"/>
+        <w:numPr>
+          <w:ilvl w:val="0"/>
+          <w:numId w:val="81"/>
+        </w:numPr>
+      </w:pPr>
+      <w:r>
+        <w:rPr>
+          <w:b/>
+        </w:rPr>
+        <w:t xml:space="preserve">Run</w:t>
+      </w:r>
+      <w:r>
+        <w:t xml:space="preserve"> starts the check on the server and the panel says it is running; the result shows by itself when it is ready (a big model like TMTL496 takes about 3 minutes). You can leave the panel and come back - the rest of the viewer works meanwhile.</w:t>
       </w:r>
     </w:p>
     <w:p>

</xml_diff>

<commit_message>
SBD check about 5x faster, same results; per-step timing under the result
Profiling a model of 12 stepped towers showed 93 % of the run in the side
regions: nearly every candidate edge is refused because it cuts a building,
and each refusal walked every corner. Now the corner that refused the last
edge is tried first, all corners before the cross-section test, and the
candidate pairs start at the first corner beyond the turn, skipping repeat
full-turn edges. Results are byte-identical on the test models (128 s -> 25 s
on the stepped towers).

engine.run returns timing_ms per step (footprints, plane search,
elevations, Case 1); the SBD tab shows it as "took ...".

Co-Authored-By: Claude Opus 5.5 <noreply@anthropic.com>
Claude-Session: https://claude.ai/code/session_01HMFznQ3NqvEPBkq88avjvR
</commit_message>
<xml_diff>
--- a/docs/manual/LWK_Viewer_User_Manual_EN.docx
+++ b/docs/manual/LWK_Viewer_User_Manual_EN.docx
@@ -20196,7 +20196,16 @@
         <w:t xml:space="preserve">Run</w:t>
       </w:r>
       <w:r>
-        <w:t xml:space="preserve"> starts the check on the server and the panel says it is running; the result shows by itself when it is ready (a big model like TMTL496 takes about 3 minutes). You can leave the panel and come back - the rest of the viewer works meanwhile.</w:t>
+        <w:t xml:space="preserve"> starts the check on the server and the panel says it is running; the result shows by itself when it is ready (a big model with many tower steps takes under a minute, since 2026-12-09). You can leave the panel and come back - the rest of the viewer works meanwhile. Under the result, </w:t>
+      </w:r>
+      <w:r>
+        <w:rPr>
+          <w:b/>
+        </w:rPr>
+        <w:t xml:space="preserve">took ...</w:t>
+      </w:r>
+      <w:r>
+        <w:t xml:space="preserve"> says how long the check took and in which steps (plane search, elevations, Case 1 ...).</w:t>
       </w:r>
     </w:p>
     <w:p>

</xml_diff>

<commit_message>
Light & Vent round 3: colour over the drawing, Filled/Outline/Off switch, Show on sheets, Tower column
- Sheets: the room colours blend into the paper (multiply), so the plan's
  lines stay dark through them; a Filled / Outline / Off switch on the
  legend, remembered per device; ?lv=on|<uid> used once, then dropped.
- Add-in: each plan viewport lists the linked models it was printed without
  (not loaded / closed workset) as links_missing; the legend and the sheet
  status bar name them, so a sheet missing the towers' drawing says why.
- 3D Checks > Light & Vent: Show on sheets at the top opens the sheet
  showing the most of the rooms chosen; Tower column and filter (also in
  the report and CSV); the Dashboard card counts per tower.
- What's new 2026-12-12, manuals EN/YUE.

Co-Authored-By: Claude Opus 5.5 <noreply@anthropic.com>
Claude-Session: https://claude.ai/code/session_01HMFznQ3NqvEPBkq88avjvR
</commit_message>
<xml_diff>
--- a/docs/manual/LWK_Viewer_User_Manual_EN.docx
+++ b/docs/manual/LWK_Viewer_User_Manual_EN.docx
@@ -20774,7 +20774,34 @@
         </w:numPr>
       </w:pPr>
       <w:r>
-        <w:t xml:space="preserve">The legend at the bottom left gives the counts, the model and when it was checked.</w:t>
+        <w:t xml:space="preserve">The legend at the bottom left gives the counts, the model and when it was checked, and a switch: </w:t>
+      </w:r>
+      <w:r>
+        <w:rPr>
+          <w:b/>
+        </w:rPr>
+        <w:t xml:space="preserve">Filled</w:t>
+      </w:r>
+      <w:r>
+        <w:t xml:space="preserve"> (rooms tinted - the drawing's lines stay dark through the colour), </w:t>
+      </w:r>
+      <w:r>
+        <w:rPr>
+          <w:b/>
+        </w:rPr>
+        <w:t xml:space="preserve">Outline</w:t>
+      </w:r>
+      <w:r>
+        <w:t xml:space="preserve"> (only each room's outline and a dot in its result colour, the drawing fully readable) or </w:t>
+      </w:r>
+      <w:r>
+        <w:rPr>
+          <w:b/>
+        </w:rPr>
+        <w:t xml:space="preserve">Off</w:t>
+      </w:r>
+      <w:r>
+        <w:t xml:space="preserve">. The choice is remembered on this device.</w:t>
       </w:r>
     </w:p>
     <w:p>
@@ -20789,6 +20816,24 @@
         <w:rPr>
           <w:b/>
         </w:rPr>
+        <w:t xml:space="preserve">Drawing missing under the colours?</w:t>
+      </w:r>
+      <w:r>
+        <w:t xml:space="preserve"> If the plan was published while a linked model (the towers' flats, for example) was not loaded or its workset was closed, the sheet has no drawing there: the legend and the status bar name the link. Open the Layout model with the links loaded and their worksets open, and publish the sheet again.</w:t>
+      </w:r>
+    </w:p>
+    <w:p>
+      <w:pPr>
+        <w:pStyle w:val="ListParagraph"/>
+        <w:numPr>
+          <w:ilvl w:val="0"/>
+          <w:numId w:val="84"/>
+        </w:numPr>
+      </w:pPr>
+      <w:r>
+        <w:rPr>
+          <w:b/>
+        </w:rPr>
         <w:t xml:space="preserve">Click a room</w:t>
       </w:r>
       <w:r>
@@ -20846,7 +20891,25 @@
         <w:t xml:space="preserve">3D &gt; Checks &gt; Light &amp; Vent:</w:t>
       </w:r>
       <w:r>
-        <w:t xml:space="preserve"> every room, filtered by floor, flat and result (rooms to look at first). Click a row for its card: </w:t>
+        <w:t xml:space="preserve"> </w:t>
+      </w:r>
+      <w:r>
+        <w:rPr>
+          <w:b/>
+        </w:rPr>
+        <w:t xml:space="preserve">Show on sheets</w:t>
+      </w:r>
+      <w:r>
+        <w:t xml:space="preserve"> at the top opens the plan sheet showing the most of the rooms chosen (floor, tower, flat), coloured. The table has a </w:t>
+      </w:r>
+      <w:r>
+        <w:rPr>
+          <w:b/>
+        </w:rPr>
+        <w:t xml:space="preserve">Tower</w:t>
+      </w:r>
+      <w:r>
+        <w:t xml:space="preserve"> column; filter by floor, tower, flat and result (rooms to look at first). Click a row for its card: </w:t>
       </w:r>
       <w:r>
         <w:rPr>

</xml_diff>

<commit_message>
Queries: pick the query from + Query, own pictures, Queries first in Tasks; offline says why
- + Query on a sheet / in 3D opens a menu: a new query or an open one (the
  last used on top), then stay to capture the next view or open the query.
  Anyone on the project may add pictures; only the raiser, addressees and
  admins remove them.
- Queries take pictures of their own: + Add picture, paste, drop; full-size
  view with previous / next. Server accepts kind "image" views.
- Tasks side bar: Queries is a highlighted button at the top, with overdue.
- Saving a query or a comment runs off the event loop; /api/ping runs in
  the threadpool. The offline header says whether the server did not
  answer or was too slow (X-LWK-Offline: down / slow).
- What's new 2026-12-14, manuals EN / YUE.

Co-Authored-By: Claude Opus 5.5 <noreply@anthropic.com>
Claude-Session: https://claude.ai/code/session_01HMFznQ3NqvEPBkq88avjvR
</commit_message>
<xml_diff>
--- a/docs/manual/LWK_Viewer_User_Manual_EN.docx
+++ b/docs/manual/LWK_Viewer_User_Manual_EN.docx
@@ -4837,7 +4837,7 @@
         <w:t xml:space="preserve">Queries</w:t>
       </w:r>
       <w:r>
-        <w:t xml:space="preserve"> (in the side bar under Quick access) is a register of questions for each project on the Projects page, numbered </w:t>
+        <w:t xml:space="preserve"> (the blue button at the top of the Tasks side bar) is a register of questions for each project on the Projects page, numbered </w:t>
       </w:r>
       <w:r>
         <w:rPr>
@@ -4864,7 +4864,16 @@
         <w:t xml:space="preserve">Queries</w:t>
       </w:r>
       <w:r>
-        <w:t xml:space="preserve"> is how many open queries are to you.</w:t>
+        <w:t xml:space="preserve"> is how many open queries are to you (and answered ones you raised, to close); a red </w:t>
+      </w:r>
+      <w:r>
+        <w:rPr>
+          <w:b/>
+        </w:rPr>
+        <w:t xml:space="preserve">N overdue</w:t>
+      </w:r>
+      <w:r>
+        <w:t xml:space="preserve"> shows when some of yours are past their due date.</w:t>
       </w:r>
     </w:p>
     <w:p>
@@ -4945,7 +4954,7 @@
         <w:t xml:space="preserve">+ Query</w:t>
       </w:r>
       <w:r>
-        <w:t xml:space="preserve"> in the header (next to + Task; in 3D also in the </w:t>
+        <w:t xml:space="preserve"> in the header (next to + Task; in 3D in the </w:t>
       </w:r>
       <w:r>
         <w:rPr>
@@ -4954,16 +4963,151 @@
         <w:t xml:space="preserve">⋯</w:t>
       </w:r>
       <w:r>
-        <w:t xml:space="preserve"> menu). It captures what you see and opens Queries: </w:t>
-      </w:r>
-      <w:r>
-        <w:rPr>
-          <w:b/>
-        </w:rPr>
-        <w:t xml:space="preserve">New query with it</w:t>
-      </w:r>
-      <w:r>
-        <w:t xml:space="preserve">, or add it to an open query. On the query a click on the picture opens the same sheet zoomed to the same area, or the 3D model with the same camera, section box and plane. Remove a picture with its ✕.</w:t>
+        <w:t xml:space="preserve"> menu). A small menu asks where the picture goes: type a subject and </w:t>
+      </w:r>
+      <w:r>
+        <w:rPr>
+          <w:b/>
+        </w:rPr>
+        <w:t xml:space="preserve">Create</w:t>
+      </w:r>
+      <w:r>
+        <w:t xml:space="preserve"> for a new query, or click one of the project's open queries (the one you used last is on top: </w:t>
+      </w:r>
+      <w:r>
+        <w:rPr>
+          <w:b/>
+        </w:rPr>
+        <w:t xml:space="preserve">Add another to Q-...</w:t>
+      </w:r>
+      <w:r>
+        <w:t xml:space="preserve">). </w:t>
+      </w:r>
+      <w:r>
+        <w:rPr>
+          <w:b/>
+        </w:rPr>
+        <w:t xml:space="preserve">After adding:</w:t>
+      </w:r>
+      <w:r>
+        <w:t xml:space="preserve"> </w:t>
+      </w:r>
+      <w:r>
+        <w:rPr>
+          <w:b/>
+        </w:rPr>
+        <w:t xml:space="preserve">Stay here</w:t>
+      </w:r>
+      <w:r>
+        <w:t xml:space="preserve"> (a note confirms it, and you move to the next sheet or 3D view and click </w:t>
+      </w:r>
+      <w:r>
+        <w:rPr>
+          <w:b/>
+        </w:rPr>
+        <w:t xml:space="preserve">+ Query</w:t>
+      </w:r>
+      <w:r>
+        <w:t xml:space="preserve"> again - so one query can hold several 2D and 3D views) or </w:t>
+      </w:r>
+      <w:r>
+        <w:rPr>
+          <w:b/>
+        </w:rPr>
+        <w:t xml:space="preserve">Open the query</w:t>
+      </w:r>
+      <w:r>
+        <w:t xml:space="preserve"> (opens it in Tasks). Your choice is remembered. Anyone on the project can add pictures to a query.</w:t>
+      </w:r>
+    </w:p>
+    <w:p>
+      <w:pPr>
+        <w:pStyle w:val="ListParagraph"/>
+        <w:numPr>
+          <w:ilvl w:val="0"/>
+          <w:numId w:val="22"/>
+        </w:numPr>
+      </w:pPr>
+      <w:r>
+        <w:rPr>
+          <w:b/>
+        </w:rPr>
+        <w:t xml:space="preserve">Opening a picture:</w:t>
+      </w:r>
+      <w:r>
+        <w:t xml:space="preserve"> on the query, a click on a sheet picture opens the same sheet zoomed to the same area; a 3D picture opens the model with the same camera, section box and plane. Remove a picture with its ✕ (who raised it, who it is to, or a project admin).</w:t>
+      </w:r>
+    </w:p>
+    <w:p>
+      <w:pPr>
+        <w:pStyle w:val="ListParagraph"/>
+        <w:numPr>
+          <w:ilvl w:val="0"/>
+          <w:numId w:val="22"/>
+        </w:numPr>
+      </w:pPr>
+      <w:r>
+        <w:rPr>
+          <w:b/>
+        </w:rPr>
+        <w:t xml:space="preserve">Pictures of your own:</w:t>
+      </w:r>
+      <w:r>
+        <w:t xml:space="preserve"> under </w:t>
+      </w:r>
+      <w:r>
+        <w:rPr>
+          <w:b/>
+        </w:rPr>
+        <w:t xml:space="preserve">Pictures &amp; views</w:t>
+      </w:r>
+      <w:r>
+        <w:t xml:space="preserve">, </w:t>
+      </w:r>
+      <w:r>
+        <w:rPr>
+          <w:b/>
+        </w:rPr>
+        <w:t xml:space="preserve">+ Add picture</w:t>
+      </w:r>
+      <w:r>
+        <w:t xml:space="preserve"> adds image files (site photos, a consultant's markup, a screenshot saved before); or paste a screenshot (</w:t>
+      </w:r>
+      <w:r>
+        <w:rPr>
+          <w:b/>
+        </w:rPr>
+        <w:t xml:space="preserve">Ctrl+V</w:t>
+      </w:r>
+      <w:r>
+        <w:t xml:space="preserve">) or drop pictures anywhere on the query panel. The </w:t>
+      </w:r>
+      <w:r>
+        <w:rPr>
+          <w:b/>
+        </w:rPr>
+        <w:t xml:space="preserve">New query</w:t>
+      </w:r>
+      <w:r>
+        <w:t xml:space="preserve"> form takes them the same way. A click shows a picture full size; </w:t>
+      </w:r>
+      <w:r>
+        <w:rPr>
+          <w:b/>
+        </w:rPr>
+        <w:t xml:space="preserve">‹ ›</w:t>
+      </w:r>
+      <w:r>
+        <w:t xml:space="preserve"> or the arrow keys go through the query's pictures, </w:t>
+      </w:r>
+      <w:r>
+        <w:rPr>
+          <w:b/>
+        </w:rPr>
+        <w:t xml:space="preserve">Esc</w:t>
+      </w:r>
+      <w:r>
+        <w:t xml:space="preserve"> closes. They are in the report too.</w:t>
       </w:r>
     </w:p>
     <w:p>
@@ -27409,6 +27553,90 @@
             <w:pPr/>
             <w:r>
               <w:t xml:space="preserve">Your connection dropped. Keep the page open; it saves when the connection returns</w:t>
+            </w:r>
+          </w:p>
+        </w:tc>
+      </w:tr>
+      <w:tr>
+        <w:tc>
+          <w:tcPr>
+            <w:tcW w:w="4680" w:type="dxa"/>
+          </w:tcPr>
+          <w:p>
+            <w:pPr/>
+            <w:r>
+              <w:t xml:space="preserve">The header says </w:t>
+            </w:r>
+            <w:r>
+              <w:rPr>
+                <w:b/>
+              </w:rPr>
+              <w:t xml:space="preserve">Offline</w:t>
+            </w:r>
+            <w:r>
+              <w:t xml:space="preserve"> (or </w:t>
+            </w:r>
+            <w:r>
+              <w:rPr>
+                <w:b/>
+              </w:rPr>
+              <w:t xml:space="preserve">Server busy</w:t>
+            </w:r>
+            <w:r>
+              <w:t xml:space="preserve">)</w:t>
+            </w:r>
+          </w:p>
+        </w:tc>
+        <w:tc>
+          <w:tcPr>
+            <w:tcW w:w="4680" w:type="dxa"/>
+          </w:tcPr>
+          <w:p>
+            <w:pPr/>
+            <w:r>
+              <w:t xml:space="preserve">Point at it for the reason. </w:t>
+            </w:r>
+            <w:r>
+              <w:rPr>
+                <w:b/>
+              </w:rPr>
+              <w:t xml:space="preserve">The server did not answer:</w:t>
+            </w:r>
+            <w:r>
+              <w:t xml:space="preserve"> on the server PC check the server window is still open (start </w:t>
+            </w:r>
+            <w:r>
+              <w:rPr>
+                <w:b/>
+              </w:rPr>
+              <w:t xml:space="preserve">server\run.bat</w:t>
+            </w:r>
+            <w:r>
+              <w:t xml:space="preserve"> again, also after each update), and </w:t>
+            </w:r>
+            <w:r>
+              <w:rPr>
+                <w:b/>
+              </w:rPr>
+              <w:t xml:space="preserve">tunnel.bat</w:t>
+            </w:r>
+            <w:r>
+              <w:t xml:space="preserve"> when you use the link from outside the office; on the server PC, http://127.0.0.1:8713/api/ping should answer. </w:t>
+            </w:r>
+            <w:r>
+              <w:rPr>
+                <w:b/>
+              </w:rPr>
+              <w:t xml:space="preserve">Server busy:</w:t>
+            </w:r>
+            <w:r>
+              <w:t xml:space="preserve"> the server is running but answered too slowly; it comes back by itself - if it happens often, an admin can look at </w:t>
+            </w:r>
+            <w:r>
+              <w:rPr>
+                <w:b/>
+              </w:rPr>
+              <w:t xml:space="preserve">Admin &gt; Performance</w:t>
             </w:r>
           </w:p>
         </w:tc>

</xml_diff>

<commit_message>
Drag sub-tasks into order or under another task; one dashboard per project, and my own dashboards
- Tasks > List: a sub-task dropped above another sub-task goes there (same
  task: new order; another task: moved under it); on a task's + Add
  sub-task line it becomes that task's last; above a top-level row it
  becomes a task. A task's panel: drag its sub-tasks into another order.
- Dashboard: a project of several parts (e.g. TKO CAL + LAY) shows all of
  them together (?reg=), with a Part filter, open issues by part, part
  names in Where and a publishing table per part; All parts / one part
  under the title and in the project picker.
- My dashboards (?board=): several projects or parts together, kept per
  person on the server (/api/dashboards); + Combine projects, Edit, Delete.
- What's new 2026-12-16, manuals EN / YUE.

Co-Authored-By: Claude Opus 5.5 <noreply@anthropic.com>
Claude-Session: https://claude.ai/code/session_01HMFznQ3NqvEPBkq88avjvR
</commit_message>
<xml_diff>
--- a/docs/manual/LWK_Viewer_User_Manual_EN.docx
+++ b/docs/manual/LWK_Viewer_User_Manual_EN.docx
@@ -1948,6 +1948,141 @@
         </w:numPr>
       </w:pPr>
       <w:r>
+        <w:rPr>
+          <w:b/>
+        </w:rPr>
+        <w:t xml:space="preserve">A whole project on one dashboard:</w:t>
+      </w:r>
+      <w:r>
+        <w:t xml:space="preserve"> a project made of several models or sheet sets (e.g. TKO with its CAL and LAY files) opens on one dashboard of all its parts together: the counts and charts add them up, the </w:t>
+      </w:r>
+      <w:r>
+        <w:rPr>
+          <w:b/>
+        </w:rPr>
+        <w:t xml:space="preserve">Part</w:t>
+      </w:r>
+      <w:r>
+        <w:t xml:space="preserve"> filter and </w:t>
+      </w:r>
+      <w:r>
+        <w:rPr>
+          <w:b/>
+        </w:rPr>
+        <w:t xml:space="preserve">Open issues by part</w:t>
+      </w:r>
+      <w:r>
+        <w:t xml:space="preserve"> tell them apart, </w:t>
+      </w:r>
+      <w:r>
+        <w:rPr>
+          <w:b/>
+        </w:rPr>
+        <w:t xml:space="preserve">Where</w:t>
+      </w:r>
+      <w:r>
+        <w:t xml:space="preserve"> names the part (CAL · A102 ...), and </w:t>
+      </w:r>
+      <w:r>
+        <w:rPr>
+          <w:b/>
+        </w:rPr>
+        <w:t xml:space="preserve">How this project is published</w:t>
+      </w:r>
+      <w:r>
+        <w:t xml:space="preserve"> has a table per part. Under the title, </w:t>
+      </w:r>
+      <w:r>
+        <w:rPr>
+          <w:b/>
+        </w:rPr>
+        <w:t xml:space="preserve">All parts</w:t>
+      </w:r>
+      <w:r>
+        <w:t xml:space="preserve"> / </w:t>
+      </w:r>
+      <w:r>
+        <w:rPr>
+          <w:b/>
+        </w:rPr>
+        <w:t xml:space="preserve">CAL</w:t>
+      </w:r>
+      <w:r>
+        <w:t xml:space="preserve"> / </w:t>
+      </w:r>
+      <w:r>
+        <w:rPr>
+          <w:b/>
+        </w:rPr>
+        <w:t xml:space="preserve">LAY</w:t>
+      </w:r>
+      <w:r>
+        <w:t xml:space="preserve"> switch to one part and back. In the project picker on the Dashboard, the project's name opens all its parts, a part opens that part.</w:t>
+      </w:r>
+    </w:p>
+    <w:p>
+      <w:pPr>
+        <w:pStyle w:val="ListParagraph"/>
+        <w:numPr>
+          <w:ilvl w:val="0"/>
+          <w:numId w:val="8"/>
+        </w:numPr>
+      </w:pPr>
+      <w:r>
+        <w:rPr>
+          <w:b/>
+        </w:rPr>
+        <w:t xml:space="preserve">My dashboards - several projects together:</w:t>
+      </w:r>
+      <w:r>
+        <w:t xml:space="preserve"> </w:t>
+      </w:r>
+      <w:r>
+        <w:rPr>
+          <w:b/>
+        </w:rPr>
+        <w:t xml:space="preserve">+ Combine projects …</w:t>
+      </w:r>
+      <w:r>
+        <w:t xml:space="preserve"> (under the title, or in the project picker) makes your own dashboard: give it a name and tick projects (all their parts, also ones added later) or single parts. It is kept for you and listed under </w:t>
+      </w:r>
+      <w:r>
+        <w:rPr>
+          <w:b/>
+        </w:rPr>
+        <w:t xml:space="preserve">My dashboards</w:t>
+      </w:r>
+      <w:r>
+        <w:t xml:space="preserve"> on any device; </w:t>
+      </w:r>
+      <w:r>
+        <w:rPr>
+          <w:b/>
+        </w:rPr>
+        <w:t xml:space="preserve">Edit</w:t>
+      </w:r>
+      <w:r>
+        <w:t xml:space="preserve"> and </w:t>
+      </w:r>
+      <w:r>
+        <w:rPr>
+          <w:b/>
+        </w:rPr>
+        <w:t xml:space="preserve">Delete</w:t>
+      </w:r>
+      <w:r>
+        <w:t xml:space="preserve"> are beside it when it is open. The printable report is per part: choose a part in the Part filter first (the spreadsheet takes them all, with a Part column).</w:t>
+      </w:r>
+    </w:p>
+    <w:p>
+      <w:pPr>
+        <w:pStyle w:val="ListParagraph"/>
+        <w:numPr>
+          <w:ilvl w:val="0"/>
+          <w:numId w:val="8"/>
+        </w:numPr>
+      </w:pPr>
+      <w:r>
         <w:t xml:space="preserve">The connection chip appears only when there is something to say: </w:t>
       </w:r>
       <w:r>
@@ -4481,6 +4616,33 @@
       </w:r>
       <w:r>
         <w:t xml:space="preserve"> takes the whole paste back.</w:t>
+      </w:r>
+    </w:p>
+    <w:p>
+      <w:pPr>
+        <w:pStyle w:val="ListParagraph"/>
+        <w:numPr>
+          <w:ilvl w:val="0"/>
+          <w:numId w:val="19"/>
+        </w:numPr>
+      </w:pPr>
+      <w:r>
+        <w:rPr>
+          <w:b/>
+        </w:rPr>
+        <w:t xml:space="preserve">Arranging sub-tasks by dragging:</w:t>
+      </w:r>
+      <w:r>
+        <w:t xml:space="preserve"> in the List, drag a sub-task above another sub-task to put it there - in the same task (a new order) or under another task. Drop it on a task's </w:t>
+      </w:r>
+      <w:r>
+        <w:rPr>
+          <w:b/>
+        </w:rPr>
+        <w:t xml:space="preserve">+ Add sub-task</w:t>
+      </w:r>
+      <w:r>
+        <w:t xml:space="preserve"> line to make it that task's last sub-task; drop it above a top-level row (or on the group) to make it a task of its own. In a task's panel, drag the sub-tasks (⋮⋮) into another order. A task cannot go under its own sub-task. When the List is sorted by a column, the order is kept but shown once you go back to your own order.</w:t>
       </w:r>
     </w:p>
     <w:p>

</xml_diff>

<commit_message>
Mark up a query's pictures; + Sheet view / + 3D view from a query
- picedit.js: the issue snapshot's markup tools (markup.js) on any
  picture; the drawing is kept beside the picture as taken (view.clean,
  view.markup) so it can be changed again. A query's pictures and the New
  query form get a mark-up button; + Query can mark up before adding.
- + Sheet view / + 3D view (query and New query form): opens the sheets /
  3D model with a bar naming the query; that query is offered first by
  + Query there. A project of several parts asks which.
- A sheet's captured picture leaves out the query badges.
- What's new 2026-12-17, manuals EN / YUE.

Co-Authored-By: Claude Opus 5.5 <noreply@anthropic.com>
Claude-Session: https://claude.ai/code/session_01HMFznQ3NqvEPBkq88avjvR
</commit_message>
<xml_diff>
--- a/docs/manual/LWK_Viewer_User_Manual_EN.docx
+++ b/docs/manual/LWK_Viewer_User_Manual_EN.docx
@@ -5270,6 +5270,105 @@
       </w:r>
       <w:r>
         <w:t xml:space="preserve"> closes. They are in the report too.</w:t>
+      </w:r>
+    </w:p>
+    <w:p>
+      <w:pPr>
+        <w:pStyle w:val="ListParagraph"/>
+        <w:numPr>
+          <w:ilvl w:val="0"/>
+          <w:numId w:val="22"/>
+        </w:numPr>
+      </w:pPr>
+      <w:r>
+        <w:rPr>
+          <w:b/>
+        </w:rPr>
+        <w:t xml:space="preserve">Marking up a picture:</w:t>
+      </w:r>
+      <w:r>
+        <w:t xml:space="preserve"> the ✎ on any picture of a query - a sheet or 3D view, or a picture of your own - opens the same markup tools as an issue's snapshot: cloud, rectangle, circle, arrow, line, pen, text, text box, callout, with colour, weight and text size. </w:t>
+      </w:r>
+      <w:r>
+        <w:rPr>
+          <w:b/>
+        </w:rPr>
+        <w:t xml:space="preserve">Done</w:t>
+      </w:r>
+      <w:r>
+        <w:t xml:space="preserve"> keeps the drawing on the picture; the ✎ shows how many marks it has, and opening it again brings the drawing back to change (the picture as taken is kept underneath). In the </w:t>
+      </w:r>
+      <w:r>
+        <w:rPr>
+          <w:b/>
+        </w:rPr>
+        <w:t xml:space="preserve">+ Query</w:t>
+      </w:r>
+      <w:r>
+        <w:t xml:space="preserve"> menu on a sheet or in 3D, tick </w:t>
+      </w:r>
+      <w:r>
+        <w:rPr>
+          <w:b/>
+        </w:rPr>
+        <w:t xml:space="preserve">Mark up the picture first</w:t>
+      </w:r>
+      <w:r>
+        <w:t xml:space="preserve"> to draw on the view before it is added.</w:t>
+      </w:r>
+    </w:p>
+    <w:p>
+      <w:pPr>
+        <w:pStyle w:val="ListParagraph"/>
+        <w:numPr>
+          <w:ilvl w:val="0"/>
+          <w:numId w:val="22"/>
+        </w:numPr>
+      </w:pPr>
+      <w:r>
+        <w:rPr>
+          <w:b/>
+        </w:rPr>
+        <w:t xml:space="preserve">+ Sheet view / + 3D view:</w:t>
+      </w:r>
+      <w:r>
+        <w:t xml:space="preserve"> in a query (and in the </w:t>
+      </w:r>
+      <w:r>
+        <w:rPr>
+          <w:b/>
+        </w:rPr>
+        <w:t xml:space="preserve">New query</w:t>
+      </w:r>
+      <w:r>
+        <w:t xml:space="preserve"> form, which raises the query first) these open the project's sheets or 3D model with a bar saying which query you are adding to; go to the view and click </w:t>
+      </w:r>
+      <w:r>
+        <w:rPr>
+          <w:b/>
+        </w:rPr>
+        <w:t xml:space="preserve">+ Query</w:t>
+      </w:r>
+      <w:r>
+        <w:t xml:space="preserve"> (or right-click &gt; </w:t>
+      </w:r>
+      <w:r>
+        <w:rPr>
+          <w:b/>
+        </w:rPr>
+        <w:t xml:space="preserve">Add to query here</w:t>
+      </w:r>
+      <w:r>
+        <w:t xml:space="preserve">) - that query is offered first. </w:t>
+      </w:r>
+      <w:r>
+        <w:rPr>
+          <w:b/>
+        </w:rPr>
+        <w:t xml:space="preserve">Back to the query</w:t>
+      </w:r>
+      <w:r>
+        <w:t xml:space="preserve"> returns. A project of several parts asks which part.</w:t>
       </w:r>
     </w:p>
     <w:p>

</xml_diff>

<commit_message>
3D: section box round an element, see-through elements/types/categories; Publisher role in manual
Right-click or Selection panel: Section box around this element; See-through
for an element, its type or category (and Model browser groups); Make all
solid again. Manuals list the Publisher role needed to publish from Revit.

Co-Authored-By: Claude Opus 5.5 <noreply@anthropic.com>
Claude-Session: https://claude.ai/code/session_01HMFznQ3NqvEPBkq88avjvR
</commit_message>
<xml_diff>
--- a/docs/manual/LWK_Viewer_User_Manual_EN.docx
+++ b/docs/manual/LWK_Viewer_User_Manual_EN.docx
@@ -598,6 +598,15 @@
         <w:rPr>
           <w:b/>
         </w:rPr>
+        <w:t xml:space="preserve">Publisher</w:t>
+      </w:r>
+      <w:r>
+        <w:t xml:space="preserve">, </w:t>
+      </w:r>
+      <w:r>
+        <w:rPr>
+          <w:b/>
+        </w:rPr>
         <w:t xml:space="preserve">Member</w:t>
       </w:r>
       <w:r>
@@ -610,7 +619,7 @@
         <w:t xml:space="preserve">Viewer</w:t>
       </w:r>
       <w:r>
-        <w:t xml:space="preserve"> (see For admins). A Viewer sees a banner saying they can look and read but not change anything.</w:t>
+        <w:t xml:space="preserve"> (see For admins). Only a Publisher or project admin can publish from Revit. A Viewer sees a banner saying they can look and read but not change anything.</w:t>
       </w:r>
     </w:p>
     <w:p>
@@ -13831,6 +13840,33 @@
         <w:rPr>
           <w:b/>
         </w:rPr>
+        <w:t xml:space="preserve">Section box around this element</w:t>
+      </w:r>
+      <w:r>
+        <w:t xml:space="preserve">, </w:t>
+      </w:r>
+      <w:r>
+        <w:rPr>
+          <w:b/>
+        </w:rPr>
+        <w:t xml:space="preserve">See-through</w:t>
+      </w:r>
+      <w:r>
+        <w:t xml:space="preserve"> (this element, its type, or its whole category), </w:t>
+      </w:r>
+      <w:r>
+        <w:rPr>
+          <w:b/>
+        </w:rPr>
+        <w:t xml:space="preserve">Make all solid again</w:t>
+      </w:r>
+      <w:r>
+        <w:t xml:space="preserve">, </w:t>
+      </w:r>
+      <w:r>
+        <w:rPr>
+          <w:b/>
+        </w:rPr>
         <w:t xml:space="preserve">Section on this face</w:t>
       </w:r>
       <w:r>
@@ -16041,6 +16077,221 @@
     </w:p>
     <w:p>
       <w:pPr>
+        <w:pStyle w:val="ListParagraph"/>
+        <w:numPr>
+          <w:ilvl w:val="0"/>
+          <w:numId w:val="64"/>
+        </w:numPr>
+      </w:pPr>
+      <w:r>
+        <w:rPr>
+          <w:b/>
+        </w:rPr>
+        <w:t xml:space="preserve">Section box round one element:</w:t>
+      </w:r>
+      <w:r>
+        <w:t xml:space="preserve"> click it and press </w:t>
+      </w:r>
+      <w:r>
+        <w:rPr>
+          <w:b/>
+        </w:rPr>
+        <w:t xml:space="preserve">Section box</w:t>
+      </w:r>
+      <w:r>
+        <w:t xml:space="preserve"> in the Selection panel, or right-click it &gt; </w:t>
+      </w:r>
+      <w:r>
+        <w:rPr>
+          <w:b/>
+        </w:rPr>
+        <w:t xml:space="preserve">Section box around this element</w:t>
+      </w:r>
+      <w:r>
+        <w:t xml:space="preserve">. The box closes round that element with a little room on every side, and the view moves to it. In the </w:t>
+      </w:r>
+      <w:r>
+        <w:rPr>
+          <w:b/>
+        </w:rPr>
+        <w:t xml:space="preserve">Model browser</w:t>
+      </w:r>
+      <w:r>
+        <w:t xml:space="preserve">, tick or pick a group (a category, a type, a level) and press </w:t>
+      </w:r>
+      <w:r>
+        <w:rPr>
+          <w:b/>
+        </w:rPr>
+        <w:t xml:space="preserve">Section box</w:t>
+      </w:r>
+      <w:r>
+        <w:t xml:space="preserve"> for a box round all of them.</w:t>
+      </w:r>
+    </w:p>
+    <w:p>
+      <w:pPr>
+        <w:pStyle w:val="Heading3"/>
+      </w:pPr>
+      <w:r>
+        <w:t xml:space="preserve">See-through elements</w:t>
+      </w:r>
+    </w:p>
+    <w:p>
+      <w:pPr/>
+      <w:r>
+        <w:t xml:space="preserve">To look past walls, floors or ceilings without hiding them, make them see-through: they stay in place as a pale screen, and a click goes through them to what is behind.</w:t>
+      </w:r>
+    </w:p>
+    <w:p>
+      <w:pPr>
+        <w:pStyle w:val="ListParagraph"/>
+        <w:numPr>
+          <w:ilvl w:val="0"/>
+          <w:numId w:val="65"/>
+        </w:numPr>
+      </w:pPr>
+      <w:r>
+        <w:rPr>
+          <w:b/>
+        </w:rPr>
+        <w:t xml:space="preserve">One element:</w:t>
+      </w:r>
+      <w:r>
+        <w:t xml:space="preserve"> click it, then </w:t>
+      </w:r>
+      <w:r>
+        <w:rPr>
+          <w:b/>
+        </w:rPr>
+        <w:t xml:space="preserve">See-through</w:t>
+      </w:r>
+      <w:r>
+        <w:t xml:space="preserve"> in the Selection panel; or right-click &gt; </w:t>
+      </w:r>
+      <w:r>
+        <w:rPr>
+          <w:b/>
+        </w:rPr>
+        <w:t xml:space="preserve">See-through: this element</w:t>
+      </w:r>
+      <w:r>
+        <w:t xml:space="preserve">.</w:t>
+      </w:r>
+    </w:p>
+    <w:p>
+      <w:pPr>
+        <w:pStyle w:val="ListParagraph"/>
+        <w:numPr>
+          <w:ilvl w:val="0"/>
+          <w:numId w:val="65"/>
+        </w:numPr>
+      </w:pPr>
+      <w:r>
+        <w:rPr>
+          <w:b/>
+        </w:rPr>
+        <w:t xml:space="preserve">Its type or its whole category:</w:t>
+      </w:r>
+      <w:r>
+        <w:t xml:space="preserve"> right-click &gt; </w:t>
+      </w:r>
+      <w:r>
+        <w:rPr>
+          <w:b/>
+        </w:rPr>
+        <w:t xml:space="preserve">See-through: its type (n)</w:t>
+      </w:r>
+      <w:r>
+        <w:t xml:space="preserve"> or </w:t>
+      </w:r>
+      <w:r>
+        <w:rPr>
+          <w:b/>
+        </w:rPr>
+        <w:t xml:space="preserve">See-through: all Walls (n)</w:t>
+      </w:r>
+      <w:r>
+        <w:t xml:space="preserve"> (the name of its category).</w:t>
+      </w:r>
+    </w:p>
+    <w:p>
+      <w:pPr>
+        <w:pStyle w:val="ListParagraph"/>
+        <w:numPr>
+          <w:ilvl w:val="0"/>
+          <w:numId w:val="65"/>
+        </w:numPr>
+      </w:pPr>
+      <w:r>
+        <w:rPr>
+          <w:b/>
+        </w:rPr>
+        <w:t xml:space="preserve">A chosen group:</w:t>
+      </w:r>
+      <w:r>
+        <w:t xml:space="preserve"> in the </w:t>
+      </w:r>
+      <w:r>
+        <w:rPr>
+          <w:b/>
+        </w:rPr>
+        <w:t xml:space="preserve">Model browser</w:t>
+      </w:r>
+      <w:r>
+        <w:t xml:space="preserve">, search or pick a category, type or level and press </w:t>
+      </w:r>
+      <w:r>
+        <w:rPr>
+          <w:b/>
+        </w:rPr>
+        <w:t xml:space="preserve">See-through</w:t>
+      </w:r>
+      <w:r>
+        <w:t xml:space="preserve">.</w:t>
+      </w:r>
+    </w:p>
+    <w:p>
+      <w:pPr>
+        <w:pStyle w:val="ListParagraph"/>
+        <w:numPr>
+          <w:ilvl w:val="0"/>
+          <w:numId w:val="65"/>
+        </w:numPr>
+      </w:pPr>
+      <w:r>
+        <w:t xml:space="preserve">The Selection panel counts them (</w:t>
+      </w:r>
+      <w:r>
+        <w:rPr>
+          <w:b/>
+        </w:rPr>
+        <w:t xml:space="preserve">5 see-through</w:t>
+      </w:r>
+      <w:r>
+        <w:t xml:space="preserve">). </w:t>
+      </w:r>
+      <w:r>
+        <w:rPr>
+          <w:b/>
+        </w:rPr>
+        <w:t xml:space="preserve">Show all</w:t>
+      </w:r>
+      <w:r>
+        <w:t xml:space="preserve">, or right-click &gt; </w:t>
+      </w:r>
+      <w:r>
+        <w:rPr>
+          <w:b/>
+        </w:rPr>
+        <w:t xml:space="preserve">Make all solid again</w:t>
+      </w:r>
+      <w:r>
+        <w:t xml:space="preserve">, makes them solid.</w:t>
+      </w:r>
+    </w:p>
+    <w:p>
+      <w:pPr>
         <w:pStyle w:val="Heading2"/>
       </w:pPr>
       <w:r>
@@ -16066,7 +16317,7 @@
         <w:pStyle w:val="ListParagraph"/>
         <w:numPr>
           <w:ilvl w:val="0"/>
-          <w:numId w:val="65"/>
+          <w:numId w:val="66"/>
         </w:numPr>
       </w:pPr>
       <w:r>
@@ -16123,7 +16374,7 @@
         <w:pStyle w:val="ListParagraph"/>
         <w:numPr>
           <w:ilvl w:val="0"/>
-          <w:numId w:val="65"/>
+          <w:numId w:val="66"/>
         </w:numPr>
       </w:pPr>
       <w:r>
@@ -16135,7 +16386,7 @@
         <w:pStyle w:val="ListParagraph"/>
         <w:numPr>
           <w:ilvl w:val="0"/>
-          <w:numId w:val="65"/>
+          <w:numId w:val="66"/>
         </w:numPr>
       </w:pPr>
       <w:r>
@@ -16165,7 +16416,7 @@
         <w:pStyle w:val="ListParagraph"/>
         <w:numPr>
           <w:ilvl w:val="0"/>
-          <w:numId w:val="65"/>
+          <w:numId w:val="66"/>
         </w:numPr>
       </w:pPr>
       <w:r>
@@ -16591,7 +16842,7 @@
         <w:pStyle w:val="ListParagraph"/>
         <w:numPr>
           <w:ilvl w:val="0"/>
-          <w:numId w:val="66"/>
+          <w:numId w:val="67"/>
         </w:numPr>
       </w:pPr>
       <w:r>
@@ -16603,7 +16854,7 @@
         <w:pStyle w:val="ListParagraph"/>
         <w:numPr>
           <w:ilvl w:val="0"/>
-          <w:numId w:val="66"/>
+          <w:numId w:val="67"/>
         </w:numPr>
       </w:pPr>
       <w:r>
@@ -16615,7 +16866,7 @@
         <w:pStyle w:val="ListParagraph"/>
         <w:numPr>
           <w:ilvl w:val="0"/>
-          <w:numId w:val="66"/>
+          <w:numId w:val="67"/>
         </w:numPr>
       </w:pPr>
       <w:r>
@@ -16635,7 +16886,7 @@
         <w:pStyle w:val="ListParagraph"/>
         <w:numPr>
           <w:ilvl w:val="0"/>
-          <w:numId w:val="67"/>
+          <w:numId w:val="68"/>
         </w:numPr>
       </w:pPr>
       <w:r>
@@ -16662,7 +16913,7 @@
         <w:pStyle w:val="ListParagraph"/>
         <w:numPr>
           <w:ilvl w:val="0"/>
-          <w:numId w:val="67"/>
+          <w:numId w:val="68"/>
         </w:numPr>
       </w:pPr>
       <w:r>
@@ -16689,7 +16940,7 @@
         <w:pStyle w:val="ListParagraph"/>
         <w:numPr>
           <w:ilvl w:val="0"/>
-          <w:numId w:val="67"/>
+          <w:numId w:val="68"/>
         </w:numPr>
       </w:pPr>
       <w:r>
@@ -16795,7 +17046,7 @@
         <w:pStyle w:val="ListParagraph"/>
         <w:numPr>
           <w:ilvl w:val="0"/>
-          <w:numId w:val="68"/>
+          <w:numId w:val="69"/>
         </w:numPr>
       </w:pPr>
       <w:r>
@@ -16807,7 +17058,7 @@
         <w:pStyle w:val="ListParagraph"/>
         <w:numPr>
           <w:ilvl w:val="0"/>
-          <w:numId w:val="68"/>
+          <w:numId w:val="69"/>
         </w:numPr>
       </w:pPr>
       <w:r>
@@ -16819,7 +17070,7 @@
         <w:pStyle w:val="ListParagraph"/>
         <w:numPr>
           <w:ilvl w:val="0"/>
-          <w:numId w:val="68"/>
+          <w:numId w:val="69"/>
         </w:numPr>
       </w:pPr>
       <w:r>
@@ -16831,7 +17082,7 @@
         <w:pStyle w:val="ListParagraph"/>
         <w:numPr>
           <w:ilvl w:val="0"/>
-          <w:numId w:val="68"/>
+          <w:numId w:val="69"/>
         </w:numPr>
       </w:pPr>
       <w:r>
@@ -16843,7 +17094,7 @@
         <w:pStyle w:val="ListParagraph"/>
         <w:numPr>
           <w:ilvl w:val="0"/>
-          <w:numId w:val="68"/>
+          <w:numId w:val="69"/>
         </w:numPr>
       </w:pPr>
       <w:r>
@@ -16855,7 +17106,7 @@
         <w:pStyle w:val="ListParagraph"/>
         <w:numPr>
           <w:ilvl w:val="0"/>
-          <w:numId w:val="68"/>
+          <w:numId w:val="69"/>
         </w:numPr>
       </w:pPr>
       <w:r>
@@ -16867,7 +17118,7 @@
         <w:pStyle w:val="ListParagraph"/>
         <w:numPr>
           <w:ilvl w:val="0"/>
-          <w:numId w:val="68"/>
+          <w:numId w:val="69"/>
         </w:numPr>
       </w:pPr>
       <w:r>
@@ -16879,7 +17130,7 @@
         <w:pStyle w:val="ListParagraph"/>
         <w:numPr>
           <w:ilvl w:val="0"/>
-          <w:numId w:val="68"/>
+          <w:numId w:val="69"/>
         </w:numPr>
       </w:pPr>
       <w:r>
@@ -16891,7 +17142,7 @@
         <w:pStyle w:val="ListParagraph"/>
         <w:numPr>
           <w:ilvl w:val="0"/>
-          <w:numId w:val="68"/>
+          <w:numId w:val="69"/>
         </w:numPr>
       </w:pPr>
       <w:r>
@@ -16903,7 +17154,7 @@
         <w:pStyle w:val="ListParagraph"/>
         <w:numPr>
           <w:ilvl w:val="0"/>
-          <w:numId w:val="68"/>
+          <w:numId w:val="69"/>
         </w:numPr>
       </w:pPr>
       <w:r>
@@ -16915,7 +17166,7 @@
         <w:pStyle w:val="ListParagraph"/>
         <w:numPr>
           <w:ilvl w:val="0"/>
-          <w:numId w:val="68"/>
+          <w:numId w:val="69"/>
         </w:numPr>
       </w:pPr>
       <w:r>
@@ -16927,7 +17178,7 @@
         <w:pStyle w:val="ListParagraph"/>
         <w:numPr>
           <w:ilvl w:val="0"/>
-          <w:numId w:val="68"/>
+          <w:numId w:val="69"/>
         </w:numPr>
       </w:pPr>
       <w:r>
@@ -16939,7 +17190,7 @@
         <w:pStyle w:val="ListParagraph"/>
         <w:numPr>
           <w:ilvl w:val="0"/>
-          <w:numId w:val="69"/>
+          <w:numId w:val="70"/>
         </w:numPr>
       </w:pPr>
       <w:r>
@@ -16951,7 +17202,7 @@
         <w:pStyle w:val="ListParagraph"/>
         <w:numPr>
           <w:ilvl w:val="0"/>
-          <w:numId w:val="69"/>
+          <w:numId w:val="70"/>
         </w:numPr>
       </w:pPr>
       <w:r>
@@ -17044,7 +17295,7 @@
         <w:pStyle w:val="ListParagraph"/>
         <w:numPr>
           <w:ilvl w:val="0"/>
-          <w:numId w:val="69"/>
+          <w:numId w:val="70"/>
         </w:numPr>
       </w:pPr>
       <w:r>
@@ -17089,7 +17340,7 @@
         <w:pStyle w:val="ListParagraph"/>
         <w:numPr>
           <w:ilvl w:val="0"/>
-          <w:numId w:val="69"/>
+          <w:numId w:val="70"/>
         </w:numPr>
       </w:pPr>
       <w:r>
@@ -17116,7 +17367,7 @@
         <w:pStyle w:val="ListParagraph"/>
         <w:numPr>
           <w:ilvl w:val="0"/>
-          <w:numId w:val="69"/>
+          <w:numId w:val="70"/>
         </w:numPr>
       </w:pPr>
       <w:r>
@@ -17480,7 +17731,7 @@
         <w:pStyle w:val="ListParagraph"/>
         <w:numPr>
           <w:ilvl w:val="0"/>
-          <w:numId w:val="70"/>
+          <w:numId w:val="71"/>
         </w:numPr>
       </w:pPr>
       <w:r>
@@ -17492,7 +17743,7 @@
         <w:pStyle w:val="ListParagraph"/>
         <w:numPr>
           <w:ilvl w:val="0"/>
-          <w:numId w:val="70"/>
+          <w:numId w:val="71"/>
         </w:numPr>
       </w:pPr>
       <w:r>
@@ -17510,7 +17761,7 @@
         <w:pStyle w:val="ListParagraph"/>
         <w:numPr>
           <w:ilvl w:val="0"/>
-          <w:numId w:val="70"/>
+          <w:numId w:val="71"/>
         </w:numPr>
       </w:pPr>
       <w:r>
@@ -17531,7 +17782,7 @@
         <w:pStyle w:val="ListParagraph"/>
         <w:numPr>
           <w:ilvl w:val="0"/>
-          <w:numId w:val="70"/>
+          <w:numId w:val="71"/>
         </w:numPr>
       </w:pPr>
       <w:r>
@@ -17558,7 +17809,7 @@
         <w:pStyle w:val="ListParagraph"/>
         <w:numPr>
           <w:ilvl w:val="0"/>
-          <w:numId w:val="70"/>
+          <w:numId w:val="71"/>
         </w:numPr>
       </w:pPr>
       <w:r>
@@ -17570,7 +17821,7 @@
         <w:pStyle w:val="ListParagraph"/>
         <w:numPr>
           <w:ilvl w:val="0"/>
-          <w:numId w:val="70"/>
+          <w:numId w:val="71"/>
         </w:numPr>
       </w:pPr>
       <w:r>
@@ -17627,7 +17878,7 @@
         <w:pStyle w:val="ListParagraph"/>
         <w:numPr>
           <w:ilvl w:val="0"/>
-          <w:numId w:val="70"/>
+          <w:numId w:val="71"/>
         </w:numPr>
       </w:pPr>
       <w:r>
@@ -17663,7 +17914,7 @@
         <w:pStyle w:val="ListParagraph"/>
         <w:numPr>
           <w:ilvl w:val="0"/>
-          <w:numId w:val="70"/>
+          <w:numId w:val="71"/>
         </w:numPr>
       </w:pPr>
       <w:r>
@@ -17699,7 +17950,7 @@
         <w:pStyle w:val="ListParagraph"/>
         <w:numPr>
           <w:ilvl w:val="0"/>
-          <w:numId w:val="70"/>
+          <w:numId w:val="71"/>
         </w:numPr>
       </w:pPr>
       <w:r>
@@ -17735,7 +17986,7 @@
         <w:pStyle w:val="ListParagraph"/>
         <w:numPr>
           <w:ilvl w:val="0"/>
-          <w:numId w:val="70"/>
+          <w:numId w:val="71"/>
         </w:numPr>
       </w:pPr>
       <w:r>
@@ -17771,7 +18022,7 @@
         <w:pStyle w:val="ListParagraph"/>
         <w:numPr>
           <w:ilvl w:val="0"/>
-          <w:numId w:val="70"/>
+          <w:numId w:val="71"/>
         </w:numPr>
       </w:pPr>
       <w:r>
@@ -17807,7 +18058,7 @@
         <w:pStyle w:val="ListParagraph"/>
         <w:numPr>
           <w:ilvl w:val="0"/>
-          <w:numId w:val="70"/>
+          <w:numId w:val="71"/>
         </w:numPr>
       </w:pPr>
       <w:r>
@@ -17852,7 +18103,7 @@
         <w:pStyle w:val="ListParagraph"/>
         <w:numPr>
           <w:ilvl w:val="0"/>
-          <w:numId w:val="70"/>
+          <w:numId w:val="71"/>
         </w:numPr>
       </w:pPr>
       <w:r>
@@ -17933,7 +18184,7 @@
         <w:pStyle w:val="ListParagraph"/>
         <w:numPr>
           <w:ilvl w:val="0"/>
-          <w:numId w:val="70"/>
+          <w:numId w:val="71"/>
         </w:numPr>
       </w:pPr>
       <w:r>
@@ -18008,7 +18259,7 @@
         <w:pStyle w:val="ListParagraph"/>
         <w:numPr>
           <w:ilvl w:val="0"/>
-          <w:numId w:val="71"/>
+          <w:numId w:val="72"/>
         </w:numPr>
       </w:pPr>
       <w:r>
@@ -18020,7 +18271,7 @@
         <w:pStyle w:val="ListParagraph"/>
         <w:numPr>
           <w:ilvl w:val="0"/>
-          <w:numId w:val="71"/>
+          <w:numId w:val="72"/>
         </w:numPr>
       </w:pPr>
       <w:r>
@@ -18032,7 +18283,7 @@
         <w:pStyle w:val="ListParagraph"/>
         <w:numPr>
           <w:ilvl w:val="0"/>
-          <w:numId w:val="71"/>
+          <w:numId w:val="72"/>
         </w:numPr>
       </w:pPr>
       <w:r>
@@ -18044,7 +18295,7 @@
         <w:pStyle w:val="ListParagraph"/>
         <w:numPr>
           <w:ilvl w:val="0"/>
-          <w:numId w:val="71"/>
+          <w:numId w:val="72"/>
         </w:numPr>
       </w:pPr>
       <w:r>
@@ -18056,7 +18307,7 @@
         <w:pStyle w:val="ListParagraph"/>
         <w:numPr>
           <w:ilvl w:val="0"/>
-          <w:numId w:val="71"/>
+          <w:numId w:val="72"/>
         </w:numPr>
       </w:pPr>
       <w:r>
@@ -18068,7 +18319,7 @@
         <w:pStyle w:val="ListParagraph"/>
         <w:numPr>
           <w:ilvl w:val="0"/>
-          <w:numId w:val="71"/>
+          <w:numId w:val="72"/>
         </w:numPr>
       </w:pPr>
       <w:r>
@@ -18080,7 +18331,7 @@
         <w:pStyle w:val="ListParagraph"/>
         <w:numPr>
           <w:ilvl w:val="0"/>
-          <w:numId w:val="71"/>
+          <w:numId w:val="72"/>
         </w:numPr>
       </w:pPr>
       <w:r>
@@ -18092,7 +18343,7 @@
         <w:pStyle w:val="ListParagraph"/>
         <w:numPr>
           <w:ilvl w:val="0"/>
-          <w:numId w:val="71"/>
+          <w:numId w:val="72"/>
         </w:numPr>
       </w:pPr>
       <w:r>
@@ -18104,7 +18355,7 @@
         <w:pStyle w:val="ListParagraph"/>
         <w:numPr>
           <w:ilvl w:val="0"/>
-          <w:numId w:val="71"/>
+          <w:numId w:val="72"/>
         </w:numPr>
       </w:pPr>
       <w:r>
@@ -18116,7 +18367,7 @@
         <w:pStyle w:val="ListParagraph"/>
         <w:numPr>
           <w:ilvl w:val="0"/>
-          <w:numId w:val="71"/>
+          <w:numId w:val="72"/>
         </w:numPr>
       </w:pPr>
       <w:r>
@@ -18128,7 +18379,7 @@
         <w:pStyle w:val="ListParagraph"/>
         <w:numPr>
           <w:ilvl w:val="0"/>
-          <w:numId w:val="71"/>
+          <w:numId w:val="72"/>
         </w:numPr>
       </w:pPr>
       <w:r>
@@ -18140,7 +18391,7 @@
         <w:pStyle w:val="ListParagraph"/>
         <w:numPr>
           <w:ilvl w:val="0"/>
-          <w:numId w:val="71"/>
+          <w:numId w:val="72"/>
         </w:numPr>
       </w:pPr>
       <w:r>
@@ -18152,7 +18403,7 @@
         <w:pStyle w:val="ListParagraph"/>
         <w:numPr>
           <w:ilvl w:val="0"/>
-          <w:numId w:val="71"/>
+          <w:numId w:val="72"/>
         </w:numPr>
       </w:pPr>
       <w:r>
@@ -18211,7 +18462,7 @@
         <w:pStyle w:val="ListParagraph"/>
         <w:numPr>
           <w:ilvl w:val="0"/>
-          <w:numId w:val="72"/>
+          <w:numId w:val="73"/>
         </w:numPr>
       </w:pPr>
       <w:r>
@@ -18223,7 +18474,7 @@
         <w:pStyle w:val="ListParagraph"/>
         <w:numPr>
           <w:ilvl w:val="0"/>
-          <w:numId w:val="72"/>
+          <w:numId w:val="73"/>
         </w:numPr>
       </w:pPr>
       <w:r>
@@ -18235,7 +18486,7 @@
         <w:pStyle w:val="ListParagraph"/>
         <w:numPr>
           <w:ilvl w:val="0"/>
-          <w:numId w:val="72"/>
+          <w:numId w:val="73"/>
         </w:numPr>
       </w:pPr>
       <w:r>
@@ -18247,7 +18498,7 @@
         <w:pStyle w:val="ListParagraph"/>
         <w:numPr>
           <w:ilvl w:val="0"/>
-          <w:numId w:val="72"/>
+          <w:numId w:val="73"/>
         </w:numPr>
       </w:pPr>
       <w:r>
@@ -18259,7 +18510,7 @@
         <w:pStyle w:val="ListParagraph"/>
         <w:numPr>
           <w:ilvl w:val="0"/>
-          <w:numId w:val="72"/>
+          <w:numId w:val="73"/>
         </w:numPr>
       </w:pPr>
       <w:r>
@@ -18271,7 +18522,7 @@
         <w:pStyle w:val="ListParagraph"/>
         <w:numPr>
           <w:ilvl w:val="0"/>
-          <w:numId w:val="72"/>
+          <w:numId w:val="73"/>
         </w:numPr>
       </w:pPr>
       <w:r>
@@ -18283,7 +18534,7 @@
         <w:pStyle w:val="ListParagraph"/>
         <w:numPr>
           <w:ilvl w:val="0"/>
-          <w:numId w:val="72"/>
+          <w:numId w:val="73"/>
         </w:numPr>
       </w:pPr>
       <w:r>
@@ -18295,7 +18546,7 @@
         <w:pStyle w:val="ListParagraph"/>
         <w:numPr>
           <w:ilvl w:val="0"/>
-          <w:numId w:val="72"/>
+          <w:numId w:val="73"/>
         </w:numPr>
       </w:pPr>
       <w:r>
@@ -18307,7 +18558,7 @@
         <w:pStyle w:val="ListParagraph"/>
         <w:numPr>
           <w:ilvl w:val="0"/>
-          <w:numId w:val="72"/>
+          <w:numId w:val="73"/>
         </w:numPr>
       </w:pPr>
       <w:r>
@@ -18319,7 +18570,7 @@
         <w:pStyle w:val="ListParagraph"/>
         <w:numPr>
           <w:ilvl w:val="0"/>
-          <w:numId w:val="72"/>
+          <w:numId w:val="73"/>
         </w:numPr>
       </w:pPr>
       <w:r>
@@ -18331,7 +18582,7 @@
         <w:pStyle w:val="ListParagraph"/>
         <w:numPr>
           <w:ilvl w:val="0"/>
-          <w:numId w:val="73"/>
+          <w:numId w:val="74"/>
         </w:numPr>
       </w:pPr>
       <w:r>
@@ -18385,7 +18636,7 @@
         <w:pStyle w:val="ListParagraph"/>
         <w:numPr>
           <w:ilvl w:val="0"/>
-          <w:numId w:val="73"/>
+          <w:numId w:val="74"/>
         </w:numPr>
       </w:pPr>
       <w:r>
@@ -18439,7 +18690,7 @@
         <w:pStyle w:val="ListParagraph"/>
         <w:numPr>
           <w:ilvl w:val="0"/>
-          <w:numId w:val="73"/>
+          <w:numId w:val="74"/>
         </w:numPr>
       </w:pPr>
       <w:r>
@@ -18493,7 +18744,7 @@
         <w:pStyle w:val="ListParagraph"/>
         <w:numPr>
           <w:ilvl w:val="0"/>
-          <w:numId w:val="73"/>
+          <w:numId w:val="74"/>
         </w:numPr>
       </w:pPr>
       <w:r>
@@ -18541,7 +18792,7 @@
         <w:pStyle w:val="ListParagraph"/>
         <w:numPr>
           <w:ilvl w:val="0"/>
-          <w:numId w:val="73"/>
+          <w:numId w:val="74"/>
         </w:numPr>
       </w:pPr>
       <w:r>
@@ -18586,7 +18837,7 @@
         <w:pStyle w:val="ListParagraph"/>
         <w:numPr>
           <w:ilvl w:val="0"/>
-          <w:numId w:val="73"/>
+          <w:numId w:val="74"/>
         </w:numPr>
       </w:pPr>
       <w:r>
@@ -18649,7 +18900,7 @@
         <w:pStyle w:val="ListParagraph"/>
         <w:numPr>
           <w:ilvl w:val="0"/>
-          <w:numId w:val="73"/>
+          <w:numId w:val="74"/>
         </w:numPr>
       </w:pPr>
       <w:r>
@@ -18667,7 +18918,7 @@
         <w:pStyle w:val="ListParagraph"/>
         <w:numPr>
           <w:ilvl w:val="0"/>
-          <w:numId w:val="73"/>
+          <w:numId w:val="74"/>
         </w:numPr>
       </w:pPr>
       <w:r>
@@ -18718,7 +18969,7 @@
         <w:pStyle w:val="ListParagraph"/>
         <w:numPr>
           <w:ilvl w:val="0"/>
-          <w:numId w:val="74"/>
+          <w:numId w:val="75"/>
         </w:numPr>
       </w:pPr>
       <w:r>
@@ -18730,7 +18981,7 @@
         <w:pStyle w:val="ListParagraph"/>
         <w:numPr>
           <w:ilvl w:val="0"/>
-          <w:numId w:val="74"/>
+          <w:numId w:val="75"/>
         </w:numPr>
       </w:pPr>
       <w:r>
@@ -18742,7 +18993,7 @@
         <w:pStyle w:val="ListParagraph"/>
         <w:numPr>
           <w:ilvl w:val="0"/>
-          <w:numId w:val="74"/>
+          <w:numId w:val="75"/>
         </w:numPr>
       </w:pPr>
       <w:r>
@@ -18754,7 +19005,7 @@
         <w:pStyle w:val="ListParagraph"/>
         <w:numPr>
           <w:ilvl w:val="0"/>
-          <w:numId w:val="74"/>
+          <w:numId w:val="75"/>
         </w:numPr>
       </w:pPr>
       <w:r>
@@ -18766,7 +19017,7 @@
         <w:pStyle w:val="ListParagraph"/>
         <w:numPr>
           <w:ilvl w:val="0"/>
-          <w:numId w:val="74"/>
+          <w:numId w:val="75"/>
         </w:numPr>
       </w:pPr>
       <w:r>
@@ -18778,7 +19029,7 @@
         <w:pStyle w:val="ListParagraph"/>
         <w:numPr>
           <w:ilvl w:val="0"/>
-          <w:numId w:val="74"/>
+          <w:numId w:val="75"/>
         </w:numPr>
       </w:pPr>
       <w:r>
@@ -18790,7 +19041,7 @@
         <w:pStyle w:val="ListParagraph"/>
         <w:numPr>
           <w:ilvl w:val="0"/>
-          <w:numId w:val="74"/>
+          <w:numId w:val="75"/>
         </w:numPr>
       </w:pPr>
       <w:r>
@@ -18802,7 +19053,7 @@
         <w:pStyle w:val="ListParagraph"/>
         <w:numPr>
           <w:ilvl w:val="0"/>
-          <w:numId w:val="74"/>
+          <w:numId w:val="75"/>
         </w:numPr>
       </w:pPr>
       <w:r>
@@ -18814,7 +19065,7 @@
         <w:pStyle w:val="ListParagraph"/>
         <w:numPr>
           <w:ilvl w:val="0"/>
-          <w:numId w:val="74"/>
+          <w:numId w:val="75"/>
         </w:numPr>
       </w:pPr>
       <w:r>
@@ -18826,7 +19077,7 @@
         <w:pStyle w:val="ListParagraph"/>
         <w:numPr>
           <w:ilvl w:val="0"/>
-          <w:numId w:val="74"/>
+          <w:numId w:val="75"/>
         </w:numPr>
       </w:pPr>
       <w:r>
@@ -18870,7 +19121,7 @@
         <w:pStyle w:val="ListParagraph"/>
         <w:numPr>
           <w:ilvl w:val="0"/>
-          <w:numId w:val="75"/>
+          <w:numId w:val="76"/>
         </w:numPr>
       </w:pPr>
       <w:r>
@@ -18897,7 +19148,7 @@
         <w:pStyle w:val="ListParagraph"/>
         <w:numPr>
           <w:ilvl w:val="0"/>
-          <w:numId w:val="75"/>
+          <w:numId w:val="76"/>
         </w:numPr>
       </w:pPr>
       <w:r>
@@ -18915,7 +19166,7 @@
         <w:pStyle w:val="ListParagraph"/>
         <w:numPr>
           <w:ilvl w:val="0"/>
-          <w:numId w:val="75"/>
+          <w:numId w:val="76"/>
         </w:numPr>
       </w:pPr>
       <w:r>
@@ -18933,7 +19184,7 @@
         <w:pStyle w:val="ListParagraph"/>
         <w:numPr>
           <w:ilvl w:val="0"/>
-          <w:numId w:val="75"/>
+          <w:numId w:val="76"/>
         </w:numPr>
       </w:pPr>
       <w:r>
@@ -19005,7 +19256,7 @@
         <w:pStyle w:val="ListParagraph"/>
         <w:numPr>
           <w:ilvl w:val="0"/>
-          <w:numId w:val="75"/>
+          <w:numId w:val="76"/>
         </w:numPr>
       </w:pPr>
       <w:r>
@@ -19032,7 +19283,7 @@
         <w:pStyle w:val="ListParagraph"/>
         <w:numPr>
           <w:ilvl w:val="0"/>
-          <w:numId w:val="76"/>
+          <w:numId w:val="77"/>
         </w:numPr>
       </w:pPr>
       <w:r>
@@ -19044,7 +19295,7 @@
         <w:pStyle w:val="ListParagraph"/>
         <w:numPr>
           <w:ilvl w:val="0"/>
-          <w:numId w:val="76"/>
+          <w:numId w:val="77"/>
         </w:numPr>
       </w:pPr>
       <w:r>
@@ -19071,7 +19322,7 @@
         <w:pStyle w:val="ListParagraph"/>
         <w:numPr>
           <w:ilvl w:val="0"/>
-          <w:numId w:val="76"/>
+          <w:numId w:val="77"/>
         </w:numPr>
       </w:pPr>
       <w:r>
@@ -19092,7 +19343,7 @@
         <w:pStyle w:val="ListParagraph"/>
         <w:numPr>
           <w:ilvl w:val="0"/>
-          <w:numId w:val="76"/>
+          <w:numId w:val="77"/>
         </w:numPr>
       </w:pPr>
       <w:r>
@@ -19167,7 +19418,7 @@
         <w:pStyle w:val="ListParagraph"/>
         <w:numPr>
           <w:ilvl w:val="0"/>
-          <w:numId w:val="76"/>
+          <w:numId w:val="77"/>
         </w:numPr>
       </w:pPr>
       <w:r>
@@ -19197,7 +19448,7 @@
         <w:pStyle w:val="ListParagraph"/>
         <w:numPr>
           <w:ilvl w:val="0"/>
-          <w:numId w:val="77"/>
+          <w:numId w:val="78"/>
         </w:numPr>
       </w:pPr>
       <w:r>
@@ -19215,7 +19466,7 @@
         <w:pStyle w:val="ListParagraph"/>
         <w:numPr>
           <w:ilvl w:val="0"/>
-          <w:numId w:val="77"/>
+          <w:numId w:val="78"/>
         </w:numPr>
       </w:pPr>
       <w:r>
@@ -19233,7 +19484,7 @@
         <w:pStyle w:val="ListParagraph"/>
         <w:numPr>
           <w:ilvl w:val="0"/>
-          <w:numId w:val="77"/>
+          <w:numId w:val="78"/>
         </w:numPr>
       </w:pPr>
       <w:r>
@@ -19283,7 +19534,7 @@
         <w:pStyle w:val="ListParagraph"/>
         <w:numPr>
           <w:ilvl w:val="0"/>
-          <w:numId w:val="78"/>
+          <w:numId w:val="79"/>
         </w:numPr>
       </w:pPr>
       <w:r>
@@ -19301,7 +19552,7 @@
         <w:pStyle w:val="ListParagraph"/>
         <w:numPr>
           <w:ilvl w:val="0"/>
-          <w:numId w:val="78"/>
+          <w:numId w:val="79"/>
         </w:numPr>
       </w:pPr>
       <w:r>
@@ -19328,7 +19579,7 @@
         <w:pStyle w:val="ListParagraph"/>
         <w:numPr>
           <w:ilvl w:val="0"/>
-          <w:numId w:val="78"/>
+          <w:numId w:val="79"/>
         </w:numPr>
       </w:pPr>
       <w:r>
@@ -19355,7 +19606,7 @@
         <w:pStyle w:val="ListParagraph"/>
         <w:numPr>
           <w:ilvl w:val="0"/>
-          <w:numId w:val="78"/>
+          <w:numId w:val="79"/>
         </w:numPr>
       </w:pPr>
       <w:r>
@@ -19409,7 +19660,7 @@
         <w:pStyle w:val="ListParagraph"/>
         <w:numPr>
           <w:ilvl w:val="0"/>
-          <w:numId w:val="79"/>
+          <w:numId w:val="80"/>
         </w:numPr>
       </w:pPr>
       <w:r>
@@ -19466,7 +19717,7 @@
         <w:pStyle w:val="ListParagraph"/>
         <w:numPr>
           <w:ilvl w:val="0"/>
-          <w:numId w:val="79"/>
+          <w:numId w:val="80"/>
         </w:numPr>
       </w:pPr>
       <w:r>
@@ -19478,7 +19729,7 @@
         <w:pStyle w:val="ListParagraph"/>
         <w:numPr>
           <w:ilvl w:val="0"/>
-          <w:numId w:val="79"/>
+          <w:numId w:val="80"/>
         </w:numPr>
       </w:pPr>
       <w:r>
@@ -19496,7 +19747,7 @@
         <w:pStyle w:val="ListParagraph"/>
         <w:numPr>
           <w:ilvl w:val="0"/>
-          <w:numId w:val="79"/>
+          <w:numId w:val="80"/>
         </w:numPr>
       </w:pPr>
       <w:r>
@@ -19555,7 +19806,7 @@
         <w:pStyle w:val="ListParagraph"/>
         <w:numPr>
           <w:ilvl w:val="0"/>
-          <w:numId w:val="80"/>
+          <w:numId w:val="81"/>
         </w:numPr>
       </w:pPr>
       <w:r>
@@ -19567,7 +19818,7 @@
         <w:pStyle w:val="ListParagraph"/>
         <w:numPr>
           <w:ilvl w:val="0"/>
-          <w:numId w:val="80"/>
+          <w:numId w:val="81"/>
         </w:numPr>
       </w:pPr>
       <w:r>
@@ -19579,7 +19830,7 @@
         <w:pStyle w:val="ListParagraph"/>
         <w:numPr>
           <w:ilvl w:val="0"/>
-          <w:numId w:val="80"/>
+          <w:numId w:val="81"/>
         </w:numPr>
       </w:pPr>
       <w:r>
@@ -19591,7 +19842,7 @@
         <w:pStyle w:val="ListParagraph"/>
         <w:numPr>
           <w:ilvl w:val="0"/>
-          <w:numId w:val="80"/>
+          <w:numId w:val="81"/>
         </w:numPr>
       </w:pPr>
       <w:r>
@@ -19603,7 +19854,7 @@
         <w:pStyle w:val="ListParagraph"/>
         <w:numPr>
           <w:ilvl w:val="0"/>
-          <w:numId w:val="80"/>
+          <w:numId w:val="81"/>
         </w:numPr>
       </w:pPr>
       <w:r>
@@ -19615,7 +19866,7 @@
         <w:pStyle w:val="ListParagraph"/>
         <w:numPr>
           <w:ilvl w:val="0"/>
-          <w:numId w:val="80"/>
+          <w:numId w:val="81"/>
         </w:numPr>
       </w:pPr>
       <w:r>
@@ -19627,7 +19878,7 @@
         <w:pStyle w:val="ListParagraph"/>
         <w:numPr>
           <w:ilvl w:val="0"/>
-          <w:numId w:val="80"/>
+          <w:numId w:val="81"/>
         </w:numPr>
       </w:pPr>
       <w:r>
@@ -19639,7 +19890,7 @@
         <w:pStyle w:val="ListParagraph"/>
         <w:numPr>
           <w:ilvl w:val="0"/>
-          <w:numId w:val="80"/>
+          <w:numId w:val="81"/>
         </w:numPr>
       </w:pPr>
       <w:r>
@@ -19651,7 +19902,7 @@
         <w:pStyle w:val="ListParagraph"/>
         <w:numPr>
           <w:ilvl w:val="0"/>
-          <w:numId w:val="80"/>
+          <w:numId w:val="81"/>
         </w:numPr>
       </w:pPr>
       <w:r>
@@ -19663,7 +19914,7 @@
         <w:pStyle w:val="ListParagraph"/>
         <w:numPr>
           <w:ilvl w:val="0"/>
-          <w:numId w:val="80"/>
+          <w:numId w:val="81"/>
         </w:numPr>
       </w:pPr>
       <w:r>
@@ -19675,7 +19926,7 @@
         <w:pStyle w:val="ListParagraph"/>
         <w:numPr>
           <w:ilvl w:val="0"/>
-          <w:numId w:val="80"/>
+          <w:numId w:val="81"/>
         </w:numPr>
       </w:pPr>
       <w:r>
@@ -19687,7 +19938,7 @@
         <w:pStyle w:val="ListParagraph"/>
         <w:numPr>
           <w:ilvl w:val="0"/>
-          <w:numId w:val="80"/>
+          <w:numId w:val="81"/>
         </w:numPr>
       </w:pPr>
       <w:r>
@@ -19699,7 +19950,7 @@
         <w:pStyle w:val="ListParagraph"/>
         <w:numPr>
           <w:ilvl w:val="0"/>
-          <w:numId w:val="80"/>
+          <w:numId w:val="81"/>
         </w:numPr>
       </w:pPr>
       <w:r>
@@ -19711,7 +19962,7 @@
         <w:pStyle w:val="ListParagraph"/>
         <w:numPr>
           <w:ilvl w:val="0"/>
-          <w:numId w:val="80"/>
+          <w:numId w:val="81"/>
         </w:numPr>
       </w:pPr>
       <w:r>
@@ -19723,7 +19974,7 @@
         <w:pStyle w:val="ListParagraph"/>
         <w:numPr>
           <w:ilvl w:val="0"/>
-          <w:numId w:val="80"/>
+          <w:numId w:val="81"/>
         </w:numPr>
       </w:pPr>
       <w:r>
@@ -19735,7 +19986,7 @@
         <w:pStyle w:val="ListParagraph"/>
         <w:numPr>
           <w:ilvl w:val="0"/>
-          <w:numId w:val="80"/>
+          <w:numId w:val="81"/>
         </w:numPr>
       </w:pPr>
       <w:r>
@@ -19786,7 +20037,7 @@
         <w:pStyle w:val="ListParagraph"/>
         <w:numPr>
           <w:ilvl w:val="0"/>
-          <w:numId w:val="81"/>
+          <w:numId w:val="82"/>
         </w:numPr>
       </w:pPr>
       <w:r>
@@ -19798,7 +20049,7 @@
         <w:pStyle w:val="ListParagraph"/>
         <w:numPr>
           <w:ilvl w:val="0"/>
-          <w:numId w:val="81"/>
+          <w:numId w:val="82"/>
         </w:numPr>
       </w:pPr>
       <w:r>
@@ -19810,7 +20061,7 @@
         <w:pStyle w:val="ListParagraph"/>
         <w:numPr>
           <w:ilvl w:val="0"/>
-          <w:numId w:val="81"/>
+          <w:numId w:val="82"/>
         </w:numPr>
       </w:pPr>
       <w:r>
@@ -19822,7 +20073,7 @@
         <w:pStyle w:val="ListParagraph"/>
         <w:numPr>
           <w:ilvl w:val="0"/>
-          <w:numId w:val="81"/>
+          <w:numId w:val="82"/>
         </w:numPr>
       </w:pPr>
       <w:r>
@@ -19834,7 +20085,7 @@
         <w:pStyle w:val="ListParagraph"/>
         <w:numPr>
           <w:ilvl w:val="0"/>
-          <w:numId w:val="81"/>
+          <w:numId w:val="82"/>
         </w:numPr>
       </w:pPr>
       <w:r>
@@ -19846,7 +20097,7 @@
         <w:pStyle w:val="ListParagraph"/>
         <w:numPr>
           <w:ilvl w:val="0"/>
-          <w:numId w:val="81"/>
+          <w:numId w:val="82"/>
         </w:numPr>
       </w:pPr>
       <w:r>
@@ -19858,7 +20109,7 @@
         <w:pStyle w:val="ListParagraph"/>
         <w:numPr>
           <w:ilvl w:val="0"/>
-          <w:numId w:val="81"/>
+          <w:numId w:val="82"/>
         </w:numPr>
       </w:pPr>
       <w:r>
@@ -19870,7 +20121,7 @@
         <w:pStyle w:val="ListParagraph"/>
         <w:numPr>
           <w:ilvl w:val="0"/>
-          <w:numId w:val="81"/>
+          <w:numId w:val="82"/>
         </w:numPr>
       </w:pPr>
       <w:r>
@@ -19933,7 +20184,7 @@
         <w:pStyle w:val="ListParagraph"/>
         <w:numPr>
           <w:ilvl w:val="0"/>
-          <w:numId w:val="82"/>
+          <w:numId w:val="83"/>
         </w:numPr>
       </w:pPr>
       <w:r>
@@ -19996,7 +20247,7 @@
         <w:pStyle w:val="ListParagraph"/>
         <w:numPr>
           <w:ilvl w:val="0"/>
-          <w:numId w:val="82"/>
+          <w:numId w:val="83"/>
         </w:numPr>
       </w:pPr>
       <w:r>
@@ -20050,7 +20301,7 @@
         <w:pStyle w:val="ListParagraph"/>
         <w:numPr>
           <w:ilvl w:val="0"/>
-          <w:numId w:val="82"/>
+          <w:numId w:val="83"/>
         </w:numPr>
       </w:pPr>
       <w:r>
@@ -20068,7 +20319,7 @@
         <w:pStyle w:val="ListParagraph"/>
         <w:numPr>
           <w:ilvl w:val="0"/>
-          <w:numId w:val="82"/>
+          <w:numId w:val="83"/>
         </w:numPr>
       </w:pPr>
       <w:r>
@@ -20095,7 +20346,7 @@
         <w:pStyle w:val="ListParagraph"/>
         <w:numPr>
           <w:ilvl w:val="0"/>
-          <w:numId w:val="82"/>
+          <w:numId w:val="83"/>
         </w:numPr>
       </w:pPr>
       <w:r>
@@ -20140,7 +20391,7 @@
         <w:pStyle w:val="ListParagraph"/>
         <w:numPr>
           <w:ilvl w:val="0"/>
-          <w:numId w:val="82"/>
+          <w:numId w:val="83"/>
         </w:numPr>
       </w:pPr>
       <w:r>
@@ -20167,7 +20418,7 @@
         <w:pStyle w:val="ListParagraph"/>
         <w:numPr>
           <w:ilvl w:val="0"/>
-          <w:numId w:val="82"/>
+          <w:numId w:val="83"/>
         </w:numPr>
       </w:pPr>
       <w:r>
@@ -20212,7 +20463,7 @@
         <w:pStyle w:val="ListParagraph"/>
         <w:numPr>
           <w:ilvl w:val="0"/>
-          <w:numId w:val="82"/>
+          <w:numId w:val="83"/>
         </w:numPr>
       </w:pPr>
       <w:r>
@@ -20257,7 +20508,7 @@
         <w:pStyle w:val="ListParagraph"/>
         <w:numPr>
           <w:ilvl w:val="0"/>
-          <w:numId w:val="82"/>
+          <w:numId w:val="83"/>
         </w:numPr>
       </w:pPr>
       <w:r>
@@ -20341,7 +20592,7 @@
         <w:pStyle w:val="ListParagraph"/>
         <w:numPr>
           <w:ilvl w:val="0"/>
-          <w:numId w:val="82"/>
+          <w:numId w:val="83"/>
         </w:numPr>
       </w:pPr>
       <w:r>
@@ -20377,7 +20628,7 @@
         <w:pStyle w:val="ListParagraph"/>
         <w:numPr>
           <w:ilvl w:val="0"/>
-          <w:numId w:val="82"/>
+          <w:numId w:val="83"/>
         </w:numPr>
       </w:pPr>
       <w:r>
@@ -20395,7 +20646,7 @@
         <w:pStyle w:val="ListParagraph"/>
         <w:numPr>
           <w:ilvl w:val="0"/>
-          <w:numId w:val="82"/>
+          <w:numId w:val="83"/>
         </w:numPr>
       </w:pPr>
       <w:r>
@@ -20431,7 +20682,7 @@
         <w:pStyle w:val="ListParagraph"/>
         <w:numPr>
           <w:ilvl w:val="0"/>
-          <w:numId w:val="82"/>
+          <w:numId w:val="83"/>
         </w:numPr>
       </w:pPr>
       <w:r>
@@ -20449,7 +20700,7 @@
         <w:pStyle w:val="ListParagraph"/>
         <w:numPr>
           <w:ilvl w:val="0"/>
-          <w:numId w:val="82"/>
+          <w:numId w:val="83"/>
         </w:numPr>
       </w:pPr>
       <w:r>
@@ -20476,7 +20727,7 @@
         <w:pStyle w:val="ListParagraph"/>
         <w:numPr>
           <w:ilvl w:val="0"/>
-          <w:numId w:val="82"/>
+          <w:numId w:val="83"/>
         </w:numPr>
       </w:pPr>
       <w:r>
@@ -20521,7 +20772,7 @@
         <w:pStyle w:val="ListParagraph"/>
         <w:numPr>
           <w:ilvl w:val="0"/>
-          <w:numId w:val="82"/>
+          <w:numId w:val="83"/>
         </w:numPr>
       </w:pPr>
       <w:r>
@@ -20539,7 +20790,7 @@
         <w:pStyle w:val="ListParagraph"/>
         <w:numPr>
           <w:ilvl w:val="0"/>
-          <w:numId w:val="82"/>
+          <w:numId w:val="83"/>
         </w:numPr>
       </w:pPr>
       <w:r>
@@ -20557,7 +20808,7 @@
         <w:pStyle w:val="ListParagraph"/>
         <w:numPr>
           <w:ilvl w:val="0"/>
-          <w:numId w:val="82"/>
+          <w:numId w:val="83"/>
         </w:numPr>
       </w:pPr>
       <w:r>
@@ -20575,7 +20826,7 @@
         <w:pStyle w:val="ListParagraph"/>
         <w:numPr>
           <w:ilvl w:val="0"/>
-          <w:numId w:val="82"/>
+          <w:numId w:val="83"/>
         </w:numPr>
       </w:pPr>
       <w:r>
@@ -20620,7 +20871,7 @@
         <w:pStyle w:val="ListParagraph"/>
         <w:numPr>
           <w:ilvl w:val="0"/>
-          <w:numId w:val="82"/>
+          <w:numId w:val="83"/>
         </w:numPr>
       </w:pPr>
       <w:r>
@@ -20674,7 +20925,7 @@
         <w:pStyle w:val="ListParagraph"/>
         <w:numPr>
           <w:ilvl w:val="0"/>
-          <w:numId w:val="82"/>
+          <w:numId w:val="83"/>
         </w:numPr>
       </w:pPr>
       <w:r>
@@ -20746,7 +20997,7 @@
         <w:pStyle w:val="ListParagraph"/>
         <w:numPr>
           <w:ilvl w:val="0"/>
-          <w:numId w:val="82"/>
+          <w:numId w:val="83"/>
         </w:numPr>
       </w:pPr>
       <w:r>
@@ -20845,7 +21096,7 @@
         <w:pStyle w:val="ListParagraph"/>
         <w:numPr>
           <w:ilvl w:val="0"/>
-          <w:numId w:val="82"/>
+          <w:numId w:val="83"/>
         </w:numPr>
       </w:pPr>
       <w:r>
@@ -20926,7 +21177,7 @@
         <w:pStyle w:val="ListParagraph"/>
         <w:numPr>
           <w:ilvl w:val="0"/>
-          <w:numId w:val="82"/>
+          <w:numId w:val="83"/>
         </w:numPr>
       </w:pPr>
       <w:r>
@@ -20989,7 +21240,7 @@
         <w:pStyle w:val="ListParagraph"/>
         <w:numPr>
           <w:ilvl w:val="0"/>
-          <w:numId w:val="82"/>
+          <w:numId w:val="83"/>
         </w:numPr>
       </w:pPr>
       <w:r>
@@ -21016,7 +21267,7 @@
         <w:pStyle w:val="ListParagraph"/>
         <w:numPr>
           <w:ilvl w:val="0"/>
-          <w:numId w:val="82"/>
+          <w:numId w:val="83"/>
         </w:numPr>
       </w:pPr>
       <w:r>
@@ -21070,7 +21321,7 @@
         <w:pStyle w:val="ListParagraph"/>
         <w:numPr>
           <w:ilvl w:val="0"/>
-          <w:numId w:val="82"/>
+          <w:numId w:val="83"/>
         </w:numPr>
       </w:pPr>
       <w:r>
@@ -21142,7 +21393,7 @@
         <w:pStyle w:val="ListParagraph"/>
         <w:numPr>
           <w:ilvl w:val="0"/>
-          <w:numId w:val="82"/>
+          <w:numId w:val="83"/>
         </w:numPr>
       </w:pPr>
       <w:r>
@@ -21196,7 +21447,7 @@
         <w:pStyle w:val="ListParagraph"/>
         <w:numPr>
           <w:ilvl w:val="0"/>
-          <w:numId w:val="82"/>
+          <w:numId w:val="83"/>
         </w:numPr>
       </w:pPr>
       <w:r>
@@ -21214,7 +21465,7 @@
         <w:pStyle w:val="ListParagraph"/>
         <w:numPr>
           <w:ilvl w:val="0"/>
-          <w:numId w:val="82"/>
+          <w:numId w:val="83"/>
         </w:numPr>
       </w:pPr>
       <w:r>
@@ -21241,7 +21492,7 @@
         <w:pStyle w:val="ListParagraph"/>
         <w:numPr>
           <w:ilvl w:val="0"/>
-          <w:numId w:val="82"/>
+          <w:numId w:val="83"/>
         </w:numPr>
       </w:pPr>
       <w:r>
@@ -21259,7 +21510,7 @@
         <w:pStyle w:val="ListParagraph"/>
         <w:numPr>
           <w:ilvl w:val="0"/>
-          <w:numId w:val="82"/>
+          <w:numId w:val="83"/>
         </w:numPr>
       </w:pPr>
       <w:r>
@@ -21295,7 +21546,7 @@
         <w:pStyle w:val="ListParagraph"/>
         <w:numPr>
           <w:ilvl w:val="0"/>
-          <w:numId w:val="82"/>
+          <w:numId w:val="83"/>
         </w:numPr>
       </w:pPr>
       <w:r>
@@ -21313,7 +21564,7 @@
         <w:pStyle w:val="ListParagraph"/>
         <w:numPr>
           <w:ilvl w:val="0"/>
-          <w:numId w:val="82"/>
+          <w:numId w:val="83"/>
         </w:numPr>
       </w:pPr>
       <w:r>
@@ -21340,7 +21591,7 @@
         <w:pStyle w:val="ListParagraph"/>
         <w:numPr>
           <w:ilvl w:val="0"/>
-          <w:numId w:val="82"/>
+          <w:numId w:val="83"/>
         </w:numPr>
       </w:pPr>
       <w:r>
@@ -21394,7 +21645,7 @@
         <w:pStyle w:val="ListParagraph"/>
         <w:numPr>
           <w:ilvl w:val="0"/>
-          <w:numId w:val="82"/>
+          <w:numId w:val="83"/>
         </w:numPr>
       </w:pPr>
       <w:r>
@@ -21478,7 +21729,7 @@
         <w:pStyle w:val="ListParagraph"/>
         <w:numPr>
           <w:ilvl w:val="0"/>
-          <w:numId w:val="83"/>
+          <w:numId w:val="84"/>
         </w:numPr>
       </w:pPr>
       <w:r>
@@ -21490,7 +21741,7 @@
         <w:pStyle w:val="ListParagraph"/>
         <w:numPr>
           <w:ilvl w:val="0"/>
-          <w:numId w:val="83"/>
+          <w:numId w:val="84"/>
         </w:numPr>
       </w:pPr>
       <w:r>
@@ -21502,7 +21753,7 @@
         <w:pStyle w:val="ListParagraph"/>
         <w:numPr>
           <w:ilvl w:val="0"/>
-          <w:numId w:val="83"/>
+          <w:numId w:val="84"/>
         </w:numPr>
       </w:pPr>
       <w:r>
@@ -21514,7 +21765,7 @@
         <w:pStyle w:val="ListParagraph"/>
         <w:numPr>
           <w:ilvl w:val="0"/>
-          <w:numId w:val="83"/>
+          <w:numId w:val="84"/>
         </w:numPr>
       </w:pPr>
       <w:r>
@@ -21526,7 +21777,7 @@
         <w:pStyle w:val="ListParagraph"/>
         <w:numPr>
           <w:ilvl w:val="0"/>
-          <w:numId w:val="83"/>
+          <w:numId w:val="84"/>
         </w:numPr>
       </w:pPr>
       <w:r>
@@ -21538,7 +21789,7 @@
         <w:pStyle w:val="ListParagraph"/>
         <w:numPr>
           <w:ilvl w:val="0"/>
-          <w:numId w:val="83"/>
+          <w:numId w:val="84"/>
         </w:numPr>
       </w:pPr>
       <w:r>
@@ -21618,7 +21869,7 @@
         <w:pStyle w:val="ListParagraph"/>
         <w:numPr>
           <w:ilvl w:val="0"/>
-          <w:numId w:val="84"/>
+          <w:numId w:val="85"/>
         </w:numPr>
       </w:pPr>
       <w:r>
@@ -21654,7 +21905,7 @@
         <w:pStyle w:val="ListParagraph"/>
         <w:numPr>
           <w:ilvl w:val="0"/>
-          <w:numId w:val="84"/>
+          <w:numId w:val="85"/>
         </w:numPr>
       </w:pPr>
       <w:r>
@@ -21690,7 +21941,7 @@
         <w:pStyle w:val="ListParagraph"/>
         <w:numPr>
           <w:ilvl w:val="0"/>
-          <w:numId w:val="84"/>
+          <w:numId w:val="85"/>
         </w:numPr>
       </w:pPr>
       <w:r>
@@ -21708,7 +21959,7 @@
         <w:pStyle w:val="ListParagraph"/>
         <w:numPr>
           <w:ilvl w:val="0"/>
-          <w:numId w:val="84"/>
+          <w:numId w:val="85"/>
         </w:numPr>
       </w:pPr>
       <w:r>
@@ -21735,7 +21986,7 @@
         <w:pStyle w:val="ListParagraph"/>
         <w:numPr>
           <w:ilvl w:val="0"/>
-          <w:numId w:val="85"/>
+          <w:numId w:val="86"/>
         </w:numPr>
       </w:pPr>
       <w:r>
@@ -21798,7 +22049,7 @@
         <w:pStyle w:val="ListParagraph"/>
         <w:numPr>
           <w:ilvl w:val="0"/>
-          <w:numId w:val="85"/>
+          <w:numId w:val="86"/>
         </w:numPr>
       </w:pPr>
       <w:r>
@@ -21837,7 +22088,7 @@
         <w:pStyle w:val="ListParagraph"/>
         <w:numPr>
           <w:ilvl w:val="0"/>
-          <w:numId w:val="85"/>
+          <w:numId w:val="86"/>
         </w:numPr>
       </w:pPr>
       <w:r>
@@ -21855,7 +22106,7 @@
         <w:pStyle w:val="ListParagraph"/>
         <w:numPr>
           <w:ilvl w:val="0"/>
-          <w:numId w:val="85"/>
+          <w:numId w:val="86"/>
         </w:numPr>
       </w:pPr>
       <w:r>
@@ -21909,7 +22160,7 @@
         <w:pStyle w:val="ListParagraph"/>
         <w:numPr>
           <w:ilvl w:val="0"/>
-          <w:numId w:val="86"/>
+          <w:numId w:val="87"/>
         </w:numPr>
       </w:pPr>
       <w:r>
@@ -21972,7 +22223,7 @@
         <w:pStyle w:val="ListParagraph"/>
         <w:numPr>
           <w:ilvl w:val="0"/>
-          <w:numId w:val="86"/>
+          <w:numId w:val="87"/>
         </w:numPr>
       </w:pPr>
       <w:r>
@@ -22026,7 +22277,7 @@
         <w:pStyle w:val="ListParagraph"/>
         <w:numPr>
           <w:ilvl w:val="0"/>
-          <w:numId w:val="86"/>
+          <w:numId w:val="87"/>
         </w:numPr>
       </w:pPr>
       <w:r>
@@ -22044,7 +22295,7 @@
         <w:pStyle w:val="ListParagraph"/>
         <w:numPr>
           <w:ilvl w:val="0"/>
-          <w:numId w:val="86"/>
+          <w:numId w:val="87"/>
         </w:numPr>
       </w:pPr>
       <w:r>
@@ -22490,7 +22741,7 @@
         <w:pStyle w:val="ListParagraph"/>
         <w:numPr>
           <w:ilvl w:val="0"/>
-          <w:numId w:val="87"/>
+          <w:numId w:val="88"/>
         </w:numPr>
       </w:pPr>
       <w:r>
@@ -22508,7 +22759,7 @@
         <w:pStyle w:val="ListParagraph"/>
         <w:numPr>
           <w:ilvl w:val="0"/>
-          <w:numId w:val="87"/>
+          <w:numId w:val="88"/>
         </w:numPr>
       </w:pPr>
       <w:r>
@@ -22526,7 +22777,7 @@
         <w:pStyle w:val="ListParagraph"/>
         <w:numPr>
           <w:ilvl w:val="0"/>
-          <w:numId w:val="87"/>
+          <w:numId w:val="88"/>
         </w:numPr>
       </w:pPr>
       <w:r>
@@ -22544,7 +22795,7 @@
         <w:pStyle w:val="ListParagraph"/>
         <w:numPr>
           <w:ilvl w:val="0"/>
-          <w:numId w:val="87"/>
+          <w:numId w:val="88"/>
         </w:numPr>
       </w:pPr>
       <w:r>
@@ -22767,7 +23018,7 @@
         <w:pStyle w:val="ListParagraph"/>
         <w:numPr>
           <w:ilvl w:val="0"/>
-          <w:numId w:val="88"/>
+          <w:numId w:val="89"/>
         </w:numPr>
       </w:pPr>
       <w:r>
@@ -22779,7 +23030,7 @@
         <w:pStyle w:val="ListParagraph"/>
         <w:numPr>
           <w:ilvl w:val="0"/>
-          <w:numId w:val="88"/>
+          <w:numId w:val="89"/>
         </w:numPr>
       </w:pPr>
       <w:r>
@@ -22842,7 +23093,7 @@
         <w:pStyle w:val="ListParagraph"/>
         <w:numPr>
           <w:ilvl w:val="0"/>
-          <w:numId w:val="88"/>
+          <w:numId w:val="89"/>
         </w:numPr>
       </w:pPr>
       <w:r>
@@ -22863,7 +23114,7 @@
         <w:pStyle w:val="ListParagraph"/>
         <w:numPr>
           <w:ilvl w:val="0"/>
-          <w:numId w:val="88"/>
+          <w:numId w:val="89"/>
         </w:numPr>
       </w:pPr>
       <w:r>
@@ -22944,7 +23195,7 @@
         <w:pStyle w:val="ListParagraph"/>
         <w:numPr>
           <w:ilvl w:val="0"/>
-          <w:numId w:val="88"/>
+          <w:numId w:val="89"/>
         </w:numPr>
       </w:pPr>
       <w:r>
@@ -22956,7 +23207,7 @@
         <w:pStyle w:val="ListParagraph"/>
         <w:numPr>
           <w:ilvl w:val="0"/>
-          <w:numId w:val="88"/>
+          <w:numId w:val="89"/>
         </w:numPr>
       </w:pPr>
       <w:r>
@@ -23035,7 +23286,7 @@
         <w:pStyle w:val="ListParagraph"/>
         <w:numPr>
           <w:ilvl w:val="0"/>
-          <w:numId w:val="89"/>
+          <w:numId w:val="90"/>
         </w:numPr>
       </w:pPr>
       <w:r>
@@ -23047,7 +23298,7 @@
         <w:pStyle w:val="ListParagraph"/>
         <w:numPr>
           <w:ilvl w:val="0"/>
-          <w:numId w:val="89"/>
+          <w:numId w:val="90"/>
         </w:numPr>
       </w:pPr>
       <w:r>
@@ -23059,7 +23310,7 @@
         <w:pStyle w:val="ListParagraph"/>
         <w:numPr>
           <w:ilvl w:val="0"/>
-          <w:numId w:val="89"/>
+          <w:numId w:val="90"/>
         </w:numPr>
       </w:pPr>
       <w:r>
@@ -23071,7 +23322,7 @@
         <w:pStyle w:val="ListParagraph"/>
         <w:numPr>
           <w:ilvl w:val="0"/>
-          <w:numId w:val="89"/>
+          <w:numId w:val="90"/>
         </w:numPr>
       </w:pPr>
       <w:r>
@@ -23083,7 +23334,7 @@
         <w:pStyle w:val="ListParagraph"/>
         <w:numPr>
           <w:ilvl w:val="0"/>
-          <w:numId w:val="89"/>
+          <w:numId w:val="90"/>
         </w:numPr>
       </w:pPr>
       <w:r>
@@ -23095,7 +23346,7 @@
         <w:pStyle w:val="ListParagraph"/>
         <w:numPr>
           <w:ilvl w:val="0"/>
-          <w:numId w:val="89"/>
+          <w:numId w:val="90"/>
         </w:numPr>
       </w:pPr>
       <w:r>
@@ -23107,7 +23358,7 @@
         <w:pStyle w:val="ListParagraph"/>
         <w:numPr>
           <w:ilvl w:val="0"/>
-          <w:numId w:val="89"/>
+          <w:numId w:val="90"/>
         </w:numPr>
       </w:pPr>
       <w:r>
@@ -23119,7 +23370,7 @@
         <w:pStyle w:val="ListParagraph"/>
         <w:numPr>
           <w:ilvl w:val="0"/>
-          <w:numId w:val="89"/>
+          <w:numId w:val="90"/>
         </w:numPr>
       </w:pPr>
       <w:r>
@@ -23131,7 +23382,7 @@
         <w:pStyle w:val="ListParagraph"/>
         <w:numPr>
           <w:ilvl w:val="0"/>
-          <w:numId w:val="89"/>
+          <w:numId w:val="90"/>
         </w:numPr>
       </w:pPr>
       <w:r>
@@ -23143,7 +23394,7 @@
         <w:pStyle w:val="ListParagraph"/>
         <w:numPr>
           <w:ilvl w:val="0"/>
-          <w:numId w:val="89"/>
+          <w:numId w:val="90"/>
         </w:numPr>
       </w:pPr>
       <w:r>
@@ -23155,7 +23406,7 @@
         <w:pStyle w:val="ListParagraph"/>
         <w:numPr>
           <w:ilvl w:val="0"/>
-          <w:numId w:val="89"/>
+          <w:numId w:val="90"/>
         </w:numPr>
       </w:pPr>
       <w:r>
@@ -23621,7 +23872,7 @@
         <w:pStyle w:val="ListParagraph"/>
         <w:numPr>
           <w:ilvl w:val="0"/>
-          <w:numId w:val="90"/>
+          <w:numId w:val="91"/>
         </w:numPr>
       </w:pPr>
       <w:r>
@@ -23633,7 +23884,7 @@
         <w:pStyle w:val="ListParagraph"/>
         <w:numPr>
           <w:ilvl w:val="0"/>
-          <w:numId w:val="90"/>
+          <w:numId w:val="91"/>
         </w:numPr>
       </w:pPr>
       <w:r>
@@ -23645,7 +23896,7 @@
         <w:pStyle w:val="ListParagraph"/>
         <w:numPr>
           <w:ilvl w:val="0"/>
-          <w:numId w:val="90"/>
+          <w:numId w:val="91"/>
         </w:numPr>
       </w:pPr>
       <w:r>
@@ -23657,7 +23908,7 @@
         <w:pStyle w:val="ListParagraph"/>
         <w:numPr>
           <w:ilvl w:val="0"/>
-          <w:numId w:val="90"/>
+          <w:numId w:val="91"/>
         </w:numPr>
       </w:pPr>
       <w:r>
@@ -23669,7 +23920,7 @@
         <w:pStyle w:val="ListParagraph"/>
         <w:numPr>
           <w:ilvl w:val="0"/>
-          <w:numId w:val="90"/>
+          <w:numId w:val="91"/>
         </w:numPr>
       </w:pPr>
       <w:r>
@@ -23681,7 +23932,7 @@
         <w:pStyle w:val="ListParagraph"/>
         <w:numPr>
           <w:ilvl w:val="0"/>
-          <w:numId w:val="90"/>
+          <w:numId w:val="91"/>
         </w:numPr>
       </w:pPr>
       <w:r>
@@ -23693,7 +23944,7 @@
         <w:pStyle w:val="ListParagraph"/>
         <w:numPr>
           <w:ilvl w:val="0"/>
-          <w:numId w:val="90"/>
+          <w:numId w:val="91"/>
         </w:numPr>
       </w:pPr>
       <w:r>
@@ -23705,7 +23956,7 @@
         <w:pStyle w:val="ListParagraph"/>
         <w:numPr>
           <w:ilvl w:val="0"/>
-          <w:numId w:val="90"/>
+          <w:numId w:val="91"/>
         </w:numPr>
       </w:pPr>
       <w:r>
@@ -23717,7 +23968,7 @@
         <w:pStyle w:val="ListParagraph"/>
         <w:numPr>
           <w:ilvl w:val="0"/>
-          <w:numId w:val="90"/>
+          <w:numId w:val="91"/>
         </w:numPr>
       </w:pPr>
       <w:r>
@@ -23729,7 +23980,7 @@
         <w:pStyle w:val="ListParagraph"/>
         <w:numPr>
           <w:ilvl w:val="0"/>
-          <w:numId w:val="90"/>
+          <w:numId w:val="91"/>
         </w:numPr>
       </w:pPr>
       <w:r>
@@ -23749,7 +24000,7 @@
         <w:pStyle w:val="ListParagraph"/>
         <w:numPr>
           <w:ilvl w:val="0"/>
-          <w:numId w:val="91"/>
+          <w:numId w:val="92"/>
         </w:numPr>
       </w:pPr>
       <w:r>
@@ -23770,7 +24021,7 @@
         <w:pStyle w:val="ListParagraph"/>
         <w:numPr>
           <w:ilvl w:val="0"/>
-          <w:numId w:val="91"/>
+          <w:numId w:val="92"/>
         </w:numPr>
       </w:pPr>
       <w:r>
@@ -23806,7 +24057,7 @@
         <w:pStyle w:val="ListParagraph"/>
         <w:numPr>
           <w:ilvl w:val="0"/>
-          <w:numId w:val="91"/>
+          <w:numId w:val="92"/>
         </w:numPr>
       </w:pPr>
       <w:r>
@@ -23854,7 +24105,7 @@
         <w:pStyle w:val="ListParagraph"/>
         <w:numPr>
           <w:ilvl w:val="0"/>
-          <w:numId w:val="91"/>
+          <w:numId w:val="92"/>
         </w:numPr>
       </w:pPr>
       <w:r>
@@ -23908,7 +24159,7 @@
         <w:pStyle w:val="ListParagraph"/>
         <w:numPr>
           <w:ilvl w:val="0"/>
-          <w:numId w:val="91"/>
+          <w:numId w:val="92"/>
         </w:numPr>
       </w:pPr>
       <w:r>
@@ -23935,7 +24186,7 @@
         <w:pStyle w:val="ListParagraph"/>
         <w:numPr>
           <w:ilvl w:val="0"/>
-          <w:numId w:val="91"/>
+          <w:numId w:val="92"/>
         </w:numPr>
       </w:pPr>
       <w:r>
@@ -23953,7 +24204,7 @@
         <w:pStyle w:val="ListParagraph"/>
         <w:numPr>
           <w:ilvl w:val="0"/>
-          <w:numId w:val="91"/>
+          <w:numId w:val="92"/>
         </w:numPr>
       </w:pPr>
       <w:r>
@@ -23971,7 +24222,7 @@
         <w:pStyle w:val="ListParagraph"/>
         <w:numPr>
           <w:ilvl w:val="0"/>
-          <w:numId w:val="91"/>
+          <w:numId w:val="92"/>
         </w:numPr>
       </w:pPr>
       <w:r>
@@ -24016,7 +24267,7 @@
         <w:pStyle w:val="ListParagraph"/>
         <w:numPr>
           <w:ilvl w:val="0"/>
-          <w:numId w:val="91"/>
+          <w:numId w:val="92"/>
         </w:numPr>
       </w:pPr>
       <w:r>
@@ -24052,7 +24303,7 @@
         <w:pStyle w:val="ListParagraph"/>
         <w:numPr>
           <w:ilvl w:val="0"/>
-          <w:numId w:val="91"/>
+          <w:numId w:val="92"/>
         </w:numPr>
       </w:pPr>
       <w:r>
@@ -24301,7 +24552,7 @@
         <w:pStyle w:val="ListParagraph"/>
         <w:numPr>
           <w:ilvl w:val="0"/>
-          <w:numId w:val="92"/>
+          <w:numId w:val="93"/>
         </w:numPr>
       </w:pPr>
       <w:r>
@@ -24337,7 +24588,7 @@
         <w:pStyle w:val="ListParagraph"/>
         <w:numPr>
           <w:ilvl w:val="0"/>
-          <w:numId w:val="92"/>
+          <w:numId w:val="93"/>
         </w:numPr>
       </w:pPr>
       <w:r>
@@ -24400,7 +24651,7 @@
         <w:pStyle w:val="ListParagraph"/>
         <w:numPr>
           <w:ilvl w:val="0"/>
-          <w:numId w:val="92"/>
+          <w:numId w:val="93"/>
         </w:numPr>
       </w:pPr>
       <w:r>
@@ -24426,7 +24677,7 @@
         <w:pStyle w:val="ListParagraph"/>
         <w:numPr>
           <w:ilvl w:val="0"/>
-          <w:numId w:val="93"/>
+          <w:numId w:val="94"/>
         </w:numPr>
       </w:pPr>
       <w:r>
@@ -24453,7 +24704,7 @@
         <w:pStyle w:val="ListParagraph"/>
         <w:numPr>
           <w:ilvl w:val="0"/>
-          <w:numId w:val="93"/>
+          <w:numId w:val="94"/>
         </w:numPr>
       </w:pPr>
       <w:r>
@@ -24474,7 +24725,7 @@
         <w:pStyle w:val="ListParagraph"/>
         <w:numPr>
           <w:ilvl w:val="0"/>
-          <w:numId w:val="93"/>
+          <w:numId w:val="94"/>
         </w:numPr>
       </w:pPr>
       <w:r>
@@ -24515,7 +24766,7 @@
         <w:pStyle w:val="ListParagraph"/>
         <w:numPr>
           <w:ilvl w:val="0"/>
-          <w:numId w:val="94"/>
+          <w:numId w:val="95"/>
         </w:numPr>
       </w:pPr>
       <w:r>
@@ -24560,7 +24811,7 @@
         <w:pStyle w:val="ListParagraph"/>
         <w:numPr>
           <w:ilvl w:val="0"/>
-          <w:numId w:val="94"/>
+          <w:numId w:val="95"/>
         </w:numPr>
       </w:pPr>
       <w:r>
@@ -24596,7 +24847,7 @@
         <w:pStyle w:val="ListParagraph"/>
         <w:numPr>
           <w:ilvl w:val="0"/>
-          <w:numId w:val="94"/>
+          <w:numId w:val="95"/>
         </w:numPr>
       </w:pPr>
       <w:r>
@@ -24623,7 +24874,7 @@
         <w:pStyle w:val="ListParagraph"/>
         <w:numPr>
           <w:ilvl w:val="0"/>
-          <w:numId w:val="94"/>
+          <w:numId w:val="95"/>
         </w:numPr>
       </w:pPr>
       <w:r>
@@ -24938,7 +25189,7 @@
         <w:pStyle w:val="ListParagraph"/>
         <w:numPr>
           <w:ilvl w:val="0"/>
-          <w:numId w:val="95"/>
+          <w:numId w:val="96"/>
         </w:numPr>
       </w:pPr>
       <w:r>
@@ -25013,7 +25264,7 @@
         <w:pStyle w:val="ListParagraph"/>
         <w:numPr>
           <w:ilvl w:val="0"/>
-          <w:numId w:val="95"/>
+          <w:numId w:val="96"/>
         </w:numPr>
       </w:pPr>
       <w:r>
@@ -25043,7 +25294,7 @@
         <w:pStyle w:val="ListParagraph"/>
         <w:numPr>
           <w:ilvl w:val="0"/>
-          <w:numId w:val="95"/>
+          <w:numId w:val="96"/>
         </w:numPr>
       </w:pPr>
       <w:r>
@@ -25069,7 +25320,7 @@
         <w:pStyle w:val="ListParagraph"/>
         <w:numPr>
           <w:ilvl w:val="0"/>
-          <w:numId w:val="96"/>
+          <w:numId w:val="97"/>
         </w:numPr>
       </w:pPr>
       <w:r>
@@ -25099,7 +25350,7 @@
         <w:pStyle w:val="ListParagraph"/>
         <w:numPr>
           <w:ilvl w:val="0"/>
-          <w:numId w:val="96"/>
+          <w:numId w:val="97"/>
         </w:numPr>
       </w:pPr>
       <w:r>
@@ -25120,7 +25371,7 @@
         <w:pStyle w:val="ListParagraph"/>
         <w:numPr>
           <w:ilvl w:val="0"/>
-          <w:numId w:val="96"/>
+          <w:numId w:val="97"/>
         </w:numPr>
       </w:pPr>
       <w:r>
@@ -25150,7 +25401,7 @@
         <w:pStyle w:val="ListParagraph"/>
         <w:numPr>
           <w:ilvl w:val="0"/>
-          <w:numId w:val="97"/>
+          <w:numId w:val="98"/>
         </w:numPr>
       </w:pPr>
       <w:r>
@@ -25162,7 +25413,7 @@
         <w:pStyle w:val="ListParagraph"/>
         <w:numPr>
           <w:ilvl w:val="0"/>
-          <w:numId w:val="97"/>
+          <w:numId w:val="98"/>
         </w:numPr>
       </w:pPr>
       <w:r>
@@ -25206,7 +25457,7 @@
         <w:pStyle w:val="ListParagraph"/>
         <w:numPr>
           <w:ilvl w:val="0"/>
-          <w:numId w:val="98"/>
+          <w:numId w:val="99"/>
         </w:numPr>
       </w:pPr>
       <w:r>
@@ -25254,7 +25505,7 @@
         <w:pStyle w:val="ListParagraph"/>
         <w:numPr>
           <w:ilvl w:val="0"/>
-          <w:numId w:val="98"/>
+          <w:numId w:val="99"/>
         </w:numPr>
       </w:pPr>
       <w:r>
@@ -25266,7 +25517,7 @@
         <w:pStyle w:val="ListParagraph"/>
         <w:numPr>
           <w:ilvl w:val="0"/>
-          <w:numId w:val="98"/>
+          <w:numId w:val="99"/>
         </w:numPr>
       </w:pPr>
       <w:r>
@@ -25284,7 +25535,7 @@
         <w:pStyle w:val="ListParagraph"/>
         <w:numPr>
           <w:ilvl w:val="0"/>
-          <w:numId w:val="98"/>
+          <w:numId w:val="99"/>
         </w:numPr>
       </w:pPr>
       <w:r>
@@ -25296,7 +25547,7 @@
         <w:pStyle w:val="ListParagraph"/>
         <w:numPr>
           <w:ilvl w:val="0"/>
-          <w:numId w:val="98"/>
+          <w:numId w:val="99"/>
         </w:numPr>
       </w:pPr>
       <w:r>
@@ -25308,7 +25559,7 @@
         <w:pStyle w:val="ListParagraph"/>
         <w:numPr>
           <w:ilvl w:val="0"/>
-          <w:numId w:val="98"/>
+          <w:numId w:val="99"/>
         </w:numPr>
       </w:pPr>
       <w:r>
@@ -25320,7 +25571,7 @@
         <w:pStyle w:val="ListParagraph"/>
         <w:numPr>
           <w:ilvl w:val="0"/>
-          <w:numId w:val="98"/>
+          <w:numId w:val="99"/>
         </w:numPr>
       </w:pPr>
       <w:r>
@@ -25594,7 +25845,7 @@
         <w:pStyle w:val="ListParagraph"/>
         <w:numPr>
           <w:ilvl w:val="0"/>
-          <w:numId w:val="99"/>
+          <w:numId w:val="100"/>
         </w:numPr>
       </w:pPr>
       <w:r>
@@ -25606,7 +25857,7 @@
         <w:pStyle w:val="ListParagraph"/>
         <w:numPr>
           <w:ilvl w:val="0"/>
-          <w:numId w:val="99"/>
+          <w:numId w:val="100"/>
         </w:numPr>
       </w:pPr>
       <w:r>
@@ -25618,7 +25869,7 @@
         <w:pStyle w:val="ListParagraph"/>
         <w:numPr>
           <w:ilvl w:val="0"/>
-          <w:numId w:val="99"/>
+          <w:numId w:val="100"/>
         </w:numPr>
       </w:pPr>
       <w:r>
@@ -25892,7 +26143,7 @@
         <w:pStyle w:val="ListParagraph"/>
         <w:numPr>
           <w:ilvl w:val="0"/>
-          <w:numId w:val="100"/>
+          <w:numId w:val="101"/>
         </w:numPr>
       </w:pPr>
       <w:r>
@@ -25904,7 +26155,7 @@
         <w:pStyle w:val="ListParagraph"/>
         <w:numPr>
           <w:ilvl w:val="0"/>
-          <w:numId w:val="100"/>
+          <w:numId w:val="101"/>
         </w:numPr>
       </w:pPr>
       <w:r>
@@ -25916,7 +26167,7 @@
         <w:pStyle w:val="ListParagraph"/>
         <w:numPr>
           <w:ilvl w:val="0"/>
-          <w:numId w:val="100"/>
+          <w:numId w:val="101"/>
         </w:numPr>
       </w:pPr>
       <w:r>
@@ -25959,7 +26210,7 @@
         <w:pStyle w:val="ListParagraph"/>
         <w:numPr>
           <w:ilvl w:val="0"/>
-          <w:numId w:val="101"/>
+          <w:numId w:val="102"/>
         </w:numPr>
       </w:pPr>
       <w:r>
@@ -26016,7 +26267,7 @@
         <w:pStyle w:val="ListParagraph"/>
         <w:numPr>
           <w:ilvl w:val="0"/>
-          <w:numId w:val="101"/>
+          <w:numId w:val="102"/>
         </w:numPr>
       </w:pPr>
       <w:r>
@@ -26046,7 +26297,7 @@
         <w:pStyle w:val="ListParagraph"/>
         <w:numPr>
           <w:ilvl w:val="0"/>
-          <w:numId w:val="101"/>
+          <w:numId w:val="102"/>
         </w:numPr>
       </w:pPr>
       <w:r>
@@ -26084,7 +26335,7 @@
         <w:pStyle w:val="ListParagraph"/>
         <w:numPr>
           <w:ilvl w:val="0"/>
-          <w:numId w:val="102"/>
+          <w:numId w:val="103"/>
         </w:numPr>
       </w:pPr>
       <w:r>
@@ -26105,7 +26356,7 @@
         <w:pStyle w:val="ListParagraph"/>
         <w:numPr>
           <w:ilvl w:val="0"/>
-          <w:numId w:val="102"/>
+          <w:numId w:val="103"/>
         </w:numPr>
       </w:pPr>
       <w:r>
@@ -26150,7 +26401,7 @@
         <w:pStyle w:val="ListParagraph"/>
         <w:numPr>
           <w:ilvl w:val="0"/>
-          <w:numId w:val="102"/>
+          <w:numId w:val="103"/>
         </w:numPr>
       </w:pPr>
       <w:r>
@@ -26249,7 +26500,7 @@
         <w:pStyle w:val="ListParagraph"/>
         <w:numPr>
           <w:ilvl w:val="0"/>
-          <w:numId w:val="102"/>
+          <w:numId w:val="103"/>
         </w:numPr>
       </w:pPr>
       <w:r>
@@ -26294,7 +26545,7 @@
         <w:pStyle w:val="ListParagraph"/>
         <w:numPr>
           <w:ilvl w:val="0"/>
-          <w:numId w:val="102"/>
+          <w:numId w:val="103"/>
         </w:numPr>
       </w:pPr>
       <w:r>
@@ -26643,7 +26894,7 @@
         <w:pStyle w:val="ListParagraph"/>
         <w:numPr>
           <w:ilvl w:val="0"/>
-          <w:numId w:val="103"/>
+          <w:numId w:val="104"/>
         </w:numPr>
       </w:pPr>
       <w:r>
@@ -26673,7 +26924,7 @@
         <w:pStyle w:val="ListParagraph"/>
         <w:numPr>
           <w:ilvl w:val="0"/>
-          <w:numId w:val="103"/>
+          <w:numId w:val="104"/>
         </w:numPr>
       </w:pPr>
       <w:r>
@@ -26721,7 +26972,7 @@
         <w:pStyle w:val="ListParagraph"/>
         <w:numPr>
           <w:ilvl w:val="0"/>
-          <w:numId w:val="103"/>
+          <w:numId w:val="104"/>
         </w:numPr>
       </w:pPr>
       <w:r>
@@ -26811,7 +27062,7 @@
         <w:pStyle w:val="ListParagraph"/>
         <w:numPr>
           <w:ilvl w:val="0"/>
-          <w:numId w:val="103"/>
+          <w:numId w:val="104"/>
         </w:numPr>
       </w:pPr>
       <w:r>
@@ -26829,7 +27080,7 @@
         <w:pStyle w:val="ListParagraph"/>
         <w:numPr>
           <w:ilvl w:val="0"/>
-          <w:numId w:val="103"/>
+          <w:numId w:val="104"/>
         </w:numPr>
       </w:pPr>
       <w:r>
@@ -26856,7 +27107,7 @@
         <w:pStyle w:val="ListParagraph"/>
         <w:numPr>
           <w:ilvl w:val="0"/>
-          <w:numId w:val="103"/>
+          <w:numId w:val="104"/>
         </w:numPr>
       </w:pPr>
       <w:r>
@@ -26882,7 +27133,7 @@
         <w:pStyle w:val="ListParagraph"/>
         <w:numPr>
           <w:ilvl w:val="0"/>
-          <w:numId w:val="104"/>
+          <w:numId w:val="105"/>
         </w:numPr>
       </w:pPr>
       <w:r>
@@ -26903,7 +27154,7 @@
         <w:pStyle w:val="ListParagraph"/>
         <w:numPr>
           <w:ilvl w:val="0"/>
-          <w:numId w:val="104"/>
+          <w:numId w:val="105"/>
         </w:numPr>
       </w:pPr>
       <w:r>
@@ -26939,7 +27190,7 @@
         <w:pStyle w:val="ListParagraph"/>
         <w:numPr>
           <w:ilvl w:val="0"/>
-          <w:numId w:val="104"/>
+          <w:numId w:val="105"/>
         </w:numPr>
       </w:pPr>
       <w:r>
@@ -26975,7 +27226,7 @@
         <w:pStyle w:val="ListParagraph"/>
         <w:numPr>
           <w:ilvl w:val="0"/>
-          <w:numId w:val="104"/>
+          <w:numId w:val="105"/>
         </w:numPr>
       </w:pPr>
       <w:r>
@@ -27004,7 +27255,7 @@
         <w:pStyle w:val="ListParagraph"/>
         <w:numPr>
           <w:ilvl w:val="0"/>
-          <w:numId w:val="105"/>
+          <w:numId w:val="106"/>
         </w:numPr>
       </w:pPr>
       <w:r>
@@ -27025,7 +27276,7 @@
         <w:pStyle w:val="ListParagraph"/>
         <w:numPr>
           <w:ilvl w:val="0"/>
-          <w:numId w:val="105"/>
+          <w:numId w:val="106"/>
         </w:numPr>
       </w:pPr>
       <w:r>
@@ -27183,6 +27434,42 @@
               <w:rPr>
                 <w:b/>
               </w:rPr>
+              <w:t xml:space="preserve">Publisher</w:t>
+            </w:r>
+          </w:p>
+        </w:tc>
+        <w:tc>
+          <w:tcPr>
+            <w:tcW w:w="4680" w:type="dxa"/>
+          </w:tcPr>
+          <w:p>
+            <w:pPr/>
+            <w:r>
+              <w:t xml:space="preserve">Everything a member can, plus publish the sheets and the 3D model from Revit (LWK tab &gt; </w:t>
+            </w:r>
+            <w:r>
+              <w:rPr>
+                <w:b/>
+              </w:rPr>
+              <w:t xml:space="preserve">Publish to Viewer</w:t>
+            </w:r>
+            <w:r>
+              <w:t xml:space="preserve">)</w:t>
+            </w:r>
+          </w:p>
+        </w:tc>
+      </w:tr>
+      <w:tr>
+        <w:tc>
+          <w:tcPr>
+            <w:tcW w:w="4680" w:type="dxa"/>
+          </w:tcPr>
+          <w:p>
+            <w:pPr/>
+            <w:r>
+              <w:rPr>
+                <w:b/>
+              </w:rPr>
               <w:t xml:space="preserve">Project admin</w:t>
             </w:r>
           </w:p>
@@ -27194,7 +27481,7 @@
           <w:p>
             <w:pPr/>
             <w:r>
-              <w:t xml:space="preserve">Everything a member can, plus manage the project's members, edit or delete anything, override layer locks, upload models</w:t>
+              <w:t xml:space="preserve">Everything a publisher can, plus manage the project's members, edit or delete anything, override layer locks, upload models</w:t>
             </w:r>
           </w:p>
         </w:tc>
@@ -27246,7 +27533,7 @@
         <w:pStyle w:val="ListParagraph"/>
         <w:numPr>
           <w:ilvl w:val="0"/>
-          <w:numId w:val="106"/>
+          <w:numId w:val="107"/>
         </w:numPr>
       </w:pPr>
       <w:r>
@@ -27336,7 +27623,7 @@
         <w:pStyle w:val="ListParagraph"/>
         <w:numPr>
           <w:ilvl w:val="0"/>
-          <w:numId w:val="106"/>
+          <w:numId w:val="107"/>
         </w:numPr>
       </w:pPr>
       <w:r>
@@ -27366,7 +27653,7 @@
         <w:pStyle w:val="ListParagraph"/>
         <w:numPr>
           <w:ilvl w:val="0"/>
-          <w:numId w:val="106"/>
+          <w:numId w:val="107"/>
         </w:numPr>
       </w:pPr>
       <w:r>
@@ -27387,7 +27674,7 @@
         <w:pStyle w:val="ListParagraph"/>
         <w:numPr>
           <w:ilvl w:val="0"/>
-          <w:numId w:val="106"/>
+          <w:numId w:val="107"/>
         </w:numPr>
       </w:pPr>
       <w:r>
@@ -27423,7 +27710,7 @@
         <w:pStyle w:val="ListParagraph"/>
         <w:numPr>
           <w:ilvl w:val="0"/>
-          <w:numId w:val="106"/>
+          <w:numId w:val="107"/>
         </w:numPr>
       </w:pPr>
       <w:r>
@@ -27441,7 +27728,7 @@
         <w:pStyle w:val="ListParagraph"/>
         <w:numPr>
           <w:ilvl w:val="0"/>
-          <w:numId w:val="106"/>
+          <w:numId w:val="107"/>
         </w:numPr>
       </w:pPr>
       <w:r>
@@ -27485,7 +27772,7 @@
         <w:pStyle w:val="ListParagraph"/>
         <w:numPr>
           <w:ilvl w:val="0"/>
-          <w:numId w:val="107"/>
+          <w:numId w:val="108"/>
         </w:numPr>
       </w:pPr>
       <w:r>
@@ -27566,7 +27853,7 @@
         <w:pStyle w:val="ListParagraph"/>
         <w:numPr>
           <w:ilvl w:val="0"/>
-          <w:numId w:val="107"/>
+          <w:numId w:val="108"/>
         </w:numPr>
       </w:pPr>
       <w:r>
@@ -27584,7 +27871,7 @@
         <w:pStyle w:val="ListParagraph"/>
         <w:numPr>
           <w:ilvl w:val="0"/>
-          <w:numId w:val="107"/>
+          <w:numId w:val="108"/>
         </w:numPr>
       </w:pPr>
       <w:r>
@@ -27605,7 +27892,7 @@
         <w:pStyle w:val="ListParagraph"/>
         <w:numPr>
           <w:ilvl w:val="0"/>
-          <w:numId w:val="107"/>
+          <w:numId w:val="108"/>
         </w:numPr>
       </w:pPr>
       <w:r>
@@ -27631,7 +27918,7 @@
         <w:pStyle w:val="ListParagraph"/>
         <w:numPr>
           <w:ilvl w:val="0"/>
-          <w:numId w:val="108"/>
+          <w:numId w:val="109"/>
         </w:numPr>
       </w:pPr>
       <w:r>
@@ -27694,7 +27981,7 @@
         <w:pStyle w:val="ListParagraph"/>
         <w:numPr>
           <w:ilvl w:val="0"/>
-          <w:numId w:val="108"/>
+          <w:numId w:val="109"/>
         </w:numPr>
       </w:pPr>
       <w:r>
@@ -27721,7 +28008,7 @@
         <w:pStyle w:val="ListParagraph"/>
         <w:numPr>
           <w:ilvl w:val="0"/>
-          <w:numId w:val="108"/>
+          <w:numId w:val="109"/>
         </w:numPr>
       </w:pPr>
       <w:r>
@@ -27739,7 +28026,7 @@
         <w:pStyle w:val="ListParagraph"/>
         <w:numPr>
           <w:ilvl w:val="0"/>
-          <w:numId w:val="108"/>
+          <w:numId w:val="109"/>
         </w:numPr>
       </w:pPr>
       <w:r>
@@ -27802,7 +28089,7 @@
         <w:pStyle w:val="ListParagraph"/>
         <w:numPr>
           <w:ilvl w:val="0"/>
-          <w:numId w:val="108"/>
+          <w:numId w:val="109"/>
         </w:numPr>
       </w:pPr>
       <w:r>
@@ -27991,6 +28278,57 @@
           <w:p>
             <w:pPr/>
             <w:r>
+              <w:t xml:space="preserve">Publish to Viewer says "You need to be a Publisher or project admin"</w:t>
+            </w:r>
+          </w:p>
+        </w:tc>
+        <w:tc>
+          <w:tcPr>
+            <w:tcW w:w="4680" w:type="dxa"/>
+          </w:tcPr>
+          <w:p>
+            <w:pPr/>
+            <w:r>
+              <w:t xml:space="preserve">You are a </w:t>
+            </w:r>
+            <w:r>
+              <w:rPr>
+                <w:b/>
+              </w:rPr>
+              <w:t xml:space="preserve">Member</w:t>
+            </w:r>
+            <w:r>
+              <w:t xml:space="preserve"> (or Viewer) on that project. A project admin opens </w:t>
+            </w:r>
+            <w:r>
+              <w:rPr>
+                <w:b/>
+              </w:rPr>
+              <w:t xml:space="preserve">Admin</w:t>
+            </w:r>
+            <w:r>
+              <w:t xml:space="preserve">, chooses the project and sets your role to </w:t>
+            </w:r>
+            <w:r>
+              <w:rPr>
+                <w:b/>
+              </w:rPr>
+              <w:t xml:space="preserve">Publisher</w:t>
+            </w:r>
+            <w:r>
+              <w:t xml:space="preserve"> in the members table</w:t>
+            </w:r>
+          </w:p>
+        </w:tc>
+      </w:tr>
+      <w:tr>
+        <w:tc>
+          <w:tcPr>
+            <w:tcW w:w="4680" w:type="dxa"/>
+          </w:tcPr>
+          <w:p>
+            <w:pPr/>
+            <w:r>
               <w:t xml:space="preserve">"N waiting to save"</w:t>
             </w:r>
           </w:p>
@@ -28517,7 +28855,7 @@
         <w:pStyle w:val="ListParagraph"/>
         <w:numPr>
           <w:ilvl w:val="0"/>
-          <w:numId w:val="109"/>
+          <w:numId w:val="110"/>
         </w:numPr>
       </w:pPr>
       <w:r>
@@ -28535,7 +28873,7 @@
         <w:pStyle w:val="ListParagraph"/>
         <w:numPr>
           <w:ilvl w:val="0"/>
-          <w:numId w:val="109"/>
+          <w:numId w:val="110"/>
         </w:numPr>
       </w:pPr>
       <w:r>
@@ -28553,7 +28891,7 @@
         <w:pStyle w:val="ListParagraph"/>
         <w:numPr>
           <w:ilvl w:val="0"/>
-          <w:numId w:val="109"/>
+          <w:numId w:val="110"/>
         </w:numPr>
       </w:pPr>
       <w:r>
@@ -28571,7 +28909,7 @@
         <w:pStyle w:val="ListParagraph"/>
         <w:numPr>
           <w:ilvl w:val="0"/>
-          <w:numId w:val="109"/>
+          <w:numId w:val="110"/>
         </w:numPr>
       </w:pPr>
       <w:r>
@@ -28589,7 +28927,7 @@
         <w:pStyle w:val="ListParagraph"/>
         <w:numPr>
           <w:ilvl w:val="0"/>
-          <w:numId w:val="109"/>
+          <w:numId w:val="110"/>
         </w:numPr>
       </w:pPr>
       <w:r>
@@ -28607,7 +28945,7 @@
         <w:pStyle w:val="ListParagraph"/>
         <w:numPr>
           <w:ilvl w:val="0"/>
-          <w:numId w:val="109"/>
+          <w:numId w:val="110"/>
         </w:numPr>
       </w:pPr>
       <w:r>
@@ -29705,7 +30043,7 @@
         <w:pStyle w:val="ListParagraph"/>
         <w:numPr>
           <w:ilvl w:val="0"/>
-          <w:numId w:val="110"/>
+          <w:numId w:val="111"/>
         </w:numPr>
       </w:pPr>
       <w:r>
@@ -29717,7 +30055,7 @@
         <w:pStyle w:val="ListParagraph"/>
         <w:numPr>
           <w:ilvl w:val="0"/>
-          <w:numId w:val="110"/>
+          <w:numId w:val="111"/>
         </w:numPr>
       </w:pPr>
       <w:r>
@@ -29729,7 +30067,7 @@
         <w:pStyle w:val="ListParagraph"/>
         <w:numPr>
           <w:ilvl w:val="0"/>
-          <w:numId w:val="110"/>
+          <w:numId w:val="111"/>
         </w:numPr>
       </w:pPr>
       <w:r>
@@ -29741,7 +30079,7 @@
         <w:pStyle w:val="ListParagraph"/>
         <w:numPr>
           <w:ilvl w:val="0"/>
-          <w:numId w:val="110"/>
+          <w:numId w:val="111"/>
         </w:numPr>
       </w:pPr>
       <w:r>
@@ -29753,7 +30091,7 @@
         <w:pStyle w:val="ListParagraph"/>
         <w:numPr>
           <w:ilvl w:val="0"/>
-          <w:numId w:val="110"/>
+          <w:numId w:val="111"/>
         </w:numPr>
       </w:pPr>
       <w:r>
@@ -29774,7 +30112,7 @@
         <w:pStyle w:val="ListParagraph"/>
         <w:numPr>
           <w:ilvl w:val="0"/>
-          <w:numId w:val="110"/>
+          <w:numId w:val="111"/>
         </w:numPr>
       </w:pPr>
       <w:r>
@@ -29786,7 +30124,7 @@
         <w:pStyle w:val="ListParagraph"/>
         <w:numPr>
           <w:ilvl w:val="0"/>
-          <w:numId w:val="110"/>
+          <w:numId w:val="111"/>
         </w:numPr>
       </w:pPr>
       <w:r>
@@ -29807,7 +30145,7 @@
         <w:pStyle w:val="ListParagraph"/>
         <w:numPr>
           <w:ilvl w:val="0"/>
-          <w:numId w:val="110"/>
+          <w:numId w:val="111"/>
         </w:numPr>
       </w:pPr>
       <w:r>
@@ -29819,7 +30157,7 @@
         <w:pStyle w:val="ListParagraph"/>
         <w:numPr>
           <w:ilvl w:val="0"/>
-          <w:numId w:val="110"/>
+          <w:numId w:val="111"/>
         </w:numPr>
       </w:pPr>
       <w:r>
@@ -29831,7 +30169,7 @@
         <w:pStyle w:val="ListParagraph"/>
         <w:numPr>
           <w:ilvl w:val="0"/>
-          <w:numId w:val="110"/>
+          <w:numId w:val="111"/>
         </w:numPr>
       </w:pPr>
       <w:r>
@@ -29843,7 +30181,7 @@
         <w:pStyle w:val="ListParagraph"/>
         <w:numPr>
           <w:ilvl w:val="0"/>
-          <w:numId w:val="110"/>
+          <w:numId w:val="111"/>
         </w:numPr>
       </w:pPr>
       <w:r>
@@ -29855,7 +30193,7 @@
         <w:pStyle w:val="ListParagraph"/>
         <w:numPr>
           <w:ilvl w:val="0"/>
-          <w:numId w:val="110"/>
+          <w:numId w:val="111"/>
         </w:numPr>
       </w:pPr>
       <w:r>
@@ -29867,7 +30205,7 @@
         <w:pStyle w:val="ListParagraph"/>
         <w:numPr>
           <w:ilvl w:val="0"/>
-          <w:numId w:val="110"/>
+          <w:numId w:val="111"/>
         </w:numPr>
       </w:pPr>
       <w:r>
@@ -29879,7 +30217,7 @@
         <w:pStyle w:val="ListParagraph"/>
         <w:numPr>
           <w:ilvl w:val="0"/>
-          <w:numId w:val="110"/>
+          <w:numId w:val="111"/>
         </w:numPr>
       </w:pPr>
       <w:r>
@@ -30344,22 +30682,19 @@
     <w:abstractNumId w:val="0"/>
   </w:num>
   <w:num w:numId="65">
+    <w:abstractNumId w:val="0"/>
+  </w:num>
+  <w:num w:numId="66">
     <w:abstractNumId w:val="1"/>
     <w:lvlOverride w:ilvl="0">
       <w:startOverride w:val="1"/>
     </w:lvlOverride>
   </w:num>
-  <w:num w:numId="66">
-    <w:abstractNumId w:val="0"/>
-  </w:num>
   <w:num w:numId="67">
     <w:abstractNumId w:val="0"/>
   </w:num>
   <w:num w:numId="68">
-    <w:abstractNumId w:val="1"/>
-    <w:lvlOverride w:ilvl="0">
-      <w:startOverride w:val="1"/>
-    </w:lvlOverride>
+    <w:abstractNumId w:val="0"/>
   </w:num>
   <w:num w:numId="69">
     <w:abstractNumId w:val="1"/>
@@ -30368,13 +30703,13 @@
     </w:lvlOverride>
   </w:num>
   <w:num w:numId="70">
-    <w:abstractNumId w:val="0"/>
-  </w:num>
-  <w:num w:numId="71">
     <w:abstractNumId w:val="1"/>
     <w:lvlOverride w:ilvl="0">
       <w:startOverride w:val="1"/>
     </w:lvlOverride>
+  </w:num>
+  <w:num w:numId="71">
+    <w:abstractNumId w:val="0"/>
   </w:num>
   <w:num w:numId="72">
     <w:abstractNumId w:val="1"/>
@@ -30383,34 +30718,34 @@
     </w:lvlOverride>
   </w:num>
   <w:num w:numId="73">
-    <w:abstractNumId w:val="0"/>
-  </w:num>
-  <w:num w:numId="74">
     <w:abstractNumId w:val="1"/>
     <w:lvlOverride w:ilvl="0">
       <w:startOverride w:val="1"/>
     </w:lvlOverride>
   </w:num>
-  <w:num w:numId="75">
+  <w:num w:numId="74">
     <w:abstractNumId w:val="0"/>
   </w:num>
-  <w:num w:numId="76">
+  <w:num w:numId="75">
     <w:abstractNumId w:val="1"/>
     <w:lvlOverride w:ilvl="0">
       <w:startOverride w:val="1"/>
     </w:lvlOverride>
   </w:num>
+  <w:num w:numId="76">
+    <w:abstractNumId w:val="0"/>
+  </w:num>
   <w:num w:numId="77">
-    <w:abstractNumId w:val="0"/>
+    <w:abstractNumId w:val="1"/>
+    <w:lvlOverride w:ilvl="0">
+      <w:startOverride w:val="1"/>
+    </w:lvlOverride>
   </w:num>
   <w:num w:numId="78">
     <w:abstractNumId w:val="0"/>
   </w:num>
   <w:num w:numId="79">
-    <w:abstractNumId w:val="1"/>
-    <w:lvlOverride w:ilvl="0">
-      <w:startOverride w:val="1"/>
-    </w:lvlOverride>
+    <w:abstractNumId w:val="0"/>
   </w:num>
   <w:num w:numId="80">
     <w:abstractNumId w:val="1"/>
@@ -30425,16 +30760,19 @@
     </w:lvlOverride>
   </w:num>
   <w:num w:numId="82">
-    <w:abstractNumId w:val="0"/>
-  </w:num>
-  <w:num w:numId="83">
     <w:abstractNumId w:val="1"/>
     <w:lvlOverride w:ilvl="0">
       <w:startOverride w:val="1"/>
     </w:lvlOverride>
   </w:num>
+  <w:num w:numId="83">
+    <w:abstractNumId w:val="0"/>
+  </w:num>
   <w:num w:numId="84">
-    <w:abstractNumId w:val="0"/>
+    <w:abstractNumId w:val="1"/>
+    <w:lvlOverride w:ilvl="0">
+      <w:startOverride w:val="1"/>
+    </w:lvlOverride>
   </w:num>
   <w:num w:numId="85">
     <w:abstractNumId w:val="0"/>
@@ -30449,10 +30787,7 @@
     <w:abstractNumId w:val="0"/>
   </w:num>
   <w:num w:numId="89">
-    <w:abstractNumId w:val="1"/>
-    <w:lvlOverride w:ilvl="0">
-      <w:startOverride w:val="1"/>
-    </w:lvlOverride>
+    <w:abstractNumId w:val="0"/>
   </w:num>
   <w:num w:numId="90">
     <w:abstractNumId w:val="1"/>
@@ -30461,7 +30796,10 @@
     </w:lvlOverride>
   </w:num>
   <w:num w:numId="91">
-    <w:abstractNumId w:val="0"/>
+    <w:abstractNumId w:val="1"/>
+    <w:lvlOverride w:ilvl="0">
+      <w:startOverride w:val="1"/>
+    </w:lvlOverride>
   </w:num>
   <w:num w:numId="92">
     <w:abstractNumId w:val="0"/>
@@ -30476,13 +30814,13 @@
     <w:abstractNumId w:val="0"/>
   </w:num>
   <w:num w:numId="96">
+    <w:abstractNumId w:val="0"/>
+  </w:num>
+  <w:num w:numId="97">
     <w:abstractNumId w:val="1"/>
     <w:lvlOverride w:ilvl="0">
       <w:startOverride w:val="1"/>
     </w:lvlOverride>
-  </w:num>
-  <w:num w:numId="97">
-    <w:abstractNumId w:val="0"/>
   </w:num>
   <w:num w:numId="98">
     <w:abstractNumId w:val="0"/>
@@ -30497,13 +30835,13 @@
     <w:abstractNumId w:val="0"/>
   </w:num>
   <w:num w:numId="102">
+    <w:abstractNumId w:val="0"/>
+  </w:num>
+  <w:num w:numId="103">
     <w:abstractNumId w:val="1"/>
     <w:lvlOverride w:ilvl="0">
       <w:startOverride w:val="1"/>
     </w:lvlOverride>
-  </w:num>
-  <w:num w:numId="103">
-    <w:abstractNumId w:val="0"/>
   </w:num>
   <w:num w:numId="104">
     <w:abstractNumId w:val="0"/>
@@ -30524,6 +30862,9 @@
     <w:abstractNumId w:val="0"/>
   </w:num>
   <w:num w:numId="110">
+    <w:abstractNumId w:val="0"/>
+  </w:num>
+  <w:num w:numId="111">
     <w:abstractNumId w:val="0"/>
   </w:num>
 </w:numbering>

</xml_diff>

<commit_message>
Phone: Sheets Set menu opens above the sheet drawer; narrower Tasks title column
The Set menu (z-index 60) opened under the drawer sheet list (70) on
phones and tablets; it and the right-click menu now sit above it. On a
phone held upright the Tasks list title column is narrow with two-line
titles, a dragged width is held to 55vw, and sub-tasks indent less.

Co-Authored-By: Claude Opus 5.5 <noreply@anthropic.com>
Claude-Session: https://claude.ai/code/session_01HMFznQ3NqvEPBkq88avjvR
</commit_message>
<xml_diff>
--- a/docs/manual/LWK_Viewer_User_Manual_EN.docx
+++ b/docs/manual/LWK_Viewer_User_Manual_EN.docx
@@ -4816,7 +4816,16 @@
         <w:t xml:space="preserve">Back</w:t>
       </w:r>
       <w:r>
-        <w:t xml:space="preserve"> returns to the list.</w:t>
+        <w:t xml:space="preserve"> returns to the list. On a phone held upright the </w:t>
+      </w:r>
+      <w:r>
+        <w:rPr>
+          <w:b/>
+        </w:rPr>
+        <w:t xml:space="preserve">Task title</w:t>
+      </w:r>
+      <w:r>
+        <w:t xml:space="preserve"> column is narrow and titles wrap onto two lines, so the other columns have room; drag its edge to make it wider (up to about half the screen).</w:t>
       </w:r>
     </w:p>
     <w:p>
@@ -11242,7 +11251,25 @@
         <w:t xml:space="preserve">Delete set</w:t>
       </w:r>
       <w:r>
-        <w:t xml:space="preserve"> is the red one.</w:t>
+        <w:t xml:space="preserve"> is the red one. On a phone or tablet, open the sheet list (</w:t>
+      </w:r>
+      <w:r>
+        <w:rPr>
+          <w:b/>
+        </w:rPr>
+        <w:t xml:space="preserve">☰ Sheets</w:t>
+      </w:r>
+      <w:r>
+        <w:t xml:space="preserve">) and tap </w:t>
+      </w:r>
+      <w:r>
+        <w:rPr>
+          <w:b/>
+        </w:rPr>
+        <w:t xml:space="preserve">Set ▾</w:t>
+      </w:r>
+      <w:r>
+        <w:t xml:space="preserve"> there.</w:t>
       </w:r>
     </w:p>
     <w:p>

</xml_diff>